<commit_message>
docs: Adiciona teste unitário UT001.03
</commit_message>
<xml_diff>
--- a/documentation/Especificacao_de_Requisitos_de_Software.docx
+++ b/documentation/Especificacao_de_Requisitos_de_Software.docx
@@ -9417,7 +9417,13 @@
         <w:rPr>
           <w:color w:val="000000" w:themeColor="text1"/>
         </w:rPr>
-        <w:t>Enviar os dados ao Repository.</w:t>
+        <w:t>Validar os dados</w:t>
+      </w:r>
+      <w:r>
+        <w:rPr>
+          <w:color w:val="000000" w:themeColor="text1"/>
+        </w:rPr>
+        <w:t>.</w:t>
       </w:r>
     </w:p>
     <w:p>
@@ -9762,10 +9768,473 @@
     </w:p>
     <w:p>
       <w:pPr>
+        <w:pStyle w:val="Ttulo4"/>
         <w:rPr>
           <w:color w:val="FF0000"/>
         </w:rPr>
       </w:pPr>
+      <w:r>
+        <w:t xml:space="preserve">6.1.1.3 [UT001.03] </w:t>
+      </w:r>
+      <w:r>
+        <w:rPr>
+          <w:color w:val="000000" w:themeColor="text1"/>
+        </w:rPr>
+        <w:t>O sistema não deve cadastrar usuário quando o login já existe</w:t>
+      </w:r>
+    </w:p>
+    <w:p/>
+    <w:p>
+      <w:pPr>
+        <w:rPr>
+          <w:color w:val="000000" w:themeColor="text1"/>
+        </w:rPr>
+      </w:pPr>
+      <w:r>
+        <w:rPr>
+          <w:b/>
+          <w:bCs/>
+          <w:color w:val="000000" w:themeColor="text1"/>
+        </w:rPr>
+        <w:t>Camada:</w:t>
+      </w:r>
+      <w:r>
+        <w:rPr>
+          <w:color w:val="000000" w:themeColor="text1"/>
+        </w:rPr>
+        <w:t xml:space="preserve"> Serviço.</w:t>
+      </w:r>
+    </w:p>
+    <w:p>
+      <w:pPr>
+        <w:rPr>
+          <w:color w:val="000000" w:themeColor="text1"/>
+        </w:rPr>
+      </w:pPr>
+      <w:r>
+        <w:rPr>
+          <w:b/>
+          <w:color w:val="000000" w:themeColor="text1"/>
+        </w:rPr>
+        <w:t>Requisitos associados:</w:t>
+      </w:r>
+      <w:r>
+        <w:rPr>
+          <w:color w:val="000000" w:themeColor="text1"/>
+        </w:rPr>
+        <w:t xml:space="preserve"> RF001.01.</w:t>
+      </w:r>
+    </w:p>
+    <w:p>
+      <w:pPr>
+        <w:rPr>
+          <w:color w:val="000000" w:themeColor="text1"/>
+        </w:rPr>
+      </w:pPr>
+      <w:r>
+        <w:rPr>
+          <w:b/>
+          <w:color w:val="000000" w:themeColor="text1"/>
+        </w:rPr>
+        <w:t xml:space="preserve">Descrição: </w:t>
+      </w:r>
+      <w:r>
+        <w:rPr>
+          <w:color w:val="000000" w:themeColor="text1"/>
+        </w:rPr>
+        <w:t>O sistema não deve cadastrar usuário.</w:t>
+      </w:r>
+    </w:p>
+    <w:p>
+      <w:pPr>
+        <w:rPr>
+          <w:color w:val="000000" w:themeColor="text1"/>
+        </w:rPr>
+      </w:pPr>
+      <w:r>
+        <w:rPr>
+          <w:b/>
+          <w:color w:val="000000" w:themeColor="text1"/>
+        </w:rPr>
+        <w:t>Condições</w:t>
+      </w:r>
+      <w:r>
+        <w:rPr>
+          <w:color w:val="000000" w:themeColor="text1"/>
+        </w:rPr>
+        <w:t>: Login existente.</w:t>
+      </w:r>
+    </w:p>
+    <w:p>
+      <w:pPr>
+        <w:rPr>
+          <w:color w:val="000000" w:themeColor="text1"/>
+        </w:rPr>
+      </w:pPr>
+      <w:r>
+        <w:rPr>
+          <w:b/>
+          <w:color w:val="000000" w:themeColor="text1"/>
+        </w:rPr>
+        <w:t>Passos:</w:t>
+      </w:r>
+      <w:r>
+        <w:rPr>
+          <w:color w:val="000000" w:themeColor="text1"/>
+        </w:rPr>
+        <w:t xml:space="preserve"> </w:t>
+      </w:r>
+    </w:p>
+    <w:p>
+      <w:pPr>
+        <w:pStyle w:val="PargrafodaLista"/>
+        <w:numPr>
+          <w:ilvl w:val="0"/>
+          <w:numId w:val="26"/>
+        </w:numPr>
+        <w:rPr>
+          <w:color w:val="000000" w:themeColor="text1"/>
+        </w:rPr>
+      </w:pPr>
+      <w:r>
+        <w:rPr>
+          <w:color w:val="000000" w:themeColor="text1"/>
+        </w:rPr>
+        <w:t>Informar os dados do usuário com login existente.</w:t>
+      </w:r>
+    </w:p>
+    <w:p>
+      <w:pPr>
+        <w:pStyle w:val="PargrafodaLista"/>
+        <w:numPr>
+          <w:ilvl w:val="0"/>
+          <w:numId w:val="26"/>
+        </w:numPr>
+        <w:rPr>
+          <w:color w:val="000000" w:themeColor="text1"/>
+        </w:rPr>
+      </w:pPr>
+      <w:r>
+        <w:rPr>
+          <w:color w:val="000000" w:themeColor="text1"/>
+        </w:rPr>
+        <w:t>Consultar no Repository se o login existe.</w:t>
+      </w:r>
+    </w:p>
+    <w:p>
+      <w:pPr>
+        <w:pStyle w:val="PargrafodaLista"/>
+        <w:numPr>
+          <w:ilvl w:val="0"/>
+          <w:numId w:val="26"/>
+        </w:numPr>
+        <w:rPr>
+          <w:color w:val="000000" w:themeColor="text1"/>
+        </w:rPr>
+      </w:pPr>
+      <w:r>
+        <w:rPr>
+          <w:color w:val="000000" w:themeColor="text1"/>
+        </w:rPr>
+        <w:t>Caso login exista lançar exceção.</w:t>
+      </w:r>
+    </w:p>
+    <w:p>
+      <w:pPr>
+        <w:rPr>
+          <w:color w:val="000000" w:themeColor="text1"/>
+        </w:rPr>
+      </w:pPr>
+      <w:r>
+        <w:rPr>
+          <w:b/>
+          <w:color w:val="000000" w:themeColor="text1"/>
+        </w:rPr>
+        <w:t>Dados do teste:</w:t>
+      </w:r>
+      <w:r>
+        <w:rPr>
+          <w:color w:val="000000" w:themeColor="text1"/>
+        </w:rPr>
+        <w:t xml:space="preserve"> </w:t>
+      </w:r>
+    </w:p>
+    <w:p>
+      <w:pPr>
+        <w:ind w:firstLine="720"/>
+        <w:rPr>
+          <w:color w:val="000000" w:themeColor="text1"/>
+        </w:rPr>
+      </w:pPr>
+      <w:r>
+        <w:rPr>
+          <w:color w:val="000000" w:themeColor="text1"/>
+        </w:rPr>
+        <w:t>{</w:t>
+      </w:r>
+    </w:p>
+    <w:p>
+      <w:pPr>
+        <w:rPr>
+          <w:color w:val="000000" w:themeColor="text1"/>
+        </w:rPr>
+      </w:pPr>
+      <w:r>
+        <w:rPr>
+          <w:color w:val="000000" w:themeColor="text1"/>
+        </w:rPr>
+        <w:tab/>
+      </w:r>
+      <w:r>
+        <w:rPr>
+          <w:color w:val="000000" w:themeColor="text1"/>
+        </w:rPr>
+        <w:tab/>
+      </w:r>
+      <w:r>
+        <w:rPr>
+          <w:color w:val="000000" w:themeColor="text1"/>
+        </w:rPr>
+        <w:t>nome: “Usuário Teste”</w:t>
+      </w:r>
+    </w:p>
+    <w:p>
+      <w:pPr>
+        <w:rPr>
+          <w:color w:val="000000" w:themeColor="text1"/>
+        </w:rPr>
+      </w:pPr>
+      <w:r>
+        <w:rPr>
+          <w:color w:val="000000" w:themeColor="text1"/>
+        </w:rPr>
+        <w:tab/>
+      </w:r>
+      <w:r>
+        <w:rPr>
+          <w:color w:val="000000" w:themeColor="text1"/>
+        </w:rPr>
+        <w:tab/>
+        <w:t>login: “</w:t>
+      </w:r>
+      <w:r>
+        <w:rPr>
+          <w:color w:val="000000" w:themeColor="text1"/>
+        </w:rPr>
+        <w:t>login_existente</w:t>
+      </w:r>
+      <w:r>
+        <w:rPr>
+          <w:color w:val="000000" w:themeColor="text1"/>
+        </w:rPr>
+        <w:t>”</w:t>
+      </w:r>
+    </w:p>
+    <w:p>
+      <w:pPr>
+        <w:rPr>
+          <w:color w:val="000000" w:themeColor="text1"/>
+        </w:rPr>
+      </w:pPr>
+      <w:r>
+        <w:rPr>
+          <w:color w:val="000000" w:themeColor="text1"/>
+        </w:rPr>
+        <w:tab/>
+      </w:r>
+      <w:r>
+        <w:rPr>
+          <w:color w:val="000000" w:themeColor="text1"/>
+        </w:rPr>
+        <w:tab/>
+        <w:t>password: “teste”</w:t>
+      </w:r>
+    </w:p>
+    <w:p>
+      <w:pPr>
+        <w:rPr>
+          <w:color w:val="000000" w:themeColor="text1"/>
+        </w:rPr>
+      </w:pPr>
+      <w:r>
+        <w:rPr>
+          <w:color w:val="000000" w:themeColor="text1"/>
+        </w:rPr>
+        <w:tab/>
+      </w:r>
+      <w:r>
+        <w:rPr>
+          <w:color w:val="000000" w:themeColor="text1"/>
+        </w:rPr>
+        <w:tab/>
+        <w:t>telefone: “11912345678”</w:t>
+      </w:r>
+    </w:p>
+    <w:p>
+      <w:pPr>
+        <w:rPr>
+          <w:color w:val="000000" w:themeColor="text1"/>
+        </w:rPr>
+      </w:pPr>
+      <w:r>
+        <w:rPr>
+          <w:color w:val="000000" w:themeColor="text1"/>
+        </w:rPr>
+        <w:tab/>
+      </w:r>
+      <w:r>
+        <w:rPr>
+          <w:color w:val="000000" w:themeColor="text1"/>
+        </w:rPr>
+        <w:tab/>
+        <w:t>email: “teste@email.com”</w:t>
+      </w:r>
+    </w:p>
+    <w:p>
+      <w:pPr>
+        <w:rPr>
+          <w:color w:val="000000" w:themeColor="text1"/>
+        </w:rPr>
+      </w:pPr>
+      <w:r>
+        <w:rPr>
+          <w:color w:val="000000" w:themeColor="text1"/>
+        </w:rPr>
+        <w:tab/>
+      </w:r>
+      <w:r>
+        <w:rPr>
+          <w:color w:val="000000" w:themeColor="text1"/>
+        </w:rPr>
+        <w:tab/>
+        <w:t>status: ATIVO</w:t>
+      </w:r>
+    </w:p>
+    <w:p>
+      <w:pPr>
+        <w:rPr>
+          <w:color w:val="000000" w:themeColor="text1"/>
+        </w:rPr>
+      </w:pPr>
+      <w:r>
+        <w:rPr>
+          <w:color w:val="000000" w:themeColor="text1"/>
+        </w:rPr>
+        <w:tab/>
+      </w:r>
+      <w:r>
+        <w:rPr>
+          <w:color w:val="000000" w:themeColor="text1"/>
+        </w:rPr>
+        <w:tab/>
+        <w:t>perfil: ADMIN</w:t>
+      </w:r>
+    </w:p>
+    <w:p>
+      <w:pPr>
+        <w:rPr>
+          <w:color w:val="000000" w:themeColor="text1"/>
+        </w:rPr>
+      </w:pPr>
+      <w:r>
+        <w:rPr>
+          <w:color w:val="000000" w:themeColor="text1"/>
+        </w:rPr>
+        <w:tab/>
+        <w:t>}</w:t>
+      </w:r>
+    </w:p>
+    <w:p>
+      <w:pPr>
+        <w:rPr>
+          <w:color w:val="000000" w:themeColor="text1"/>
+        </w:rPr>
+      </w:pPr>
+      <w:r>
+        <w:rPr>
+          <w:b/>
+          <w:color w:val="000000" w:themeColor="text1"/>
+        </w:rPr>
+        <w:t xml:space="preserve">Resultado esperado: </w:t>
+      </w:r>
+      <w:r>
+        <w:rPr>
+          <w:color w:val="000000" w:themeColor="text1"/>
+        </w:rPr>
+        <w:t xml:space="preserve">Lançar exceção </w:t>
+      </w:r>
+      <w:r>
+        <w:rPr>
+          <w:color w:val="000000" w:themeColor="text1"/>
+        </w:rPr>
+        <w:t>EntityAlreadyExisting</w:t>
+      </w:r>
+      <w:r>
+        <w:rPr>
+          <w:color w:val="000000" w:themeColor="text1"/>
+        </w:rPr>
+        <w:t xml:space="preserve"> com a mensagem “Login já cadastrado!”.</w:t>
+      </w:r>
+    </w:p>
+    <w:p>
+      <w:pPr>
+        <w:rPr>
+          <w:color w:val="000000" w:themeColor="text1"/>
+        </w:rPr>
+      </w:pPr>
+      <w:r>
+        <w:rPr>
+          <w:b/>
+          <w:color w:val="000000" w:themeColor="text1"/>
+        </w:rPr>
+        <w:t>Status:</w:t>
+      </w:r>
+      <w:r>
+        <w:rPr>
+          <w:color w:val="000000" w:themeColor="text1"/>
+        </w:rPr>
+        <w:t xml:space="preserve"> Não realizado.</w:t>
+      </w:r>
+    </w:p>
+    <w:p>
+      <w:pPr>
+        <w:rPr>
+          <w:color w:val="000000" w:themeColor="text1"/>
+        </w:rPr>
+      </w:pPr>
+      <w:r>
+        <w:rPr>
+          <w:b/>
+          <w:color w:val="000000" w:themeColor="text1"/>
+        </w:rPr>
+        <w:t>Realização do teste:</w:t>
+      </w:r>
+      <w:r>
+        <w:rPr>
+          <w:color w:val="000000" w:themeColor="text1"/>
+        </w:rPr>
+        <w:t xml:space="preserve"> 00/00/0000.</w:t>
+      </w:r>
+    </w:p>
+    <w:p>
+      <w:pPr>
+        <w:rPr>
+          <w:color w:val="000000" w:themeColor="text1"/>
+        </w:rPr>
+      </w:pPr>
+      <w:r>
+        <w:rPr>
+          <w:b/>
+          <w:color w:val="000000" w:themeColor="text1"/>
+        </w:rPr>
+        <w:t xml:space="preserve">Responsável: </w:t>
+      </w:r>
+      <w:r>
+        <w:rPr>
+          <w:color w:val="000000" w:themeColor="text1"/>
+        </w:rPr>
+        <w:t>A definir.</w:t>
+      </w:r>
     </w:p>
     <w:p>
       <w:pPr>
@@ -9773,6 +10242,11 @@
       </w:pPr>
       <w:bookmarkStart w:id="52" w:name="_1m74qn55enf9"/>
       <w:bookmarkEnd w:id="52"/>
+    </w:p>
+    <w:p>
+      <w:pPr>
+        <w:pStyle w:val="Ttulo2"/>
+      </w:pPr>
       <w:r>
         <w:t>6.2 Testes de Integração</w:t>
       </w:r>
@@ -10768,6 +11242,92 @@
     </w:lvl>
   </w:abstractNum>
   <w:abstractNum w:abstractNumId="5" w15:restartNumberingAfterBreak="0">
+    <w:nsid w:val="2567169C"/>
+    <w:multiLevelType w:val="multilevel"/>
+    <w:tmpl w:val="7EAE38A0"/>
+    <w:lvl w:ilvl="0">
+      <w:start w:val="1"/>
+      <w:numFmt w:val="decimal"/>
+      <w:lvlText w:val="%1."/>
+      <w:lvlJc w:val="left"/>
+      <w:pPr>
+        <w:ind w:left="709" w:hanging="360"/>
+      </w:pPr>
+    </w:lvl>
+    <w:lvl w:ilvl="1">
+      <w:start w:val="1"/>
+      <w:numFmt w:val="lowerLetter"/>
+      <w:lvlText w:val="%2."/>
+      <w:lvlJc w:val="left"/>
+      <w:pPr>
+        <w:ind w:left="1429" w:hanging="360"/>
+      </w:pPr>
+    </w:lvl>
+    <w:lvl w:ilvl="2">
+      <w:start w:val="1"/>
+      <w:numFmt w:val="lowerRoman"/>
+      <w:lvlText w:val="%3."/>
+      <w:lvlJc w:val="right"/>
+      <w:pPr>
+        <w:ind w:left="2149" w:hanging="180"/>
+      </w:pPr>
+    </w:lvl>
+    <w:lvl w:ilvl="3">
+      <w:start w:val="1"/>
+      <w:numFmt w:val="decimal"/>
+      <w:lvlText w:val="%4."/>
+      <w:lvlJc w:val="left"/>
+      <w:pPr>
+        <w:ind w:left="2869" w:hanging="360"/>
+      </w:pPr>
+    </w:lvl>
+    <w:lvl w:ilvl="4">
+      <w:start w:val="1"/>
+      <w:numFmt w:val="lowerLetter"/>
+      <w:lvlText w:val="%5."/>
+      <w:lvlJc w:val="left"/>
+      <w:pPr>
+        <w:ind w:left="3589" w:hanging="360"/>
+      </w:pPr>
+    </w:lvl>
+    <w:lvl w:ilvl="5">
+      <w:start w:val="1"/>
+      <w:numFmt w:val="lowerRoman"/>
+      <w:lvlText w:val="%6."/>
+      <w:lvlJc w:val="right"/>
+      <w:pPr>
+        <w:ind w:left="4309" w:hanging="180"/>
+      </w:pPr>
+    </w:lvl>
+    <w:lvl w:ilvl="6">
+      <w:start w:val="1"/>
+      <w:numFmt w:val="decimal"/>
+      <w:lvlText w:val="%7."/>
+      <w:lvlJc w:val="left"/>
+      <w:pPr>
+        <w:ind w:left="5029" w:hanging="360"/>
+      </w:pPr>
+    </w:lvl>
+    <w:lvl w:ilvl="7">
+      <w:start w:val="1"/>
+      <w:numFmt w:val="lowerLetter"/>
+      <w:lvlText w:val="%8."/>
+      <w:lvlJc w:val="left"/>
+      <w:pPr>
+        <w:ind w:left="5749" w:hanging="360"/>
+      </w:pPr>
+    </w:lvl>
+    <w:lvl w:ilvl="8">
+      <w:start w:val="1"/>
+      <w:numFmt w:val="lowerRoman"/>
+      <w:lvlText w:val="%9."/>
+      <w:lvlJc w:val="right"/>
+      <w:pPr>
+        <w:ind w:left="6469" w:hanging="180"/>
+      </w:pPr>
+    </w:lvl>
+  </w:abstractNum>
+  <w:abstractNum w:abstractNumId="6" w15:restartNumberingAfterBreak="0">
     <w:nsid w:val="27687D6D"/>
     <w:multiLevelType w:val="multilevel"/>
     <w:tmpl w:val="33B28994"/>
@@ -10853,7 +11413,7 @@
       </w:pPr>
     </w:lvl>
   </w:abstractNum>
-  <w:abstractNum w:abstractNumId="6" w15:restartNumberingAfterBreak="0">
+  <w:abstractNum w:abstractNumId="7" w15:restartNumberingAfterBreak="0">
     <w:nsid w:val="28492A00"/>
     <w:multiLevelType w:val="multilevel"/>
     <w:tmpl w:val="DF10247E"/>
@@ -10966,7 +11526,7 @@
       </w:rPr>
     </w:lvl>
   </w:abstractNum>
-  <w:abstractNum w:abstractNumId="7" w15:restartNumberingAfterBreak="0">
+  <w:abstractNum w:abstractNumId="8" w15:restartNumberingAfterBreak="0">
     <w:nsid w:val="29530051"/>
     <w:multiLevelType w:val="multilevel"/>
     <w:tmpl w:val="C04CB900"/>
@@ -11079,7 +11639,7 @@
       </w:rPr>
     </w:lvl>
   </w:abstractNum>
-  <w:abstractNum w:abstractNumId="8" w15:restartNumberingAfterBreak="0">
+  <w:abstractNum w:abstractNumId="9" w15:restartNumberingAfterBreak="0">
     <w:nsid w:val="311B04C2"/>
     <w:multiLevelType w:val="multilevel"/>
     <w:tmpl w:val="4B86EAF0"/>
@@ -11192,7 +11752,7 @@
       </w:rPr>
     </w:lvl>
   </w:abstractNum>
-  <w:abstractNum w:abstractNumId="9" w15:restartNumberingAfterBreak="0">
+  <w:abstractNum w:abstractNumId="10" w15:restartNumberingAfterBreak="0">
     <w:nsid w:val="35873CED"/>
     <w:multiLevelType w:val="multilevel"/>
     <w:tmpl w:val="316EA91C"/>
@@ -11305,7 +11865,7 @@
       </w:rPr>
     </w:lvl>
   </w:abstractNum>
-  <w:abstractNum w:abstractNumId="10" w15:restartNumberingAfterBreak="0">
+  <w:abstractNum w:abstractNumId="11" w15:restartNumberingAfterBreak="0">
     <w:nsid w:val="3AE82604"/>
     <w:multiLevelType w:val="multilevel"/>
     <w:tmpl w:val="5EC8825C"/>
@@ -11418,7 +11978,7 @@
       </w:rPr>
     </w:lvl>
   </w:abstractNum>
-  <w:abstractNum w:abstractNumId="11" w15:restartNumberingAfterBreak="0">
+  <w:abstractNum w:abstractNumId="12" w15:restartNumberingAfterBreak="0">
     <w:nsid w:val="425F7142"/>
     <w:multiLevelType w:val="multilevel"/>
     <w:tmpl w:val="6C3A65C8"/>
@@ -11531,7 +12091,7 @@
       </w:rPr>
     </w:lvl>
   </w:abstractNum>
-  <w:abstractNum w:abstractNumId="12" w15:restartNumberingAfterBreak="0">
+  <w:abstractNum w:abstractNumId="13" w15:restartNumberingAfterBreak="0">
     <w:nsid w:val="433872DF"/>
     <w:multiLevelType w:val="multilevel"/>
     <w:tmpl w:val="473E9B32"/>
@@ -11644,7 +12204,7 @@
       </w:rPr>
     </w:lvl>
   </w:abstractNum>
-  <w:abstractNum w:abstractNumId="13" w15:restartNumberingAfterBreak="0">
+  <w:abstractNum w:abstractNumId="14" w15:restartNumberingAfterBreak="0">
     <w:nsid w:val="4ABF56A0"/>
     <w:multiLevelType w:val="multilevel"/>
     <w:tmpl w:val="0D8E790A"/>
@@ -11730,7 +12290,7 @@
       </w:pPr>
     </w:lvl>
   </w:abstractNum>
-  <w:abstractNum w:abstractNumId="14" w15:restartNumberingAfterBreak="0">
+  <w:abstractNum w:abstractNumId="15" w15:restartNumberingAfterBreak="0">
     <w:nsid w:val="4DB86243"/>
     <w:multiLevelType w:val="multilevel"/>
     <w:tmpl w:val="D652AE68"/>
@@ -11843,7 +12403,7 @@
       </w:rPr>
     </w:lvl>
   </w:abstractNum>
-  <w:abstractNum w:abstractNumId="15" w15:restartNumberingAfterBreak="0">
+  <w:abstractNum w:abstractNumId="16" w15:restartNumberingAfterBreak="0">
     <w:nsid w:val="5C394BC9"/>
     <w:multiLevelType w:val="multilevel"/>
     <w:tmpl w:val="7EAE38A0"/>
@@ -11929,7 +12489,7 @@
       </w:pPr>
     </w:lvl>
   </w:abstractNum>
-  <w:abstractNum w:abstractNumId="16" w15:restartNumberingAfterBreak="0">
+  <w:abstractNum w:abstractNumId="17" w15:restartNumberingAfterBreak="0">
     <w:nsid w:val="610B3EDF"/>
     <w:multiLevelType w:val="multilevel"/>
     <w:tmpl w:val="7EAE38A0"/>
@@ -12015,7 +12575,7 @@
       </w:pPr>
     </w:lvl>
   </w:abstractNum>
-  <w:abstractNum w:abstractNumId="17" w15:restartNumberingAfterBreak="0">
+  <w:abstractNum w:abstractNumId="18" w15:restartNumberingAfterBreak="0">
     <w:nsid w:val="67403CB5"/>
     <w:multiLevelType w:val="multilevel"/>
     <w:tmpl w:val="75326788"/>
@@ -12128,7 +12688,7 @@
       </w:rPr>
     </w:lvl>
   </w:abstractNum>
-  <w:abstractNum w:abstractNumId="18" w15:restartNumberingAfterBreak="0">
+  <w:abstractNum w:abstractNumId="19" w15:restartNumberingAfterBreak="0">
     <w:nsid w:val="67C547F7"/>
     <w:multiLevelType w:val="multilevel"/>
     <w:tmpl w:val="35EAD4B8"/>
@@ -12214,7 +12774,7 @@
       </w:pPr>
     </w:lvl>
   </w:abstractNum>
-  <w:abstractNum w:abstractNumId="19" w15:restartNumberingAfterBreak="0">
+  <w:abstractNum w:abstractNumId="20" w15:restartNumberingAfterBreak="0">
     <w:nsid w:val="6C8202C1"/>
     <w:multiLevelType w:val="multilevel"/>
     <w:tmpl w:val="981048B2"/>
@@ -12327,7 +12887,7 @@
       </w:rPr>
     </w:lvl>
   </w:abstractNum>
-  <w:abstractNum w:abstractNumId="20" w15:restartNumberingAfterBreak="0">
+  <w:abstractNum w:abstractNumId="21" w15:restartNumberingAfterBreak="0">
     <w:nsid w:val="6CD6232C"/>
     <w:multiLevelType w:val="multilevel"/>
     <w:tmpl w:val="2C50429A"/>
@@ -12440,7 +13000,7 @@
       </w:rPr>
     </w:lvl>
   </w:abstractNum>
-  <w:abstractNum w:abstractNumId="21" w15:restartNumberingAfterBreak="0">
+  <w:abstractNum w:abstractNumId="22" w15:restartNumberingAfterBreak="0">
     <w:nsid w:val="6FBC5385"/>
     <w:multiLevelType w:val="multilevel"/>
     <w:tmpl w:val="9E36186C"/>
@@ -12553,7 +13113,7 @@
       </w:rPr>
     </w:lvl>
   </w:abstractNum>
-  <w:abstractNum w:abstractNumId="22" w15:restartNumberingAfterBreak="0">
+  <w:abstractNum w:abstractNumId="23" w15:restartNumberingAfterBreak="0">
     <w:nsid w:val="7ABF4D30"/>
     <w:multiLevelType w:val="multilevel"/>
     <w:tmpl w:val="C61A779C"/>
@@ -12666,7 +13226,7 @@
       </w:rPr>
     </w:lvl>
   </w:abstractNum>
-  <w:abstractNum w:abstractNumId="23" w15:restartNumberingAfterBreak="0">
+  <w:abstractNum w:abstractNumId="24" w15:restartNumberingAfterBreak="0">
     <w:nsid w:val="7ED21264"/>
     <w:multiLevelType w:val="multilevel"/>
     <w:tmpl w:val="87B4A5EE"/>
@@ -12779,7 +13339,7 @@
       </w:rPr>
     </w:lvl>
   </w:abstractNum>
-  <w:abstractNum w:abstractNumId="24" w15:restartNumberingAfterBreak="0">
+  <w:abstractNum w:abstractNumId="25" w15:restartNumberingAfterBreak="0">
     <w:nsid w:val="7FF4155E"/>
     <w:multiLevelType w:val="multilevel"/>
     <w:tmpl w:val="F9722B4C"/>
@@ -12872,76 +13432,79 @@
     <w:abstractNumId w:val="1"/>
   </w:num>
   <w:num w:numId="2" w16cid:durableId="88086438">
-    <w:abstractNumId w:val="22"/>
+    <w:abstractNumId w:val="23"/>
   </w:num>
   <w:num w:numId="3" w16cid:durableId="1706714901">
-    <w:abstractNumId w:val="20"/>
+    <w:abstractNumId w:val="21"/>
   </w:num>
   <w:num w:numId="4" w16cid:durableId="113717744">
     <w:abstractNumId w:val="0"/>
   </w:num>
   <w:num w:numId="5" w16cid:durableId="74671158">
+    <w:abstractNumId w:val="9"/>
+  </w:num>
+  <w:num w:numId="6" w16cid:durableId="913590874">
+    <w:abstractNumId w:val="15"/>
+  </w:num>
+  <w:num w:numId="7" w16cid:durableId="1890459348">
+    <w:abstractNumId w:val="25"/>
+  </w:num>
+  <w:num w:numId="8" w16cid:durableId="333532636">
     <w:abstractNumId w:val="8"/>
   </w:num>
-  <w:num w:numId="6" w16cid:durableId="913590874">
-    <w:abstractNumId w:val="14"/>
-  </w:num>
-  <w:num w:numId="7" w16cid:durableId="1890459348">
-    <w:abstractNumId w:val="24"/>
-  </w:num>
-  <w:num w:numId="8" w16cid:durableId="333532636">
-    <w:abstractNumId w:val="7"/>
-  </w:num>
   <w:num w:numId="9" w16cid:durableId="128785046">
-    <w:abstractNumId w:val="19"/>
+    <w:abstractNumId w:val="20"/>
   </w:num>
   <w:num w:numId="10" w16cid:durableId="905458532">
     <w:abstractNumId w:val="4"/>
   </w:num>
   <w:num w:numId="11" w16cid:durableId="1135484454">
-    <w:abstractNumId w:val="9"/>
+    <w:abstractNumId w:val="10"/>
   </w:num>
   <w:num w:numId="12" w16cid:durableId="568999983">
-    <w:abstractNumId w:val="23"/>
+    <w:abstractNumId w:val="24"/>
   </w:num>
   <w:num w:numId="13" w16cid:durableId="1767190151">
     <w:abstractNumId w:val="3"/>
   </w:num>
   <w:num w:numId="14" w16cid:durableId="715394213">
+    <w:abstractNumId w:val="13"/>
+  </w:num>
+  <w:num w:numId="15" w16cid:durableId="1314019323">
+    <w:abstractNumId w:val="11"/>
+  </w:num>
+  <w:num w:numId="16" w16cid:durableId="2108111862">
+    <w:abstractNumId w:val="22"/>
+  </w:num>
+  <w:num w:numId="17" w16cid:durableId="1320620575">
+    <w:abstractNumId w:val="18"/>
+  </w:num>
+  <w:num w:numId="18" w16cid:durableId="1431511382">
+    <w:abstractNumId w:val="7"/>
+  </w:num>
+  <w:num w:numId="19" w16cid:durableId="1528325566">
     <w:abstractNumId w:val="12"/>
   </w:num>
-  <w:num w:numId="15" w16cid:durableId="1314019323">
-    <w:abstractNumId w:val="10"/>
+  <w:num w:numId="20" w16cid:durableId="990518204">
+    <w:abstractNumId w:val="14"/>
   </w:num>
-  <w:num w:numId="16" w16cid:durableId="2108111862">
-    <w:abstractNumId w:val="21"/>
-  </w:num>
-  <w:num w:numId="17" w16cid:durableId="1320620575">
-    <w:abstractNumId w:val="17"/>
-  </w:num>
-  <w:num w:numId="18" w16cid:durableId="1431511382">
+  <w:num w:numId="21" w16cid:durableId="900098538">
     <w:abstractNumId w:val="6"/>
   </w:num>
-  <w:num w:numId="19" w16cid:durableId="1528325566">
-    <w:abstractNumId w:val="11"/>
-  </w:num>
-  <w:num w:numId="20" w16cid:durableId="990518204">
-    <w:abstractNumId w:val="13"/>
-  </w:num>
-  <w:num w:numId="21" w16cid:durableId="900098538">
-    <w:abstractNumId w:val="5"/>
-  </w:num>
   <w:num w:numId="22" w16cid:durableId="1159611945">
-    <w:abstractNumId w:val="18"/>
+    <w:abstractNumId w:val="19"/>
   </w:num>
   <w:num w:numId="23" w16cid:durableId="727652842">
     <w:abstractNumId w:val="2"/>
   </w:num>
   <w:num w:numId="24" w16cid:durableId="1596135007">
+    <w:abstractNumId w:val="17"/>
+  </w:num>
+  <w:num w:numId="25" w16cid:durableId="414478111">
     <w:abstractNumId w:val="16"/>
   </w:num>
-  <w:num w:numId="25" w16cid:durableId="414478111">
-    <w:abstractNumId w:val="15"/>
+  <w:num w:numId="26" w16cid:durableId="372466584">
+    <w:abstractNumId w:val="5"/>
   </w:num>
 </w:numbering>
 </file>

</xml_diff>

<commit_message>
docs: Ajustes na descrição dos identificadores.
</commit_message>
<xml_diff>
--- a/documentation/Especificacao_de_Requisitos_de_Software.docx
+++ b/documentation/Especificacao_de_Requisitos_de_Software.docx
@@ -1,6 +1,6 @@
 
 <file path=word/document.xml><?xml version="1.0" encoding="utf-8"?>
-<w:document xmlns:wpc="http://schemas.microsoft.com/office/word/2010/wordprocessingCanvas" xmlns:cx="http://schemas.microsoft.com/office/drawing/2014/chartex" xmlns:cx1="http://schemas.microsoft.com/office/drawing/2015/9/8/chartex" xmlns:cx2="http://schemas.microsoft.com/office/drawing/2015/10/21/chartex" xmlns:cx3="http://schemas.microsoft.com/office/drawing/2016/5/9/chartex" xmlns:cx4="http://schemas.microsoft.com/office/drawing/2016/5/10/chartex" xmlns:cx5="http://schemas.microsoft.com/office/drawing/2016/5/11/chartex" xmlns:cx6="http://schemas.microsoft.com/office/drawing/2016/5/12/chartex" xmlns:cx7="http://schemas.microsoft.com/office/drawing/2016/5/13/chartex" xmlns:cx8="http://schemas.microsoft.com/office/drawing/2016/5/14/chartex" xmlns:mc="http://schemas.openxmlformats.org/markup-compatibility/2006" xmlns:aink="http://schemas.microsoft.com/office/drawing/2016/ink" xmlns:am3d="http://schemas.microsoft.com/office/drawing/2017/model3d" xmlns:o="urn:schemas-microsoft-com:office:office" xmlns:oel="http://schemas.microsoft.com/office/2019/extlst" xmlns:r="http://schemas.openxmlformats.org/officeDocument/2006/relationships" xmlns:m="http://schemas.openxmlformats.org/officeDocument/2006/math" xmlns:v="urn:schemas-microsoft-com:vml" xmlns:wp14="http://schemas.microsoft.com/office/word/2010/wordprocessingDrawing" xmlns:wp="http://schemas.openxmlformats.org/drawingml/2006/wordprocessingDrawing" xmlns:w10="urn:schemas-microsoft-com:office:word" xmlns:w="http://schemas.openxmlformats.org/wordprocessingml/2006/main" xmlns:w14="http://schemas.microsoft.com/office/word/2010/wordml" xmlns:w15="http://schemas.microsoft.com/office/word/2012/wordml" xmlns:w16cex="http://schemas.microsoft.com/office/word/2018/wordml/cex" xmlns:w16cid="http://schemas.microsoft.com/office/word/2016/wordml/cid" xmlns:w16="http://schemas.microsoft.com/office/word/2018/wordml" xmlns:w16du="http://schemas.microsoft.com/office/word/2023/wordml/word16du" xmlns:w16sdtdh="http://schemas.microsoft.com/office/word/2020/wordml/sdtdatahash" xmlns:w16se="http://schemas.microsoft.com/office/word/2015/wordml/symex" xmlns:wpg="http://schemas.microsoft.com/office/word/2010/wordprocessingGroup" xmlns:wpi="http://schemas.microsoft.com/office/word/2010/wordprocessingInk" xmlns:wne="http://schemas.microsoft.com/office/word/2006/wordml" xmlns:wps="http://schemas.microsoft.com/office/word/2010/wordprocessingShape" mc:Ignorable="w14 w15 w16se w16cid w16 w16cex w16sdtdh w16du wp14">
+<w:document xmlns:wpc="http://schemas.microsoft.com/office/word/2010/wordprocessingCanvas" xmlns:cx="http://schemas.microsoft.com/office/drawing/2014/chartex" xmlns:cx1="http://schemas.microsoft.com/office/drawing/2015/9/8/chartex" xmlns:cx2="http://schemas.microsoft.com/office/drawing/2015/10/21/chartex" xmlns:cx3="http://schemas.microsoft.com/office/drawing/2016/5/9/chartex" xmlns:cx4="http://schemas.microsoft.com/office/drawing/2016/5/10/chartex" xmlns:cx5="http://schemas.microsoft.com/office/drawing/2016/5/11/chartex" xmlns:cx6="http://schemas.microsoft.com/office/drawing/2016/5/12/chartex" xmlns:cx7="http://schemas.microsoft.com/office/drawing/2016/5/13/chartex" xmlns:cx8="http://schemas.microsoft.com/office/drawing/2016/5/14/chartex" xmlns:mc="http://schemas.openxmlformats.org/markup-compatibility/2006" xmlns:aink="http://schemas.microsoft.com/office/drawing/2016/ink" xmlns:am3d="http://schemas.microsoft.com/office/drawing/2017/model3d" xmlns:o="urn:schemas-microsoft-com:office:office" xmlns:oel="http://schemas.microsoft.com/office/2019/extlst" xmlns:r="http://schemas.openxmlformats.org/officeDocument/2006/relationships" xmlns:m="http://schemas.openxmlformats.org/officeDocument/2006/math" xmlns:v="urn:schemas-microsoft-com:vml" xmlns:wp14="http://schemas.microsoft.com/office/word/2010/wordprocessingDrawing" xmlns:wp="http://schemas.openxmlformats.org/drawingml/2006/wordprocessingDrawing" xmlns:w10="urn:schemas-microsoft-com:office:word" xmlns:w="http://schemas.openxmlformats.org/wordprocessingml/2006/main" xmlns:w14="http://schemas.microsoft.com/office/word/2010/wordml" xmlns:w15="http://schemas.microsoft.com/office/word/2012/wordml" xmlns:w16cex="http://schemas.microsoft.com/office/word/2018/wordml/cex" xmlns:w16cid="http://schemas.microsoft.com/office/word/2016/wordml/cid" xmlns:w16="http://schemas.microsoft.com/office/word/2018/wordml" xmlns:w16du="http://schemas.microsoft.com/office/word/2023/wordml/word16du" xmlns:w16sdtdh="http://schemas.microsoft.com/office/word/2020/wordml/sdtdatahash" xmlns:w16sdtfl="http://schemas.microsoft.com/office/word/2024/wordml/sdtformatlock" xmlns:w16se="http://schemas.microsoft.com/office/word/2015/wordml/symex" xmlns:wpg="http://schemas.microsoft.com/office/word/2010/wordprocessingGroup" xmlns:wpi="http://schemas.microsoft.com/office/word/2010/wordprocessingInk" xmlns:wne="http://schemas.microsoft.com/office/word/2006/wordml" xmlns:wps="http://schemas.microsoft.com/office/word/2010/wordprocessingShape" mc:Ignorable="w14 w15 w16se w16cid w16 w16cex w16sdtdh w16sdtfl w16du wp14">
   <w:body>
     <w:p>
       <w:pPr>
@@ -2598,7 +2598,19 @@
         <w:ind w:firstLine="850"/>
       </w:pPr>
       <w:r>
-        <w:t xml:space="preserve">Os requisitos serão identificados com um identificador único. A numeração inicia com o identificador </w:t>
+        <w:t>Requisitos do software, serão utilizados os seguintes identificadores:</w:t>
+      </w:r>
+    </w:p>
+    <w:p>
+      <w:pPr>
+        <w:pStyle w:val="PargrafodaLista"/>
+        <w:numPr>
+          <w:ilvl w:val="0"/>
+          <w:numId w:val="27"/>
+        </w:numPr>
+      </w:pPr>
+      <w:r>
+        <w:t xml:space="preserve">Requisitos funcionais: </w:t>
       </w:r>
       <w:r>
         <w:rPr>
@@ -2607,7 +2619,7 @@
         <w:t>[RF001]</w:t>
       </w:r>
       <w:r>
-        <w:t xml:space="preserve"> para o módulo acrescentado de </w:t>
+        <w:t xml:space="preserve"> para o módulo, acrescentado de </w:t>
       </w:r>
       <w:r>
         <w:rPr>
@@ -2616,7 +2628,22 @@
         <w:t>[.00]</w:t>
       </w:r>
       <w:r>
-        <w:t xml:space="preserve"> para o requisito em si para requisitos funcionais e </w:t>
+        <w:t xml:space="preserve"> para o requisito em si</w:t>
+      </w:r>
+      <w:r>
+        <w:t>.</w:t>
+      </w:r>
+    </w:p>
+    <w:p>
+      <w:pPr>
+        <w:pStyle w:val="PargrafodaLista"/>
+        <w:numPr>
+          <w:ilvl w:val="0"/>
+          <w:numId w:val="27"/>
+        </w:numPr>
+      </w:pPr>
+      <w:r>
+        <w:t xml:space="preserve">Requisitos não funcionais: </w:t>
       </w:r>
       <w:r>
         <w:rPr>
@@ -2625,7 +2652,7 @@
         <w:t>[RNF001]</w:t>
       </w:r>
       <w:r>
-        <w:t xml:space="preserve"> para o módulo acrescentado de </w:t>
+        <w:t xml:space="preserve"> para o módulo, acrescentado de </w:t>
       </w:r>
       <w:r>
         <w:rPr>
@@ -2634,24 +2661,33 @@
         <w:t>[.00]</w:t>
       </w:r>
       <w:r>
-        <w:t xml:space="preserve"> para o requisito em si para requisitos não funcionais, a numeração será incrementada conforme surgirem novos requisitos.</w:t>
+        <w:rPr>
+          <w:bCs/>
+        </w:rPr>
+        <w:t>.</w:t>
       </w:r>
     </w:p>
     <w:p>
       <w:pPr>
         <w:ind w:firstLine="850"/>
-      </w:pPr>
-      <w:r>
-        <w:t xml:space="preserve">Documentos anexos serão identificados com o identificador único </w:t>
-      </w:r>
-      <w:r>
         <w:rPr>
           <w:b/>
         </w:rPr>
+      </w:pPr>
+      <w:r>
+        <w:t xml:space="preserve">Documentos anexos serão identificados com o identificador </w:t>
+      </w:r>
+      <w:r>
+        <w:rPr>
+          <w:b/>
+        </w:rPr>
         <w:t>[DOC001]</w:t>
       </w:r>
       <w:r>
-        <w:t xml:space="preserve">, a numeração será incrementada conforme surgirem novos documentos. </w:t>
+        <w:rPr>
+          <w:b/>
+        </w:rPr>
+        <w:t>.</w:t>
       </w:r>
     </w:p>
     <w:p>
@@ -2668,7 +2704,7 @@
         <w:t>[RN001]</w:t>
       </w:r>
       <w:r>
-        <w:t xml:space="preserve"> para o módulo acrescentado de </w:t>
+        <w:t xml:space="preserve"> para o módulo, acrescentado de </w:t>
       </w:r>
       <w:r>
         <w:rPr>
@@ -2677,7 +2713,10 @@
         <w:t>[.00]</w:t>
       </w:r>
       <w:r>
-        <w:t xml:space="preserve"> para a regra em si,  a numeração será incrementada conforme surgirem novas regras.</w:t>
+        <w:t xml:space="preserve"> para a regra em si</w:t>
+      </w:r>
+      <w:r>
+        <w:t>.</w:t>
       </w:r>
     </w:p>
     <w:p>
@@ -2685,16 +2724,111 @@
         <w:ind w:firstLine="850"/>
       </w:pPr>
       <w:r>
-        <w:t xml:space="preserve">Os testes serão identificados com o identificador único </w:t>
+        <w:t>Diagramas utilização os seguintes identificadores:</w:t>
+      </w:r>
+    </w:p>
+    <w:p>
+      <w:pPr>
+        <w:pStyle w:val="PargrafodaLista"/>
+        <w:numPr>
+          <w:ilvl w:val="0"/>
+          <w:numId w:val="29"/>
+        </w:numPr>
+      </w:pPr>
+      <w:r>
+        <w:t xml:space="preserve">Diagrama de classe: </w:t>
       </w:r>
       <w:r>
         <w:rPr>
           <w:b/>
+          <w:bCs/>
+        </w:rPr>
+        <w:t>[DC001]</w:t>
+      </w:r>
+      <w:r>
+        <w:t xml:space="preserve"> para cada diagrama.</w:t>
+      </w:r>
+    </w:p>
+    <w:p>
+      <w:pPr>
+        <w:pStyle w:val="PargrafodaLista"/>
+        <w:numPr>
+          <w:ilvl w:val="0"/>
+          <w:numId w:val="29"/>
+        </w:numPr>
+      </w:pPr>
+      <w:r>
+        <w:t xml:space="preserve">Diagrama de caso de uso: </w:t>
+      </w:r>
+      <w:r>
+        <w:rPr>
+          <w:b/>
+          <w:bCs/>
+        </w:rPr>
+        <w:t>[DCU001]</w:t>
+      </w:r>
+      <w:r>
+        <w:t xml:space="preserve"> para cada diagrama.</w:t>
+      </w:r>
+    </w:p>
+    <w:p>
+      <w:pPr>
+        <w:pStyle w:val="PargrafodaLista"/>
+        <w:numPr>
+          <w:ilvl w:val="0"/>
+          <w:numId w:val="29"/>
+        </w:numPr>
+      </w:pPr>
+      <w:r>
+        <w:t xml:space="preserve">Diagrama de sequência: </w:t>
+      </w:r>
+      <w:r>
+        <w:rPr>
+          <w:b/>
+          <w:bCs/>
+        </w:rPr>
+        <w:t>[DS001]</w:t>
+      </w:r>
+      <w:r>
+        <w:t xml:space="preserve"> para cada diagrama.</w:t>
+      </w:r>
+    </w:p>
+    <w:p>
+      <w:pPr>
+        <w:ind w:firstLine="850"/>
+      </w:pPr>
+      <w:r>
+        <w:t>Testes</w:t>
+      </w:r>
+      <w:r>
+        <w:t xml:space="preserve"> </w:t>
+      </w:r>
+      <w:r>
+        <w:t xml:space="preserve">de software, </w:t>
+      </w:r>
+      <w:r>
+        <w:t>serão utilizados os seguintes identificadores:</w:t>
+      </w:r>
+    </w:p>
+    <w:p>
+      <w:pPr>
+        <w:pStyle w:val="PargrafodaLista"/>
+        <w:numPr>
+          <w:ilvl w:val="0"/>
+          <w:numId w:val="28"/>
+        </w:numPr>
+      </w:pPr>
+      <w:r>
+        <w:t xml:space="preserve">Testes unitários: </w:t>
+      </w:r>
+      <w:r>
+        <w:rPr>
+          <w:b/>
         </w:rPr>
         <w:t>[TU001]</w:t>
       </w:r>
       <w:r>
-        <w:t xml:space="preserve"> para o módulo acrescentado de </w:t>
+        <w:t xml:space="preserve"> para o módulo, acrescentado de </w:t>
       </w:r>
       <w:r>
         <w:rPr>
@@ -2703,7 +2837,19 @@
         <w:t>[.00]</w:t>
       </w:r>
       <w:r>
-        <w:t xml:space="preserve"> para o teste em si para testes unitários, </w:t>
+        <w:t xml:space="preserve"> para o teste em si.</w:t>
+      </w:r>
+    </w:p>
+    <w:p>
+      <w:pPr>
+        <w:pStyle w:val="PargrafodaLista"/>
+        <w:numPr>
+          <w:ilvl w:val="0"/>
+          <w:numId w:val="28"/>
+        </w:numPr>
+      </w:pPr>
+      <w:r>
+        <w:t xml:space="preserve">Testes de integração: </w:t>
       </w:r>
       <w:r>
         <w:rPr>
@@ -2712,7 +2858,7 @@
         <w:t xml:space="preserve">[TI001] </w:t>
       </w:r>
       <w:r>
-        <w:t xml:space="preserve"> para o módulo acrescentado de </w:t>
+        <w:t xml:space="preserve">para o módulo acrescentado de </w:t>
       </w:r>
       <w:r>
         <w:rPr>
@@ -2721,7 +2867,19 @@
         <w:t>[.00]</w:t>
       </w:r>
       <w:r>
-        <w:t xml:space="preserve"> para o requisito em si para testes de integração e </w:t>
+        <w:t xml:space="preserve"> para o requisito em si.</w:t>
+      </w:r>
+    </w:p>
+    <w:p>
+      <w:pPr>
+        <w:pStyle w:val="PargrafodaLista"/>
+        <w:numPr>
+          <w:ilvl w:val="0"/>
+          <w:numId w:val="28"/>
+        </w:numPr>
+      </w:pPr>
+      <w:r>
+        <w:t xml:space="preserve">Testes de performance: </w:t>
       </w:r>
       <w:r>
         <w:rPr>
@@ -2730,7 +2888,7 @@
         <w:t xml:space="preserve">[TP001] </w:t>
       </w:r>
       <w:r>
-        <w:t xml:space="preserve"> para o módulo acrescentado de </w:t>
+        <w:t xml:space="preserve">para o módulo acrescentado de </w:t>
       </w:r>
       <w:r>
         <w:rPr>
@@ -2739,7 +2897,10 @@
         <w:t>[.00]</w:t>
       </w:r>
       <w:r>
-        <w:t xml:space="preserve"> para o requisito em si para teste de performance, a numeração será incrementada conforme surgirem novos testes.</w:t>
+        <w:t xml:space="preserve"> para o requisito em si</w:t>
+      </w:r>
+      <w:r>
+        <w:t>.</w:t>
       </w:r>
     </w:p>
     <w:p>
@@ -2763,7 +2924,13 @@
         <w:ind w:firstLine="850"/>
       </w:pPr>
       <w:r>
-        <w:t xml:space="preserve">Para estabelecer a prioridade dos requisitos, foram adotados as denominações </w:t>
+        <w:t xml:space="preserve">Para estabelecer a prioridade dos requisitos, foram </w:t>
+      </w:r>
+      <w:r>
+        <w:t>adotadas</w:t>
+      </w:r>
+      <w:r>
+        <w:t xml:space="preserve"> as denominações </w:t>
       </w:r>
       <w:r>
         <w:rPr>
@@ -2851,6 +3018,7 @@
               <w:rPr>
                 <w:b/>
               </w:rPr>
+              <w:lastRenderedPageBreak/>
               <w:t>Essenciais</w:t>
             </w:r>
           </w:p>
@@ -2868,11 +3036,7 @@
           </w:tcPr>
           <w:p>
             <w:r>
-              <w:t xml:space="preserve">Requisitos que são absolutamente necessários para o funcionamento do sistema. Sem esses requisitos, o software não </w:t>
-            </w:r>
-            <w:r>
-              <w:lastRenderedPageBreak/>
-              <w:t>pode operar ou cumprir sua finalidade principal. Eles são críticos e devem ser implementados.</w:t>
+              <w:t>Requisitos que são absolutamente necessários para o funcionamento do sistema. Sem esses requisitos, o software não pode operar ou cumprir sua finalidade principal. Eles são críticos e devem ser implementados.</w:t>
             </w:r>
           </w:p>
         </w:tc>
@@ -2910,7 +3074,6 @@
               <w:rPr>
                 <w:b/>
               </w:rPr>
-              <w:lastRenderedPageBreak/>
               <w:t>Importantes</w:t>
             </w:r>
           </w:p>
@@ -3970,7 +4133,7 @@
         <w:rPr>
           <w:color w:val="000000" w:themeColor="text1"/>
         </w:rPr>
-        <w:t>O sistema deve permitir o cadastros de usuários que acessarão o sistema com as informações conforme diagrama de classe 5.1.1</w:t>
+        <w:t>O sistema deve permitir o cadastro de usuários que acessarão o sistema com as informações conforme diagrama de classe 5.1.1</w:t>
       </w:r>
       <w:r>
         <w:t xml:space="preserve">. </w:t>
@@ -4322,7 +4485,13 @@
         <w:t>Descrição:</w:t>
       </w:r>
       <w:r>
-        <w:t xml:space="preserve"> O backend do sistema deve ser elaborado utilizando a linguagem de  programação Java na versão</w:t>
+        <w:t xml:space="preserve"> O backend do sistema deve ser elaborado utilizando a linguagem </w:t>
+      </w:r>
+      <w:r>
+        <w:t>de programação</w:t>
+      </w:r>
+      <w:r>
+        <w:t xml:space="preserve"> Java na versão</w:t>
       </w:r>
       <w:r>
         <w:rPr>
@@ -4401,7 +4570,15 @@
         <w:t>Descrição:</w:t>
       </w:r>
       <w:r>
-        <w:t xml:space="preserve">  O backend do sistema deve ser elaborado utilizando framework Spring  na versão 3.3.3, utilizando dos seguintes projetos:</w:t>
+        <w:t xml:space="preserve">  O backend do sistema deve ser elaborado utilizando framework </w:t>
+      </w:r>
+      <w:proofErr w:type="gramStart"/>
+      <w:r>
+        <w:t>Spring  na</w:t>
+      </w:r>
+      <w:proofErr w:type="gramEnd"/>
+      <w:r>
+        <w:t xml:space="preserve"> versão 3.3.3, utilizando dos seguintes projetos:</w:t>
       </w:r>
     </w:p>
     <w:p>
@@ -4413,7 +4590,23 @@
         </w:numPr>
       </w:pPr>
       <w:r>
-        <w:t>Spring Web MVC: responsável por arquitetar as camadas de model e controller do projeto para criar as APIs Restful.</w:t>
+        <w:t xml:space="preserve">Spring Web MVC: responsável por arquitetar as camadas de model e </w:t>
+      </w:r>
+      <w:proofErr w:type="spellStart"/>
+      <w:r>
+        <w:t>controller</w:t>
+      </w:r>
+      <w:proofErr w:type="spellEnd"/>
+      <w:r>
+        <w:t xml:space="preserve"> do projeto para criar as APIs </w:t>
+      </w:r>
+      <w:proofErr w:type="spellStart"/>
+      <w:r>
+        <w:t>Restful</w:t>
+      </w:r>
+      <w:proofErr w:type="spellEnd"/>
+      <w:r>
+        <w:t>.</w:t>
       </w:r>
     </w:p>
     <w:p>
@@ -4425,7 +4618,15 @@
         </w:numPr>
       </w:pPr>
       <w:r>
-        <w:t>Spring Validation: responsável por definir as validações dos dados.</w:t>
+        <w:t xml:space="preserve">Spring </w:t>
+      </w:r>
+      <w:proofErr w:type="spellStart"/>
+      <w:r>
+        <w:t>Validation</w:t>
+      </w:r>
+      <w:proofErr w:type="spellEnd"/>
+      <w:r>
+        <w:t>: responsável por definir as validações dos dados.</w:t>
       </w:r>
     </w:p>
     <w:p>
@@ -4461,7 +4662,15 @@
         </w:numPr>
       </w:pPr>
       <w:r>
-        <w:t>Spring AMQP: responsável por fazer a comunicação assíncrona utilizando um broker de mensageiria entre os micros serviços.</w:t>
+        <w:t xml:space="preserve">Spring AMQP: responsável por fazer a comunicação assíncrona utilizando um broker de </w:t>
+      </w:r>
+      <w:proofErr w:type="spellStart"/>
+      <w:r>
+        <w:t>mensageiria</w:t>
+      </w:r>
+      <w:proofErr w:type="spellEnd"/>
+      <w:r>
+        <w:t xml:space="preserve"> entre os micros serviços.</w:t>
       </w:r>
     </w:p>
     <w:p>
@@ -4497,7 +4706,15 @@
         </w:numPr>
       </w:pPr>
       <w:r>
-        <w:t>Spring Cloud Config: responsável por criar um servidor de configuração para os micros serviços.</w:t>
+        <w:t xml:space="preserve">Spring Cloud </w:t>
+      </w:r>
+      <w:proofErr w:type="spellStart"/>
+      <w:r>
+        <w:t>Config</w:t>
+      </w:r>
+      <w:proofErr w:type="spellEnd"/>
+      <w:r>
+        <w:t>: responsável por criar um servidor de configuração para os micros serviços.</w:t>
       </w:r>
     </w:p>
     <w:p>
@@ -4509,7 +4726,23 @@
         </w:numPr>
       </w:pPr>
       <w:r>
-        <w:t>Spring Cloud Circuit Breaker Resilience4J: responsável por criar os métodos fallback para prevenir falhas.</w:t>
+        <w:t xml:space="preserve">Spring Cloud Circuit </w:t>
+      </w:r>
+      <w:proofErr w:type="spellStart"/>
+      <w:r>
+        <w:t>Breaker</w:t>
+      </w:r>
+      <w:proofErr w:type="spellEnd"/>
+      <w:r>
+        <w:t xml:space="preserve"> Resilience4J: responsável por criar os métodos </w:t>
+      </w:r>
+      <w:proofErr w:type="spellStart"/>
+      <w:r>
+        <w:t>fallback</w:t>
+      </w:r>
+      <w:proofErr w:type="spellEnd"/>
+      <w:r>
+        <w:t xml:space="preserve"> para prevenir falhas.</w:t>
       </w:r>
     </w:p>
     <w:p>
@@ -4595,7 +4828,21 @@
         <w:t>Descrição:</w:t>
       </w:r>
       <w:r>
-        <w:t xml:space="preserve">  A troca de mensagens entre os micros serviços deve ser feita utilizando o broker RabbiMQ.</w:t>
+        <w:t xml:space="preserve">  A troca de mensagens entre os micros </w:t>
+      </w:r>
+      <w:r>
+        <w:t>serviços devem</w:t>
+      </w:r>
+      <w:r>
+        <w:t xml:space="preserve"> ser feita utilizando o broker </w:t>
+      </w:r>
+      <w:proofErr w:type="spellStart"/>
+      <w:r>
+        <w:t>RabbiMQ</w:t>
+      </w:r>
+      <w:proofErr w:type="spellEnd"/>
+      <w:r>
+        <w:t>.</w:t>
       </w:r>
     </w:p>
     <w:p/>
@@ -4613,8 +4860,16 @@
         <w:rPr>
           <w:color w:val="000000" w:themeColor="text1"/>
         </w:rPr>
-        <w:t>Log agregation</w:t>
-      </w:r>
+        <w:t xml:space="preserve">Log </w:t>
+      </w:r>
+      <w:proofErr w:type="spellStart"/>
+      <w:r>
+        <w:rPr>
+          <w:color w:val="000000" w:themeColor="text1"/>
+        </w:rPr>
+        <w:t>agregation</w:t>
+      </w:r>
+      <w:proofErr w:type="spellEnd"/>
     </w:p>
     <w:p/>
     <w:p>
@@ -4636,7 +4891,23 @@
         <w:t>Descrição:</w:t>
       </w:r>
       <w:r>
-        <w:t xml:space="preserve">  Os logs gerados pelos micros serviços devem ser centralizados utilizando o log agragation Elasticsearch.</w:t>
+        <w:t xml:space="preserve">  Os logs gerados pelos micros serviços devem ser centralizados utilizando o log </w:t>
+      </w:r>
+      <w:proofErr w:type="spellStart"/>
+      <w:r>
+        <w:t>agragation</w:t>
+      </w:r>
+      <w:proofErr w:type="spellEnd"/>
+      <w:r>
+        <w:t xml:space="preserve"> </w:t>
+      </w:r>
+      <w:proofErr w:type="spellStart"/>
+      <w:r>
+        <w:t>Elasticsearch</w:t>
+      </w:r>
+      <w:proofErr w:type="spellEnd"/>
+      <w:r>
+        <w:t>.</w:t>
       </w:r>
     </w:p>
     <w:p/>
@@ -5225,7 +5496,13 @@
         <w:t>Descrição:</w:t>
       </w:r>
       <w:r>
-        <w:t xml:space="preserve"> O sistema deve validar se o telefone do usuário tem entre 8 e 9 dígitos, caso o telefone esteja fora desse critérios o sistema deve retornar a mensagem para o usuário: “Telefone inválido”. Caso o telefone esteja dentro dos critérios, o sistema deve permitir o cadastro.</w:t>
+        <w:t xml:space="preserve"> O sistema deve validar se o telefone do usuário tem entre 8 e 9 dígitos, caso o telefone esteja fora </w:t>
+      </w:r>
+      <w:r>
+        <w:t>desses critérios</w:t>
+      </w:r>
+      <w:r>
+        <w:t xml:space="preserve"> o sistema deve retornar a mensagem para o usuário: “Telefone inválido”. Caso o telefone esteja dentro dos critérios, o sistema deve permitir o cadastro.</w:t>
       </w:r>
     </w:p>
     <w:p/>
@@ -5257,7 +5534,13 @@
         <w:t>Descrição:</w:t>
       </w:r>
       <w:r>
-        <w:t xml:space="preserve"> O sistema deve validar se o e-mail do usuário é válido, caso o e-mail esteja fora desse critérios o sistema deve retornar a mensagem para o usuário: “E-mail inválido”. Caso o e-mail esteja dentro dos critérios, o sistema deve permitir o cadastro.</w:t>
+        <w:t xml:space="preserve"> O sistema deve validar se o e-mail do usuário é válido, caso o e-mail esteja fora </w:t>
+      </w:r>
+      <w:r>
+        <w:t>desses critérios</w:t>
+      </w:r>
+      <w:r>
+        <w:t xml:space="preserve"> o sistema deve retornar a mensagem para o usuário: “E-mail inválido”. Caso o e-mail esteja dentro dos critérios, o sistema deve permitir o cadastro.</w:t>
       </w:r>
     </w:p>
     <w:p/>
@@ -5320,6 +5603,11 @@
       <w:pPr>
         <w:pStyle w:val="Ttulo4"/>
       </w:pPr>
+    </w:p>
+    <w:p>
+      <w:pPr>
+        <w:pStyle w:val="Ttulo4"/>
+      </w:pPr>
       <w:r>
         <w:t>3.3.1.14 [RN001.14] Status inicial do usuário</w:t>
       </w:r>
@@ -5341,10 +5629,23 @@
         <w:rPr>
           <w:b/>
         </w:rPr>
+        <w:lastRenderedPageBreak/>
         <w:t>Descrição:</w:t>
       </w:r>
       <w:r>
-        <w:t xml:space="preserve"> Ao criar um novo usuário o status inicial deve ser ATIVO.</w:t>
+        <w:t xml:space="preserve"> Ao </w:t>
+      </w:r>
+      <w:r>
+        <w:t>criar um</w:t>
+      </w:r>
+      <w:r>
+        <w:t xml:space="preserve"> usuário</w:t>
+      </w:r>
+      <w:r>
+        <w:t>,</w:t>
+      </w:r>
+      <w:r>
+        <w:t xml:space="preserve"> o status inicial deve ser ATIVO.</w:t>
       </w:r>
     </w:p>
     <w:p/>
@@ -5388,7 +5689,13 @@
         </w:numPr>
       </w:pPr>
       <w:r>
-        <w:t>ADMIN: Usuários com esse perfil tem acesso livre à todo o sistema.</w:t>
+        <w:t xml:space="preserve">ADMIN: Usuários com esse perfil tem acesso livre </w:t>
+      </w:r>
+      <w:r>
+        <w:t>a</w:t>
+      </w:r>
+      <w:r>
+        <w:t xml:space="preserve"> todo o sistema.</w:t>
       </w:r>
     </w:p>
     <w:p>
@@ -6427,7 +6734,21 @@
           <w:bCs/>
           <w:color w:val="000000" w:themeColor="text1"/>
         </w:rPr>
-        <w:t>5.1.1 [CD001] Usuário</w:t>
+        <w:t>5.1.1 [</w:t>
+      </w:r>
+      <w:r>
+        <w:rPr>
+          <w:bCs/>
+          <w:color w:val="000000" w:themeColor="text1"/>
+        </w:rPr>
+        <w:t>DC</w:t>
+      </w:r>
+      <w:r>
+        <w:rPr>
+          <w:bCs/>
+          <w:color w:val="000000" w:themeColor="text1"/>
+        </w:rPr>
+        <w:t>001] Usuário</w:t>
       </w:r>
     </w:p>
     <w:p>
@@ -6563,7 +6884,23 @@
         <w:t>Usuário:</w:t>
       </w:r>
       <w:r>
-        <w:t xml:space="preserve"> Classe que representa os usuários que irão operar o sistema, é composta pelas classes UsuarioStatus e UsuarioTipo, possui os atributos:</w:t>
+        <w:t xml:space="preserve"> Classe que representa os usuários que irão operar o sistema, é composta pelas classes </w:t>
+      </w:r>
+      <w:proofErr w:type="spellStart"/>
+      <w:r>
+        <w:t>UsuarioStatus</w:t>
+      </w:r>
+      <w:proofErr w:type="spellEnd"/>
+      <w:r>
+        <w:t xml:space="preserve"> e </w:t>
+      </w:r>
+      <w:proofErr w:type="spellStart"/>
+      <w:r>
+        <w:t>UsuarioTipo</w:t>
+      </w:r>
+      <w:proofErr w:type="spellEnd"/>
+      <w:r>
+        <w:t>, possui os atributos:</w:t>
       </w:r>
     </w:p>
     <w:p>
@@ -6605,8 +6942,17 @@
                 <w:b/>
                 <w:bCs/>
               </w:rPr>
-              <w:t>Atributos da classe Usuario</w:t>
+              <w:t xml:space="preserve">Atributos da classe </w:t>
             </w:r>
+            <w:proofErr w:type="spellStart"/>
+            <w:r>
+              <w:rPr>
+                <w:b/>
+                <w:bCs/>
+              </w:rPr>
+              <w:t>Usuario</w:t>
+            </w:r>
+            <w:proofErr w:type="spellEnd"/>
           </w:p>
         </w:tc>
       </w:tr>
@@ -6791,6 +7137,7 @@
                 <w:szCs w:val="22"/>
               </w:rPr>
             </w:pPr>
+            <w:proofErr w:type="spellStart"/>
             <w:r>
               <w:rPr>
                 <w:sz w:val="22"/>
@@ -6798,6 +7145,7 @@
               </w:rPr>
               <w:t>String</w:t>
             </w:r>
+            <w:proofErr w:type="spellEnd"/>
           </w:p>
         </w:tc>
       </w:tr>
@@ -6854,6 +7202,7 @@
                 <w:szCs w:val="22"/>
               </w:rPr>
             </w:pPr>
+            <w:proofErr w:type="spellStart"/>
             <w:r>
               <w:rPr>
                 <w:sz w:val="22"/>
@@ -6861,6 +7210,7 @@
               </w:rPr>
               <w:t>String</w:t>
             </w:r>
+            <w:proofErr w:type="spellEnd"/>
           </w:p>
         </w:tc>
       </w:tr>
@@ -6917,6 +7267,7 @@
                 <w:szCs w:val="22"/>
               </w:rPr>
             </w:pPr>
+            <w:proofErr w:type="spellStart"/>
             <w:r>
               <w:rPr>
                 <w:sz w:val="22"/>
@@ -6924,6 +7275,7 @@
               </w:rPr>
               <w:t>String</w:t>
             </w:r>
+            <w:proofErr w:type="spellEnd"/>
           </w:p>
         </w:tc>
       </w:tr>
@@ -6980,6 +7332,7 @@
                 <w:szCs w:val="22"/>
               </w:rPr>
             </w:pPr>
+            <w:proofErr w:type="spellStart"/>
             <w:r>
               <w:rPr>
                 <w:sz w:val="22"/>
@@ -6987,6 +7340,7 @@
               </w:rPr>
               <w:t>String</w:t>
             </w:r>
+            <w:proofErr w:type="spellEnd"/>
           </w:p>
         </w:tc>
       </w:tr>
@@ -7043,6 +7397,7 @@
                 <w:szCs w:val="22"/>
               </w:rPr>
             </w:pPr>
+            <w:proofErr w:type="spellStart"/>
             <w:r>
               <w:rPr>
                 <w:sz w:val="22"/>
@@ -7050,6 +7405,7 @@
               </w:rPr>
               <w:t>String</w:t>
             </w:r>
+            <w:proofErr w:type="spellEnd"/>
           </w:p>
         </w:tc>
       </w:tr>
@@ -7106,6 +7462,7 @@
                 <w:szCs w:val="22"/>
               </w:rPr>
             </w:pPr>
+            <w:proofErr w:type="spellStart"/>
             <w:r>
               <w:rPr>
                 <w:sz w:val="22"/>
@@ -7113,6 +7470,7 @@
               </w:rPr>
               <w:t>UsuarioStatus</w:t>
             </w:r>
+            <w:proofErr w:type="spellEnd"/>
           </w:p>
         </w:tc>
       </w:tr>
@@ -7175,6 +7533,7 @@
                 <w:szCs w:val="22"/>
               </w:rPr>
             </w:pPr>
+            <w:proofErr w:type="spellStart"/>
             <w:r>
               <w:rPr>
                 <w:sz w:val="22"/>
@@ -7182,6 +7541,7 @@
               </w:rPr>
               <w:t>UsuarioPerfil</w:t>
             </w:r>
+            <w:proofErr w:type="spellEnd"/>
           </w:p>
         </w:tc>
       </w:tr>
@@ -7200,7 +7560,15 @@
         </w:r>
       </w:fldSimple>
       <w:r>
-        <w:t xml:space="preserve">: atributos da classe Usuario </w:t>
+        <w:t xml:space="preserve">: atributos da classe </w:t>
+      </w:r>
+      <w:proofErr w:type="spellStart"/>
+      <w:r>
+        <w:t>Usuario</w:t>
+      </w:r>
+      <w:proofErr w:type="spellEnd"/>
+      <w:r>
+        <w:t xml:space="preserve"> </w:t>
       </w:r>
     </w:p>
     <w:p>
@@ -7211,15 +7579,32 @@
           <w:numId w:val="9"/>
         </w:numPr>
       </w:pPr>
+      <w:proofErr w:type="spellStart"/>
       <w:r>
         <w:rPr>
           <w:b/>
           <w:bCs/>
         </w:rPr>
-        <w:t>UsuarioStatus:</w:t>
-      </w:r>
-      <w:r>
-        <w:t xml:space="preserve"> Classe do tipo ENUM que representa o status do usuário, compõe a classe Usuario, possui os atributos: </w:t>
+        <w:t>UsuarioStatus</w:t>
+      </w:r>
+      <w:proofErr w:type="spellEnd"/>
+      <w:r>
+        <w:rPr>
+          <w:b/>
+          <w:bCs/>
+        </w:rPr>
+        <w:t>:</w:t>
+      </w:r>
+      <w:r>
+        <w:t xml:space="preserve"> Classe do tipo ENUM que representa o status do usuário, compõe a classe </w:t>
+      </w:r>
+      <w:proofErr w:type="spellStart"/>
+      <w:r>
+        <w:t>Usuario</w:t>
+      </w:r>
+      <w:proofErr w:type="spellEnd"/>
+      <w:r>
+        <w:t xml:space="preserve">, possui os atributos: </w:t>
       </w:r>
     </w:p>
     <w:p>
@@ -7257,8 +7642,17 @@
                 <w:b/>
                 <w:bCs/>
               </w:rPr>
-              <w:t>Atributos da classe UsuarioStatus</w:t>
+              <w:t xml:space="preserve">Atributos da classe </w:t>
             </w:r>
+            <w:proofErr w:type="spellStart"/>
+            <w:r>
+              <w:rPr>
+                <w:b/>
+                <w:bCs/>
+              </w:rPr>
+              <w:t>UsuarioStatus</w:t>
+            </w:r>
+            <w:proofErr w:type="spellEnd"/>
           </w:p>
         </w:tc>
       </w:tr>
@@ -7413,7 +7807,15 @@
         </w:r>
       </w:fldSimple>
       <w:r>
-        <w:t xml:space="preserve">: atributos da classe UsuarioStatus </w:t>
+        <w:t xml:space="preserve">: atributos da classe </w:t>
+      </w:r>
+      <w:proofErr w:type="spellStart"/>
+      <w:r>
+        <w:t>UsuarioStatus</w:t>
+      </w:r>
+      <w:proofErr w:type="spellEnd"/>
+      <w:r>
+        <w:t xml:space="preserve"> </w:t>
       </w:r>
     </w:p>
     <w:p>
@@ -7424,15 +7826,32 @@
           <w:numId w:val="12"/>
         </w:numPr>
       </w:pPr>
+      <w:proofErr w:type="spellStart"/>
       <w:r>
         <w:rPr>
           <w:b/>
           <w:bCs/>
         </w:rPr>
-        <w:t>UsuarioPerfil:</w:t>
-      </w:r>
-      <w:r>
-        <w:t xml:space="preserve"> Classe do tipo ENUM que representa o perfil de acesso do usuário, compõe a classe Usuario, possui os atributos: </w:t>
+        <w:t>UsuarioPerfil</w:t>
+      </w:r>
+      <w:proofErr w:type="spellEnd"/>
+      <w:r>
+        <w:rPr>
+          <w:b/>
+          <w:bCs/>
+        </w:rPr>
+        <w:t>:</w:t>
+      </w:r>
+      <w:r>
+        <w:t xml:space="preserve"> Classe do tipo ENUM que representa o perfil de acesso do usuário, compõe a classe </w:t>
+      </w:r>
+      <w:proofErr w:type="spellStart"/>
+      <w:r>
+        <w:t>Usuario</w:t>
+      </w:r>
+      <w:proofErr w:type="spellEnd"/>
+      <w:r>
+        <w:t xml:space="preserve">, possui os atributos: </w:t>
       </w:r>
     </w:p>
     <w:p>
@@ -7470,8 +7889,17 @@
                 <w:b/>
                 <w:bCs/>
               </w:rPr>
-              <w:t>Atributos da classe UsuarioPerfil</w:t>
+              <w:t xml:space="preserve">Atributos da classe </w:t>
             </w:r>
+            <w:proofErr w:type="spellStart"/>
+            <w:r>
+              <w:rPr>
+                <w:b/>
+                <w:bCs/>
+              </w:rPr>
+              <w:t>UsuarioPerfil</w:t>
+            </w:r>
+            <w:proofErr w:type="spellEnd"/>
           </w:p>
         </w:tc>
       </w:tr>
@@ -7666,7 +8094,15 @@
         </w:r>
       </w:fldSimple>
       <w:r>
-        <w:t xml:space="preserve">: atributos da classe UsuarioPerfil </w:t>
+        <w:t xml:space="preserve">: atributos da classe </w:t>
+      </w:r>
+      <w:proofErr w:type="spellStart"/>
+      <w:r>
+        <w:t>UsuarioPerfil</w:t>
+      </w:r>
+      <w:proofErr w:type="spellEnd"/>
+      <w:r>
+        <w:t xml:space="preserve"> </w:t>
       </w:r>
     </w:p>
     <w:p>
@@ -7710,7 +8146,31 @@
           <w:bCs/>
           <w:color w:val="000000" w:themeColor="text1"/>
         </w:rPr>
-        <w:t>5.2.1 [UC001] Login</w:t>
+        <w:t>5.2.1 [</w:t>
+      </w:r>
+      <w:r>
+        <w:rPr>
+          <w:b/>
+          <w:bCs/>
+          <w:color w:val="000000" w:themeColor="text1"/>
+        </w:rPr>
+        <w:t>D</w:t>
+      </w:r>
+      <w:r>
+        <w:rPr>
+          <w:b/>
+          <w:bCs/>
+          <w:color w:val="000000" w:themeColor="text1"/>
+        </w:rPr>
+        <w:t>CU</w:t>
+      </w:r>
+      <w:r>
+        <w:rPr>
+          <w:b/>
+          <w:bCs/>
+          <w:color w:val="000000" w:themeColor="text1"/>
+        </w:rPr>
+        <w:t>001] Login</w:t>
       </w:r>
     </w:p>
     <w:p/>
@@ -8110,7 +8570,13 @@
         <w:jc w:val="left"/>
       </w:pPr>
       <w:r>
-        <w:t>5.3.1 [SD001] Login</w:t>
+        <w:t>5.3.1 [</w:t>
+      </w:r>
+      <w:r>
+        <w:t>DS</w:t>
+      </w:r>
+      <w:r>
+        <w:t>001] Login</w:t>
       </w:r>
     </w:p>
     <w:p>
@@ -8651,10 +9117,10 @@
       <w:bookmarkStart w:id="51" w:name="_mvbavk2w77z5"/>
       <w:bookmarkEnd w:id="51"/>
       <w:r>
-        <w:t>6.1.1.1 [U</w:t>
-      </w:r>
-      <w:r>
-        <w:t>T</w:t>
+        <w:t>6.1.1.1 [</w:t>
+      </w:r>
+      <w:r>
+        <w:t>TU</w:t>
       </w:r>
       <w:r>
         <w:t xml:space="preserve">001.01] </w:t>
@@ -8996,11 +9462,19 @@
         </w:rPr>
         <w:tab/>
       </w:r>
-      <w:r>
-        <w:rPr>
-          <w:color w:val="000000" w:themeColor="text1"/>
-        </w:rPr>
-        <w:t xml:space="preserve">password: </w:t>
+      <w:proofErr w:type="spellStart"/>
+      <w:r>
+        <w:rPr>
+          <w:color w:val="000000" w:themeColor="text1"/>
+        </w:rPr>
+        <w:t>password</w:t>
+      </w:r>
+      <w:proofErr w:type="spellEnd"/>
+      <w:r>
+        <w:rPr>
+          <w:color w:val="000000" w:themeColor="text1"/>
+        </w:rPr>
+        <w:t xml:space="preserve">: </w:t>
       </w:r>
       <w:r>
         <w:rPr>
@@ -9082,11 +9556,19 @@
         </w:rPr>
         <w:tab/>
       </w:r>
-      <w:r>
-        <w:rPr>
-          <w:color w:val="000000" w:themeColor="text1"/>
-        </w:rPr>
-        <w:t xml:space="preserve">email: </w:t>
+      <w:proofErr w:type="spellStart"/>
+      <w:r>
+        <w:rPr>
+          <w:color w:val="000000" w:themeColor="text1"/>
+        </w:rPr>
+        <w:t>email</w:t>
+      </w:r>
+      <w:proofErr w:type="spellEnd"/>
+      <w:r>
+        <w:rPr>
+          <w:color w:val="000000" w:themeColor="text1"/>
+        </w:rPr>
+        <w:t xml:space="preserve">: </w:t>
       </w:r>
       <w:r>
         <w:rPr>
@@ -9188,7 +9670,21 @@
         <w:rPr>
           <w:color w:val="000000" w:themeColor="text1"/>
         </w:rPr>
-        <w:t>Objeto Usuario não nulo.</w:t>
+        <w:t xml:space="preserve">Objeto </w:t>
+      </w:r>
+      <w:proofErr w:type="spellStart"/>
+      <w:r>
+        <w:rPr>
+          <w:color w:val="000000" w:themeColor="text1"/>
+        </w:rPr>
+        <w:t>Usuario</w:t>
+      </w:r>
+      <w:proofErr w:type="spellEnd"/>
+      <w:r>
+        <w:rPr>
+          <w:color w:val="000000" w:themeColor="text1"/>
+        </w:rPr>
+        <w:t xml:space="preserve"> não nulo.</w:t>
       </w:r>
     </w:p>
     <w:p>
@@ -9266,10 +9762,10 @@
         </w:rPr>
       </w:pPr>
       <w:r>
-        <w:t>6.1.1.2 [U</w:t>
-      </w:r>
-      <w:r>
-        <w:t>T</w:t>
+        <w:t>6.1.1.2 [</w:t>
+      </w:r>
+      <w:r>
+        <w:t>TU</w:t>
       </w:r>
       <w:r>
         <w:t xml:space="preserve">001.02] </w:t>
@@ -9500,8 +9996,16 @@
         <w:rPr>
           <w:color w:val="000000" w:themeColor="text1"/>
         </w:rPr>
-        <w:t>nome: null</w:t>
-      </w:r>
+        <w:t xml:space="preserve">nome: </w:t>
+      </w:r>
+      <w:proofErr w:type="spellStart"/>
+      <w:r>
+        <w:rPr>
+          <w:color w:val="000000" w:themeColor="text1"/>
+        </w:rPr>
+        <w:t>null</w:t>
+      </w:r>
+      <w:proofErr w:type="spellEnd"/>
     </w:p>
     <w:p>
       <w:pPr>
@@ -9525,8 +10029,16 @@
         <w:rPr>
           <w:color w:val="000000" w:themeColor="text1"/>
         </w:rPr>
-        <w:t>login: null</w:t>
-      </w:r>
+        <w:t xml:space="preserve">login: </w:t>
+      </w:r>
+      <w:proofErr w:type="spellStart"/>
+      <w:r>
+        <w:rPr>
+          <w:color w:val="000000" w:themeColor="text1"/>
+        </w:rPr>
+        <w:t>null</w:t>
+      </w:r>
+      <w:proofErr w:type="spellEnd"/>
     </w:p>
     <w:p>
       <w:pPr>
@@ -9576,12 +10088,21 @@
         </w:rPr>
         <w:tab/>
       </w:r>
+      <w:proofErr w:type="spellStart"/>
       <w:r>
         <w:rPr>
           <w:color w:val="000000" w:themeColor="text1"/>
           <w:lang w:val="en-US"/>
         </w:rPr>
-        <w:t>telefone: null</w:t>
+        <w:t>telefone</w:t>
+      </w:r>
+      <w:proofErr w:type="spellEnd"/>
+      <w:r>
+        <w:rPr>
+          <w:color w:val="000000" w:themeColor="text1"/>
+          <w:lang w:val="en-US"/>
+        </w:rPr>
+        <w:t>: null</w:t>
       </w:r>
     </w:p>
     <w:p>
@@ -9774,7 +10295,13 @@
         </w:rPr>
       </w:pPr>
       <w:r>
-        <w:t xml:space="preserve">6.1.1.3 [UT001.03] </w:t>
+        <w:t>6.1.1.3 [</w:t>
+      </w:r>
+      <w:r>
+        <w:t>TU</w:t>
+      </w:r>
+      <w:r>
+        <w:t xml:space="preserve">001.03] </w:t>
       </w:r>
       <w:r>
         <w:rPr>
@@ -10002,6 +10529,7 @@
       <w:pPr>
         <w:rPr>
           <w:color w:val="000000" w:themeColor="text1"/>
+          <w:lang w:val="en-US"/>
         </w:rPr>
       </w:pPr>
       <w:r>
@@ -10015,17 +10543,27 @@
           <w:color w:val="000000" w:themeColor="text1"/>
         </w:rPr>
         <w:tab/>
+      </w:r>
+      <w:r>
+        <w:rPr>
+          <w:color w:val="000000" w:themeColor="text1"/>
+          <w:lang w:val="en-US"/>
+        </w:rPr>
         <w:t>login: “</w:t>
       </w:r>
-      <w:r>
-        <w:rPr>
-          <w:color w:val="000000" w:themeColor="text1"/>
+      <w:proofErr w:type="spellStart"/>
+      <w:r>
+        <w:rPr>
+          <w:color w:val="000000" w:themeColor="text1"/>
+          <w:lang w:val="en-US"/>
         </w:rPr>
         <w:t>login_existente</w:t>
       </w:r>
-      <w:r>
-        <w:rPr>
-          <w:color w:val="000000" w:themeColor="text1"/>
+      <w:proofErr w:type="spellEnd"/>
+      <w:r>
+        <w:rPr>
+          <w:color w:val="000000" w:themeColor="text1"/>
+          <w:lang w:val="en-US"/>
         </w:rPr>
         <w:t>”</w:t>
       </w:r>
@@ -10034,17 +10572,20 @@
       <w:pPr>
         <w:rPr>
           <w:color w:val="000000" w:themeColor="text1"/>
-        </w:rPr>
-      </w:pPr>
-      <w:r>
-        <w:rPr>
-          <w:color w:val="000000" w:themeColor="text1"/>
+          <w:lang w:val="en-US"/>
+        </w:rPr>
+      </w:pPr>
+      <w:r>
+        <w:rPr>
+          <w:color w:val="000000" w:themeColor="text1"/>
+          <w:lang w:val="en-US"/>
         </w:rPr>
         <w:tab/>
       </w:r>
       <w:r>
         <w:rPr>
           <w:color w:val="000000" w:themeColor="text1"/>
+          <w:lang w:val="en-US"/>
         </w:rPr>
         <w:tab/>
         <w:t>password: “teste”</w:t>
@@ -10059,14 +10600,21 @@
       <w:r>
         <w:rPr>
           <w:color w:val="000000" w:themeColor="text1"/>
+          <w:lang w:val="en-US"/>
         </w:rPr>
         <w:tab/>
       </w:r>
       <w:r>
         <w:rPr>
           <w:color w:val="000000" w:themeColor="text1"/>
+          <w:lang w:val="en-US"/>
         </w:rPr>
         <w:tab/>
+      </w:r>
+      <w:r>
+        <w:rPr>
+          <w:color w:val="000000" w:themeColor="text1"/>
+        </w:rPr>
         <w:t>telefone: “11912345678”</w:t>
       </w:r>
     </w:p>
@@ -10087,7 +10635,20 @@
           <w:color w:val="000000" w:themeColor="text1"/>
         </w:rPr>
         <w:tab/>
-        <w:t>email: “teste@email.com”</w:t>
+      </w:r>
+      <w:proofErr w:type="spellStart"/>
+      <w:r>
+        <w:rPr>
+          <w:color w:val="000000" w:themeColor="text1"/>
+        </w:rPr>
+        <w:t>email</w:t>
+      </w:r>
+      <w:proofErr w:type="spellEnd"/>
+      <w:r>
+        <w:rPr>
+          <w:color w:val="000000" w:themeColor="text1"/>
+        </w:rPr>
+        <w:t>: “teste@email.com”</w:t>
       </w:r>
     </w:p>
     <w:p>
@@ -10163,12 +10724,14 @@
         </w:rPr>
         <w:t xml:space="preserve">Lançar exceção </w:t>
       </w:r>
+      <w:proofErr w:type="spellStart"/>
       <w:r>
         <w:rPr>
           <w:color w:val="000000" w:themeColor="text1"/>
         </w:rPr>
         <w:t>EntityAlreadyExisting</w:t>
       </w:r>
+      <w:proofErr w:type="spellEnd"/>
       <w:r>
         <w:rPr>
           <w:color w:val="000000" w:themeColor="text1"/>
@@ -10242,12 +10805,8 @@
       </w:pPr>
       <w:bookmarkStart w:id="52" w:name="_1m74qn55enf9"/>
       <w:bookmarkEnd w:id="52"/>
-    </w:p>
-    <w:p>
-      <w:pPr>
-        <w:pStyle w:val="Ttulo2"/>
-      </w:pPr>
-      <w:r>
+      <w:r>
+        <w:lastRenderedPageBreak/>
         <w:t>6.2 Testes de Integração</w:t>
       </w:r>
       <w:bookmarkStart w:id="53" w:name="_dphyuw2e1f0q"/>
@@ -10285,7 +10844,13 @@
       <w:bookmarkStart w:id="55" w:name="_wt5wnsver5aw"/>
       <w:bookmarkEnd w:id="55"/>
       <w:r>
-        <w:t>6.2 Testes de Performance</w:t>
+        <w:t>6.</w:t>
+      </w:r>
+      <w:r>
+        <w:t>3</w:t>
+      </w:r>
+      <w:r>
+        <w:t xml:space="preserve"> Testes de Performance</w:t>
       </w:r>
       <w:bookmarkStart w:id="56" w:name="_l7gi8yc86vp0"/>
       <w:bookmarkEnd w:id="56"/>
@@ -10507,7 +11072,7 @@
 </file>
 
 <file path=word/endnotes.xml><?xml version="1.0" encoding="utf-8"?>
-<w:endnotes xmlns:wpc="http://schemas.microsoft.com/office/word/2010/wordprocessingCanvas" xmlns:cx="http://schemas.microsoft.com/office/drawing/2014/chartex" xmlns:cx1="http://schemas.microsoft.com/office/drawing/2015/9/8/chartex" xmlns:cx2="http://schemas.microsoft.com/office/drawing/2015/10/21/chartex" xmlns:cx3="http://schemas.microsoft.com/office/drawing/2016/5/9/chartex" xmlns:cx4="http://schemas.microsoft.com/office/drawing/2016/5/10/chartex" xmlns:cx5="http://schemas.microsoft.com/office/drawing/2016/5/11/chartex" xmlns:cx6="http://schemas.microsoft.com/office/drawing/2016/5/12/chartex" xmlns:cx7="http://schemas.microsoft.com/office/drawing/2016/5/13/chartex" xmlns:cx8="http://schemas.microsoft.com/office/drawing/2016/5/14/chartex" xmlns:mc="http://schemas.openxmlformats.org/markup-compatibility/2006" xmlns:aink="http://schemas.microsoft.com/office/drawing/2016/ink" xmlns:am3d="http://schemas.microsoft.com/office/drawing/2017/model3d" xmlns:o="urn:schemas-microsoft-com:office:office" xmlns:oel="http://schemas.microsoft.com/office/2019/extlst" xmlns:r="http://schemas.openxmlformats.org/officeDocument/2006/relationships" xmlns:m="http://schemas.openxmlformats.org/officeDocument/2006/math" xmlns:v="urn:schemas-microsoft-com:vml" xmlns:wp14="http://schemas.microsoft.com/office/word/2010/wordprocessingDrawing" xmlns:wp="http://schemas.openxmlformats.org/drawingml/2006/wordprocessingDrawing" xmlns:w10="urn:schemas-microsoft-com:office:word" xmlns:w="http://schemas.openxmlformats.org/wordprocessingml/2006/main" xmlns:w14="http://schemas.microsoft.com/office/word/2010/wordml" xmlns:w15="http://schemas.microsoft.com/office/word/2012/wordml" xmlns:w16cex="http://schemas.microsoft.com/office/word/2018/wordml/cex" xmlns:w16cid="http://schemas.microsoft.com/office/word/2016/wordml/cid" xmlns:w16="http://schemas.microsoft.com/office/word/2018/wordml" xmlns:w16du="http://schemas.microsoft.com/office/word/2023/wordml/word16du" xmlns:w16sdtdh="http://schemas.microsoft.com/office/word/2020/wordml/sdtdatahash" xmlns:w16se="http://schemas.microsoft.com/office/word/2015/wordml/symex" xmlns:wpg="http://schemas.microsoft.com/office/word/2010/wordprocessingGroup" xmlns:wpi="http://schemas.microsoft.com/office/word/2010/wordprocessingInk" xmlns:wne="http://schemas.microsoft.com/office/word/2006/wordml" xmlns:wps="http://schemas.microsoft.com/office/word/2010/wordprocessingShape" mc:Ignorable="w14 w15 w16se w16cid w16 w16cex w16sdtdh w16du wp14">
+<w:endnotes xmlns:wpc="http://schemas.microsoft.com/office/word/2010/wordprocessingCanvas" xmlns:cx="http://schemas.microsoft.com/office/drawing/2014/chartex" xmlns:cx1="http://schemas.microsoft.com/office/drawing/2015/9/8/chartex" xmlns:cx2="http://schemas.microsoft.com/office/drawing/2015/10/21/chartex" xmlns:cx3="http://schemas.microsoft.com/office/drawing/2016/5/9/chartex" xmlns:cx4="http://schemas.microsoft.com/office/drawing/2016/5/10/chartex" xmlns:cx5="http://schemas.microsoft.com/office/drawing/2016/5/11/chartex" xmlns:cx6="http://schemas.microsoft.com/office/drawing/2016/5/12/chartex" xmlns:cx7="http://schemas.microsoft.com/office/drawing/2016/5/13/chartex" xmlns:cx8="http://schemas.microsoft.com/office/drawing/2016/5/14/chartex" xmlns:mc="http://schemas.openxmlformats.org/markup-compatibility/2006" xmlns:aink="http://schemas.microsoft.com/office/drawing/2016/ink" xmlns:am3d="http://schemas.microsoft.com/office/drawing/2017/model3d" xmlns:o="urn:schemas-microsoft-com:office:office" xmlns:oel="http://schemas.microsoft.com/office/2019/extlst" xmlns:r="http://schemas.openxmlformats.org/officeDocument/2006/relationships" xmlns:m="http://schemas.openxmlformats.org/officeDocument/2006/math" xmlns:v="urn:schemas-microsoft-com:vml" xmlns:wp14="http://schemas.microsoft.com/office/word/2010/wordprocessingDrawing" xmlns:wp="http://schemas.openxmlformats.org/drawingml/2006/wordprocessingDrawing" xmlns:w10="urn:schemas-microsoft-com:office:word" xmlns:w="http://schemas.openxmlformats.org/wordprocessingml/2006/main" xmlns:w14="http://schemas.microsoft.com/office/word/2010/wordml" xmlns:w15="http://schemas.microsoft.com/office/word/2012/wordml" xmlns:w16cex="http://schemas.microsoft.com/office/word/2018/wordml/cex" xmlns:w16cid="http://schemas.microsoft.com/office/word/2016/wordml/cid" xmlns:w16="http://schemas.microsoft.com/office/word/2018/wordml" xmlns:w16du="http://schemas.microsoft.com/office/word/2023/wordml/word16du" xmlns:w16sdtdh="http://schemas.microsoft.com/office/word/2020/wordml/sdtdatahash" xmlns:w16sdtfl="http://schemas.microsoft.com/office/word/2024/wordml/sdtformatlock" xmlns:w16se="http://schemas.microsoft.com/office/word/2015/wordml/symex" xmlns:wpg="http://schemas.microsoft.com/office/word/2010/wordprocessingGroup" xmlns:wpi="http://schemas.microsoft.com/office/word/2010/wordprocessingInk" xmlns:wne="http://schemas.microsoft.com/office/word/2006/wordml" xmlns:wps="http://schemas.microsoft.com/office/word/2010/wordprocessingShape" mc:Ignorable="w14 w15 w16se w16cid w16 w16cex w16sdtdh w16sdtfl w16du wp14">
   <w:endnote w:type="separator" w:id="-1">
     <w:p>
       <w:pPr>
@@ -10532,7 +11097,7 @@
 </file>
 
 <file path=word/footer1.xml><?xml version="1.0" encoding="utf-8"?>
-<w:ftr xmlns:wpc="http://schemas.microsoft.com/office/word/2010/wordprocessingCanvas" xmlns:cx="http://schemas.microsoft.com/office/drawing/2014/chartex" xmlns:cx1="http://schemas.microsoft.com/office/drawing/2015/9/8/chartex" xmlns:cx2="http://schemas.microsoft.com/office/drawing/2015/10/21/chartex" xmlns:cx3="http://schemas.microsoft.com/office/drawing/2016/5/9/chartex" xmlns:cx4="http://schemas.microsoft.com/office/drawing/2016/5/10/chartex" xmlns:cx5="http://schemas.microsoft.com/office/drawing/2016/5/11/chartex" xmlns:cx6="http://schemas.microsoft.com/office/drawing/2016/5/12/chartex" xmlns:cx7="http://schemas.microsoft.com/office/drawing/2016/5/13/chartex" xmlns:cx8="http://schemas.microsoft.com/office/drawing/2016/5/14/chartex" xmlns:mc="http://schemas.openxmlformats.org/markup-compatibility/2006" xmlns:aink="http://schemas.microsoft.com/office/drawing/2016/ink" xmlns:am3d="http://schemas.microsoft.com/office/drawing/2017/model3d" xmlns:o="urn:schemas-microsoft-com:office:office" xmlns:oel="http://schemas.microsoft.com/office/2019/extlst" xmlns:r="http://schemas.openxmlformats.org/officeDocument/2006/relationships" xmlns:m="http://schemas.openxmlformats.org/officeDocument/2006/math" xmlns:v="urn:schemas-microsoft-com:vml" xmlns:wp14="http://schemas.microsoft.com/office/word/2010/wordprocessingDrawing" xmlns:wp="http://schemas.openxmlformats.org/drawingml/2006/wordprocessingDrawing" xmlns:w10="urn:schemas-microsoft-com:office:word" xmlns:w="http://schemas.openxmlformats.org/wordprocessingml/2006/main" xmlns:w14="http://schemas.microsoft.com/office/word/2010/wordml" xmlns:w15="http://schemas.microsoft.com/office/word/2012/wordml" xmlns:w16cex="http://schemas.microsoft.com/office/word/2018/wordml/cex" xmlns:w16cid="http://schemas.microsoft.com/office/word/2016/wordml/cid" xmlns:w16="http://schemas.microsoft.com/office/word/2018/wordml" xmlns:w16du="http://schemas.microsoft.com/office/word/2023/wordml/word16du" xmlns:w16sdtdh="http://schemas.microsoft.com/office/word/2020/wordml/sdtdatahash" xmlns:w16se="http://schemas.microsoft.com/office/word/2015/wordml/symex" xmlns:wpg="http://schemas.microsoft.com/office/word/2010/wordprocessingGroup" xmlns:wpi="http://schemas.microsoft.com/office/word/2010/wordprocessingInk" xmlns:wne="http://schemas.microsoft.com/office/word/2006/wordml" xmlns:wps="http://schemas.microsoft.com/office/word/2010/wordprocessingShape" mc:Ignorable="w14 w15 w16se w16cid w16 w16cex w16sdtdh w16du wp14">
+<w:ftr xmlns:wpc="http://schemas.microsoft.com/office/word/2010/wordprocessingCanvas" xmlns:cx="http://schemas.microsoft.com/office/drawing/2014/chartex" xmlns:cx1="http://schemas.microsoft.com/office/drawing/2015/9/8/chartex" xmlns:cx2="http://schemas.microsoft.com/office/drawing/2015/10/21/chartex" xmlns:cx3="http://schemas.microsoft.com/office/drawing/2016/5/9/chartex" xmlns:cx4="http://schemas.microsoft.com/office/drawing/2016/5/10/chartex" xmlns:cx5="http://schemas.microsoft.com/office/drawing/2016/5/11/chartex" xmlns:cx6="http://schemas.microsoft.com/office/drawing/2016/5/12/chartex" xmlns:cx7="http://schemas.microsoft.com/office/drawing/2016/5/13/chartex" xmlns:cx8="http://schemas.microsoft.com/office/drawing/2016/5/14/chartex" xmlns:mc="http://schemas.openxmlformats.org/markup-compatibility/2006" xmlns:aink="http://schemas.microsoft.com/office/drawing/2016/ink" xmlns:am3d="http://schemas.microsoft.com/office/drawing/2017/model3d" xmlns:o="urn:schemas-microsoft-com:office:office" xmlns:oel="http://schemas.microsoft.com/office/2019/extlst" xmlns:r="http://schemas.openxmlformats.org/officeDocument/2006/relationships" xmlns:m="http://schemas.openxmlformats.org/officeDocument/2006/math" xmlns:v="urn:schemas-microsoft-com:vml" xmlns:wp14="http://schemas.microsoft.com/office/word/2010/wordprocessingDrawing" xmlns:wp="http://schemas.openxmlformats.org/drawingml/2006/wordprocessingDrawing" xmlns:w10="urn:schemas-microsoft-com:office:word" xmlns:w="http://schemas.openxmlformats.org/wordprocessingml/2006/main" xmlns:w14="http://schemas.microsoft.com/office/word/2010/wordml" xmlns:w15="http://schemas.microsoft.com/office/word/2012/wordml" xmlns:w16cex="http://schemas.microsoft.com/office/word/2018/wordml/cex" xmlns:w16cid="http://schemas.microsoft.com/office/word/2016/wordml/cid" xmlns:w16="http://schemas.microsoft.com/office/word/2018/wordml" xmlns:w16du="http://schemas.microsoft.com/office/word/2023/wordml/word16du" xmlns:w16sdtdh="http://schemas.microsoft.com/office/word/2020/wordml/sdtdatahash" xmlns:w16sdtfl="http://schemas.microsoft.com/office/word/2024/wordml/sdtformatlock" xmlns:w16se="http://schemas.microsoft.com/office/word/2015/wordml/symex" xmlns:wpg="http://schemas.microsoft.com/office/word/2010/wordprocessingGroup" xmlns:wpi="http://schemas.microsoft.com/office/word/2010/wordprocessingInk" xmlns:wne="http://schemas.microsoft.com/office/word/2006/wordml" xmlns:wps="http://schemas.microsoft.com/office/word/2010/wordprocessingShape" mc:Ignorable="w14 w15 w16se w16cid w16 w16cex w16sdtdh w16sdtfl w16du wp14">
   <w:p>
     <w:pPr>
       <w:jc w:val="right"/>
@@ -10560,7 +11125,7 @@
 </file>
 
 <file path=word/footnotes.xml><?xml version="1.0" encoding="utf-8"?>
-<w:footnotes xmlns:wpc="http://schemas.microsoft.com/office/word/2010/wordprocessingCanvas" xmlns:cx="http://schemas.microsoft.com/office/drawing/2014/chartex" xmlns:cx1="http://schemas.microsoft.com/office/drawing/2015/9/8/chartex" xmlns:cx2="http://schemas.microsoft.com/office/drawing/2015/10/21/chartex" xmlns:cx3="http://schemas.microsoft.com/office/drawing/2016/5/9/chartex" xmlns:cx4="http://schemas.microsoft.com/office/drawing/2016/5/10/chartex" xmlns:cx5="http://schemas.microsoft.com/office/drawing/2016/5/11/chartex" xmlns:cx6="http://schemas.microsoft.com/office/drawing/2016/5/12/chartex" xmlns:cx7="http://schemas.microsoft.com/office/drawing/2016/5/13/chartex" xmlns:cx8="http://schemas.microsoft.com/office/drawing/2016/5/14/chartex" xmlns:mc="http://schemas.openxmlformats.org/markup-compatibility/2006" xmlns:aink="http://schemas.microsoft.com/office/drawing/2016/ink" xmlns:am3d="http://schemas.microsoft.com/office/drawing/2017/model3d" xmlns:o="urn:schemas-microsoft-com:office:office" xmlns:oel="http://schemas.microsoft.com/office/2019/extlst" xmlns:r="http://schemas.openxmlformats.org/officeDocument/2006/relationships" xmlns:m="http://schemas.openxmlformats.org/officeDocument/2006/math" xmlns:v="urn:schemas-microsoft-com:vml" xmlns:wp14="http://schemas.microsoft.com/office/word/2010/wordprocessingDrawing" xmlns:wp="http://schemas.openxmlformats.org/drawingml/2006/wordprocessingDrawing" xmlns:w10="urn:schemas-microsoft-com:office:word" xmlns:w="http://schemas.openxmlformats.org/wordprocessingml/2006/main" xmlns:w14="http://schemas.microsoft.com/office/word/2010/wordml" xmlns:w15="http://schemas.microsoft.com/office/word/2012/wordml" xmlns:w16cex="http://schemas.microsoft.com/office/word/2018/wordml/cex" xmlns:w16cid="http://schemas.microsoft.com/office/word/2016/wordml/cid" xmlns:w16="http://schemas.microsoft.com/office/word/2018/wordml" xmlns:w16du="http://schemas.microsoft.com/office/word/2023/wordml/word16du" xmlns:w16sdtdh="http://schemas.microsoft.com/office/word/2020/wordml/sdtdatahash" xmlns:w16se="http://schemas.microsoft.com/office/word/2015/wordml/symex" xmlns:wpg="http://schemas.microsoft.com/office/word/2010/wordprocessingGroup" xmlns:wpi="http://schemas.microsoft.com/office/word/2010/wordprocessingInk" xmlns:wne="http://schemas.microsoft.com/office/word/2006/wordml" xmlns:wps="http://schemas.microsoft.com/office/word/2010/wordprocessingShape" mc:Ignorable="w14 w15 w16se w16cid w16 w16cex w16sdtdh w16du wp14">
+<w:footnotes xmlns:wpc="http://schemas.microsoft.com/office/word/2010/wordprocessingCanvas" xmlns:cx="http://schemas.microsoft.com/office/drawing/2014/chartex" xmlns:cx1="http://schemas.microsoft.com/office/drawing/2015/9/8/chartex" xmlns:cx2="http://schemas.microsoft.com/office/drawing/2015/10/21/chartex" xmlns:cx3="http://schemas.microsoft.com/office/drawing/2016/5/9/chartex" xmlns:cx4="http://schemas.microsoft.com/office/drawing/2016/5/10/chartex" xmlns:cx5="http://schemas.microsoft.com/office/drawing/2016/5/11/chartex" xmlns:cx6="http://schemas.microsoft.com/office/drawing/2016/5/12/chartex" xmlns:cx7="http://schemas.microsoft.com/office/drawing/2016/5/13/chartex" xmlns:cx8="http://schemas.microsoft.com/office/drawing/2016/5/14/chartex" xmlns:mc="http://schemas.openxmlformats.org/markup-compatibility/2006" xmlns:aink="http://schemas.microsoft.com/office/drawing/2016/ink" xmlns:am3d="http://schemas.microsoft.com/office/drawing/2017/model3d" xmlns:o="urn:schemas-microsoft-com:office:office" xmlns:oel="http://schemas.microsoft.com/office/2019/extlst" xmlns:r="http://schemas.openxmlformats.org/officeDocument/2006/relationships" xmlns:m="http://schemas.openxmlformats.org/officeDocument/2006/math" xmlns:v="urn:schemas-microsoft-com:vml" xmlns:wp14="http://schemas.microsoft.com/office/word/2010/wordprocessingDrawing" xmlns:wp="http://schemas.openxmlformats.org/drawingml/2006/wordprocessingDrawing" xmlns:w10="urn:schemas-microsoft-com:office:word" xmlns:w="http://schemas.openxmlformats.org/wordprocessingml/2006/main" xmlns:w14="http://schemas.microsoft.com/office/word/2010/wordml" xmlns:w15="http://schemas.microsoft.com/office/word/2012/wordml" xmlns:w16cex="http://schemas.microsoft.com/office/word/2018/wordml/cex" xmlns:w16cid="http://schemas.microsoft.com/office/word/2016/wordml/cid" xmlns:w16="http://schemas.microsoft.com/office/word/2018/wordml" xmlns:w16du="http://schemas.microsoft.com/office/word/2023/wordml/word16du" xmlns:w16sdtdh="http://schemas.microsoft.com/office/word/2020/wordml/sdtdatahash" xmlns:w16sdtfl="http://schemas.microsoft.com/office/word/2024/wordml/sdtformatlock" xmlns:w16se="http://schemas.microsoft.com/office/word/2015/wordml/symex" xmlns:wpg="http://schemas.microsoft.com/office/word/2010/wordprocessingGroup" xmlns:wpi="http://schemas.microsoft.com/office/word/2010/wordprocessingInk" xmlns:wne="http://schemas.microsoft.com/office/word/2006/wordml" xmlns:wps="http://schemas.microsoft.com/office/word/2010/wordprocessingShape" mc:Ignorable="w14 w15 w16se w16cid w16 w16cex w16sdtdh w16sdtfl w16du wp14">
   <w:footnote w:type="separator" w:id="-1">
     <w:p>
       <w:pPr>
@@ -10585,7 +11150,7 @@
 </file>
 
 <file path=word/header1.xml><?xml version="1.0" encoding="utf-8"?>
-<w:hdr xmlns:wpc="http://schemas.microsoft.com/office/word/2010/wordprocessingCanvas" xmlns:cx="http://schemas.microsoft.com/office/drawing/2014/chartex" xmlns:cx1="http://schemas.microsoft.com/office/drawing/2015/9/8/chartex" xmlns:cx2="http://schemas.microsoft.com/office/drawing/2015/10/21/chartex" xmlns:cx3="http://schemas.microsoft.com/office/drawing/2016/5/9/chartex" xmlns:cx4="http://schemas.microsoft.com/office/drawing/2016/5/10/chartex" xmlns:cx5="http://schemas.microsoft.com/office/drawing/2016/5/11/chartex" xmlns:cx6="http://schemas.microsoft.com/office/drawing/2016/5/12/chartex" xmlns:cx7="http://schemas.microsoft.com/office/drawing/2016/5/13/chartex" xmlns:cx8="http://schemas.microsoft.com/office/drawing/2016/5/14/chartex" xmlns:mc="http://schemas.openxmlformats.org/markup-compatibility/2006" xmlns:aink="http://schemas.microsoft.com/office/drawing/2016/ink" xmlns:am3d="http://schemas.microsoft.com/office/drawing/2017/model3d" xmlns:o="urn:schemas-microsoft-com:office:office" xmlns:oel="http://schemas.microsoft.com/office/2019/extlst" xmlns:r="http://schemas.openxmlformats.org/officeDocument/2006/relationships" xmlns:m="http://schemas.openxmlformats.org/officeDocument/2006/math" xmlns:v="urn:schemas-microsoft-com:vml" xmlns:wp14="http://schemas.microsoft.com/office/word/2010/wordprocessingDrawing" xmlns:wp="http://schemas.openxmlformats.org/drawingml/2006/wordprocessingDrawing" xmlns:w10="urn:schemas-microsoft-com:office:word" xmlns:w="http://schemas.openxmlformats.org/wordprocessingml/2006/main" xmlns:w14="http://schemas.microsoft.com/office/word/2010/wordml" xmlns:w15="http://schemas.microsoft.com/office/word/2012/wordml" xmlns:w16cex="http://schemas.microsoft.com/office/word/2018/wordml/cex" xmlns:w16cid="http://schemas.microsoft.com/office/word/2016/wordml/cid" xmlns:w16="http://schemas.microsoft.com/office/word/2018/wordml" xmlns:w16du="http://schemas.microsoft.com/office/word/2023/wordml/word16du" xmlns:w16sdtdh="http://schemas.microsoft.com/office/word/2020/wordml/sdtdatahash" xmlns:w16se="http://schemas.microsoft.com/office/word/2015/wordml/symex" xmlns:wpg="http://schemas.microsoft.com/office/word/2010/wordprocessingGroup" xmlns:wpi="http://schemas.microsoft.com/office/word/2010/wordprocessingInk" xmlns:wne="http://schemas.microsoft.com/office/word/2006/wordml" xmlns:wps="http://schemas.microsoft.com/office/word/2010/wordprocessingShape" mc:Ignorable="w14 w15 w16se w16cid w16 w16cex w16sdtdh w16du wp14">
+<w:hdr xmlns:wpc="http://schemas.microsoft.com/office/word/2010/wordprocessingCanvas" xmlns:cx="http://schemas.microsoft.com/office/drawing/2014/chartex" xmlns:cx1="http://schemas.microsoft.com/office/drawing/2015/9/8/chartex" xmlns:cx2="http://schemas.microsoft.com/office/drawing/2015/10/21/chartex" xmlns:cx3="http://schemas.microsoft.com/office/drawing/2016/5/9/chartex" xmlns:cx4="http://schemas.microsoft.com/office/drawing/2016/5/10/chartex" xmlns:cx5="http://schemas.microsoft.com/office/drawing/2016/5/11/chartex" xmlns:cx6="http://schemas.microsoft.com/office/drawing/2016/5/12/chartex" xmlns:cx7="http://schemas.microsoft.com/office/drawing/2016/5/13/chartex" xmlns:cx8="http://schemas.microsoft.com/office/drawing/2016/5/14/chartex" xmlns:mc="http://schemas.openxmlformats.org/markup-compatibility/2006" xmlns:aink="http://schemas.microsoft.com/office/drawing/2016/ink" xmlns:am3d="http://schemas.microsoft.com/office/drawing/2017/model3d" xmlns:o="urn:schemas-microsoft-com:office:office" xmlns:oel="http://schemas.microsoft.com/office/2019/extlst" xmlns:r="http://schemas.openxmlformats.org/officeDocument/2006/relationships" xmlns:m="http://schemas.openxmlformats.org/officeDocument/2006/math" xmlns:v="urn:schemas-microsoft-com:vml" xmlns:wp14="http://schemas.microsoft.com/office/word/2010/wordprocessingDrawing" xmlns:wp="http://schemas.openxmlformats.org/drawingml/2006/wordprocessingDrawing" xmlns:w10="urn:schemas-microsoft-com:office:word" xmlns:w="http://schemas.openxmlformats.org/wordprocessingml/2006/main" xmlns:w14="http://schemas.microsoft.com/office/word/2010/wordml" xmlns:w15="http://schemas.microsoft.com/office/word/2012/wordml" xmlns:w16cex="http://schemas.microsoft.com/office/word/2018/wordml/cex" xmlns:w16cid="http://schemas.microsoft.com/office/word/2016/wordml/cid" xmlns:w16="http://schemas.microsoft.com/office/word/2018/wordml" xmlns:w16du="http://schemas.microsoft.com/office/word/2023/wordml/word16du" xmlns:w16sdtdh="http://schemas.microsoft.com/office/word/2020/wordml/sdtdatahash" xmlns:w16sdtfl="http://schemas.microsoft.com/office/word/2024/wordml/sdtformatlock" xmlns:w16se="http://schemas.microsoft.com/office/word/2015/wordml/symex" xmlns:wpg="http://schemas.microsoft.com/office/word/2010/wordprocessingGroup" xmlns:wpi="http://schemas.microsoft.com/office/word/2010/wordprocessingInk" xmlns:wne="http://schemas.microsoft.com/office/word/2006/wordml" xmlns:wps="http://schemas.microsoft.com/office/word/2010/wordprocessingShape" mc:Ignorable="w14 w15 w16se w16cid w16 w16cex w16sdtdh w16sdtfl w16du wp14">
   <w:p>
     <w:pPr>
       <w:jc w:val="left"/>
@@ -10702,7 +11267,7 @@
 </file>
 
 <file path=word/numbering.xml><?xml version="1.0" encoding="utf-8"?>
-<w:numbering xmlns:wpc="http://schemas.microsoft.com/office/word/2010/wordprocessingCanvas" xmlns:cx="http://schemas.microsoft.com/office/drawing/2014/chartex" xmlns:cx1="http://schemas.microsoft.com/office/drawing/2015/9/8/chartex" xmlns:cx2="http://schemas.microsoft.com/office/drawing/2015/10/21/chartex" xmlns:cx3="http://schemas.microsoft.com/office/drawing/2016/5/9/chartex" xmlns:cx4="http://schemas.microsoft.com/office/drawing/2016/5/10/chartex" xmlns:cx5="http://schemas.microsoft.com/office/drawing/2016/5/11/chartex" xmlns:cx6="http://schemas.microsoft.com/office/drawing/2016/5/12/chartex" xmlns:cx7="http://schemas.microsoft.com/office/drawing/2016/5/13/chartex" xmlns:cx8="http://schemas.microsoft.com/office/drawing/2016/5/14/chartex" xmlns:mc="http://schemas.openxmlformats.org/markup-compatibility/2006" xmlns:aink="http://schemas.microsoft.com/office/drawing/2016/ink" xmlns:am3d="http://schemas.microsoft.com/office/drawing/2017/model3d" xmlns:o="urn:schemas-microsoft-com:office:office" xmlns:oel="http://schemas.microsoft.com/office/2019/extlst" xmlns:r="http://schemas.openxmlformats.org/officeDocument/2006/relationships" xmlns:m="http://schemas.openxmlformats.org/officeDocument/2006/math" xmlns:v="urn:schemas-microsoft-com:vml" xmlns:wp14="http://schemas.microsoft.com/office/word/2010/wordprocessingDrawing" xmlns:wp="http://schemas.openxmlformats.org/drawingml/2006/wordprocessingDrawing" xmlns:w10="urn:schemas-microsoft-com:office:word" xmlns:w="http://schemas.openxmlformats.org/wordprocessingml/2006/main" xmlns:w14="http://schemas.microsoft.com/office/word/2010/wordml" xmlns:w15="http://schemas.microsoft.com/office/word/2012/wordml" xmlns:w16cex="http://schemas.microsoft.com/office/word/2018/wordml/cex" xmlns:w16cid="http://schemas.microsoft.com/office/word/2016/wordml/cid" xmlns:w16="http://schemas.microsoft.com/office/word/2018/wordml" xmlns:w16du="http://schemas.microsoft.com/office/word/2023/wordml/word16du" xmlns:w16sdtdh="http://schemas.microsoft.com/office/word/2020/wordml/sdtdatahash" xmlns:w16se="http://schemas.microsoft.com/office/word/2015/wordml/symex" xmlns:wpg="http://schemas.microsoft.com/office/word/2010/wordprocessingGroup" xmlns:wpi="http://schemas.microsoft.com/office/word/2010/wordprocessingInk" xmlns:wne="http://schemas.microsoft.com/office/word/2006/wordml" xmlns:wps="http://schemas.microsoft.com/office/word/2010/wordprocessingShape" mc:Ignorable="w14 w15 w16se w16cid w16 w16cex w16sdtdh w16du wp14">
+<w:numbering xmlns:wpc="http://schemas.microsoft.com/office/word/2010/wordprocessingCanvas" xmlns:cx="http://schemas.microsoft.com/office/drawing/2014/chartex" xmlns:cx1="http://schemas.microsoft.com/office/drawing/2015/9/8/chartex" xmlns:cx2="http://schemas.microsoft.com/office/drawing/2015/10/21/chartex" xmlns:cx3="http://schemas.microsoft.com/office/drawing/2016/5/9/chartex" xmlns:cx4="http://schemas.microsoft.com/office/drawing/2016/5/10/chartex" xmlns:cx5="http://schemas.microsoft.com/office/drawing/2016/5/11/chartex" xmlns:cx6="http://schemas.microsoft.com/office/drawing/2016/5/12/chartex" xmlns:cx7="http://schemas.microsoft.com/office/drawing/2016/5/13/chartex" xmlns:cx8="http://schemas.microsoft.com/office/drawing/2016/5/14/chartex" xmlns:mc="http://schemas.openxmlformats.org/markup-compatibility/2006" xmlns:aink="http://schemas.microsoft.com/office/drawing/2016/ink" xmlns:am3d="http://schemas.microsoft.com/office/drawing/2017/model3d" xmlns:o="urn:schemas-microsoft-com:office:office" xmlns:oel="http://schemas.microsoft.com/office/2019/extlst" xmlns:r="http://schemas.openxmlformats.org/officeDocument/2006/relationships" xmlns:m="http://schemas.openxmlformats.org/officeDocument/2006/math" xmlns:v="urn:schemas-microsoft-com:vml" xmlns:wp14="http://schemas.microsoft.com/office/word/2010/wordprocessingDrawing" xmlns:wp="http://schemas.openxmlformats.org/drawingml/2006/wordprocessingDrawing" xmlns:w10="urn:schemas-microsoft-com:office:word" xmlns:w="http://schemas.openxmlformats.org/wordprocessingml/2006/main" xmlns:w14="http://schemas.microsoft.com/office/word/2010/wordml" xmlns:w15="http://schemas.microsoft.com/office/word/2012/wordml" xmlns:w16cex="http://schemas.microsoft.com/office/word/2018/wordml/cex" xmlns:w16cid="http://schemas.microsoft.com/office/word/2016/wordml/cid" xmlns:w16="http://schemas.microsoft.com/office/word/2018/wordml" xmlns:w16du="http://schemas.microsoft.com/office/word/2023/wordml/word16du" xmlns:w16sdtdh="http://schemas.microsoft.com/office/word/2020/wordml/sdtdatahash" xmlns:w16sdtfl="http://schemas.microsoft.com/office/word/2024/wordml/sdtformatlock" xmlns:w16se="http://schemas.microsoft.com/office/word/2015/wordml/symex" xmlns:wpg="http://schemas.microsoft.com/office/word/2010/wordprocessingGroup" xmlns:wpi="http://schemas.microsoft.com/office/word/2010/wordprocessingInk" xmlns:wne="http://schemas.microsoft.com/office/word/2006/wordml" xmlns:wps="http://schemas.microsoft.com/office/word/2010/wordprocessingShape" mc:Ignorable="w14 w15 w16se w16cid w16 w16cex w16sdtdh w16sdtfl w16du wp14">
   <w:abstractNum w:abstractNumId="0" w15:restartNumberingAfterBreak="0">
     <w:nsid w:val="01677822"/>
     <w:multiLevelType w:val="multilevel"/>
@@ -11866,6 +12431,119 @@
     </w:lvl>
   </w:abstractNum>
   <w:abstractNum w:abstractNumId="11" w15:restartNumberingAfterBreak="0">
+    <w:nsid w:val="35D208BE"/>
+    <w:multiLevelType w:val="hybridMultilevel"/>
+    <w:tmpl w:val="FEB2915A"/>
+    <w:lvl w:ilvl="0" w:tplc="04160001">
+      <w:start w:val="1"/>
+      <w:numFmt w:val="bullet"/>
+      <w:lvlText w:val=""/>
+      <w:lvlJc w:val="left"/>
+      <w:pPr>
+        <w:ind w:left="1570" w:hanging="360"/>
+      </w:pPr>
+      <w:rPr>
+        <w:rFonts w:ascii="Symbol" w:hAnsi="Symbol" w:hint="default"/>
+      </w:rPr>
+    </w:lvl>
+    <w:lvl w:ilvl="1" w:tplc="04160003" w:tentative="1">
+      <w:start w:val="1"/>
+      <w:numFmt w:val="bullet"/>
+      <w:lvlText w:val="o"/>
+      <w:lvlJc w:val="left"/>
+      <w:pPr>
+        <w:ind w:left="2290" w:hanging="360"/>
+      </w:pPr>
+      <w:rPr>
+        <w:rFonts w:ascii="Courier New" w:hAnsi="Courier New" w:cs="Courier New" w:hint="default"/>
+      </w:rPr>
+    </w:lvl>
+    <w:lvl w:ilvl="2" w:tplc="04160005" w:tentative="1">
+      <w:start w:val="1"/>
+      <w:numFmt w:val="bullet"/>
+      <w:lvlText w:val=""/>
+      <w:lvlJc w:val="left"/>
+      <w:pPr>
+        <w:ind w:left="3010" w:hanging="360"/>
+      </w:pPr>
+      <w:rPr>
+        <w:rFonts w:ascii="Wingdings" w:hAnsi="Wingdings" w:hint="default"/>
+      </w:rPr>
+    </w:lvl>
+    <w:lvl w:ilvl="3" w:tplc="04160001" w:tentative="1">
+      <w:start w:val="1"/>
+      <w:numFmt w:val="bullet"/>
+      <w:lvlText w:val=""/>
+      <w:lvlJc w:val="left"/>
+      <w:pPr>
+        <w:ind w:left="3730" w:hanging="360"/>
+      </w:pPr>
+      <w:rPr>
+        <w:rFonts w:ascii="Symbol" w:hAnsi="Symbol" w:hint="default"/>
+      </w:rPr>
+    </w:lvl>
+    <w:lvl w:ilvl="4" w:tplc="04160003" w:tentative="1">
+      <w:start w:val="1"/>
+      <w:numFmt w:val="bullet"/>
+      <w:lvlText w:val="o"/>
+      <w:lvlJc w:val="left"/>
+      <w:pPr>
+        <w:ind w:left="4450" w:hanging="360"/>
+      </w:pPr>
+      <w:rPr>
+        <w:rFonts w:ascii="Courier New" w:hAnsi="Courier New" w:cs="Courier New" w:hint="default"/>
+      </w:rPr>
+    </w:lvl>
+    <w:lvl w:ilvl="5" w:tplc="04160005" w:tentative="1">
+      <w:start w:val="1"/>
+      <w:numFmt w:val="bullet"/>
+      <w:lvlText w:val=""/>
+      <w:lvlJc w:val="left"/>
+      <w:pPr>
+        <w:ind w:left="5170" w:hanging="360"/>
+      </w:pPr>
+      <w:rPr>
+        <w:rFonts w:ascii="Wingdings" w:hAnsi="Wingdings" w:hint="default"/>
+      </w:rPr>
+    </w:lvl>
+    <w:lvl w:ilvl="6" w:tplc="04160001" w:tentative="1">
+      <w:start w:val="1"/>
+      <w:numFmt w:val="bullet"/>
+      <w:lvlText w:val=""/>
+      <w:lvlJc w:val="left"/>
+      <w:pPr>
+        <w:ind w:left="5890" w:hanging="360"/>
+      </w:pPr>
+      <w:rPr>
+        <w:rFonts w:ascii="Symbol" w:hAnsi="Symbol" w:hint="default"/>
+      </w:rPr>
+    </w:lvl>
+    <w:lvl w:ilvl="7" w:tplc="04160003" w:tentative="1">
+      <w:start w:val="1"/>
+      <w:numFmt w:val="bullet"/>
+      <w:lvlText w:val="o"/>
+      <w:lvlJc w:val="left"/>
+      <w:pPr>
+        <w:ind w:left="6610" w:hanging="360"/>
+      </w:pPr>
+      <w:rPr>
+        <w:rFonts w:ascii="Courier New" w:hAnsi="Courier New" w:cs="Courier New" w:hint="default"/>
+      </w:rPr>
+    </w:lvl>
+    <w:lvl w:ilvl="8" w:tplc="04160005" w:tentative="1">
+      <w:start w:val="1"/>
+      <w:numFmt w:val="bullet"/>
+      <w:lvlText w:val=""/>
+      <w:lvlJc w:val="left"/>
+      <w:pPr>
+        <w:ind w:left="7330" w:hanging="360"/>
+      </w:pPr>
+      <w:rPr>
+        <w:rFonts w:ascii="Wingdings" w:hAnsi="Wingdings" w:hint="default"/>
+      </w:rPr>
+    </w:lvl>
+  </w:abstractNum>
+  <w:abstractNum w:abstractNumId="12" w15:restartNumberingAfterBreak="0">
     <w:nsid w:val="3AE82604"/>
     <w:multiLevelType w:val="multilevel"/>
     <w:tmpl w:val="5EC8825C"/>
@@ -11978,7 +12656,7 @@
       </w:rPr>
     </w:lvl>
   </w:abstractNum>
-  <w:abstractNum w:abstractNumId="12" w15:restartNumberingAfterBreak="0">
+  <w:abstractNum w:abstractNumId="13" w15:restartNumberingAfterBreak="0">
     <w:nsid w:val="425F7142"/>
     <w:multiLevelType w:val="multilevel"/>
     <w:tmpl w:val="6C3A65C8"/>
@@ -12091,7 +12769,7 @@
       </w:rPr>
     </w:lvl>
   </w:abstractNum>
-  <w:abstractNum w:abstractNumId="13" w15:restartNumberingAfterBreak="0">
+  <w:abstractNum w:abstractNumId="14" w15:restartNumberingAfterBreak="0">
     <w:nsid w:val="433872DF"/>
     <w:multiLevelType w:val="multilevel"/>
     <w:tmpl w:val="473E9B32"/>
@@ -12204,7 +12882,7 @@
       </w:rPr>
     </w:lvl>
   </w:abstractNum>
-  <w:abstractNum w:abstractNumId="14" w15:restartNumberingAfterBreak="0">
+  <w:abstractNum w:abstractNumId="15" w15:restartNumberingAfterBreak="0">
     <w:nsid w:val="4ABF56A0"/>
     <w:multiLevelType w:val="multilevel"/>
     <w:tmpl w:val="0D8E790A"/>
@@ -12290,7 +12968,120 @@
       </w:pPr>
     </w:lvl>
   </w:abstractNum>
-  <w:abstractNum w:abstractNumId="15" w15:restartNumberingAfterBreak="0">
+  <w:abstractNum w:abstractNumId="16" w15:restartNumberingAfterBreak="0">
+    <w:nsid w:val="4C99572E"/>
+    <w:multiLevelType w:val="hybridMultilevel"/>
+    <w:tmpl w:val="81062254"/>
+    <w:lvl w:ilvl="0" w:tplc="04160001">
+      <w:start w:val="1"/>
+      <w:numFmt w:val="bullet"/>
+      <w:lvlText w:val=""/>
+      <w:lvlJc w:val="left"/>
+      <w:pPr>
+        <w:ind w:left="1570" w:hanging="360"/>
+      </w:pPr>
+      <w:rPr>
+        <w:rFonts w:ascii="Symbol" w:hAnsi="Symbol" w:hint="default"/>
+      </w:rPr>
+    </w:lvl>
+    <w:lvl w:ilvl="1" w:tplc="04160003" w:tentative="1">
+      <w:start w:val="1"/>
+      <w:numFmt w:val="bullet"/>
+      <w:lvlText w:val="o"/>
+      <w:lvlJc w:val="left"/>
+      <w:pPr>
+        <w:ind w:left="2290" w:hanging="360"/>
+      </w:pPr>
+      <w:rPr>
+        <w:rFonts w:ascii="Courier New" w:hAnsi="Courier New" w:cs="Courier New" w:hint="default"/>
+      </w:rPr>
+    </w:lvl>
+    <w:lvl w:ilvl="2" w:tplc="04160005" w:tentative="1">
+      <w:start w:val="1"/>
+      <w:numFmt w:val="bullet"/>
+      <w:lvlText w:val=""/>
+      <w:lvlJc w:val="left"/>
+      <w:pPr>
+        <w:ind w:left="3010" w:hanging="360"/>
+      </w:pPr>
+      <w:rPr>
+        <w:rFonts w:ascii="Wingdings" w:hAnsi="Wingdings" w:hint="default"/>
+      </w:rPr>
+    </w:lvl>
+    <w:lvl w:ilvl="3" w:tplc="04160001" w:tentative="1">
+      <w:start w:val="1"/>
+      <w:numFmt w:val="bullet"/>
+      <w:lvlText w:val=""/>
+      <w:lvlJc w:val="left"/>
+      <w:pPr>
+        <w:ind w:left="3730" w:hanging="360"/>
+      </w:pPr>
+      <w:rPr>
+        <w:rFonts w:ascii="Symbol" w:hAnsi="Symbol" w:hint="default"/>
+      </w:rPr>
+    </w:lvl>
+    <w:lvl w:ilvl="4" w:tplc="04160003" w:tentative="1">
+      <w:start w:val="1"/>
+      <w:numFmt w:val="bullet"/>
+      <w:lvlText w:val="o"/>
+      <w:lvlJc w:val="left"/>
+      <w:pPr>
+        <w:ind w:left="4450" w:hanging="360"/>
+      </w:pPr>
+      <w:rPr>
+        <w:rFonts w:ascii="Courier New" w:hAnsi="Courier New" w:cs="Courier New" w:hint="default"/>
+      </w:rPr>
+    </w:lvl>
+    <w:lvl w:ilvl="5" w:tplc="04160005" w:tentative="1">
+      <w:start w:val="1"/>
+      <w:numFmt w:val="bullet"/>
+      <w:lvlText w:val=""/>
+      <w:lvlJc w:val="left"/>
+      <w:pPr>
+        <w:ind w:left="5170" w:hanging="360"/>
+      </w:pPr>
+      <w:rPr>
+        <w:rFonts w:ascii="Wingdings" w:hAnsi="Wingdings" w:hint="default"/>
+      </w:rPr>
+    </w:lvl>
+    <w:lvl w:ilvl="6" w:tplc="04160001" w:tentative="1">
+      <w:start w:val="1"/>
+      <w:numFmt w:val="bullet"/>
+      <w:lvlText w:val=""/>
+      <w:lvlJc w:val="left"/>
+      <w:pPr>
+        <w:ind w:left="5890" w:hanging="360"/>
+      </w:pPr>
+      <w:rPr>
+        <w:rFonts w:ascii="Symbol" w:hAnsi="Symbol" w:hint="default"/>
+      </w:rPr>
+    </w:lvl>
+    <w:lvl w:ilvl="7" w:tplc="04160003" w:tentative="1">
+      <w:start w:val="1"/>
+      <w:numFmt w:val="bullet"/>
+      <w:lvlText w:val="o"/>
+      <w:lvlJc w:val="left"/>
+      <w:pPr>
+        <w:ind w:left="6610" w:hanging="360"/>
+      </w:pPr>
+      <w:rPr>
+        <w:rFonts w:ascii="Courier New" w:hAnsi="Courier New" w:cs="Courier New" w:hint="default"/>
+      </w:rPr>
+    </w:lvl>
+    <w:lvl w:ilvl="8" w:tplc="04160005" w:tentative="1">
+      <w:start w:val="1"/>
+      <w:numFmt w:val="bullet"/>
+      <w:lvlText w:val=""/>
+      <w:lvlJc w:val="left"/>
+      <w:pPr>
+        <w:ind w:left="7330" w:hanging="360"/>
+      </w:pPr>
+      <w:rPr>
+        <w:rFonts w:ascii="Wingdings" w:hAnsi="Wingdings" w:hint="default"/>
+      </w:rPr>
+    </w:lvl>
+  </w:abstractNum>
+  <w:abstractNum w:abstractNumId="17" w15:restartNumberingAfterBreak="0">
     <w:nsid w:val="4DB86243"/>
     <w:multiLevelType w:val="multilevel"/>
     <w:tmpl w:val="D652AE68"/>
@@ -12403,7 +13194,7 @@
       </w:rPr>
     </w:lvl>
   </w:abstractNum>
-  <w:abstractNum w:abstractNumId="16" w15:restartNumberingAfterBreak="0">
+  <w:abstractNum w:abstractNumId="18" w15:restartNumberingAfterBreak="0">
     <w:nsid w:val="5C394BC9"/>
     <w:multiLevelType w:val="multilevel"/>
     <w:tmpl w:val="7EAE38A0"/>
@@ -12489,7 +13280,7 @@
       </w:pPr>
     </w:lvl>
   </w:abstractNum>
-  <w:abstractNum w:abstractNumId="17" w15:restartNumberingAfterBreak="0">
+  <w:abstractNum w:abstractNumId="19" w15:restartNumberingAfterBreak="0">
     <w:nsid w:val="610B3EDF"/>
     <w:multiLevelType w:val="multilevel"/>
     <w:tmpl w:val="7EAE38A0"/>
@@ -12575,7 +13366,7 @@
       </w:pPr>
     </w:lvl>
   </w:abstractNum>
-  <w:abstractNum w:abstractNumId="18" w15:restartNumberingAfterBreak="0">
+  <w:abstractNum w:abstractNumId="20" w15:restartNumberingAfterBreak="0">
     <w:nsid w:val="67403CB5"/>
     <w:multiLevelType w:val="multilevel"/>
     <w:tmpl w:val="75326788"/>
@@ -12688,7 +13479,7 @@
       </w:rPr>
     </w:lvl>
   </w:abstractNum>
-  <w:abstractNum w:abstractNumId="19" w15:restartNumberingAfterBreak="0">
+  <w:abstractNum w:abstractNumId="21" w15:restartNumberingAfterBreak="0">
     <w:nsid w:val="67C547F7"/>
     <w:multiLevelType w:val="multilevel"/>
     <w:tmpl w:val="35EAD4B8"/>
@@ -12774,7 +13565,7 @@
       </w:pPr>
     </w:lvl>
   </w:abstractNum>
-  <w:abstractNum w:abstractNumId="20" w15:restartNumberingAfterBreak="0">
+  <w:abstractNum w:abstractNumId="22" w15:restartNumberingAfterBreak="0">
     <w:nsid w:val="6C8202C1"/>
     <w:multiLevelType w:val="multilevel"/>
     <w:tmpl w:val="981048B2"/>
@@ -12887,7 +13678,7 @@
       </w:rPr>
     </w:lvl>
   </w:abstractNum>
-  <w:abstractNum w:abstractNumId="21" w15:restartNumberingAfterBreak="0">
+  <w:abstractNum w:abstractNumId="23" w15:restartNumberingAfterBreak="0">
     <w:nsid w:val="6CD6232C"/>
     <w:multiLevelType w:val="multilevel"/>
     <w:tmpl w:val="2C50429A"/>
@@ -13000,7 +13791,7 @@
       </w:rPr>
     </w:lvl>
   </w:abstractNum>
-  <w:abstractNum w:abstractNumId="22" w15:restartNumberingAfterBreak="0">
+  <w:abstractNum w:abstractNumId="24" w15:restartNumberingAfterBreak="0">
     <w:nsid w:val="6FBC5385"/>
     <w:multiLevelType w:val="multilevel"/>
     <w:tmpl w:val="9E36186C"/>
@@ -13113,7 +13904,7 @@
       </w:rPr>
     </w:lvl>
   </w:abstractNum>
-  <w:abstractNum w:abstractNumId="23" w15:restartNumberingAfterBreak="0">
+  <w:abstractNum w:abstractNumId="25" w15:restartNumberingAfterBreak="0">
     <w:nsid w:val="7ABF4D30"/>
     <w:multiLevelType w:val="multilevel"/>
     <w:tmpl w:val="C61A779C"/>
@@ -13226,7 +14017,120 @@
       </w:rPr>
     </w:lvl>
   </w:abstractNum>
-  <w:abstractNum w:abstractNumId="24" w15:restartNumberingAfterBreak="0">
+  <w:abstractNum w:abstractNumId="26" w15:restartNumberingAfterBreak="0">
+    <w:nsid w:val="7E36314E"/>
+    <w:multiLevelType w:val="hybridMultilevel"/>
+    <w:tmpl w:val="6FDA89B4"/>
+    <w:lvl w:ilvl="0" w:tplc="04160001">
+      <w:start w:val="1"/>
+      <w:numFmt w:val="bullet"/>
+      <w:lvlText w:val=""/>
+      <w:lvlJc w:val="left"/>
+      <w:pPr>
+        <w:ind w:left="1570" w:hanging="360"/>
+      </w:pPr>
+      <w:rPr>
+        <w:rFonts w:ascii="Symbol" w:hAnsi="Symbol" w:hint="default"/>
+      </w:rPr>
+    </w:lvl>
+    <w:lvl w:ilvl="1" w:tplc="04160003" w:tentative="1">
+      <w:start w:val="1"/>
+      <w:numFmt w:val="bullet"/>
+      <w:lvlText w:val="o"/>
+      <w:lvlJc w:val="left"/>
+      <w:pPr>
+        <w:ind w:left="2290" w:hanging="360"/>
+      </w:pPr>
+      <w:rPr>
+        <w:rFonts w:ascii="Courier New" w:hAnsi="Courier New" w:cs="Courier New" w:hint="default"/>
+      </w:rPr>
+    </w:lvl>
+    <w:lvl w:ilvl="2" w:tplc="04160005" w:tentative="1">
+      <w:start w:val="1"/>
+      <w:numFmt w:val="bullet"/>
+      <w:lvlText w:val=""/>
+      <w:lvlJc w:val="left"/>
+      <w:pPr>
+        <w:ind w:left="3010" w:hanging="360"/>
+      </w:pPr>
+      <w:rPr>
+        <w:rFonts w:ascii="Wingdings" w:hAnsi="Wingdings" w:hint="default"/>
+      </w:rPr>
+    </w:lvl>
+    <w:lvl w:ilvl="3" w:tplc="04160001" w:tentative="1">
+      <w:start w:val="1"/>
+      <w:numFmt w:val="bullet"/>
+      <w:lvlText w:val=""/>
+      <w:lvlJc w:val="left"/>
+      <w:pPr>
+        <w:ind w:left="3730" w:hanging="360"/>
+      </w:pPr>
+      <w:rPr>
+        <w:rFonts w:ascii="Symbol" w:hAnsi="Symbol" w:hint="default"/>
+      </w:rPr>
+    </w:lvl>
+    <w:lvl w:ilvl="4" w:tplc="04160003" w:tentative="1">
+      <w:start w:val="1"/>
+      <w:numFmt w:val="bullet"/>
+      <w:lvlText w:val="o"/>
+      <w:lvlJc w:val="left"/>
+      <w:pPr>
+        <w:ind w:left="4450" w:hanging="360"/>
+      </w:pPr>
+      <w:rPr>
+        <w:rFonts w:ascii="Courier New" w:hAnsi="Courier New" w:cs="Courier New" w:hint="default"/>
+      </w:rPr>
+    </w:lvl>
+    <w:lvl w:ilvl="5" w:tplc="04160005" w:tentative="1">
+      <w:start w:val="1"/>
+      <w:numFmt w:val="bullet"/>
+      <w:lvlText w:val=""/>
+      <w:lvlJc w:val="left"/>
+      <w:pPr>
+        <w:ind w:left="5170" w:hanging="360"/>
+      </w:pPr>
+      <w:rPr>
+        <w:rFonts w:ascii="Wingdings" w:hAnsi="Wingdings" w:hint="default"/>
+      </w:rPr>
+    </w:lvl>
+    <w:lvl w:ilvl="6" w:tplc="04160001" w:tentative="1">
+      <w:start w:val="1"/>
+      <w:numFmt w:val="bullet"/>
+      <w:lvlText w:val=""/>
+      <w:lvlJc w:val="left"/>
+      <w:pPr>
+        <w:ind w:left="5890" w:hanging="360"/>
+      </w:pPr>
+      <w:rPr>
+        <w:rFonts w:ascii="Symbol" w:hAnsi="Symbol" w:hint="default"/>
+      </w:rPr>
+    </w:lvl>
+    <w:lvl w:ilvl="7" w:tplc="04160003" w:tentative="1">
+      <w:start w:val="1"/>
+      <w:numFmt w:val="bullet"/>
+      <w:lvlText w:val="o"/>
+      <w:lvlJc w:val="left"/>
+      <w:pPr>
+        <w:ind w:left="6610" w:hanging="360"/>
+      </w:pPr>
+      <w:rPr>
+        <w:rFonts w:ascii="Courier New" w:hAnsi="Courier New" w:cs="Courier New" w:hint="default"/>
+      </w:rPr>
+    </w:lvl>
+    <w:lvl w:ilvl="8" w:tplc="04160005" w:tentative="1">
+      <w:start w:val="1"/>
+      <w:numFmt w:val="bullet"/>
+      <w:lvlText w:val=""/>
+      <w:lvlJc w:val="left"/>
+      <w:pPr>
+        <w:ind w:left="7330" w:hanging="360"/>
+      </w:pPr>
+      <w:rPr>
+        <w:rFonts w:ascii="Wingdings" w:hAnsi="Wingdings" w:hint="default"/>
+      </w:rPr>
+    </w:lvl>
+  </w:abstractNum>
+  <w:abstractNum w:abstractNumId="27" w15:restartNumberingAfterBreak="0">
     <w:nsid w:val="7ED21264"/>
     <w:multiLevelType w:val="multilevel"/>
     <w:tmpl w:val="87B4A5EE"/>
@@ -13339,7 +14243,7 @@
       </w:rPr>
     </w:lvl>
   </w:abstractNum>
-  <w:abstractNum w:abstractNumId="25" w15:restartNumberingAfterBreak="0">
+  <w:abstractNum w:abstractNumId="28" w15:restartNumberingAfterBreak="0">
     <w:nsid w:val="7FF4155E"/>
     <w:multiLevelType w:val="multilevel"/>
     <w:tmpl w:val="F9722B4C"/>
@@ -13432,10 +14336,10 @@
     <w:abstractNumId w:val="1"/>
   </w:num>
   <w:num w:numId="2" w16cid:durableId="88086438">
-    <w:abstractNumId w:val="23"/>
+    <w:abstractNumId w:val="25"/>
   </w:num>
   <w:num w:numId="3" w16cid:durableId="1706714901">
-    <w:abstractNumId w:val="21"/>
+    <w:abstractNumId w:val="23"/>
   </w:num>
   <w:num w:numId="4" w16cid:durableId="113717744">
     <w:abstractNumId w:val="0"/>
@@ -13444,16 +14348,16 @@
     <w:abstractNumId w:val="9"/>
   </w:num>
   <w:num w:numId="6" w16cid:durableId="913590874">
-    <w:abstractNumId w:val="15"/>
+    <w:abstractNumId w:val="17"/>
   </w:num>
   <w:num w:numId="7" w16cid:durableId="1890459348">
-    <w:abstractNumId w:val="25"/>
+    <w:abstractNumId w:val="28"/>
   </w:num>
   <w:num w:numId="8" w16cid:durableId="333532636">
     <w:abstractNumId w:val="8"/>
   </w:num>
   <w:num w:numId="9" w16cid:durableId="128785046">
-    <w:abstractNumId w:val="20"/>
+    <w:abstractNumId w:val="22"/>
   </w:num>
   <w:num w:numId="10" w16cid:durableId="905458532">
     <w:abstractNumId w:val="4"/>
@@ -13462,55 +14366,64 @@
     <w:abstractNumId w:val="10"/>
   </w:num>
   <w:num w:numId="12" w16cid:durableId="568999983">
-    <w:abstractNumId w:val="24"/>
+    <w:abstractNumId w:val="27"/>
   </w:num>
   <w:num w:numId="13" w16cid:durableId="1767190151">
     <w:abstractNumId w:val="3"/>
   </w:num>
   <w:num w:numId="14" w16cid:durableId="715394213">
-    <w:abstractNumId w:val="13"/>
+    <w:abstractNumId w:val="14"/>
   </w:num>
   <w:num w:numId="15" w16cid:durableId="1314019323">
-    <w:abstractNumId w:val="11"/>
+    <w:abstractNumId w:val="12"/>
   </w:num>
   <w:num w:numId="16" w16cid:durableId="2108111862">
-    <w:abstractNumId w:val="22"/>
+    <w:abstractNumId w:val="24"/>
   </w:num>
   <w:num w:numId="17" w16cid:durableId="1320620575">
-    <w:abstractNumId w:val="18"/>
+    <w:abstractNumId w:val="20"/>
   </w:num>
   <w:num w:numId="18" w16cid:durableId="1431511382">
     <w:abstractNumId w:val="7"/>
   </w:num>
   <w:num w:numId="19" w16cid:durableId="1528325566">
-    <w:abstractNumId w:val="12"/>
+    <w:abstractNumId w:val="13"/>
   </w:num>
   <w:num w:numId="20" w16cid:durableId="990518204">
-    <w:abstractNumId w:val="14"/>
+    <w:abstractNumId w:val="15"/>
   </w:num>
   <w:num w:numId="21" w16cid:durableId="900098538">
     <w:abstractNumId w:val="6"/>
   </w:num>
   <w:num w:numId="22" w16cid:durableId="1159611945">
-    <w:abstractNumId w:val="19"/>
+    <w:abstractNumId w:val="21"/>
   </w:num>
   <w:num w:numId="23" w16cid:durableId="727652842">
     <w:abstractNumId w:val="2"/>
   </w:num>
   <w:num w:numId="24" w16cid:durableId="1596135007">
-    <w:abstractNumId w:val="17"/>
+    <w:abstractNumId w:val="19"/>
   </w:num>
   <w:num w:numId="25" w16cid:durableId="414478111">
-    <w:abstractNumId w:val="16"/>
+    <w:abstractNumId w:val="18"/>
   </w:num>
   <w:num w:numId="26" w16cid:durableId="372466584">
     <w:abstractNumId w:val="5"/>
+  </w:num>
+  <w:num w:numId="27" w16cid:durableId="1787504088">
+    <w:abstractNumId w:val="26"/>
+  </w:num>
+  <w:num w:numId="28" w16cid:durableId="927734810">
+    <w:abstractNumId w:val="16"/>
+  </w:num>
+  <w:num w:numId="29" w16cid:durableId="1914387497">
+    <w:abstractNumId w:val="11"/>
   </w:num>
 </w:numbering>
 </file>
 
 <file path=word/styles.xml><?xml version="1.0" encoding="utf-8"?>
-<w:styles xmlns:mc="http://schemas.openxmlformats.org/markup-compatibility/2006" xmlns:r="http://schemas.openxmlformats.org/officeDocument/2006/relationships" xmlns:w="http://schemas.openxmlformats.org/wordprocessingml/2006/main" xmlns:w14="http://schemas.microsoft.com/office/word/2010/wordml" xmlns:w15="http://schemas.microsoft.com/office/word/2012/wordml" xmlns:w16cex="http://schemas.microsoft.com/office/word/2018/wordml/cex" xmlns:w16cid="http://schemas.microsoft.com/office/word/2016/wordml/cid" xmlns:w16="http://schemas.microsoft.com/office/word/2018/wordml" xmlns:w16du="http://schemas.microsoft.com/office/word/2023/wordml/word16du" xmlns:w16sdtdh="http://schemas.microsoft.com/office/word/2020/wordml/sdtdatahash" xmlns:w16se="http://schemas.microsoft.com/office/word/2015/wordml/symex" mc:Ignorable="w14 w15 w16se w16cid w16 w16cex w16sdtdh w16du">
+<w:styles xmlns:mc="http://schemas.openxmlformats.org/markup-compatibility/2006" xmlns:r="http://schemas.openxmlformats.org/officeDocument/2006/relationships" xmlns:w="http://schemas.openxmlformats.org/wordprocessingml/2006/main" xmlns:w14="http://schemas.microsoft.com/office/word/2010/wordml" xmlns:w15="http://schemas.microsoft.com/office/word/2012/wordml" xmlns:w16cex="http://schemas.microsoft.com/office/word/2018/wordml/cex" xmlns:w16cid="http://schemas.microsoft.com/office/word/2016/wordml/cid" xmlns:w16="http://schemas.microsoft.com/office/word/2018/wordml" xmlns:w16du="http://schemas.microsoft.com/office/word/2023/wordml/word16du" xmlns:w16sdtdh="http://schemas.microsoft.com/office/word/2020/wordml/sdtdatahash" xmlns:w16sdtfl="http://schemas.microsoft.com/office/word/2024/wordml/sdtformatlock" xmlns:w16se="http://schemas.microsoft.com/office/word/2015/wordml/symex" mc:Ignorable="w14 w15 w16se w16cid w16 w16cex w16sdtdh w16sdtfl w16du">
   <w:docDefaults>
     <w:rPrDefault>
       <w:rPr>

</xml_diff>

<commit_message>
docs: Alteração no teste unitário TU001.03
</commit_message>
<xml_diff>
--- a/documentation/Especificacao_de_Requisitos_de_Software.docx
+++ b/documentation/Especificacao_de_Requisitos_de_Software.docx
@@ -2628,10 +2628,7 @@
         <w:t>[.00]</w:t>
       </w:r>
       <w:r>
-        <w:t xml:space="preserve"> para o requisito em si</w:t>
-      </w:r>
-      <w:r>
-        <w:t>.</w:t>
+        <w:t xml:space="preserve"> para o requisito em si.</w:t>
       </w:r>
     </w:p>
     <w:p>
@@ -2681,42 +2678,33 @@
         <w:rPr>
           <w:b/>
         </w:rPr>
-        <w:t>[DOC001]</w:t>
+        <w:t>[DOC001].</w:t>
+      </w:r>
+    </w:p>
+    <w:p>
+      <w:pPr>
+        <w:ind w:firstLine="850"/>
+      </w:pPr>
+      <w:r>
+        <w:t xml:space="preserve">Regras de negócios serão identificadas com o identificador único </w:t>
       </w:r>
       <w:r>
         <w:rPr>
           <w:b/>
         </w:rPr>
-        <w:t>.</w:t>
-      </w:r>
-    </w:p>
-    <w:p>
-      <w:pPr>
-        <w:ind w:firstLine="850"/>
-      </w:pPr>
-      <w:r>
-        <w:t xml:space="preserve">Regras de negócios serão identificadas com o identificador único </w:t>
+        <w:t>[RN001]</w:t>
+      </w:r>
+      <w:r>
+        <w:t xml:space="preserve"> para o módulo, acrescentado de </w:t>
       </w:r>
       <w:r>
         <w:rPr>
           <w:b/>
         </w:rPr>
-        <w:t>[RN001]</w:t>
-      </w:r>
-      <w:r>
-        <w:t xml:space="preserve"> para o módulo, acrescentado de </w:t>
-      </w:r>
-      <w:r>
-        <w:rPr>
-          <w:b/>
-        </w:rPr>
         <w:t>[.00]</w:t>
       </w:r>
       <w:r>
-        <w:t xml:space="preserve"> para a regra em si</w:t>
-      </w:r>
-      <w:r>
-        <w:t>.</w:t>
+        <w:t xml:space="preserve"> para a regra em si.</w:t>
       </w:r>
     </w:p>
     <w:p>
@@ -2798,10 +2786,7 @@
         <w:ind w:firstLine="850"/>
       </w:pPr>
       <w:r>
-        <w:t>Testes</w:t>
-      </w:r>
-      <w:r>
-        <w:t xml:space="preserve"> </w:t>
+        <w:t xml:space="preserve">Testes </w:t>
       </w:r>
       <w:r>
         <w:t xml:space="preserve">de software, </w:t>
@@ -2897,10 +2882,7 @@
         <w:t>[.00]</w:t>
       </w:r>
       <w:r>
-        <w:t xml:space="preserve"> para o requisito em si</w:t>
-      </w:r>
-      <w:r>
-        <w:t>.</w:t>
+        <w:t xml:space="preserve"> para o requisito em si.</w:t>
       </w:r>
     </w:p>
     <w:p>
@@ -5601,7 +5583,7 @@
     </w:p>
     <w:p>
       <w:pPr>
-        <w:pStyle w:val="Ttulo4"/>
+        <w:pStyle w:val="PargrafodaLista"/>
       </w:pPr>
     </w:p>
     <w:p>
@@ -8134,42 +8116,18 @@
     </w:p>
     <w:p>
       <w:pPr>
-        <w:rPr>
-          <w:b/>
-          <w:bCs/>
-          <w:color w:val="000000" w:themeColor="text1"/>
-        </w:rPr>
-      </w:pPr>
-      <w:r>
-        <w:rPr>
-          <w:b/>
-          <w:bCs/>
-          <w:color w:val="000000" w:themeColor="text1"/>
-        </w:rPr>
+        <w:pStyle w:val="Ttulo3"/>
+      </w:pPr>
+      <w:r>
         <w:t>5.2.1 [</w:t>
       </w:r>
       <w:r>
-        <w:rPr>
-          <w:b/>
-          <w:bCs/>
-          <w:color w:val="000000" w:themeColor="text1"/>
-        </w:rPr>
         <w:t>D</w:t>
       </w:r>
       <w:r>
-        <w:rPr>
-          <w:b/>
-          <w:bCs/>
-          <w:color w:val="000000" w:themeColor="text1"/>
-        </w:rPr>
         <w:t>CU</w:t>
       </w:r>
       <w:r>
-        <w:rPr>
-          <w:b/>
-          <w:bCs/>
-          <w:color w:val="000000" w:themeColor="text1"/>
-        </w:rPr>
         <w:t>001] Login</w:t>
       </w:r>
     </w:p>
@@ -8537,7 +8495,7 @@
     </w:p>
     <w:p>
       <w:pPr>
-        <w:jc w:val="left"/>
+        <w:pStyle w:val="Ttulo2"/>
       </w:pPr>
       <w:r>
         <w:lastRenderedPageBreak/>
@@ -8567,7 +8525,7 @@
     </w:p>
     <w:p>
       <w:pPr>
-        <w:jc w:val="left"/>
+        <w:pStyle w:val="Ttulo3"/>
       </w:pPr>
       <w:r>
         <w:t>5.3.1 [</w:t>
@@ -8667,7 +8625,7 @@
     </w:p>
     <w:p>
       <w:pPr>
-        <w:jc w:val="left"/>
+        <w:pStyle w:val="Ttulo4"/>
       </w:pPr>
       <w:r>
         <w:t>5.3.1.1 Descrição</w:t>
@@ -10295,19 +10253,25 @@
         </w:rPr>
       </w:pPr>
       <w:r>
-        <w:t>6.1.1.3 [</w:t>
-      </w:r>
-      <w:r>
-        <w:t>TU</w:t>
-      </w:r>
-      <w:r>
-        <w:t xml:space="preserve">001.03] </w:t>
-      </w:r>
-      <w:r>
-        <w:rPr>
-          <w:color w:val="000000" w:themeColor="text1"/>
-        </w:rPr>
-        <w:t>O sistema não deve cadastrar usuário quando o login já existe</w:t>
+        <w:t>6.1.1.</w:t>
+      </w:r>
+      <w:r>
+        <w:t>3</w:t>
+      </w:r>
+      <w:r>
+        <w:t xml:space="preserve"> [TU001.0</w:t>
+      </w:r>
+      <w:r>
+        <w:t>3</w:t>
+      </w:r>
+      <w:r>
+        <w:t xml:space="preserve">] </w:t>
+      </w:r>
+      <w:r>
+        <w:rPr>
+          <w:color w:val="000000" w:themeColor="text1"/>
+        </w:rPr>
+        <w:t>O sistema não deve cadastrar usuário quando o nome tem menos de 4 caracteres</w:t>
       </w:r>
     </w:p>
     <w:p/>
@@ -10349,7 +10313,13 @@
         <w:rPr>
           <w:color w:val="000000" w:themeColor="text1"/>
         </w:rPr>
-        <w:t xml:space="preserve"> RF001.01.</w:t>
+        <w:t xml:space="preserve"> RF001.01, RN</w:t>
+      </w:r>
+      <w:r>
+        <w:rPr>
+          <w:color w:val="000000" w:themeColor="text1"/>
+        </w:rPr>
+        <w:t>001.01</w:t>
       </w:r>
     </w:p>
     <w:p>
@@ -10389,7 +10359,19 @@
         <w:rPr>
           <w:color w:val="000000" w:themeColor="text1"/>
         </w:rPr>
-        <w:t>: Login existente.</w:t>
+        <w:t xml:space="preserve">: </w:t>
+      </w:r>
+      <w:r>
+        <w:rPr>
+          <w:color w:val="000000" w:themeColor="text1"/>
+        </w:rPr>
+        <w:t>Nome do usuário com 3 caracteres</w:t>
+      </w:r>
+      <w:r>
+        <w:rPr>
+          <w:color w:val="000000" w:themeColor="text1"/>
+        </w:rPr>
+        <w:t>.</w:t>
       </w:r>
     </w:p>
     <w:p>
@@ -10427,7 +10409,19 @@
         <w:rPr>
           <w:color w:val="000000" w:themeColor="text1"/>
         </w:rPr>
-        <w:t>Informar os dados do usuário com login existente.</w:t>
+        <w:t xml:space="preserve">Informar os dados do usuário com </w:t>
+      </w:r>
+      <w:r>
+        <w:rPr>
+          <w:color w:val="000000" w:themeColor="text1"/>
+        </w:rPr>
+        <w:t>o nome com 3 caracteres</w:t>
+      </w:r>
+      <w:r>
+        <w:rPr>
+          <w:color w:val="000000" w:themeColor="text1"/>
+        </w:rPr>
+        <w:t>.</w:t>
       </w:r>
     </w:p>
     <w:p>
@@ -10445,7 +10439,13 @@
         <w:rPr>
           <w:color w:val="000000" w:themeColor="text1"/>
         </w:rPr>
-        <w:t>Consultar no Repository se o login existe.</w:t>
+        <w:t>Validar a quantidade de caracteres do nome</w:t>
+      </w:r>
+      <w:r>
+        <w:rPr>
+          <w:color w:val="000000" w:themeColor="text1"/>
+        </w:rPr>
+        <w:t>.</w:t>
       </w:r>
     </w:p>
     <w:p>
@@ -10463,7 +10463,19 @@
         <w:rPr>
           <w:color w:val="000000" w:themeColor="text1"/>
         </w:rPr>
-        <w:t>Caso login exista lançar exceção.</w:t>
+        <w:t xml:space="preserve">Receber mensagem de erro ao cadastrar </w:t>
+      </w:r>
+      <w:r>
+        <w:rPr>
+          <w:color w:val="000000" w:themeColor="text1"/>
+        </w:rPr>
+        <w:t>nome</w:t>
+      </w:r>
+      <w:r>
+        <w:rPr>
+          <w:color w:val="000000" w:themeColor="text1"/>
+        </w:rPr>
+        <w:t xml:space="preserve"> inválido.</w:t>
       </w:r>
     </w:p>
     <w:p>
@@ -10522,7 +10534,19 @@
         <w:rPr>
           <w:color w:val="000000" w:themeColor="text1"/>
         </w:rPr>
-        <w:t>nome: “Usuário Teste”</w:t>
+        <w:t>nome: “</w:t>
+      </w:r>
+      <w:r>
+        <w:rPr>
+          <w:color w:val="000000" w:themeColor="text1"/>
+        </w:rPr>
+        <w:t>abc</w:t>
+      </w:r>
+      <w:r>
+        <w:rPr>
+          <w:color w:val="000000" w:themeColor="text1"/>
+        </w:rPr>
+        <w:t>”</w:t>
       </w:r>
     </w:p>
     <w:p>
@@ -10549,23 +10573,7 @@
           <w:color w:val="000000" w:themeColor="text1"/>
           <w:lang w:val="en-US"/>
         </w:rPr>
-        <w:t>login: “</w:t>
-      </w:r>
-      <w:proofErr w:type="spellStart"/>
-      <w:r>
-        <w:rPr>
-          <w:color w:val="000000" w:themeColor="text1"/>
-          <w:lang w:val="en-US"/>
-        </w:rPr>
-        <w:t>login_existente</w:t>
-      </w:r>
-      <w:proofErr w:type="spellEnd"/>
-      <w:r>
-        <w:rPr>
-          <w:color w:val="000000" w:themeColor="text1"/>
-          <w:lang w:val="en-US"/>
-        </w:rPr>
-        <w:t>”</w:t>
+        <w:t>login: “login”</w:t>
       </w:r>
     </w:p>
     <w:p>
@@ -10729,6 +10737,568 @@
         <w:rPr>
           <w:color w:val="000000" w:themeColor="text1"/>
         </w:rPr>
+        <w:t>InvalidNameException</w:t>
+      </w:r>
+      <w:proofErr w:type="spellEnd"/>
+      <w:r>
+        <w:rPr>
+          <w:color w:val="000000" w:themeColor="text1"/>
+        </w:rPr>
+        <w:t xml:space="preserve"> com a mensagem “</w:t>
+      </w:r>
+      <w:r>
+        <w:rPr>
+          <w:color w:val="000000" w:themeColor="text1"/>
+        </w:rPr>
+        <w:t>O nome do usuário deve ter entre 4 e 32 caracteres</w:t>
+      </w:r>
+      <w:r>
+        <w:rPr>
+          <w:color w:val="000000" w:themeColor="text1"/>
+        </w:rPr>
+        <w:t>”.</w:t>
+      </w:r>
+    </w:p>
+    <w:p>
+      <w:pPr>
+        <w:rPr>
+          <w:color w:val="000000" w:themeColor="text1"/>
+        </w:rPr>
+      </w:pPr>
+      <w:r>
+        <w:rPr>
+          <w:b/>
+          <w:color w:val="000000" w:themeColor="text1"/>
+        </w:rPr>
+        <w:t>Status:</w:t>
+      </w:r>
+      <w:r>
+        <w:rPr>
+          <w:color w:val="000000" w:themeColor="text1"/>
+        </w:rPr>
+        <w:t xml:space="preserve"> Não realizado.</w:t>
+      </w:r>
+    </w:p>
+    <w:p>
+      <w:pPr>
+        <w:rPr>
+          <w:color w:val="000000" w:themeColor="text1"/>
+        </w:rPr>
+      </w:pPr>
+      <w:r>
+        <w:rPr>
+          <w:b/>
+          <w:color w:val="000000" w:themeColor="text1"/>
+        </w:rPr>
+        <w:t>Realização do teste:</w:t>
+      </w:r>
+      <w:r>
+        <w:rPr>
+          <w:color w:val="000000" w:themeColor="text1"/>
+        </w:rPr>
+        <w:t xml:space="preserve"> 00/00/0000.</w:t>
+      </w:r>
+    </w:p>
+    <w:p>
+      <w:pPr>
+        <w:rPr>
+          <w:color w:val="000000" w:themeColor="text1"/>
+        </w:rPr>
+      </w:pPr>
+      <w:r>
+        <w:rPr>
+          <w:b/>
+          <w:color w:val="000000" w:themeColor="text1"/>
+        </w:rPr>
+        <w:t xml:space="preserve">Responsável: </w:t>
+      </w:r>
+      <w:r>
+        <w:rPr>
+          <w:color w:val="000000" w:themeColor="text1"/>
+        </w:rPr>
+        <w:t>A definir.</w:t>
+      </w:r>
+    </w:p>
+    <w:p>
+      <w:pPr>
+        <w:rPr>
+          <w:color w:val="000000" w:themeColor="text1"/>
+        </w:rPr>
+      </w:pPr>
+    </w:p>
+    <w:p>
+      <w:pPr>
+        <w:rPr>
+          <w:color w:val="000000" w:themeColor="text1"/>
+        </w:rPr>
+      </w:pPr>
+    </w:p>
+    <w:p>
+      <w:pPr>
+        <w:pStyle w:val="Ttulo4"/>
+        <w:rPr>
+          <w:color w:val="FF0000"/>
+        </w:rPr>
+      </w:pPr>
+      <w:r>
+        <w:t>6.1.1.</w:t>
+      </w:r>
+      <w:r>
+        <w:t>X</w:t>
+      </w:r>
+      <w:r>
+        <w:t xml:space="preserve"> [</w:t>
+      </w:r>
+      <w:r>
+        <w:t>TU</w:t>
+      </w:r>
+      <w:r>
+        <w:t>001.0</w:t>
+      </w:r>
+      <w:r>
+        <w:t>X</w:t>
+      </w:r>
+      <w:r>
+        <w:t xml:space="preserve">] </w:t>
+      </w:r>
+      <w:r>
+        <w:rPr>
+          <w:color w:val="000000" w:themeColor="text1"/>
+        </w:rPr>
+        <w:t>O sistema não deve cadastrar usuário quando o login já existe</w:t>
+      </w:r>
+    </w:p>
+    <w:p/>
+    <w:p>
+      <w:pPr>
+        <w:rPr>
+          <w:color w:val="000000" w:themeColor="text1"/>
+        </w:rPr>
+      </w:pPr>
+      <w:r>
+        <w:rPr>
+          <w:b/>
+          <w:bCs/>
+          <w:color w:val="000000" w:themeColor="text1"/>
+        </w:rPr>
+        <w:t>Camada:</w:t>
+      </w:r>
+      <w:r>
+        <w:rPr>
+          <w:color w:val="000000" w:themeColor="text1"/>
+        </w:rPr>
+        <w:t xml:space="preserve"> Serviço.</w:t>
+      </w:r>
+    </w:p>
+    <w:p>
+      <w:pPr>
+        <w:rPr>
+          <w:color w:val="000000" w:themeColor="text1"/>
+        </w:rPr>
+      </w:pPr>
+      <w:r>
+        <w:rPr>
+          <w:b/>
+          <w:color w:val="000000" w:themeColor="text1"/>
+        </w:rPr>
+        <w:t>Requisitos associados:</w:t>
+      </w:r>
+      <w:r>
+        <w:rPr>
+          <w:color w:val="000000" w:themeColor="text1"/>
+        </w:rPr>
+        <w:t xml:space="preserve"> RF001.01</w:t>
+      </w:r>
+      <w:r>
+        <w:rPr>
+          <w:color w:val="000000" w:themeColor="text1"/>
+        </w:rPr>
+        <w:t>, RN</w:t>
+      </w:r>
+      <w:r>
+        <w:rPr>
+          <w:color w:val="000000" w:themeColor="text1"/>
+        </w:rPr>
+        <w:t>.</w:t>
+      </w:r>
+    </w:p>
+    <w:p>
+      <w:pPr>
+        <w:rPr>
+          <w:color w:val="000000" w:themeColor="text1"/>
+        </w:rPr>
+      </w:pPr>
+      <w:r>
+        <w:rPr>
+          <w:b/>
+          <w:color w:val="000000" w:themeColor="text1"/>
+        </w:rPr>
+        <w:t xml:space="preserve">Descrição: </w:t>
+      </w:r>
+      <w:r>
+        <w:rPr>
+          <w:color w:val="000000" w:themeColor="text1"/>
+        </w:rPr>
+        <w:t>O sistema não deve cadastrar usuário.</w:t>
+      </w:r>
+    </w:p>
+    <w:p>
+      <w:pPr>
+        <w:rPr>
+          <w:color w:val="000000" w:themeColor="text1"/>
+        </w:rPr>
+      </w:pPr>
+      <w:r>
+        <w:rPr>
+          <w:b/>
+          <w:color w:val="000000" w:themeColor="text1"/>
+        </w:rPr>
+        <w:t>Condições</w:t>
+      </w:r>
+      <w:r>
+        <w:rPr>
+          <w:color w:val="000000" w:themeColor="text1"/>
+        </w:rPr>
+        <w:t>: Login existente.</w:t>
+      </w:r>
+    </w:p>
+    <w:p>
+      <w:pPr>
+        <w:rPr>
+          <w:color w:val="000000" w:themeColor="text1"/>
+        </w:rPr>
+      </w:pPr>
+      <w:r>
+        <w:rPr>
+          <w:b/>
+          <w:color w:val="000000" w:themeColor="text1"/>
+        </w:rPr>
+        <w:t>Passos:</w:t>
+      </w:r>
+      <w:r>
+        <w:rPr>
+          <w:color w:val="000000" w:themeColor="text1"/>
+        </w:rPr>
+        <w:t xml:space="preserve"> </w:t>
+      </w:r>
+    </w:p>
+    <w:p>
+      <w:pPr>
+        <w:pStyle w:val="PargrafodaLista"/>
+        <w:numPr>
+          <w:ilvl w:val="0"/>
+          <w:numId w:val="26"/>
+        </w:numPr>
+        <w:rPr>
+          <w:color w:val="000000" w:themeColor="text1"/>
+        </w:rPr>
+      </w:pPr>
+      <w:r>
+        <w:rPr>
+          <w:color w:val="000000" w:themeColor="text1"/>
+        </w:rPr>
+        <w:t>Informar os dados do usuário com login existente.</w:t>
+      </w:r>
+    </w:p>
+    <w:p>
+      <w:pPr>
+        <w:pStyle w:val="PargrafodaLista"/>
+        <w:numPr>
+          <w:ilvl w:val="0"/>
+          <w:numId w:val="26"/>
+        </w:numPr>
+        <w:rPr>
+          <w:color w:val="000000" w:themeColor="text1"/>
+        </w:rPr>
+      </w:pPr>
+      <w:r>
+        <w:rPr>
+          <w:color w:val="000000" w:themeColor="text1"/>
+        </w:rPr>
+        <w:t>Consultar no Repository se o login existe.</w:t>
+      </w:r>
+    </w:p>
+    <w:p>
+      <w:pPr>
+        <w:pStyle w:val="PargrafodaLista"/>
+        <w:numPr>
+          <w:ilvl w:val="0"/>
+          <w:numId w:val="26"/>
+        </w:numPr>
+        <w:rPr>
+          <w:color w:val="000000" w:themeColor="text1"/>
+        </w:rPr>
+      </w:pPr>
+      <w:r>
+        <w:rPr>
+          <w:color w:val="000000" w:themeColor="text1"/>
+        </w:rPr>
+        <w:t>Caso login exista lançar exceção.</w:t>
+      </w:r>
+    </w:p>
+    <w:p>
+      <w:pPr>
+        <w:rPr>
+          <w:color w:val="000000" w:themeColor="text1"/>
+        </w:rPr>
+      </w:pPr>
+      <w:r>
+        <w:rPr>
+          <w:b/>
+          <w:color w:val="000000" w:themeColor="text1"/>
+        </w:rPr>
+        <w:t>Dados do teste:</w:t>
+      </w:r>
+      <w:r>
+        <w:rPr>
+          <w:color w:val="000000" w:themeColor="text1"/>
+        </w:rPr>
+        <w:t xml:space="preserve"> </w:t>
+      </w:r>
+    </w:p>
+    <w:p>
+      <w:pPr>
+        <w:ind w:firstLine="720"/>
+        <w:rPr>
+          <w:color w:val="000000" w:themeColor="text1"/>
+        </w:rPr>
+      </w:pPr>
+      <w:r>
+        <w:rPr>
+          <w:color w:val="000000" w:themeColor="text1"/>
+        </w:rPr>
+        <w:t>{</w:t>
+      </w:r>
+    </w:p>
+    <w:p>
+      <w:pPr>
+        <w:rPr>
+          <w:color w:val="000000" w:themeColor="text1"/>
+        </w:rPr>
+      </w:pPr>
+      <w:r>
+        <w:rPr>
+          <w:color w:val="000000" w:themeColor="text1"/>
+        </w:rPr>
+        <w:tab/>
+      </w:r>
+      <w:r>
+        <w:rPr>
+          <w:color w:val="000000" w:themeColor="text1"/>
+        </w:rPr>
+        <w:tab/>
+      </w:r>
+      <w:r>
+        <w:rPr>
+          <w:color w:val="000000" w:themeColor="text1"/>
+        </w:rPr>
+        <w:t>nome: “Usuário Teste”</w:t>
+      </w:r>
+    </w:p>
+    <w:p>
+      <w:pPr>
+        <w:rPr>
+          <w:color w:val="000000" w:themeColor="text1"/>
+          <w:lang w:val="en-US"/>
+        </w:rPr>
+      </w:pPr>
+      <w:r>
+        <w:rPr>
+          <w:color w:val="000000" w:themeColor="text1"/>
+        </w:rPr>
+        <w:tab/>
+      </w:r>
+      <w:r>
+        <w:rPr>
+          <w:color w:val="000000" w:themeColor="text1"/>
+        </w:rPr>
+        <w:tab/>
+      </w:r>
+      <w:r>
+        <w:rPr>
+          <w:color w:val="000000" w:themeColor="text1"/>
+          <w:lang w:val="en-US"/>
+        </w:rPr>
+        <w:t>login: “</w:t>
+      </w:r>
+      <w:proofErr w:type="spellStart"/>
+      <w:r>
+        <w:rPr>
+          <w:color w:val="000000" w:themeColor="text1"/>
+          <w:lang w:val="en-US"/>
+        </w:rPr>
+        <w:t>login_existente</w:t>
+      </w:r>
+      <w:proofErr w:type="spellEnd"/>
+      <w:r>
+        <w:rPr>
+          <w:color w:val="000000" w:themeColor="text1"/>
+          <w:lang w:val="en-US"/>
+        </w:rPr>
+        <w:t>”</w:t>
+      </w:r>
+    </w:p>
+    <w:p>
+      <w:pPr>
+        <w:rPr>
+          <w:color w:val="000000" w:themeColor="text1"/>
+          <w:lang w:val="en-US"/>
+        </w:rPr>
+      </w:pPr>
+      <w:r>
+        <w:rPr>
+          <w:color w:val="000000" w:themeColor="text1"/>
+          <w:lang w:val="en-US"/>
+        </w:rPr>
+        <w:tab/>
+      </w:r>
+      <w:r>
+        <w:rPr>
+          <w:color w:val="000000" w:themeColor="text1"/>
+          <w:lang w:val="en-US"/>
+        </w:rPr>
+        <w:tab/>
+        <w:t>password: “teste”</w:t>
+      </w:r>
+    </w:p>
+    <w:p>
+      <w:pPr>
+        <w:rPr>
+          <w:color w:val="000000" w:themeColor="text1"/>
+        </w:rPr>
+      </w:pPr>
+      <w:r>
+        <w:rPr>
+          <w:color w:val="000000" w:themeColor="text1"/>
+          <w:lang w:val="en-US"/>
+        </w:rPr>
+        <w:tab/>
+      </w:r>
+      <w:r>
+        <w:rPr>
+          <w:color w:val="000000" w:themeColor="text1"/>
+          <w:lang w:val="en-US"/>
+        </w:rPr>
+        <w:tab/>
+      </w:r>
+      <w:r>
+        <w:rPr>
+          <w:color w:val="000000" w:themeColor="text1"/>
+        </w:rPr>
+        <w:t>telefone: “11912345678”</w:t>
+      </w:r>
+    </w:p>
+    <w:p>
+      <w:pPr>
+        <w:rPr>
+          <w:color w:val="000000" w:themeColor="text1"/>
+        </w:rPr>
+      </w:pPr>
+      <w:r>
+        <w:rPr>
+          <w:color w:val="000000" w:themeColor="text1"/>
+        </w:rPr>
+        <w:tab/>
+      </w:r>
+      <w:r>
+        <w:rPr>
+          <w:color w:val="000000" w:themeColor="text1"/>
+        </w:rPr>
+        <w:tab/>
+      </w:r>
+      <w:proofErr w:type="spellStart"/>
+      <w:r>
+        <w:rPr>
+          <w:color w:val="000000" w:themeColor="text1"/>
+        </w:rPr>
+        <w:t>email</w:t>
+      </w:r>
+      <w:proofErr w:type="spellEnd"/>
+      <w:r>
+        <w:rPr>
+          <w:color w:val="000000" w:themeColor="text1"/>
+        </w:rPr>
+        <w:t>: “teste@email.com”</w:t>
+      </w:r>
+    </w:p>
+    <w:p>
+      <w:pPr>
+        <w:rPr>
+          <w:color w:val="000000" w:themeColor="text1"/>
+        </w:rPr>
+      </w:pPr>
+      <w:r>
+        <w:rPr>
+          <w:color w:val="000000" w:themeColor="text1"/>
+        </w:rPr>
+        <w:tab/>
+      </w:r>
+      <w:r>
+        <w:rPr>
+          <w:color w:val="000000" w:themeColor="text1"/>
+        </w:rPr>
+        <w:tab/>
+        <w:t>status: ATIVO</w:t>
+      </w:r>
+    </w:p>
+    <w:p>
+      <w:pPr>
+        <w:rPr>
+          <w:color w:val="000000" w:themeColor="text1"/>
+        </w:rPr>
+      </w:pPr>
+      <w:r>
+        <w:rPr>
+          <w:color w:val="000000" w:themeColor="text1"/>
+        </w:rPr>
+        <w:tab/>
+      </w:r>
+      <w:r>
+        <w:rPr>
+          <w:color w:val="000000" w:themeColor="text1"/>
+        </w:rPr>
+        <w:tab/>
+        <w:t>perfil: ADMIN</w:t>
+      </w:r>
+    </w:p>
+    <w:p>
+      <w:pPr>
+        <w:rPr>
+          <w:color w:val="000000" w:themeColor="text1"/>
+        </w:rPr>
+      </w:pPr>
+      <w:r>
+        <w:rPr>
+          <w:color w:val="000000" w:themeColor="text1"/>
+        </w:rPr>
+        <w:tab/>
+        <w:t>}</w:t>
+      </w:r>
+    </w:p>
+    <w:p>
+      <w:pPr>
+        <w:rPr>
+          <w:color w:val="000000" w:themeColor="text1"/>
+        </w:rPr>
+      </w:pPr>
+      <w:r>
+        <w:rPr>
+          <w:b/>
+          <w:color w:val="000000" w:themeColor="text1"/>
+        </w:rPr>
+        <w:t xml:space="preserve">Resultado esperado: </w:t>
+      </w:r>
+      <w:r>
+        <w:rPr>
+          <w:color w:val="000000" w:themeColor="text1"/>
+        </w:rPr>
+        <w:t xml:space="preserve">Lançar exceção </w:t>
+      </w:r>
+      <w:proofErr w:type="spellStart"/>
+      <w:r>
+        <w:rPr>
+          <w:color w:val="000000" w:themeColor="text1"/>
+        </w:rPr>
         <w:t>EntityAlreadyExisting</w:t>
       </w:r>
       <w:proofErr w:type="spellEnd"/>
@@ -10806,7 +11376,6 @@
       <w:bookmarkStart w:id="52" w:name="_1m74qn55enf9"/>
       <w:bookmarkEnd w:id="52"/>
       <w:r>
-        <w:lastRenderedPageBreak/>
         <w:t>6.2 Testes de Integração</w:t>
       </w:r>
       <w:bookmarkStart w:id="53" w:name="_dphyuw2e1f0q"/>

</xml_diff>

<commit_message>
docs: Adicionado teste unitário TU001.04
</commit_message>
<xml_diff>
--- a/documentation/Especificacao_de_Requisitos_de_Software.docx
+++ b/documentation/Especificacao_de_Requisitos_de_Software.docx
@@ -4418,7 +4418,13 @@
       <w:bookmarkStart w:id="25" w:name="_e5cbc74jozps"/>
       <w:bookmarkEnd w:id="25"/>
       <w:r>
-        <w:t>3.2 Requisitos Não Funcionais (NF)</w:t>
+        <w:t>3.2 Requisitos Não Funcionais (</w:t>
+      </w:r>
+      <w:r>
+        <w:t>R</w:t>
+      </w:r>
+      <w:r>
+        <w:t>NF)</w:t>
       </w:r>
     </w:p>
     <w:p/>
@@ -10321,6 +10327,12 @@
         </w:rPr>
         <w:t>001.01</w:t>
       </w:r>
+      <w:r>
+        <w:rPr>
+          <w:color w:val="000000" w:themeColor="text1"/>
+        </w:rPr>
+        <w:t>.</w:t>
+      </w:r>
     </w:p>
     <w:p>
       <w:pPr>
@@ -10821,42 +10833,23 @@
     </w:p>
     <w:p>
       <w:pPr>
-        <w:rPr>
-          <w:color w:val="000000" w:themeColor="text1"/>
-        </w:rPr>
-      </w:pPr>
-    </w:p>
-    <w:p>
-      <w:pPr>
-        <w:rPr>
-          <w:color w:val="000000" w:themeColor="text1"/>
-        </w:rPr>
-      </w:pPr>
-    </w:p>
-    <w:p>
-      <w:pPr>
         <w:pStyle w:val="Ttulo4"/>
         <w:rPr>
           <w:color w:val="FF0000"/>
         </w:rPr>
       </w:pPr>
       <w:r>
+        <w:lastRenderedPageBreak/>
         <w:t>6.1.1.</w:t>
       </w:r>
       <w:r>
-        <w:t>X</w:t>
-      </w:r>
-      <w:r>
-        <w:t xml:space="preserve"> [</w:t>
-      </w:r>
-      <w:r>
-        <w:t>TU</w:t>
-      </w:r>
-      <w:r>
-        <w:t>001.0</w:t>
-      </w:r>
-      <w:r>
-        <w:t>X</w:t>
+        <w:t>4</w:t>
+      </w:r>
+      <w:r>
+        <w:t xml:space="preserve"> [TU001.0</w:t>
+      </w:r>
+      <w:r>
+        <w:t>4</w:t>
       </w:r>
       <w:r>
         <w:t xml:space="preserve">] </w:t>
@@ -10865,7 +10858,31 @@
         <w:rPr>
           <w:color w:val="000000" w:themeColor="text1"/>
         </w:rPr>
-        <w:t>O sistema não deve cadastrar usuário quando o login já existe</w:t>
+        <w:t xml:space="preserve">O sistema não deve cadastrar usuário quando o nome tem </w:t>
+      </w:r>
+      <w:r>
+        <w:rPr>
+          <w:color w:val="000000" w:themeColor="text1"/>
+        </w:rPr>
+        <w:t>mais</w:t>
+      </w:r>
+      <w:r>
+        <w:rPr>
+          <w:color w:val="000000" w:themeColor="text1"/>
+        </w:rPr>
+        <w:t xml:space="preserve"> de </w:t>
+      </w:r>
+      <w:r>
+        <w:rPr>
+          <w:color w:val="000000" w:themeColor="text1"/>
+        </w:rPr>
+        <w:t>32</w:t>
+      </w:r>
+      <w:r>
+        <w:rPr>
+          <w:color w:val="000000" w:themeColor="text1"/>
+        </w:rPr>
+        <w:t xml:space="preserve"> caracteres</w:t>
       </w:r>
     </w:p>
     <w:p/>
@@ -10907,13 +10924,7 @@
         <w:rPr>
           <w:color w:val="000000" w:themeColor="text1"/>
         </w:rPr>
-        <w:t xml:space="preserve"> RF001.01</w:t>
-      </w:r>
-      <w:r>
-        <w:rPr>
-          <w:color w:val="000000" w:themeColor="text1"/>
-        </w:rPr>
-        <w:t>, RN</w:t>
+        <w:t xml:space="preserve"> RF001.01, RN001.01</w:t>
       </w:r>
       <w:r>
         <w:rPr>
@@ -10959,7 +10970,19 @@
         <w:rPr>
           <w:color w:val="000000" w:themeColor="text1"/>
         </w:rPr>
-        <w:t>: Login existente.</w:t>
+        <w:t>: Nome do usuário com 3</w:t>
+      </w:r>
+      <w:r>
+        <w:rPr>
+          <w:color w:val="000000" w:themeColor="text1"/>
+        </w:rPr>
+        <w:t>3</w:t>
+      </w:r>
+      <w:r>
+        <w:rPr>
+          <w:color w:val="000000" w:themeColor="text1"/>
+        </w:rPr>
+        <w:t xml:space="preserve"> caracteres.</w:t>
       </w:r>
     </w:p>
     <w:p>
@@ -10987,7 +11010,7 @@
         <w:pStyle w:val="PargrafodaLista"/>
         <w:numPr>
           <w:ilvl w:val="0"/>
-          <w:numId w:val="26"/>
+          <w:numId w:val="30"/>
         </w:numPr>
         <w:rPr>
           <w:color w:val="000000" w:themeColor="text1"/>
@@ -10997,7 +11020,19 @@
         <w:rPr>
           <w:color w:val="000000" w:themeColor="text1"/>
         </w:rPr>
-        <w:t>Informar os dados do usuário com login existente.</w:t>
+        <w:t>Informar os dados do usuário com o nome com 3</w:t>
+      </w:r>
+      <w:r>
+        <w:rPr>
+          <w:color w:val="000000" w:themeColor="text1"/>
+        </w:rPr>
+        <w:t>3</w:t>
+      </w:r>
+      <w:r>
+        <w:rPr>
+          <w:color w:val="000000" w:themeColor="text1"/>
+        </w:rPr>
+        <w:t xml:space="preserve"> caracteres.</w:t>
       </w:r>
     </w:p>
     <w:p>
@@ -11005,7 +11040,7 @@
         <w:pStyle w:val="PargrafodaLista"/>
         <w:numPr>
           <w:ilvl w:val="0"/>
-          <w:numId w:val="26"/>
+          <w:numId w:val="30"/>
         </w:numPr>
         <w:rPr>
           <w:color w:val="000000" w:themeColor="text1"/>
@@ -11015,7 +11050,7 @@
         <w:rPr>
           <w:color w:val="000000" w:themeColor="text1"/>
         </w:rPr>
-        <w:t>Consultar no Repository se o login existe.</w:t>
+        <w:t>Validar a quantidade de caracteres do nome.</w:t>
       </w:r>
     </w:p>
     <w:p>
@@ -11023,7 +11058,7 @@
         <w:pStyle w:val="PargrafodaLista"/>
         <w:numPr>
           <w:ilvl w:val="0"/>
-          <w:numId w:val="26"/>
+          <w:numId w:val="30"/>
         </w:numPr>
         <w:rPr>
           <w:color w:val="000000" w:themeColor="text1"/>
@@ -11033,7 +11068,7 @@
         <w:rPr>
           <w:color w:val="000000" w:themeColor="text1"/>
         </w:rPr>
-        <w:t>Caso login exista lançar exceção.</w:t>
+        <w:t>Receber mensagem de erro ao cadastrar nome inválido.</w:t>
       </w:r>
     </w:p>
     <w:p>
@@ -11092,7 +11127,103 @@
         <w:rPr>
           <w:color w:val="000000" w:themeColor="text1"/>
         </w:rPr>
-        <w:t>nome: “Usuário Teste”</w:t>
+        <w:t>nome: “</w:t>
+      </w:r>
+      <w:proofErr w:type="spellStart"/>
+      <w:r>
+        <w:rPr>
+          <w:color w:val="000000" w:themeColor="text1"/>
+        </w:rPr>
+        <w:t>abc</w:t>
+      </w:r>
+      <w:r>
+        <w:rPr>
+          <w:color w:val="000000" w:themeColor="text1"/>
+        </w:rPr>
+        <w:t>d</w:t>
+      </w:r>
+      <w:proofErr w:type="spellEnd"/>
+      <w:r>
+        <w:rPr>
+          <w:color w:val="000000" w:themeColor="text1"/>
+        </w:rPr>
+        <w:t xml:space="preserve"> </w:t>
+      </w:r>
+      <w:proofErr w:type="spellStart"/>
+      <w:r>
+        <w:rPr>
+          <w:color w:val="000000" w:themeColor="text1"/>
+        </w:rPr>
+        <w:t>efgh</w:t>
+      </w:r>
+      <w:proofErr w:type="spellEnd"/>
+      <w:r>
+        <w:rPr>
+          <w:color w:val="000000" w:themeColor="text1"/>
+        </w:rPr>
+        <w:t xml:space="preserve"> </w:t>
+      </w:r>
+      <w:proofErr w:type="spellStart"/>
+      <w:r>
+        <w:rPr>
+          <w:color w:val="000000" w:themeColor="text1"/>
+        </w:rPr>
+        <w:t>ijkl</w:t>
+      </w:r>
+      <w:proofErr w:type="spellEnd"/>
+      <w:r>
+        <w:rPr>
+          <w:color w:val="000000" w:themeColor="text1"/>
+        </w:rPr>
+        <w:t xml:space="preserve"> </w:t>
+      </w:r>
+      <w:proofErr w:type="spellStart"/>
+      <w:r>
+        <w:rPr>
+          <w:color w:val="000000" w:themeColor="text1"/>
+        </w:rPr>
+        <w:t>nmop</w:t>
+      </w:r>
+      <w:proofErr w:type="spellEnd"/>
+      <w:r>
+        <w:rPr>
+          <w:color w:val="000000" w:themeColor="text1"/>
+        </w:rPr>
+        <w:t xml:space="preserve"> </w:t>
+      </w:r>
+      <w:proofErr w:type="spellStart"/>
+      <w:r>
+        <w:rPr>
+          <w:color w:val="000000" w:themeColor="text1"/>
+        </w:rPr>
+        <w:t>qrst</w:t>
+      </w:r>
+      <w:proofErr w:type="spellEnd"/>
+      <w:r>
+        <w:rPr>
+          <w:color w:val="000000" w:themeColor="text1"/>
+        </w:rPr>
+        <w:t xml:space="preserve"> </w:t>
+      </w:r>
+      <w:proofErr w:type="spellStart"/>
+      <w:r>
+        <w:rPr>
+          <w:color w:val="000000" w:themeColor="text1"/>
+        </w:rPr>
+        <w:t>uvxz</w:t>
+      </w:r>
+      <w:proofErr w:type="spellEnd"/>
+      <w:r>
+        <w:rPr>
+          <w:color w:val="000000" w:themeColor="text1"/>
+        </w:rPr>
+        <w:t xml:space="preserve"> 123</w:t>
+      </w:r>
+      <w:r>
+        <w:rPr>
+          <w:color w:val="000000" w:themeColor="text1"/>
+        </w:rPr>
+        <w:t>”</w:t>
       </w:r>
     </w:p>
     <w:p>
@@ -11119,23 +11250,7 @@
           <w:color w:val="000000" w:themeColor="text1"/>
           <w:lang w:val="en-US"/>
         </w:rPr>
-        <w:t>login: “</w:t>
-      </w:r>
-      <w:proofErr w:type="spellStart"/>
-      <w:r>
-        <w:rPr>
-          <w:color w:val="000000" w:themeColor="text1"/>
-          <w:lang w:val="en-US"/>
-        </w:rPr>
-        <w:t>login_existente</w:t>
-      </w:r>
-      <w:proofErr w:type="spellEnd"/>
-      <w:r>
-        <w:rPr>
-          <w:color w:val="000000" w:themeColor="text1"/>
-          <w:lang w:val="en-US"/>
-        </w:rPr>
-        <w:t>”</w:t>
+        <w:t>login: “login”</w:t>
       </w:r>
     </w:p>
     <w:p>
@@ -11165,13 +11280,14 @@
       <w:pPr>
         <w:rPr>
           <w:color w:val="000000" w:themeColor="text1"/>
-        </w:rPr>
-      </w:pPr>
-      <w:r>
-        <w:rPr>
-          <w:color w:val="000000" w:themeColor="text1"/>
           <w:lang w:val="en-US"/>
         </w:rPr>
+      </w:pPr>
+      <w:r>
+        <w:rPr>
+          <w:color w:val="000000" w:themeColor="text1"/>
+          <w:lang w:val="en-US"/>
+        </w:rPr>
         <w:tab/>
       </w:r>
       <w:r>
@@ -11181,6 +11297,561 @@
         </w:rPr>
         <w:tab/>
       </w:r>
+      <w:proofErr w:type="spellStart"/>
+      <w:r>
+        <w:rPr>
+          <w:color w:val="000000" w:themeColor="text1"/>
+          <w:lang w:val="en-US"/>
+        </w:rPr>
+        <w:t>telefone</w:t>
+      </w:r>
+      <w:proofErr w:type="spellEnd"/>
+      <w:r>
+        <w:rPr>
+          <w:color w:val="000000" w:themeColor="text1"/>
+          <w:lang w:val="en-US"/>
+        </w:rPr>
+        <w:t>: “11912345678”</w:t>
+      </w:r>
+    </w:p>
+    <w:p>
+      <w:pPr>
+        <w:rPr>
+          <w:color w:val="000000" w:themeColor="text1"/>
+        </w:rPr>
+      </w:pPr>
+      <w:r>
+        <w:rPr>
+          <w:color w:val="000000" w:themeColor="text1"/>
+          <w:lang w:val="en-US"/>
+        </w:rPr>
+        <w:tab/>
+      </w:r>
+      <w:r>
+        <w:rPr>
+          <w:color w:val="000000" w:themeColor="text1"/>
+          <w:lang w:val="en-US"/>
+        </w:rPr>
+        <w:tab/>
+      </w:r>
+      <w:proofErr w:type="spellStart"/>
+      <w:r>
+        <w:rPr>
+          <w:color w:val="000000" w:themeColor="text1"/>
+        </w:rPr>
+        <w:t>email</w:t>
+      </w:r>
+      <w:proofErr w:type="spellEnd"/>
+      <w:r>
+        <w:rPr>
+          <w:color w:val="000000" w:themeColor="text1"/>
+        </w:rPr>
+        <w:t>: “teste@email.com”</w:t>
+      </w:r>
+    </w:p>
+    <w:p>
+      <w:pPr>
+        <w:rPr>
+          <w:color w:val="000000" w:themeColor="text1"/>
+        </w:rPr>
+      </w:pPr>
+      <w:r>
+        <w:rPr>
+          <w:color w:val="000000" w:themeColor="text1"/>
+        </w:rPr>
+        <w:tab/>
+      </w:r>
+      <w:r>
+        <w:rPr>
+          <w:color w:val="000000" w:themeColor="text1"/>
+        </w:rPr>
+        <w:tab/>
+        <w:t>status: ATIVO</w:t>
+      </w:r>
+    </w:p>
+    <w:p>
+      <w:pPr>
+        <w:rPr>
+          <w:color w:val="000000" w:themeColor="text1"/>
+        </w:rPr>
+      </w:pPr>
+      <w:r>
+        <w:rPr>
+          <w:color w:val="000000" w:themeColor="text1"/>
+        </w:rPr>
+        <w:tab/>
+      </w:r>
+      <w:r>
+        <w:rPr>
+          <w:color w:val="000000" w:themeColor="text1"/>
+        </w:rPr>
+        <w:tab/>
+        <w:t>perfil: ADMIN</w:t>
+      </w:r>
+    </w:p>
+    <w:p>
+      <w:pPr>
+        <w:rPr>
+          <w:color w:val="000000" w:themeColor="text1"/>
+        </w:rPr>
+      </w:pPr>
+      <w:r>
+        <w:rPr>
+          <w:color w:val="000000" w:themeColor="text1"/>
+        </w:rPr>
+        <w:tab/>
+        <w:t>}</w:t>
+      </w:r>
+    </w:p>
+    <w:p>
+      <w:pPr>
+        <w:rPr>
+          <w:color w:val="000000" w:themeColor="text1"/>
+        </w:rPr>
+      </w:pPr>
+      <w:r>
+        <w:rPr>
+          <w:b/>
+          <w:color w:val="000000" w:themeColor="text1"/>
+        </w:rPr>
+        <w:t xml:space="preserve">Resultado esperado: </w:t>
+      </w:r>
+      <w:r>
+        <w:rPr>
+          <w:color w:val="000000" w:themeColor="text1"/>
+        </w:rPr>
+        <w:t xml:space="preserve">Lançar exceção </w:t>
+      </w:r>
+      <w:proofErr w:type="spellStart"/>
+      <w:r>
+        <w:rPr>
+          <w:color w:val="000000" w:themeColor="text1"/>
+        </w:rPr>
+        <w:t>InvalidNameException</w:t>
+      </w:r>
+      <w:proofErr w:type="spellEnd"/>
+      <w:r>
+        <w:rPr>
+          <w:color w:val="000000" w:themeColor="text1"/>
+        </w:rPr>
+        <w:t xml:space="preserve"> com a mensagem “O nome do usuário deve ter entre 4 e 32 caracteres”.</w:t>
+      </w:r>
+    </w:p>
+    <w:p>
+      <w:pPr>
+        <w:rPr>
+          <w:color w:val="000000" w:themeColor="text1"/>
+        </w:rPr>
+      </w:pPr>
+      <w:r>
+        <w:rPr>
+          <w:b/>
+          <w:color w:val="000000" w:themeColor="text1"/>
+        </w:rPr>
+        <w:t>Status:</w:t>
+      </w:r>
+      <w:r>
+        <w:rPr>
+          <w:color w:val="000000" w:themeColor="text1"/>
+        </w:rPr>
+        <w:t xml:space="preserve"> Não realizado.</w:t>
+      </w:r>
+    </w:p>
+    <w:p>
+      <w:pPr>
+        <w:rPr>
+          <w:color w:val="000000" w:themeColor="text1"/>
+        </w:rPr>
+      </w:pPr>
+      <w:r>
+        <w:rPr>
+          <w:b/>
+          <w:color w:val="000000" w:themeColor="text1"/>
+        </w:rPr>
+        <w:t>Realização do teste:</w:t>
+      </w:r>
+      <w:r>
+        <w:rPr>
+          <w:color w:val="000000" w:themeColor="text1"/>
+        </w:rPr>
+        <w:t xml:space="preserve"> 00/00/0000.</w:t>
+      </w:r>
+    </w:p>
+    <w:p>
+      <w:pPr>
+        <w:rPr>
+          <w:color w:val="000000" w:themeColor="text1"/>
+        </w:rPr>
+      </w:pPr>
+      <w:r>
+        <w:rPr>
+          <w:b/>
+          <w:color w:val="000000" w:themeColor="text1"/>
+        </w:rPr>
+        <w:t xml:space="preserve">Responsável: </w:t>
+      </w:r>
+      <w:r>
+        <w:rPr>
+          <w:color w:val="000000" w:themeColor="text1"/>
+        </w:rPr>
+        <w:t>A definir.</w:t>
+      </w:r>
+    </w:p>
+    <w:p>
+      <w:pPr>
+        <w:rPr>
+          <w:color w:val="000000" w:themeColor="text1"/>
+        </w:rPr>
+      </w:pPr>
+    </w:p>
+    <w:p>
+      <w:pPr>
+        <w:pStyle w:val="Ttulo4"/>
+        <w:rPr>
+          <w:color w:val="FF0000"/>
+        </w:rPr>
+      </w:pPr>
+      <w:r>
+        <w:t>6.1.1.</w:t>
+      </w:r>
+      <w:r>
+        <w:t>X</w:t>
+      </w:r>
+      <w:r>
+        <w:t xml:space="preserve"> [</w:t>
+      </w:r>
+      <w:r>
+        <w:t>TU</w:t>
+      </w:r>
+      <w:r>
+        <w:t>001.0</w:t>
+      </w:r>
+      <w:r>
+        <w:t>X</w:t>
+      </w:r>
+      <w:r>
+        <w:t xml:space="preserve">] </w:t>
+      </w:r>
+      <w:r>
+        <w:rPr>
+          <w:color w:val="000000" w:themeColor="text1"/>
+        </w:rPr>
+        <w:t>O sistema não deve cadastrar usuário quando o login já existe</w:t>
+      </w:r>
+    </w:p>
+    <w:p/>
+    <w:p>
+      <w:pPr>
+        <w:rPr>
+          <w:color w:val="000000" w:themeColor="text1"/>
+        </w:rPr>
+      </w:pPr>
+      <w:r>
+        <w:rPr>
+          <w:b/>
+          <w:bCs/>
+          <w:color w:val="000000" w:themeColor="text1"/>
+        </w:rPr>
+        <w:t>Camada:</w:t>
+      </w:r>
+      <w:r>
+        <w:rPr>
+          <w:color w:val="000000" w:themeColor="text1"/>
+        </w:rPr>
+        <w:t xml:space="preserve"> Serviço.</w:t>
+      </w:r>
+    </w:p>
+    <w:p>
+      <w:pPr>
+        <w:rPr>
+          <w:color w:val="000000" w:themeColor="text1"/>
+        </w:rPr>
+      </w:pPr>
+      <w:r>
+        <w:rPr>
+          <w:b/>
+          <w:color w:val="000000" w:themeColor="text1"/>
+        </w:rPr>
+        <w:t>Requisitos associados:</w:t>
+      </w:r>
+      <w:r>
+        <w:rPr>
+          <w:color w:val="000000" w:themeColor="text1"/>
+        </w:rPr>
+        <w:t xml:space="preserve"> RF001.01</w:t>
+      </w:r>
+      <w:r>
+        <w:rPr>
+          <w:color w:val="000000" w:themeColor="text1"/>
+        </w:rPr>
+        <w:t>, RN</w:t>
+      </w:r>
+      <w:r>
+        <w:rPr>
+          <w:color w:val="000000" w:themeColor="text1"/>
+        </w:rPr>
+        <w:t>.</w:t>
+      </w:r>
+    </w:p>
+    <w:p>
+      <w:pPr>
+        <w:rPr>
+          <w:color w:val="000000" w:themeColor="text1"/>
+        </w:rPr>
+      </w:pPr>
+      <w:r>
+        <w:rPr>
+          <w:b/>
+          <w:color w:val="000000" w:themeColor="text1"/>
+        </w:rPr>
+        <w:t xml:space="preserve">Descrição: </w:t>
+      </w:r>
+      <w:r>
+        <w:rPr>
+          <w:color w:val="000000" w:themeColor="text1"/>
+        </w:rPr>
+        <w:t>O sistema não deve cadastrar usuário.</w:t>
+      </w:r>
+    </w:p>
+    <w:p>
+      <w:pPr>
+        <w:rPr>
+          <w:color w:val="000000" w:themeColor="text1"/>
+        </w:rPr>
+      </w:pPr>
+      <w:r>
+        <w:rPr>
+          <w:b/>
+          <w:color w:val="000000" w:themeColor="text1"/>
+        </w:rPr>
+        <w:t>Condições</w:t>
+      </w:r>
+      <w:r>
+        <w:rPr>
+          <w:color w:val="000000" w:themeColor="text1"/>
+        </w:rPr>
+        <w:t>: Login existente.</w:t>
+      </w:r>
+    </w:p>
+    <w:p>
+      <w:pPr>
+        <w:rPr>
+          <w:color w:val="000000" w:themeColor="text1"/>
+        </w:rPr>
+      </w:pPr>
+      <w:r>
+        <w:rPr>
+          <w:b/>
+          <w:color w:val="000000" w:themeColor="text1"/>
+        </w:rPr>
+        <w:t>Passos:</w:t>
+      </w:r>
+      <w:r>
+        <w:rPr>
+          <w:color w:val="000000" w:themeColor="text1"/>
+        </w:rPr>
+        <w:t xml:space="preserve"> </w:t>
+      </w:r>
+    </w:p>
+    <w:p>
+      <w:pPr>
+        <w:pStyle w:val="PargrafodaLista"/>
+        <w:numPr>
+          <w:ilvl w:val="0"/>
+          <w:numId w:val="30"/>
+        </w:numPr>
+        <w:rPr>
+          <w:color w:val="000000" w:themeColor="text1"/>
+        </w:rPr>
+      </w:pPr>
+      <w:r>
+        <w:rPr>
+          <w:color w:val="000000" w:themeColor="text1"/>
+        </w:rPr>
+        <w:t>Informar os dados do usuário com login existente.</w:t>
+      </w:r>
+    </w:p>
+    <w:p>
+      <w:pPr>
+        <w:pStyle w:val="PargrafodaLista"/>
+        <w:numPr>
+          <w:ilvl w:val="0"/>
+          <w:numId w:val="30"/>
+        </w:numPr>
+        <w:rPr>
+          <w:color w:val="000000" w:themeColor="text1"/>
+        </w:rPr>
+      </w:pPr>
+      <w:r>
+        <w:rPr>
+          <w:color w:val="000000" w:themeColor="text1"/>
+        </w:rPr>
+        <w:t>Consultar no Repository se o login existe.</w:t>
+      </w:r>
+    </w:p>
+    <w:p>
+      <w:pPr>
+        <w:pStyle w:val="PargrafodaLista"/>
+        <w:numPr>
+          <w:ilvl w:val="0"/>
+          <w:numId w:val="30"/>
+        </w:numPr>
+        <w:rPr>
+          <w:color w:val="000000" w:themeColor="text1"/>
+        </w:rPr>
+      </w:pPr>
+      <w:r>
+        <w:rPr>
+          <w:color w:val="000000" w:themeColor="text1"/>
+        </w:rPr>
+        <w:t>Caso login exista lançar exceção.</w:t>
+      </w:r>
+    </w:p>
+    <w:p>
+      <w:pPr>
+        <w:rPr>
+          <w:color w:val="000000" w:themeColor="text1"/>
+        </w:rPr>
+      </w:pPr>
+      <w:r>
+        <w:rPr>
+          <w:b/>
+          <w:color w:val="000000" w:themeColor="text1"/>
+        </w:rPr>
+        <w:t>Dados do teste:</w:t>
+      </w:r>
+      <w:r>
+        <w:rPr>
+          <w:color w:val="000000" w:themeColor="text1"/>
+        </w:rPr>
+        <w:t xml:space="preserve"> </w:t>
+      </w:r>
+    </w:p>
+    <w:p>
+      <w:pPr>
+        <w:ind w:firstLine="720"/>
+        <w:rPr>
+          <w:color w:val="000000" w:themeColor="text1"/>
+        </w:rPr>
+      </w:pPr>
+      <w:r>
+        <w:rPr>
+          <w:color w:val="000000" w:themeColor="text1"/>
+        </w:rPr>
+        <w:t>{</w:t>
+      </w:r>
+    </w:p>
+    <w:p>
+      <w:pPr>
+        <w:rPr>
+          <w:color w:val="000000" w:themeColor="text1"/>
+        </w:rPr>
+      </w:pPr>
+      <w:r>
+        <w:rPr>
+          <w:color w:val="000000" w:themeColor="text1"/>
+        </w:rPr>
+        <w:tab/>
+      </w:r>
+      <w:r>
+        <w:rPr>
+          <w:color w:val="000000" w:themeColor="text1"/>
+        </w:rPr>
+        <w:tab/>
+      </w:r>
+      <w:r>
+        <w:rPr>
+          <w:color w:val="000000" w:themeColor="text1"/>
+        </w:rPr>
+        <w:t>nome: “Usuário Teste”</w:t>
+      </w:r>
+    </w:p>
+    <w:p>
+      <w:pPr>
+        <w:rPr>
+          <w:color w:val="000000" w:themeColor="text1"/>
+          <w:lang w:val="en-US"/>
+        </w:rPr>
+      </w:pPr>
+      <w:r>
+        <w:rPr>
+          <w:color w:val="000000" w:themeColor="text1"/>
+        </w:rPr>
+        <w:tab/>
+      </w:r>
+      <w:r>
+        <w:rPr>
+          <w:color w:val="000000" w:themeColor="text1"/>
+        </w:rPr>
+        <w:tab/>
+      </w:r>
+      <w:r>
+        <w:rPr>
+          <w:color w:val="000000" w:themeColor="text1"/>
+          <w:lang w:val="en-US"/>
+        </w:rPr>
+        <w:t>login: “</w:t>
+      </w:r>
+      <w:proofErr w:type="spellStart"/>
+      <w:r>
+        <w:rPr>
+          <w:color w:val="000000" w:themeColor="text1"/>
+          <w:lang w:val="en-US"/>
+        </w:rPr>
+        <w:t>login_existente</w:t>
+      </w:r>
+      <w:proofErr w:type="spellEnd"/>
+      <w:r>
+        <w:rPr>
+          <w:color w:val="000000" w:themeColor="text1"/>
+          <w:lang w:val="en-US"/>
+        </w:rPr>
+        <w:t>”</w:t>
+      </w:r>
+    </w:p>
+    <w:p>
+      <w:pPr>
+        <w:rPr>
+          <w:color w:val="000000" w:themeColor="text1"/>
+          <w:lang w:val="en-US"/>
+        </w:rPr>
+      </w:pPr>
+      <w:r>
+        <w:rPr>
+          <w:color w:val="000000" w:themeColor="text1"/>
+          <w:lang w:val="en-US"/>
+        </w:rPr>
+        <w:tab/>
+      </w:r>
+      <w:r>
+        <w:rPr>
+          <w:color w:val="000000" w:themeColor="text1"/>
+          <w:lang w:val="en-US"/>
+        </w:rPr>
+        <w:tab/>
+        <w:t>password: “teste”</w:t>
+      </w:r>
+    </w:p>
+    <w:p>
+      <w:pPr>
+        <w:rPr>
+          <w:color w:val="000000" w:themeColor="text1"/>
+        </w:rPr>
+      </w:pPr>
+      <w:r>
+        <w:rPr>
+          <w:color w:val="000000" w:themeColor="text1"/>
+          <w:lang w:val="en-US"/>
+        </w:rPr>
+        <w:tab/>
+      </w:r>
+      <w:r>
+        <w:rPr>
+          <w:color w:val="000000" w:themeColor="text1"/>
+          <w:lang w:val="en-US"/>
+        </w:rPr>
+        <w:tab/>
+      </w:r>
       <w:r>
         <w:rPr>
           <w:color w:val="000000" w:themeColor="text1"/>
@@ -11231,6 +11902,7 @@
         <w:rPr>
           <w:color w:val="000000" w:themeColor="text1"/>
         </w:rPr>
+        <w:lastRenderedPageBreak/>
         <w:tab/>
       </w:r>
       <w:r>
@@ -12064,6 +12736,92 @@
     </w:lvl>
   </w:abstractNum>
   <w:abstractNum w:abstractNumId="2" w15:restartNumberingAfterBreak="0">
+    <w:nsid w:val="0C792592"/>
+    <w:multiLevelType w:val="multilevel"/>
+    <w:tmpl w:val="7EAE38A0"/>
+    <w:lvl w:ilvl="0">
+      <w:start w:val="1"/>
+      <w:numFmt w:val="decimal"/>
+      <w:lvlText w:val="%1."/>
+      <w:lvlJc w:val="left"/>
+      <w:pPr>
+        <w:ind w:left="709" w:hanging="360"/>
+      </w:pPr>
+    </w:lvl>
+    <w:lvl w:ilvl="1">
+      <w:start w:val="1"/>
+      <w:numFmt w:val="lowerLetter"/>
+      <w:lvlText w:val="%2."/>
+      <w:lvlJc w:val="left"/>
+      <w:pPr>
+        <w:ind w:left="1429" w:hanging="360"/>
+      </w:pPr>
+    </w:lvl>
+    <w:lvl w:ilvl="2">
+      <w:start w:val="1"/>
+      <w:numFmt w:val="lowerRoman"/>
+      <w:lvlText w:val="%3."/>
+      <w:lvlJc w:val="right"/>
+      <w:pPr>
+        <w:ind w:left="2149" w:hanging="180"/>
+      </w:pPr>
+    </w:lvl>
+    <w:lvl w:ilvl="3">
+      <w:start w:val="1"/>
+      <w:numFmt w:val="decimal"/>
+      <w:lvlText w:val="%4."/>
+      <w:lvlJc w:val="left"/>
+      <w:pPr>
+        <w:ind w:left="2869" w:hanging="360"/>
+      </w:pPr>
+    </w:lvl>
+    <w:lvl w:ilvl="4">
+      <w:start w:val="1"/>
+      <w:numFmt w:val="lowerLetter"/>
+      <w:lvlText w:val="%5."/>
+      <w:lvlJc w:val="left"/>
+      <w:pPr>
+        <w:ind w:left="3589" w:hanging="360"/>
+      </w:pPr>
+    </w:lvl>
+    <w:lvl w:ilvl="5">
+      <w:start w:val="1"/>
+      <w:numFmt w:val="lowerRoman"/>
+      <w:lvlText w:val="%6."/>
+      <w:lvlJc w:val="right"/>
+      <w:pPr>
+        <w:ind w:left="4309" w:hanging="180"/>
+      </w:pPr>
+    </w:lvl>
+    <w:lvl w:ilvl="6">
+      <w:start w:val="1"/>
+      <w:numFmt w:val="decimal"/>
+      <w:lvlText w:val="%7."/>
+      <w:lvlJc w:val="left"/>
+      <w:pPr>
+        <w:ind w:left="5029" w:hanging="360"/>
+      </w:pPr>
+    </w:lvl>
+    <w:lvl w:ilvl="7">
+      <w:start w:val="1"/>
+      <w:numFmt w:val="lowerLetter"/>
+      <w:lvlText w:val="%8."/>
+      <w:lvlJc w:val="left"/>
+      <w:pPr>
+        <w:ind w:left="5749" w:hanging="360"/>
+      </w:pPr>
+    </w:lvl>
+    <w:lvl w:ilvl="8">
+      <w:start w:val="1"/>
+      <w:numFmt w:val="lowerRoman"/>
+      <w:lvlText w:val="%9."/>
+      <w:lvlJc w:val="right"/>
+      <w:pPr>
+        <w:ind w:left="6469" w:hanging="180"/>
+      </w:pPr>
+    </w:lvl>
+  </w:abstractNum>
+  <w:abstractNum w:abstractNumId="3" w15:restartNumberingAfterBreak="0">
     <w:nsid w:val="0F7126F9"/>
     <w:multiLevelType w:val="multilevel"/>
     <w:tmpl w:val="992CC7A0"/>
@@ -12149,7 +12907,7 @@
       </w:pPr>
     </w:lvl>
   </w:abstractNum>
-  <w:abstractNum w:abstractNumId="3" w15:restartNumberingAfterBreak="0">
+  <w:abstractNum w:abstractNumId="4" w15:restartNumberingAfterBreak="0">
     <w:nsid w:val="10C87B59"/>
     <w:multiLevelType w:val="multilevel"/>
     <w:tmpl w:val="98CC4F86"/>
@@ -12262,7 +13020,7 @@
       </w:rPr>
     </w:lvl>
   </w:abstractNum>
-  <w:abstractNum w:abstractNumId="4" w15:restartNumberingAfterBreak="0">
+  <w:abstractNum w:abstractNumId="5" w15:restartNumberingAfterBreak="0">
     <w:nsid w:val="1C297EA4"/>
     <w:multiLevelType w:val="multilevel"/>
     <w:tmpl w:val="4C245F70"/>
@@ -12375,7 +13133,7 @@
       </w:rPr>
     </w:lvl>
   </w:abstractNum>
-  <w:abstractNum w:abstractNumId="5" w15:restartNumberingAfterBreak="0">
+  <w:abstractNum w:abstractNumId="6" w15:restartNumberingAfterBreak="0">
     <w:nsid w:val="2567169C"/>
     <w:multiLevelType w:val="multilevel"/>
     <w:tmpl w:val="7EAE38A0"/>
@@ -12461,7 +13219,7 @@
       </w:pPr>
     </w:lvl>
   </w:abstractNum>
-  <w:abstractNum w:abstractNumId="6" w15:restartNumberingAfterBreak="0">
+  <w:abstractNum w:abstractNumId="7" w15:restartNumberingAfterBreak="0">
     <w:nsid w:val="27687D6D"/>
     <w:multiLevelType w:val="multilevel"/>
     <w:tmpl w:val="33B28994"/>
@@ -12547,7 +13305,7 @@
       </w:pPr>
     </w:lvl>
   </w:abstractNum>
-  <w:abstractNum w:abstractNumId="7" w15:restartNumberingAfterBreak="0">
+  <w:abstractNum w:abstractNumId="8" w15:restartNumberingAfterBreak="0">
     <w:nsid w:val="28492A00"/>
     <w:multiLevelType w:val="multilevel"/>
     <w:tmpl w:val="DF10247E"/>
@@ -12660,7 +13418,7 @@
       </w:rPr>
     </w:lvl>
   </w:abstractNum>
-  <w:abstractNum w:abstractNumId="8" w15:restartNumberingAfterBreak="0">
+  <w:abstractNum w:abstractNumId="9" w15:restartNumberingAfterBreak="0">
     <w:nsid w:val="29530051"/>
     <w:multiLevelType w:val="multilevel"/>
     <w:tmpl w:val="C04CB900"/>
@@ -12773,7 +13531,7 @@
       </w:rPr>
     </w:lvl>
   </w:abstractNum>
-  <w:abstractNum w:abstractNumId="9" w15:restartNumberingAfterBreak="0">
+  <w:abstractNum w:abstractNumId="10" w15:restartNumberingAfterBreak="0">
     <w:nsid w:val="311B04C2"/>
     <w:multiLevelType w:val="multilevel"/>
     <w:tmpl w:val="4B86EAF0"/>
@@ -12886,7 +13644,7 @@
       </w:rPr>
     </w:lvl>
   </w:abstractNum>
-  <w:abstractNum w:abstractNumId="10" w15:restartNumberingAfterBreak="0">
+  <w:abstractNum w:abstractNumId="11" w15:restartNumberingAfterBreak="0">
     <w:nsid w:val="35873CED"/>
     <w:multiLevelType w:val="multilevel"/>
     <w:tmpl w:val="316EA91C"/>
@@ -12999,7 +13757,7 @@
       </w:rPr>
     </w:lvl>
   </w:abstractNum>
-  <w:abstractNum w:abstractNumId="11" w15:restartNumberingAfterBreak="0">
+  <w:abstractNum w:abstractNumId="12" w15:restartNumberingAfterBreak="0">
     <w:nsid w:val="35D208BE"/>
     <w:multiLevelType w:val="hybridMultilevel"/>
     <w:tmpl w:val="FEB2915A"/>
@@ -13112,7 +13870,7 @@
       </w:rPr>
     </w:lvl>
   </w:abstractNum>
-  <w:abstractNum w:abstractNumId="12" w15:restartNumberingAfterBreak="0">
+  <w:abstractNum w:abstractNumId="13" w15:restartNumberingAfterBreak="0">
     <w:nsid w:val="3AE82604"/>
     <w:multiLevelType w:val="multilevel"/>
     <w:tmpl w:val="5EC8825C"/>
@@ -13225,7 +13983,7 @@
       </w:rPr>
     </w:lvl>
   </w:abstractNum>
-  <w:abstractNum w:abstractNumId="13" w15:restartNumberingAfterBreak="0">
+  <w:abstractNum w:abstractNumId="14" w15:restartNumberingAfterBreak="0">
     <w:nsid w:val="425F7142"/>
     <w:multiLevelType w:val="multilevel"/>
     <w:tmpl w:val="6C3A65C8"/>
@@ -13338,7 +14096,7 @@
       </w:rPr>
     </w:lvl>
   </w:abstractNum>
-  <w:abstractNum w:abstractNumId="14" w15:restartNumberingAfterBreak="0">
+  <w:abstractNum w:abstractNumId="15" w15:restartNumberingAfterBreak="0">
     <w:nsid w:val="433872DF"/>
     <w:multiLevelType w:val="multilevel"/>
     <w:tmpl w:val="473E9B32"/>
@@ -13451,7 +14209,7 @@
       </w:rPr>
     </w:lvl>
   </w:abstractNum>
-  <w:abstractNum w:abstractNumId="15" w15:restartNumberingAfterBreak="0">
+  <w:abstractNum w:abstractNumId="16" w15:restartNumberingAfterBreak="0">
     <w:nsid w:val="4ABF56A0"/>
     <w:multiLevelType w:val="multilevel"/>
     <w:tmpl w:val="0D8E790A"/>
@@ -13537,7 +14295,7 @@
       </w:pPr>
     </w:lvl>
   </w:abstractNum>
-  <w:abstractNum w:abstractNumId="16" w15:restartNumberingAfterBreak="0">
+  <w:abstractNum w:abstractNumId="17" w15:restartNumberingAfterBreak="0">
     <w:nsid w:val="4C99572E"/>
     <w:multiLevelType w:val="hybridMultilevel"/>
     <w:tmpl w:val="81062254"/>
@@ -13650,7 +14408,7 @@
       </w:rPr>
     </w:lvl>
   </w:abstractNum>
-  <w:abstractNum w:abstractNumId="17" w15:restartNumberingAfterBreak="0">
+  <w:abstractNum w:abstractNumId="18" w15:restartNumberingAfterBreak="0">
     <w:nsid w:val="4DB86243"/>
     <w:multiLevelType w:val="multilevel"/>
     <w:tmpl w:val="D652AE68"/>
@@ -13763,7 +14521,7 @@
       </w:rPr>
     </w:lvl>
   </w:abstractNum>
-  <w:abstractNum w:abstractNumId="18" w15:restartNumberingAfterBreak="0">
+  <w:abstractNum w:abstractNumId="19" w15:restartNumberingAfterBreak="0">
     <w:nsid w:val="5C394BC9"/>
     <w:multiLevelType w:val="multilevel"/>
     <w:tmpl w:val="7EAE38A0"/>
@@ -13849,7 +14607,7 @@
       </w:pPr>
     </w:lvl>
   </w:abstractNum>
-  <w:abstractNum w:abstractNumId="19" w15:restartNumberingAfterBreak="0">
+  <w:abstractNum w:abstractNumId="20" w15:restartNumberingAfterBreak="0">
     <w:nsid w:val="610B3EDF"/>
     <w:multiLevelType w:val="multilevel"/>
     <w:tmpl w:val="7EAE38A0"/>
@@ -13935,7 +14693,7 @@
       </w:pPr>
     </w:lvl>
   </w:abstractNum>
-  <w:abstractNum w:abstractNumId="20" w15:restartNumberingAfterBreak="0">
+  <w:abstractNum w:abstractNumId="21" w15:restartNumberingAfterBreak="0">
     <w:nsid w:val="67403CB5"/>
     <w:multiLevelType w:val="multilevel"/>
     <w:tmpl w:val="75326788"/>
@@ -14048,7 +14806,7 @@
       </w:rPr>
     </w:lvl>
   </w:abstractNum>
-  <w:abstractNum w:abstractNumId="21" w15:restartNumberingAfterBreak="0">
+  <w:abstractNum w:abstractNumId="22" w15:restartNumberingAfterBreak="0">
     <w:nsid w:val="67C547F7"/>
     <w:multiLevelType w:val="multilevel"/>
     <w:tmpl w:val="35EAD4B8"/>
@@ -14134,7 +14892,7 @@
       </w:pPr>
     </w:lvl>
   </w:abstractNum>
-  <w:abstractNum w:abstractNumId="22" w15:restartNumberingAfterBreak="0">
+  <w:abstractNum w:abstractNumId="23" w15:restartNumberingAfterBreak="0">
     <w:nsid w:val="6C8202C1"/>
     <w:multiLevelType w:val="multilevel"/>
     <w:tmpl w:val="981048B2"/>
@@ -14247,7 +15005,7 @@
       </w:rPr>
     </w:lvl>
   </w:abstractNum>
-  <w:abstractNum w:abstractNumId="23" w15:restartNumberingAfterBreak="0">
+  <w:abstractNum w:abstractNumId="24" w15:restartNumberingAfterBreak="0">
     <w:nsid w:val="6CD6232C"/>
     <w:multiLevelType w:val="multilevel"/>
     <w:tmpl w:val="2C50429A"/>
@@ -14360,7 +15118,7 @@
       </w:rPr>
     </w:lvl>
   </w:abstractNum>
-  <w:abstractNum w:abstractNumId="24" w15:restartNumberingAfterBreak="0">
+  <w:abstractNum w:abstractNumId="25" w15:restartNumberingAfterBreak="0">
     <w:nsid w:val="6FBC5385"/>
     <w:multiLevelType w:val="multilevel"/>
     <w:tmpl w:val="9E36186C"/>
@@ -14473,7 +15231,7 @@
       </w:rPr>
     </w:lvl>
   </w:abstractNum>
-  <w:abstractNum w:abstractNumId="25" w15:restartNumberingAfterBreak="0">
+  <w:abstractNum w:abstractNumId="26" w15:restartNumberingAfterBreak="0">
     <w:nsid w:val="7ABF4D30"/>
     <w:multiLevelType w:val="multilevel"/>
     <w:tmpl w:val="C61A779C"/>
@@ -14586,7 +15344,7 @@
       </w:rPr>
     </w:lvl>
   </w:abstractNum>
-  <w:abstractNum w:abstractNumId="26" w15:restartNumberingAfterBreak="0">
+  <w:abstractNum w:abstractNumId="27" w15:restartNumberingAfterBreak="0">
     <w:nsid w:val="7E36314E"/>
     <w:multiLevelType w:val="hybridMultilevel"/>
     <w:tmpl w:val="6FDA89B4"/>
@@ -14699,7 +15457,7 @@
       </w:rPr>
     </w:lvl>
   </w:abstractNum>
-  <w:abstractNum w:abstractNumId="27" w15:restartNumberingAfterBreak="0">
+  <w:abstractNum w:abstractNumId="28" w15:restartNumberingAfterBreak="0">
     <w:nsid w:val="7ED21264"/>
     <w:multiLevelType w:val="multilevel"/>
     <w:tmpl w:val="87B4A5EE"/>
@@ -14812,7 +15570,7 @@
       </w:rPr>
     </w:lvl>
   </w:abstractNum>
-  <w:abstractNum w:abstractNumId="28" w15:restartNumberingAfterBreak="0">
+  <w:abstractNum w:abstractNumId="29" w15:restartNumberingAfterBreak="0">
     <w:nsid w:val="7FF4155E"/>
     <w:multiLevelType w:val="multilevel"/>
     <w:tmpl w:val="F9722B4C"/>
@@ -14905,88 +15663,91 @@
     <w:abstractNumId w:val="1"/>
   </w:num>
   <w:num w:numId="2" w16cid:durableId="88086438">
-    <w:abstractNumId w:val="25"/>
+    <w:abstractNumId w:val="26"/>
   </w:num>
   <w:num w:numId="3" w16cid:durableId="1706714901">
-    <w:abstractNumId w:val="23"/>
+    <w:abstractNumId w:val="24"/>
   </w:num>
   <w:num w:numId="4" w16cid:durableId="113717744">
     <w:abstractNumId w:val="0"/>
   </w:num>
   <w:num w:numId="5" w16cid:durableId="74671158">
+    <w:abstractNumId w:val="10"/>
+  </w:num>
+  <w:num w:numId="6" w16cid:durableId="913590874">
+    <w:abstractNumId w:val="18"/>
+  </w:num>
+  <w:num w:numId="7" w16cid:durableId="1890459348">
+    <w:abstractNumId w:val="29"/>
+  </w:num>
+  <w:num w:numId="8" w16cid:durableId="333532636">
     <w:abstractNumId w:val="9"/>
   </w:num>
-  <w:num w:numId="6" w16cid:durableId="913590874">
+  <w:num w:numId="9" w16cid:durableId="128785046">
+    <w:abstractNumId w:val="23"/>
+  </w:num>
+  <w:num w:numId="10" w16cid:durableId="905458532">
+    <w:abstractNumId w:val="5"/>
+  </w:num>
+  <w:num w:numId="11" w16cid:durableId="1135484454">
+    <w:abstractNumId w:val="11"/>
+  </w:num>
+  <w:num w:numId="12" w16cid:durableId="568999983">
+    <w:abstractNumId w:val="28"/>
+  </w:num>
+  <w:num w:numId="13" w16cid:durableId="1767190151">
+    <w:abstractNumId w:val="4"/>
+  </w:num>
+  <w:num w:numId="14" w16cid:durableId="715394213">
+    <w:abstractNumId w:val="15"/>
+  </w:num>
+  <w:num w:numId="15" w16cid:durableId="1314019323">
+    <w:abstractNumId w:val="13"/>
+  </w:num>
+  <w:num w:numId="16" w16cid:durableId="2108111862">
+    <w:abstractNumId w:val="25"/>
+  </w:num>
+  <w:num w:numId="17" w16cid:durableId="1320620575">
+    <w:abstractNumId w:val="21"/>
+  </w:num>
+  <w:num w:numId="18" w16cid:durableId="1431511382">
+    <w:abstractNumId w:val="8"/>
+  </w:num>
+  <w:num w:numId="19" w16cid:durableId="1528325566">
+    <w:abstractNumId w:val="14"/>
+  </w:num>
+  <w:num w:numId="20" w16cid:durableId="990518204">
+    <w:abstractNumId w:val="16"/>
+  </w:num>
+  <w:num w:numId="21" w16cid:durableId="900098538">
+    <w:abstractNumId w:val="7"/>
+  </w:num>
+  <w:num w:numId="22" w16cid:durableId="1159611945">
+    <w:abstractNumId w:val="22"/>
+  </w:num>
+  <w:num w:numId="23" w16cid:durableId="727652842">
+    <w:abstractNumId w:val="3"/>
+  </w:num>
+  <w:num w:numId="24" w16cid:durableId="1596135007">
+    <w:abstractNumId w:val="20"/>
+  </w:num>
+  <w:num w:numId="25" w16cid:durableId="414478111">
+    <w:abstractNumId w:val="19"/>
+  </w:num>
+  <w:num w:numId="26" w16cid:durableId="372466584">
+    <w:abstractNumId w:val="6"/>
+  </w:num>
+  <w:num w:numId="27" w16cid:durableId="1787504088">
+    <w:abstractNumId w:val="27"/>
+  </w:num>
+  <w:num w:numId="28" w16cid:durableId="927734810">
     <w:abstractNumId w:val="17"/>
   </w:num>
-  <w:num w:numId="7" w16cid:durableId="1890459348">
-    <w:abstractNumId w:val="28"/>
-  </w:num>
-  <w:num w:numId="8" w16cid:durableId="333532636">
-    <w:abstractNumId w:val="8"/>
-  </w:num>
-  <w:num w:numId="9" w16cid:durableId="128785046">
-    <w:abstractNumId w:val="22"/>
-  </w:num>
-  <w:num w:numId="10" w16cid:durableId="905458532">
-    <w:abstractNumId w:val="4"/>
-  </w:num>
-  <w:num w:numId="11" w16cid:durableId="1135484454">
-    <w:abstractNumId w:val="10"/>
-  </w:num>
-  <w:num w:numId="12" w16cid:durableId="568999983">
-    <w:abstractNumId w:val="27"/>
-  </w:num>
-  <w:num w:numId="13" w16cid:durableId="1767190151">
-    <w:abstractNumId w:val="3"/>
-  </w:num>
-  <w:num w:numId="14" w16cid:durableId="715394213">
-    <w:abstractNumId w:val="14"/>
-  </w:num>
-  <w:num w:numId="15" w16cid:durableId="1314019323">
+  <w:num w:numId="29" w16cid:durableId="1914387497">
     <w:abstractNumId w:val="12"/>
   </w:num>
-  <w:num w:numId="16" w16cid:durableId="2108111862">
-    <w:abstractNumId w:val="24"/>
-  </w:num>
-  <w:num w:numId="17" w16cid:durableId="1320620575">
-    <w:abstractNumId w:val="20"/>
-  </w:num>
-  <w:num w:numId="18" w16cid:durableId="1431511382">
-    <w:abstractNumId w:val="7"/>
-  </w:num>
-  <w:num w:numId="19" w16cid:durableId="1528325566">
-    <w:abstractNumId w:val="13"/>
-  </w:num>
-  <w:num w:numId="20" w16cid:durableId="990518204">
-    <w:abstractNumId w:val="15"/>
-  </w:num>
-  <w:num w:numId="21" w16cid:durableId="900098538">
-    <w:abstractNumId w:val="6"/>
-  </w:num>
-  <w:num w:numId="22" w16cid:durableId="1159611945">
-    <w:abstractNumId w:val="21"/>
-  </w:num>
-  <w:num w:numId="23" w16cid:durableId="727652842">
+  <w:num w:numId="30" w16cid:durableId="36636164">
     <w:abstractNumId w:val="2"/>
-  </w:num>
-  <w:num w:numId="24" w16cid:durableId="1596135007">
-    <w:abstractNumId w:val="19"/>
-  </w:num>
-  <w:num w:numId="25" w16cid:durableId="414478111">
-    <w:abstractNumId w:val="18"/>
-  </w:num>
-  <w:num w:numId="26" w16cid:durableId="372466584">
-    <w:abstractNumId w:val="5"/>
-  </w:num>
-  <w:num w:numId="27" w16cid:durableId="1787504088">
-    <w:abstractNumId w:val="26"/>
-  </w:num>
-  <w:num w:numId="28" w16cid:durableId="927734810">
-    <w:abstractNumId w:val="16"/>
-  </w:num>
-  <w:num w:numId="29" w16cid:durableId="1914387497">
-    <w:abstractNumId w:val="11"/>
   </w:num>
 </w:numbering>
 </file>

</xml_diff>

<commit_message>
docs: Adicionado teste unitário TU001.05
</commit_message>
<xml_diff>
--- a/documentation/Especificacao_de_Requisitos_de_Software.docx
+++ b/documentation/Especificacao_de_Requisitos_de_Software.docx
@@ -11515,19 +11515,13 @@
         <w:t>6.1.1.</w:t>
       </w:r>
       <w:r>
-        <w:t>X</w:t>
-      </w:r>
-      <w:r>
-        <w:t xml:space="preserve"> [</w:t>
-      </w:r>
-      <w:r>
-        <w:t>TU</w:t>
-      </w:r>
-      <w:r>
-        <w:t>001.0</w:t>
-      </w:r>
-      <w:r>
-        <w:t>X</w:t>
+        <w:t>5</w:t>
+      </w:r>
+      <w:r>
+        <w:t xml:space="preserve"> [TU001.0</w:t>
+      </w:r>
+      <w:r>
+        <w:t>5</w:t>
       </w:r>
       <w:r>
         <w:t xml:space="preserve">] </w:t>
@@ -11536,7 +11530,13 @@
         <w:rPr>
           <w:color w:val="000000" w:themeColor="text1"/>
         </w:rPr>
-        <w:t>O sistema não deve cadastrar usuário quando o login já existe</w:t>
+        <w:t xml:space="preserve">O sistema não deve cadastrar usuário quando o nome tem </w:t>
+      </w:r>
+      <w:r>
+        <w:rPr>
+          <w:color w:val="000000" w:themeColor="text1"/>
+        </w:rPr>
+        <w:t>apenas espaços em branco</w:t>
       </w:r>
     </w:p>
     <w:p/>
@@ -11578,13 +11578,13 @@
         <w:rPr>
           <w:color w:val="000000" w:themeColor="text1"/>
         </w:rPr>
-        <w:t xml:space="preserve"> RF001.01</w:t>
-      </w:r>
-      <w:r>
-        <w:rPr>
-          <w:color w:val="000000" w:themeColor="text1"/>
-        </w:rPr>
-        <w:t>, RN</w:t>
+        <w:t xml:space="preserve"> RF001.01, RN001.0</w:t>
+      </w:r>
+      <w:r>
+        <w:rPr>
+          <w:color w:val="000000" w:themeColor="text1"/>
+        </w:rPr>
+        <w:t>2</w:t>
       </w:r>
       <w:r>
         <w:rPr>
@@ -11630,7 +11630,31 @@
         <w:rPr>
           <w:color w:val="000000" w:themeColor="text1"/>
         </w:rPr>
-        <w:t>: Login existente.</w:t>
+        <w:t xml:space="preserve">: Nome do usuário com </w:t>
+      </w:r>
+      <w:r>
+        <w:rPr>
+          <w:color w:val="000000" w:themeColor="text1"/>
+        </w:rPr>
+        <w:t>5</w:t>
+      </w:r>
+      <w:r>
+        <w:rPr>
+          <w:color w:val="000000" w:themeColor="text1"/>
+        </w:rPr>
+        <w:t xml:space="preserve"> </w:t>
+      </w:r>
+      <w:r>
+        <w:rPr>
+          <w:color w:val="000000" w:themeColor="text1"/>
+        </w:rPr>
+        <w:t>espaços em branco</w:t>
+      </w:r>
+      <w:r>
+        <w:rPr>
+          <w:color w:val="000000" w:themeColor="text1"/>
+        </w:rPr>
+        <w:t>.</w:t>
       </w:r>
     </w:p>
     <w:p>
@@ -11658,7 +11682,7 @@
         <w:pStyle w:val="PargrafodaLista"/>
         <w:numPr>
           <w:ilvl w:val="0"/>
-          <w:numId w:val="30"/>
+          <w:numId w:val="31"/>
         </w:numPr>
         <w:rPr>
           <w:color w:val="000000" w:themeColor="text1"/>
@@ -11668,7 +11692,7 @@
         <w:rPr>
           <w:color w:val="000000" w:themeColor="text1"/>
         </w:rPr>
-        <w:t>Informar os dados do usuário com login existente.</w:t>
+        <w:t>Informar os dados do usuário com o nome com 5 espaços em branco.</w:t>
       </w:r>
     </w:p>
     <w:p>
@@ -11676,7 +11700,7 @@
         <w:pStyle w:val="PargrafodaLista"/>
         <w:numPr>
           <w:ilvl w:val="0"/>
-          <w:numId w:val="30"/>
+          <w:numId w:val="31"/>
         </w:numPr>
         <w:rPr>
           <w:color w:val="000000" w:themeColor="text1"/>
@@ -11686,7 +11710,31 @@
         <w:rPr>
           <w:color w:val="000000" w:themeColor="text1"/>
         </w:rPr>
-        <w:t>Consultar no Repository se o login existe.</w:t>
+        <w:t xml:space="preserve">Validar </w:t>
+      </w:r>
+      <w:r>
+        <w:rPr>
+          <w:color w:val="000000" w:themeColor="text1"/>
+        </w:rPr>
+        <w:t>os</w:t>
+      </w:r>
+      <w:r>
+        <w:rPr>
+          <w:color w:val="000000" w:themeColor="text1"/>
+        </w:rPr>
+        <w:t xml:space="preserve"> caracteres</w:t>
+      </w:r>
+      <w:r>
+        <w:rPr>
+          <w:color w:val="000000" w:themeColor="text1"/>
+        </w:rPr>
+        <w:t xml:space="preserve"> em branco</w:t>
+      </w:r>
+      <w:r>
+        <w:rPr>
+          <w:color w:val="000000" w:themeColor="text1"/>
+        </w:rPr>
+        <w:t xml:space="preserve"> do nome.</w:t>
       </w:r>
     </w:p>
     <w:p>
@@ -11694,7 +11742,7 @@
         <w:pStyle w:val="PargrafodaLista"/>
         <w:numPr>
           <w:ilvl w:val="0"/>
-          <w:numId w:val="30"/>
+          <w:numId w:val="31"/>
         </w:numPr>
         <w:rPr>
           <w:color w:val="000000" w:themeColor="text1"/>
@@ -11704,7 +11752,7 @@
         <w:rPr>
           <w:color w:val="000000" w:themeColor="text1"/>
         </w:rPr>
-        <w:t>Caso login exista lançar exceção.</w:t>
+        <w:t>Receber mensagem de erro ao cadastrar nome inválido.</w:t>
       </w:r>
     </w:p>
     <w:p>
@@ -11763,7 +11811,33 @@
         <w:rPr>
           <w:color w:val="000000" w:themeColor="text1"/>
         </w:rPr>
-        <w:t>nome: “Usuário Teste”</w:t>
+        <w:t xml:space="preserve">nome: </w:t>
+      </w:r>
+      <w:proofErr w:type="gramStart"/>
+      <w:r>
+        <w:rPr>
+          <w:color w:val="000000" w:themeColor="text1"/>
+        </w:rPr>
+        <w:t>“</w:t>
+      </w:r>
+      <w:r>
+        <w:rPr>
+          <w:color w:val="000000" w:themeColor="text1"/>
+        </w:rPr>
+        <w:t xml:space="preserve">  </w:t>
+      </w:r>
+      <w:proofErr w:type="gramEnd"/>
+      <w:r>
+        <w:rPr>
+          <w:color w:val="000000" w:themeColor="text1"/>
+        </w:rPr>
+        <w:t xml:space="preserve">   </w:t>
+      </w:r>
+      <w:r>
+        <w:rPr>
+          <w:color w:val="000000" w:themeColor="text1"/>
+        </w:rPr>
+        <w:t>”</w:t>
       </w:r>
     </w:p>
     <w:p>
@@ -11790,23 +11864,7 @@
           <w:color w:val="000000" w:themeColor="text1"/>
           <w:lang w:val="en-US"/>
         </w:rPr>
-        <w:t>login: “</w:t>
-      </w:r>
-      <w:proofErr w:type="spellStart"/>
-      <w:r>
-        <w:rPr>
-          <w:color w:val="000000" w:themeColor="text1"/>
-          <w:lang w:val="en-US"/>
-        </w:rPr>
-        <w:t>login_existente</w:t>
-      </w:r>
-      <w:proofErr w:type="spellEnd"/>
-      <w:r>
-        <w:rPr>
-          <w:color w:val="000000" w:themeColor="text1"/>
-          <w:lang w:val="en-US"/>
-        </w:rPr>
-        <w:t>”</w:t>
+        <w:t>login: “login”</w:t>
       </w:r>
     </w:p>
     <w:p>
@@ -11836,13 +11894,14 @@
       <w:pPr>
         <w:rPr>
           <w:color w:val="000000" w:themeColor="text1"/>
-        </w:rPr>
-      </w:pPr>
-      <w:r>
-        <w:rPr>
-          <w:color w:val="000000" w:themeColor="text1"/>
           <w:lang w:val="en-US"/>
         </w:rPr>
+      </w:pPr>
+      <w:r>
+        <w:rPr>
+          <w:color w:val="000000" w:themeColor="text1"/>
+          <w:lang w:val="en-US"/>
+        </w:rPr>
         <w:tab/>
       </w:r>
       <w:r>
@@ -11852,55 +11911,33 @@
         </w:rPr>
         <w:tab/>
       </w:r>
-      <w:r>
-        <w:rPr>
-          <w:color w:val="000000" w:themeColor="text1"/>
-        </w:rPr>
-        <w:t>telefone: “11912345678”</w:t>
-      </w:r>
-    </w:p>
-    <w:p>
-      <w:pPr>
-        <w:rPr>
-          <w:color w:val="000000" w:themeColor="text1"/>
-        </w:rPr>
-      </w:pPr>
-      <w:r>
-        <w:rPr>
-          <w:color w:val="000000" w:themeColor="text1"/>
-        </w:rPr>
-        <w:tab/>
-      </w:r>
-      <w:r>
-        <w:rPr>
-          <w:color w:val="000000" w:themeColor="text1"/>
-        </w:rPr>
-        <w:tab/>
-      </w:r>
       <w:proofErr w:type="spellStart"/>
       <w:r>
         <w:rPr>
           <w:color w:val="000000" w:themeColor="text1"/>
-        </w:rPr>
-        <w:t>email</w:t>
+          <w:lang w:val="en-US"/>
+        </w:rPr>
+        <w:t>telefone</w:t>
       </w:r>
       <w:proofErr w:type="spellEnd"/>
       <w:r>
         <w:rPr>
           <w:color w:val="000000" w:themeColor="text1"/>
-        </w:rPr>
-        <w:t>: “teste@email.com”</w:t>
-      </w:r>
-    </w:p>
-    <w:p>
-      <w:pPr>
-        <w:rPr>
-          <w:color w:val="000000" w:themeColor="text1"/>
-        </w:rPr>
-      </w:pPr>
-      <w:r>
-        <w:rPr>
-          <w:color w:val="000000" w:themeColor="text1"/>
+          <w:lang w:val="en-US"/>
+        </w:rPr>
+        <w:t>: “11912345678”</w:t>
+      </w:r>
+    </w:p>
+    <w:p>
+      <w:pPr>
+        <w:rPr>
+          <w:color w:val="000000" w:themeColor="text1"/>
+        </w:rPr>
+      </w:pPr>
+      <w:r>
+        <w:rPr>
+          <w:color w:val="000000" w:themeColor="text1"/>
+          <w:lang w:val="en-US"/>
         </w:rPr>
         <w:lastRenderedPageBreak/>
         <w:tab/>
@@ -11908,6 +11945,40 @@
       <w:r>
         <w:rPr>
           <w:color w:val="000000" w:themeColor="text1"/>
+          <w:lang w:val="en-US"/>
+        </w:rPr>
+        <w:tab/>
+      </w:r>
+      <w:proofErr w:type="spellStart"/>
+      <w:r>
+        <w:rPr>
+          <w:color w:val="000000" w:themeColor="text1"/>
+        </w:rPr>
+        <w:t>email</w:t>
+      </w:r>
+      <w:proofErr w:type="spellEnd"/>
+      <w:r>
+        <w:rPr>
+          <w:color w:val="000000" w:themeColor="text1"/>
+        </w:rPr>
+        <w:t>: “teste@email.com”</w:t>
+      </w:r>
+    </w:p>
+    <w:p>
+      <w:pPr>
+        <w:rPr>
+          <w:color w:val="000000" w:themeColor="text1"/>
+        </w:rPr>
+      </w:pPr>
+      <w:r>
+        <w:rPr>
+          <w:color w:val="000000" w:themeColor="text1"/>
+        </w:rPr>
+        <w:tab/>
+      </w:r>
+      <w:r>
+        <w:rPr>
+          <w:color w:val="000000" w:themeColor="text1"/>
         </w:rPr>
         <w:tab/>
         <w:t>status: ATIVO</w:t>
@@ -11971,6 +12042,561 @@
         <w:rPr>
           <w:color w:val="000000" w:themeColor="text1"/>
         </w:rPr>
+        <w:t>InvalidNameException</w:t>
+      </w:r>
+      <w:proofErr w:type="spellEnd"/>
+      <w:r>
+        <w:rPr>
+          <w:color w:val="000000" w:themeColor="text1"/>
+        </w:rPr>
+        <w:t xml:space="preserve"> com a mensagem “O nome do usuário </w:t>
+      </w:r>
+      <w:r>
+        <w:rPr>
+          <w:color w:val="000000" w:themeColor="text1"/>
+        </w:rPr>
+        <w:t>não pode conter apenas espaços em branco</w:t>
+      </w:r>
+      <w:r>
+        <w:rPr>
+          <w:color w:val="000000" w:themeColor="text1"/>
+        </w:rPr>
+        <w:t>”.</w:t>
+      </w:r>
+    </w:p>
+    <w:p>
+      <w:pPr>
+        <w:rPr>
+          <w:color w:val="000000" w:themeColor="text1"/>
+        </w:rPr>
+      </w:pPr>
+      <w:r>
+        <w:rPr>
+          <w:b/>
+          <w:color w:val="000000" w:themeColor="text1"/>
+        </w:rPr>
+        <w:t>Status:</w:t>
+      </w:r>
+      <w:r>
+        <w:rPr>
+          <w:color w:val="000000" w:themeColor="text1"/>
+        </w:rPr>
+        <w:t xml:space="preserve"> Não realizado.</w:t>
+      </w:r>
+    </w:p>
+    <w:p>
+      <w:pPr>
+        <w:rPr>
+          <w:color w:val="000000" w:themeColor="text1"/>
+        </w:rPr>
+      </w:pPr>
+      <w:r>
+        <w:rPr>
+          <w:b/>
+          <w:color w:val="000000" w:themeColor="text1"/>
+        </w:rPr>
+        <w:t>Realização do teste:</w:t>
+      </w:r>
+      <w:r>
+        <w:rPr>
+          <w:color w:val="000000" w:themeColor="text1"/>
+        </w:rPr>
+        <w:t xml:space="preserve"> 00/00/0000.</w:t>
+      </w:r>
+    </w:p>
+    <w:p>
+      <w:pPr>
+        <w:rPr>
+          <w:color w:val="000000" w:themeColor="text1"/>
+        </w:rPr>
+      </w:pPr>
+      <w:r>
+        <w:rPr>
+          <w:b/>
+          <w:color w:val="000000" w:themeColor="text1"/>
+        </w:rPr>
+        <w:t xml:space="preserve">Responsável: </w:t>
+      </w:r>
+      <w:r>
+        <w:rPr>
+          <w:color w:val="000000" w:themeColor="text1"/>
+        </w:rPr>
+        <w:t>A definir.</w:t>
+      </w:r>
+    </w:p>
+    <w:p>
+      <w:pPr>
+        <w:rPr>
+          <w:color w:val="000000" w:themeColor="text1"/>
+        </w:rPr>
+      </w:pPr>
+    </w:p>
+    <w:p>
+      <w:pPr>
+        <w:pStyle w:val="Ttulo4"/>
+        <w:rPr>
+          <w:color w:val="FF0000"/>
+        </w:rPr>
+      </w:pPr>
+      <w:r>
+        <w:t>6.1.1.</w:t>
+      </w:r>
+      <w:r>
+        <w:t>X</w:t>
+      </w:r>
+      <w:r>
+        <w:t xml:space="preserve"> [</w:t>
+      </w:r>
+      <w:r>
+        <w:t>TU</w:t>
+      </w:r>
+      <w:r>
+        <w:t>001.0</w:t>
+      </w:r>
+      <w:r>
+        <w:t>X</w:t>
+      </w:r>
+      <w:r>
+        <w:t xml:space="preserve">] </w:t>
+      </w:r>
+      <w:r>
+        <w:rPr>
+          <w:color w:val="000000" w:themeColor="text1"/>
+        </w:rPr>
+        <w:t>O sistema não deve cadastrar usuário quando o login já existe</w:t>
+      </w:r>
+    </w:p>
+    <w:p/>
+    <w:p>
+      <w:pPr>
+        <w:rPr>
+          <w:color w:val="000000" w:themeColor="text1"/>
+        </w:rPr>
+      </w:pPr>
+      <w:r>
+        <w:rPr>
+          <w:b/>
+          <w:bCs/>
+          <w:color w:val="000000" w:themeColor="text1"/>
+        </w:rPr>
+        <w:t>Camada:</w:t>
+      </w:r>
+      <w:r>
+        <w:rPr>
+          <w:color w:val="000000" w:themeColor="text1"/>
+        </w:rPr>
+        <w:t xml:space="preserve"> Serviço.</w:t>
+      </w:r>
+    </w:p>
+    <w:p>
+      <w:pPr>
+        <w:rPr>
+          <w:color w:val="000000" w:themeColor="text1"/>
+        </w:rPr>
+      </w:pPr>
+      <w:r>
+        <w:rPr>
+          <w:b/>
+          <w:color w:val="000000" w:themeColor="text1"/>
+        </w:rPr>
+        <w:t>Requisitos associados:</w:t>
+      </w:r>
+      <w:r>
+        <w:rPr>
+          <w:color w:val="000000" w:themeColor="text1"/>
+        </w:rPr>
+        <w:t xml:space="preserve"> RF001.01</w:t>
+      </w:r>
+      <w:r>
+        <w:rPr>
+          <w:color w:val="000000" w:themeColor="text1"/>
+        </w:rPr>
+        <w:t>, RN</w:t>
+      </w:r>
+      <w:r>
+        <w:rPr>
+          <w:color w:val="000000" w:themeColor="text1"/>
+        </w:rPr>
+        <w:t>.</w:t>
+      </w:r>
+    </w:p>
+    <w:p>
+      <w:pPr>
+        <w:rPr>
+          <w:color w:val="000000" w:themeColor="text1"/>
+        </w:rPr>
+      </w:pPr>
+      <w:r>
+        <w:rPr>
+          <w:b/>
+          <w:color w:val="000000" w:themeColor="text1"/>
+        </w:rPr>
+        <w:t xml:space="preserve">Descrição: </w:t>
+      </w:r>
+      <w:r>
+        <w:rPr>
+          <w:color w:val="000000" w:themeColor="text1"/>
+        </w:rPr>
+        <w:t>O sistema não deve cadastrar usuário.</w:t>
+      </w:r>
+    </w:p>
+    <w:p>
+      <w:pPr>
+        <w:rPr>
+          <w:color w:val="000000" w:themeColor="text1"/>
+        </w:rPr>
+      </w:pPr>
+      <w:r>
+        <w:rPr>
+          <w:b/>
+          <w:color w:val="000000" w:themeColor="text1"/>
+        </w:rPr>
+        <w:t>Condições</w:t>
+      </w:r>
+      <w:r>
+        <w:rPr>
+          <w:color w:val="000000" w:themeColor="text1"/>
+        </w:rPr>
+        <w:t>: Login existente.</w:t>
+      </w:r>
+    </w:p>
+    <w:p>
+      <w:pPr>
+        <w:rPr>
+          <w:color w:val="000000" w:themeColor="text1"/>
+        </w:rPr>
+      </w:pPr>
+      <w:r>
+        <w:rPr>
+          <w:b/>
+          <w:color w:val="000000" w:themeColor="text1"/>
+        </w:rPr>
+        <w:t>Passos:</w:t>
+      </w:r>
+      <w:r>
+        <w:rPr>
+          <w:color w:val="000000" w:themeColor="text1"/>
+        </w:rPr>
+        <w:t xml:space="preserve"> </w:t>
+      </w:r>
+    </w:p>
+    <w:p>
+      <w:pPr>
+        <w:pStyle w:val="PargrafodaLista"/>
+        <w:numPr>
+          <w:ilvl w:val="0"/>
+          <w:numId w:val="31"/>
+        </w:numPr>
+        <w:rPr>
+          <w:color w:val="000000" w:themeColor="text1"/>
+        </w:rPr>
+      </w:pPr>
+      <w:r>
+        <w:rPr>
+          <w:color w:val="000000" w:themeColor="text1"/>
+        </w:rPr>
+        <w:t>Informar os dados do usuário com login existente.</w:t>
+      </w:r>
+    </w:p>
+    <w:p>
+      <w:pPr>
+        <w:pStyle w:val="PargrafodaLista"/>
+        <w:numPr>
+          <w:ilvl w:val="0"/>
+          <w:numId w:val="31"/>
+        </w:numPr>
+        <w:rPr>
+          <w:color w:val="000000" w:themeColor="text1"/>
+        </w:rPr>
+      </w:pPr>
+      <w:r>
+        <w:rPr>
+          <w:color w:val="000000" w:themeColor="text1"/>
+        </w:rPr>
+        <w:t>Consultar no Repository se o login existe.</w:t>
+      </w:r>
+    </w:p>
+    <w:p>
+      <w:pPr>
+        <w:pStyle w:val="PargrafodaLista"/>
+        <w:numPr>
+          <w:ilvl w:val="0"/>
+          <w:numId w:val="31"/>
+        </w:numPr>
+        <w:rPr>
+          <w:color w:val="000000" w:themeColor="text1"/>
+        </w:rPr>
+      </w:pPr>
+      <w:r>
+        <w:rPr>
+          <w:color w:val="000000" w:themeColor="text1"/>
+        </w:rPr>
+        <w:t>Caso login exista lançar exceção.</w:t>
+      </w:r>
+    </w:p>
+    <w:p>
+      <w:pPr>
+        <w:rPr>
+          <w:color w:val="000000" w:themeColor="text1"/>
+        </w:rPr>
+      </w:pPr>
+      <w:r>
+        <w:rPr>
+          <w:b/>
+          <w:color w:val="000000" w:themeColor="text1"/>
+        </w:rPr>
+        <w:t>Dados do teste:</w:t>
+      </w:r>
+      <w:r>
+        <w:rPr>
+          <w:color w:val="000000" w:themeColor="text1"/>
+        </w:rPr>
+        <w:t xml:space="preserve"> </w:t>
+      </w:r>
+    </w:p>
+    <w:p>
+      <w:pPr>
+        <w:ind w:firstLine="720"/>
+        <w:rPr>
+          <w:color w:val="000000" w:themeColor="text1"/>
+        </w:rPr>
+      </w:pPr>
+      <w:r>
+        <w:rPr>
+          <w:color w:val="000000" w:themeColor="text1"/>
+        </w:rPr>
+        <w:t>{</w:t>
+      </w:r>
+    </w:p>
+    <w:p>
+      <w:pPr>
+        <w:rPr>
+          <w:color w:val="000000" w:themeColor="text1"/>
+        </w:rPr>
+      </w:pPr>
+      <w:r>
+        <w:rPr>
+          <w:color w:val="000000" w:themeColor="text1"/>
+        </w:rPr>
+        <w:tab/>
+      </w:r>
+      <w:r>
+        <w:rPr>
+          <w:color w:val="000000" w:themeColor="text1"/>
+        </w:rPr>
+        <w:tab/>
+      </w:r>
+      <w:r>
+        <w:rPr>
+          <w:color w:val="000000" w:themeColor="text1"/>
+        </w:rPr>
+        <w:t>nome: “Usuário Teste”</w:t>
+      </w:r>
+    </w:p>
+    <w:p>
+      <w:pPr>
+        <w:rPr>
+          <w:color w:val="000000" w:themeColor="text1"/>
+          <w:lang w:val="en-US"/>
+        </w:rPr>
+      </w:pPr>
+      <w:r>
+        <w:rPr>
+          <w:color w:val="000000" w:themeColor="text1"/>
+        </w:rPr>
+        <w:tab/>
+      </w:r>
+      <w:r>
+        <w:rPr>
+          <w:color w:val="000000" w:themeColor="text1"/>
+        </w:rPr>
+        <w:tab/>
+      </w:r>
+      <w:r>
+        <w:rPr>
+          <w:color w:val="000000" w:themeColor="text1"/>
+          <w:lang w:val="en-US"/>
+        </w:rPr>
+        <w:t>login: “</w:t>
+      </w:r>
+      <w:proofErr w:type="spellStart"/>
+      <w:r>
+        <w:rPr>
+          <w:color w:val="000000" w:themeColor="text1"/>
+          <w:lang w:val="en-US"/>
+        </w:rPr>
+        <w:t>login_existente</w:t>
+      </w:r>
+      <w:proofErr w:type="spellEnd"/>
+      <w:r>
+        <w:rPr>
+          <w:color w:val="000000" w:themeColor="text1"/>
+          <w:lang w:val="en-US"/>
+        </w:rPr>
+        <w:t>”</w:t>
+      </w:r>
+    </w:p>
+    <w:p>
+      <w:pPr>
+        <w:rPr>
+          <w:color w:val="000000" w:themeColor="text1"/>
+          <w:lang w:val="en-US"/>
+        </w:rPr>
+      </w:pPr>
+      <w:r>
+        <w:rPr>
+          <w:color w:val="000000" w:themeColor="text1"/>
+          <w:lang w:val="en-US"/>
+        </w:rPr>
+        <w:tab/>
+      </w:r>
+      <w:r>
+        <w:rPr>
+          <w:color w:val="000000" w:themeColor="text1"/>
+          <w:lang w:val="en-US"/>
+        </w:rPr>
+        <w:tab/>
+        <w:t>password: “teste”</w:t>
+      </w:r>
+    </w:p>
+    <w:p>
+      <w:pPr>
+        <w:rPr>
+          <w:color w:val="000000" w:themeColor="text1"/>
+        </w:rPr>
+      </w:pPr>
+      <w:r>
+        <w:rPr>
+          <w:color w:val="000000" w:themeColor="text1"/>
+          <w:lang w:val="en-US"/>
+        </w:rPr>
+        <w:tab/>
+      </w:r>
+      <w:r>
+        <w:rPr>
+          <w:color w:val="000000" w:themeColor="text1"/>
+          <w:lang w:val="en-US"/>
+        </w:rPr>
+        <w:tab/>
+      </w:r>
+      <w:r>
+        <w:rPr>
+          <w:color w:val="000000" w:themeColor="text1"/>
+        </w:rPr>
+        <w:t>telefone: “11912345678”</w:t>
+      </w:r>
+    </w:p>
+    <w:p>
+      <w:pPr>
+        <w:rPr>
+          <w:color w:val="000000" w:themeColor="text1"/>
+        </w:rPr>
+      </w:pPr>
+      <w:r>
+        <w:rPr>
+          <w:color w:val="000000" w:themeColor="text1"/>
+        </w:rPr>
+        <w:tab/>
+      </w:r>
+      <w:r>
+        <w:rPr>
+          <w:color w:val="000000" w:themeColor="text1"/>
+        </w:rPr>
+        <w:tab/>
+      </w:r>
+      <w:proofErr w:type="spellStart"/>
+      <w:r>
+        <w:rPr>
+          <w:color w:val="000000" w:themeColor="text1"/>
+        </w:rPr>
+        <w:t>email</w:t>
+      </w:r>
+      <w:proofErr w:type="spellEnd"/>
+      <w:r>
+        <w:rPr>
+          <w:color w:val="000000" w:themeColor="text1"/>
+        </w:rPr>
+        <w:t>: “teste@email.com”</w:t>
+      </w:r>
+    </w:p>
+    <w:p>
+      <w:pPr>
+        <w:rPr>
+          <w:color w:val="000000" w:themeColor="text1"/>
+        </w:rPr>
+      </w:pPr>
+      <w:r>
+        <w:rPr>
+          <w:color w:val="000000" w:themeColor="text1"/>
+        </w:rPr>
+        <w:tab/>
+      </w:r>
+      <w:r>
+        <w:rPr>
+          <w:color w:val="000000" w:themeColor="text1"/>
+        </w:rPr>
+        <w:tab/>
+        <w:t>status: ATIVO</w:t>
+      </w:r>
+    </w:p>
+    <w:p>
+      <w:pPr>
+        <w:rPr>
+          <w:color w:val="000000" w:themeColor="text1"/>
+        </w:rPr>
+      </w:pPr>
+      <w:r>
+        <w:rPr>
+          <w:color w:val="000000" w:themeColor="text1"/>
+        </w:rPr>
+        <w:tab/>
+      </w:r>
+      <w:r>
+        <w:rPr>
+          <w:color w:val="000000" w:themeColor="text1"/>
+        </w:rPr>
+        <w:tab/>
+        <w:t>perfil: ADMIN</w:t>
+      </w:r>
+    </w:p>
+    <w:p>
+      <w:pPr>
+        <w:rPr>
+          <w:color w:val="000000" w:themeColor="text1"/>
+        </w:rPr>
+      </w:pPr>
+      <w:r>
+        <w:rPr>
+          <w:color w:val="000000" w:themeColor="text1"/>
+        </w:rPr>
+        <w:tab/>
+        <w:t>}</w:t>
+      </w:r>
+    </w:p>
+    <w:p>
+      <w:pPr>
+        <w:rPr>
+          <w:color w:val="000000" w:themeColor="text1"/>
+        </w:rPr>
+      </w:pPr>
+      <w:r>
+        <w:rPr>
+          <w:b/>
+          <w:color w:val="000000" w:themeColor="text1"/>
+        </w:rPr>
+        <w:t xml:space="preserve">Resultado esperado: </w:t>
+      </w:r>
+      <w:r>
+        <w:rPr>
+          <w:color w:val="000000" w:themeColor="text1"/>
+        </w:rPr>
+        <w:t xml:space="preserve">Lançar exceção </w:t>
+      </w:r>
+      <w:proofErr w:type="spellStart"/>
+      <w:r>
+        <w:rPr>
+          <w:color w:val="000000" w:themeColor="text1"/>
+        </w:rPr>
         <w:t>EntityAlreadyExisting</w:t>
       </w:r>
       <w:proofErr w:type="spellEnd"/>
@@ -12040,6 +12666,13 @@
         </w:rPr>
         <w:t>A definir.</w:t>
       </w:r>
+    </w:p>
+    <w:p>
+      <w:pPr>
+        <w:rPr>
+          <w:color w:val="000000" w:themeColor="text1"/>
+        </w:rPr>
+      </w:pPr>
     </w:p>
     <w:p>
       <w:pPr>
@@ -12908,6 +13541,92 @@
     </w:lvl>
   </w:abstractNum>
   <w:abstractNum w:abstractNumId="4" w15:restartNumberingAfterBreak="0">
+    <w:nsid w:val="101F3353"/>
+    <w:multiLevelType w:val="multilevel"/>
+    <w:tmpl w:val="7EAE38A0"/>
+    <w:lvl w:ilvl="0">
+      <w:start w:val="1"/>
+      <w:numFmt w:val="decimal"/>
+      <w:lvlText w:val="%1."/>
+      <w:lvlJc w:val="left"/>
+      <w:pPr>
+        <w:ind w:left="709" w:hanging="360"/>
+      </w:pPr>
+    </w:lvl>
+    <w:lvl w:ilvl="1">
+      <w:start w:val="1"/>
+      <w:numFmt w:val="lowerLetter"/>
+      <w:lvlText w:val="%2."/>
+      <w:lvlJc w:val="left"/>
+      <w:pPr>
+        <w:ind w:left="1429" w:hanging="360"/>
+      </w:pPr>
+    </w:lvl>
+    <w:lvl w:ilvl="2">
+      <w:start w:val="1"/>
+      <w:numFmt w:val="lowerRoman"/>
+      <w:lvlText w:val="%3."/>
+      <w:lvlJc w:val="right"/>
+      <w:pPr>
+        <w:ind w:left="2149" w:hanging="180"/>
+      </w:pPr>
+    </w:lvl>
+    <w:lvl w:ilvl="3">
+      <w:start w:val="1"/>
+      <w:numFmt w:val="decimal"/>
+      <w:lvlText w:val="%4."/>
+      <w:lvlJc w:val="left"/>
+      <w:pPr>
+        <w:ind w:left="2869" w:hanging="360"/>
+      </w:pPr>
+    </w:lvl>
+    <w:lvl w:ilvl="4">
+      <w:start w:val="1"/>
+      <w:numFmt w:val="lowerLetter"/>
+      <w:lvlText w:val="%5."/>
+      <w:lvlJc w:val="left"/>
+      <w:pPr>
+        <w:ind w:left="3589" w:hanging="360"/>
+      </w:pPr>
+    </w:lvl>
+    <w:lvl w:ilvl="5">
+      <w:start w:val="1"/>
+      <w:numFmt w:val="lowerRoman"/>
+      <w:lvlText w:val="%6."/>
+      <w:lvlJc w:val="right"/>
+      <w:pPr>
+        <w:ind w:left="4309" w:hanging="180"/>
+      </w:pPr>
+    </w:lvl>
+    <w:lvl w:ilvl="6">
+      <w:start w:val="1"/>
+      <w:numFmt w:val="decimal"/>
+      <w:lvlText w:val="%7."/>
+      <w:lvlJc w:val="left"/>
+      <w:pPr>
+        <w:ind w:left="5029" w:hanging="360"/>
+      </w:pPr>
+    </w:lvl>
+    <w:lvl w:ilvl="7">
+      <w:start w:val="1"/>
+      <w:numFmt w:val="lowerLetter"/>
+      <w:lvlText w:val="%8."/>
+      <w:lvlJc w:val="left"/>
+      <w:pPr>
+        <w:ind w:left="5749" w:hanging="360"/>
+      </w:pPr>
+    </w:lvl>
+    <w:lvl w:ilvl="8">
+      <w:start w:val="1"/>
+      <w:numFmt w:val="lowerRoman"/>
+      <w:lvlText w:val="%9."/>
+      <w:lvlJc w:val="right"/>
+      <w:pPr>
+        <w:ind w:left="6469" w:hanging="180"/>
+      </w:pPr>
+    </w:lvl>
+  </w:abstractNum>
+  <w:abstractNum w:abstractNumId="5" w15:restartNumberingAfterBreak="0">
     <w:nsid w:val="10C87B59"/>
     <w:multiLevelType w:val="multilevel"/>
     <w:tmpl w:val="98CC4F86"/>
@@ -13020,7 +13739,7 @@
       </w:rPr>
     </w:lvl>
   </w:abstractNum>
-  <w:abstractNum w:abstractNumId="5" w15:restartNumberingAfterBreak="0">
+  <w:abstractNum w:abstractNumId="6" w15:restartNumberingAfterBreak="0">
     <w:nsid w:val="1C297EA4"/>
     <w:multiLevelType w:val="multilevel"/>
     <w:tmpl w:val="4C245F70"/>
@@ -13133,7 +13852,7 @@
       </w:rPr>
     </w:lvl>
   </w:abstractNum>
-  <w:abstractNum w:abstractNumId="6" w15:restartNumberingAfterBreak="0">
+  <w:abstractNum w:abstractNumId="7" w15:restartNumberingAfterBreak="0">
     <w:nsid w:val="2567169C"/>
     <w:multiLevelType w:val="multilevel"/>
     <w:tmpl w:val="7EAE38A0"/>
@@ -13219,7 +13938,7 @@
       </w:pPr>
     </w:lvl>
   </w:abstractNum>
-  <w:abstractNum w:abstractNumId="7" w15:restartNumberingAfterBreak="0">
+  <w:abstractNum w:abstractNumId="8" w15:restartNumberingAfterBreak="0">
     <w:nsid w:val="27687D6D"/>
     <w:multiLevelType w:val="multilevel"/>
     <w:tmpl w:val="33B28994"/>
@@ -13305,7 +14024,7 @@
       </w:pPr>
     </w:lvl>
   </w:abstractNum>
-  <w:abstractNum w:abstractNumId="8" w15:restartNumberingAfterBreak="0">
+  <w:abstractNum w:abstractNumId="9" w15:restartNumberingAfterBreak="0">
     <w:nsid w:val="28492A00"/>
     <w:multiLevelType w:val="multilevel"/>
     <w:tmpl w:val="DF10247E"/>
@@ -13418,7 +14137,7 @@
       </w:rPr>
     </w:lvl>
   </w:abstractNum>
-  <w:abstractNum w:abstractNumId="9" w15:restartNumberingAfterBreak="0">
+  <w:abstractNum w:abstractNumId="10" w15:restartNumberingAfterBreak="0">
     <w:nsid w:val="29530051"/>
     <w:multiLevelType w:val="multilevel"/>
     <w:tmpl w:val="C04CB900"/>
@@ -13531,7 +14250,7 @@
       </w:rPr>
     </w:lvl>
   </w:abstractNum>
-  <w:abstractNum w:abstractNumId="10" w15:restartNumberingAfterBreak="0">
+  <w:abstractNum w:abstractNumId="11" w15:restartNumberingAfterBreak="0">
     <w:nsid w:val="311B04C2"/>
     <w:multiLevelType w:val="multilevel"/>
     <w:tmpl w:val="4B86EAF0"/>
@@ -13644,7 +14363,7 @@
       </w:rPr>
     </w:lvl>
   </w:abstractNum>
-  <w:abstractNum w:abstractNumId="11" w15:restartNumberingAfterBreak="0">
+  <w:abstractNum w:abstractNumId="12" w15:restartNumberingAfterBreak="0">
     <w:nsid w:val="35873CED"/>
     <w:multiLevelType w:val="multilevel"/>
     <w:tmpl w:val="316EA91C"/>
@@ -13757,7 +14476,7 @@
       </w:rPr>
     </w:lvl>
   </w:abstractNum>
-  <w:abstractNum w:abstractNumId="12" w15:restartNumberingAfterBreak="0">
+  <w:abstractNum w:abstractNumId="13" w15:restartNumberingAfterBreak="0">
     <w:nsid w:val="35D208BE"/>
     <w:multiLevelType w:val="hybridMultilevel"/>
     <w:tmpl w:val="FEB2915A"/>
@@ -13870,7 +14589,7 @@
       </w:rPr>
     </w:lvl>
   </w:abstractNum>
-  <w:abstractNum w:abstractNumId="13" w15:restartNumberingAfterBreak="0">
+  <w:abstractNum w:abstractNumId="14" w15:restartNumberingAfterBreak="0">
     <w:nsid w:val="3AE82604"/>
     <w:multiLevelType w:val="multilevel"/>
     <w:tmpl w:val="5EC8825C"/>
@@ -13983,7 +14702,7 @@
       </w:rPr>
     </w:lvl>
   </w:abstractNum>
-  <w:abstractNum w:abstractNumId="14" w15:restartNumberingAfterBreak="0">
+  <w:abstractNum w:abstractNumId="15" w15:restartNumberingAfterBreak="0">
     <w:nsid w:val="425F7142"/>
     <w:multiLevelType w:val="multilevel"/>
     <w:tmpl w:val="6C3A65C8"/>
@@ -14096,7 +14815,7 @@
       </w:rPr>
     </w:lvl>
   </w:abstractNum>
-  <w:abstractNum w:abstractNumId="15" w15:restartNumberingAfterBreak="0">
+  <w:abstractNum w:abstractNumId="16" w15:restartNumberingAfterBreak="0">
     <w:nsid w:val="433872DF"/>
     <w:multiLevelType w:val="multilevel"/>
     <w:tmpl w:val="473E9B32"/>
@@ -14209,7 +14928,7 @@
       </w:rPr>
     </w:lvl>
   </w:abstractNum>
-  <w:abstractNum w:abstractNumId="16" w15:restartNumberingAfterBreak="0">
+  <w:abstractNum w:abstractNumId="17" w15:restartNumberingAfterBreak="0">
     <w:nsid w:val="4ABF56A0"/>
     <w:multiLevelType w:val="multilevel"/>
     <w:tmpl w:val="0D8E790A"/>
@@ -14295,7 +15014,7 @@
       </w:pPr>
     </w:lvl>
   </w:abstractNum>
-  <w:abstractNum w:abstractNumId="17" w15:restartNumberingAfterBreak="0">
+  <w:abstractNum w:abstractNumId="18" w15:restartNumberingAfterBreak="0">
     <w:nsid w:val="4C99572E"/>
     <w:multiLevelType w:val="hybridMultilevel"/>
     <w:tmpl w:val="81062254"/>
@@ -14408,7 +15127,7 @@
       </w:rPr>
     </w:lvl>
   </w:abstractNum>
-  <w:abstractNum w:abstractNumId="18" w15:restartNumberingAfterBreak="0">
+  <w:abstractNum w:abstractNumId="19" w15:restartNumberingAfterBreak="0">
     <w:nsid w:val="4DB86243"/>
     <w:multiLevelType w:val="multilevel"/>
     <w:tmpl w:val="D652AE68"/>
@@ -14521,7 +15240,7 @@
       </w:rPr>
     </w:lvl>
   </w:abstractNum>
-  <w:abstractNum w:abstractNumId="19" w15:restartNumberingAfterBreak="0">
+  <w:abstractNum w:abstractNumId="20" w15:restartNumberingAfterBreak="0">
     <w:nsid w:val="5C394BC9"/>
     <w:multiLevelType w:val="multilevel"/>
     <w:tmpl w:val="7EAE38A0"/>
@@ -14607,7 +15326,7 @@
       </w:pPr>
     </w:lvl>
   </w:abstractNum>
-  <w:abstractNum w:abstractNumId="20" w15:restartNumberingAfterBreak="0">
+  <w:abstractNum w:abstractNumId="21" w15:restartNumberingAfterBreak="0">
     <w:nsid w:val="610B3EDF"/>
     <w:multiLevelType w:val="multilevel"/>
     <w:tmpl w:val="7EAE38A0"/>
@@ -14693,7 +15412,7 @@
       </w:pPr>
     </w:lvl>
   </w:abstractNum>
-  <w:abstractNum w:abstractNumId="21" w15:restartNumberingAfterBreak="0">
+  <w:abstractNum w:abstractNumId="22" w15:restartNumberingAfterBreak="0">
     <w:nsid w:val="67403CB5"/>
     <w:multiLevelType w:val="multilevel"/>
     <w:tmpl w:val="75326788"/>
@@ -14806,7 +15525,7 @@
       </w:rPr>
     </w:lvl>
   </w:abstractNum>
-  <w:abstractNum w:abstractNumId="22" w15:restartNumberingAfterBreak="0">
+  <w:abstractNum w:abstractNumId="23" w15:restartNumberingAfterBreak="0">
     <w:nsid w:val="67C547F7"/>
     <w:multiLevelType w:val="multilevel"/>
     <w:tmpl w:val="35EAD4B8"/>
@@ -14892,7 +15611,7 @@
       </w:pPr>
     </w:lvl>
   </w:abstractNum>
-  <w:abstractNum w:abstractNumId="23" w15:restartNumberingAfterBreak="0">
+  <w:abstractNum w:abstractNumId="24" w15:restartNumberingAfterBreak="0">
     <w:nsid w:val="6C8202C1"/>
     <w:multiLevelType w:val="multilevel"/>
     <w:tmpl w:val="981048B2"/>
@@ -15005,7 +15724,7 @@
       </w:rPr>
     </w:lvl>
   </w:abstractNum>
-  <w:abstractNum w:abstractNumId="24" w15:restartNumberingAfterBreak="0">
+  <w:abstractNum w:abstractNumId="25" w15:restartNumberingAfterBreak="0">
     <w:nsid w:val="6CD6232C"/>
     <w:multiLevelType w:val="multilevel"/>
     <w:tmpl w:val="2C50429A"/>
@@ -15118,7 +15837,7 @@
       </w:rPr>
     </w:lvl>
   </w:abstractNum>
-  <w:abstractNum w:abstractNumId="25" w15:restartNumberingAfterBreak="0">
+  <w:abstractNum w:abstractNumId="26" w15:restartNumberingAfterBreak="0">
     <w:nsid w:val="6FBC5385"/>
     <w:multiLevelType w:val="multilevel"/>
     <w:tmpl w:val="9E36186C"/>
@@ -15231,7 +15950,7 @@
       </w:rPr>
     </w:lvl>
   </w:abstractNum>
-  <w:abstractNum w:abstractNumId="26" w15:restartNumberingAfterBreak="0">
+  <w:abstractNum w:abstractNumId="27" w15:restartNumberingAfterBreak="0">
     <w:nsid w:val="7ABF4D30"/>
     <w:multiLevelType w:val="multilevel"/>
     <w:tmpl w:val="C61A779C"/>
@@ -15344,7 +16063,7 @@
       </w:rPr>
     </w:lvl>
   </w:abstractNum>
-  <w:abstractNum w:abstractNumId="27" w15:restartNumberingAfterBreak="0">
+  <w:abstractNum w:abstractNumId="28" w15:restartNumberingAfterBreak="0">
     <w:nsid w:val="7E36314E"/>
     <w:multiLevelType w:val="hybridMultilevel"/>
     <w:tmpl w:val="6FDA89B4"/>
@@ -15457,7 +16176,7 @@
       </w:rPr>
     </w:lvl>
   </w:abstractNum>
-  <w:abstractNum w:abstractNumId="28" w15:restartNumberingAfterBreak="0">
+  <w:abstractNum w:abstractNumId="29" w15:restartNumberingAfterBreak="0">
     <w:nsid w:val="7ED21264"/>
     <w:multiLevelType w:val="multilevel"/>
     <w:tmpl w:val="87B4A5EE"/>
@@ -15570,7 +16289,7 @@
       </w:rPr>
     </w:lvl>
   </w:abstractNum>
-  <w:abstractNum w:abstractNumId="29" w15:restartNumberingAfterBreak="0">
+  <w:abstractNum w:abstractNumId="30" w15:restartNumberingAfterBreak="0">
     <w:nsid w:val="7FF4155E"/>
     <w:multiLevelType w:val="multilevel"/>
     <w:tmpl w:val="F9722B4C"/>
@@ -15663,91 +16382,94 @@
     <w:abstractNumId w:val="1"/>
   </w:num>
   <w:num w:numId="2" w16cid:durableId="88086438">
-    <w:abstractNumId w:val="26"/>
+    <w:abstractNumId w:val="27"/>
   </w:num>
   <w:num w:numId="3" w16cid:durableId="1706714901">
-    <w:abstractNumId w:val="24"/>
+    <w:abstractNumId w:val="25"/>
   </w:num>
   <w:num w:numId="4" w16cid:durableId="113717744">
     <w:abstractNumId w:val="0"/>
   </w:num>
   <w:num w:numId="5" w16cid:durableId="74671158">
+    <w:abstractNumId w:val="11"/>
+  </w:num>
+  <w:num w:numId="6" w16cid:durableId="913590874">
+    <w:abstractNumId w:val="19"/>
+  </w:num>
+  <w:num w:numId="7" w16cid:durableId="1890459348">
+    <w:abstractNumId w:val="30"/>
+  </w:num>
+  <w:num w:numId="8" w16cid:durableId="333532636">
     <w:abstractNumId w:val="10"/>
   </w:num>
-  <w:num w:numId="6" w16cid:durableId="913590874">
-    <w:abstractNumId w:val="18"/>
+  <w:num w:numId="9" w16cid:durableId="128785046">
+    <w:abstractNumId w:val="24"/>
   </w:num>
-  <w:num w:numId="7" w16cid:durableId="1890459348">
+  <w:num w:numId="10" w16cid:durableId="905458532">
+    <w:abstractNumId w:val="6"/>
+  </w:num>
+  <w:num w:numId="11" w16cid:durableId="1135484454">
+    <w:abstractNumId w:val="12"/>
+  </w:num>
+  <w:num w:numId="12" w16cid:durableId="568999983">
     <w:abstractNumId w:val="29"/>
   </w:num>
-  <w:num w:numId="8" w16cid:durableId="333532636">
+  <w:num w:numId="13" w16cid:durableId="1767190151">
+    <w:abstractNumId w:val="5"/>
+  </w:num>
+  <w:num w:numId="14" w16cid:durableId="715394213">
+    <w:abstractNumId w:val="16"/>
+  </w:num>
+  <w:num w:numId="15" w16cid:durableId="1314019323">
+    <w:abstractNumId w:val="14"/>
+  </w:num>
+  <w:num w:numId="16" w16cid:durableId="2108111862">
+    <w:abstractNumId w:val="26"/>
+  </w:num>
+  <w:num w:numId="17" w16cid:durableId="1320620575">
+    <w:abstractNumId w:val="22"/>
+  </w:num>
+  <w:num w:numId="18" w16cid:durableId="1431511382">
     <w:abstractNumId w:val="9"/>
   </w:num>
-  <w:num w:numId="9" w16cid:durableId="128785046">
-    <w:abstractNumId w:val="23"/>
-  </w:num>
-  <w:num w:numId="10" w16cid:durableId="905458532">
-    <w:abstractNumId w:val="5"/>
-  </w:num>
-  <w:num w:numId="11" w16cid:durableId="1135484454">
-    <w:abstractNumId w:val="11"/>
-  </w:num>
-  <w:num w:numId="12" w16cid:durableId="568999983">
-    <w:abstractNumId w:val="28"/>
-  </w:num>
-  <w:num w:numId="13" w16cid:durableId="1767190151">
-    <w:abstractNumId w:val="4"/>
-  </w:num>
-  <w:num w:numId="14" w16cid:durableId="715394213">
+  <w:num w:numId="19" w16cid:durableId="1528325566">
     <w:abstractNumId w:val="15"/>
   </w:num>
-  <w:num w:numId="15" w16cid:durableId="1314019323">
-    <w:abstractNumId w:val="13"/>
+  <w:num w:numId="20" w16cid:durableId="990518204">
+    <w:abstractNumId w:val="17"/>
   </w:num>
-  <w:num w:numId="16" w16cid:durableId="2108111862">
-    <w:abstractNumId w:val="25"/>
-  </w:num>
-  <w:num w:numId="17" w16cid:durableId="1320620575">
-    <w:abstractNumId w:val="21"/>
-  </w:num>
-  <w:num w:numId="18" w16cid:durableId="1431511382">
+  <w:num w:numId="21" w16cid:durableId="900098538">
     <w:abstractNumId w:val="8"/>
   </w:num>
-  <w:num w:numId="19" w16cid:durableId="1528325566">
-    <w:abstractNumId w:val="14"/>
-  </w:num>
-  <w:num w:numId="20" w16cid:durableId="990518204">
-    <w:abstractNumId w:val="16"/>
-  </w:num>
-  <w:num w:numId="21" w16cid:durableId="900098538">
-    <w:abstractNumId w:val="7"/>
-  </w:num>
   <w:num w:numId="22" w16cid:durableId="1159611945">
-    <w:abstractNumId w:val="22"/>
+    <w:abstractNumId w:val="23"/>
   </w:num>
   <w:num w:numId="23" w16cid:durableId="727652842">
     <w:abstractNumId w:val="3"/>
   </w:num>
   <w:num w:numId="24" w16cid:durableId="1596135007">
+    <w:abstractNumId w:val="21"/>
+  </w:num>
+  <w:num w:numId="25" w16cid:durableId="414478111">
     <w:abstractNumId w:val="20"/>
   </w:num>
-  <w:num w:numId="25" w16cid:durableId="414478111">
-    <w:abstractNumId w:val="19"/>
-  </w:num>
   <w:num w:numId="26" w16cid:durableId="372466584">
-    <w:abstractNumId w:val="6"/>
+    <w:abstractNumId w:val="7"/>
   </w:num>
   <w:num w:numId="27" w16cid:durableId="1787504088">
-    <w:abstractNumId w:val="27"/>
+    <w:abstractNumId w:val="28"/>
   </w:num>
   <w:num w:numId="28" w16cid:durableId="927734810">
-    <w:abstractNumId w:val="17"/>
+    <w:abstractNumId w:val="18"/>
   </w:num>
   <w:num w:numId="29" w16cid:durableId="1914387497">
-    <w:abstractNumId w:val="12"/>
+    <w:abstractNumId w:val="13"/>
   </w:num>
   <w:num w:numId="30" w16cid:durableId="36636164">
     <w:abstractNumId w:val="2"/>
+  </w:num>
+  <w:num w:numId="31" w16cid:durableId="1094086007">
+    <w:abstractNumId w:val="4"/>
   </w:num>
 </w:numbering>
 </file>

</xml_diff>

<commit_message>
docs: Adicionado teste unitário TU001.08
</commit_message>
<xml_diff>
--- a/documentation/Especificacao_de_Requisitos_de_Software.docx
+++ b/documentation/Especificacao_de_Requisitos_de_Software.docx
@@ -6047,15 +6047,7 @@
         <w:t>Descrição:</w:t>
       </w:r>
       <w:r>
-        <w:t xml:space="preserve">  O backend do sistema deve ser elaborado utilizando framework </w:t>
-      </w:r>
-      <w:proofErr w:type="gramStart"/>
-      <w:r>
-        <w:t>Spring  na</w:t>
-      </w:r>
-      <w:proofErr w:type="gramEnd"/>
-      <w:r>
-        <w:t xml:space="preserve"> versão 3.3.3, utilizando dos seguintes projetos:</w:t>
+        <w:t xml:space="preserve">  O backend do sistema deve ser elaborado utilizando framework Spring  na versão 3.3.3, utilizando dos seguintes projetos:</w:t>
       </w:r>
     </w:p>
     <w:p>
@@ -6067,23 +6059,7 @@
         </w:numPr>
       </w:pPr>
       <w:r>
-        <w:t xml:space="preserve">Spring Web MVC: responsável por arquitetar as camadas de model e </w:t>
-      </w:r>
-      <w:proofErr w:type="spellStart"/>
-      <w:r>
-        <w:t>controller</w:t>
-      </w:r>
-      <w:proofErr w:type="spellEnd"/>
-      <w:r>
-        <w:t xml:space="preserve"> do projeto para criar as APIs </w:t>
-      </w:r>
-      <w:proofErr w:type="spellStart"/>
-      <w:r>
-        <w:t>Restful</w:t>
-      </w:r>
-      <w:proofErr w:type="spellEnd"/>
-      <w:r>
-        <w:t>.</w:t>
+        <w:t>Spring Web MVC: responsável por arquitetar as camadas de model e controller do projeto para criar as APIs Restful.</w:t>
       </w:r>
     </w:p>
     <w:p>
@@ -6095,15 +6071,7 @@
         </w:numPr>
       </w:pPr>
       <w:r>
-        <w:t xml:space="preserve">Spring </w:t>
-      </w:r>
-      <w:proofErr w:type="spellStart"/>
-      <w:r>
-        <w:t>Validation</w:t>
-      </w:r>
-      <w:proofErr w:type="spellEnd"/>
-      <w:r>
-        <w:t>: responsável por definir as validações dos dados.</w:t>
+        <w:t>Spring Validation: responsável por definir as validações dos dados.</w:t>
       </w:r>
     </w:p>
     <w:p>
@@ -6139,15 +6107,7 @@
         </w:numPr>
       </w:pPr>
       <w:r>
-        <w:t xml:space="preserve">Spring AMQP: responsável por fazer a comunicação assíncrona utilizando um broker de </w:t>
-      </w:r>
-      <w:proofErr w:type="spellStart"/>
-      <w:r>
-        <w:t>mensageiria</w:t>
-      </w:r>
-      <w:proofErr w:type="spellEnd"/>
-      <w:r>
-        <w:t xml:space="preserve"> entre os micros serviços.</w:t>
+        <w:t>Spring AMQP: responsável por fazer a comunicação assíncrona utilizando um broker de mensageiria entre os micros serviços.</w:t>
       </w:r>
     </w:p>
     <w:p>
@@ -6183,15 +6143,7 @@
         </w:numPr>
       </w:pPr>
       <w:r>
-        <w:t xml:space="preserve">Spring Cloud </w:t>
-      </w:r>
-      <w:proofErr w:type="spellStart"/>
-      <w:r>
-        <w:t>Config</w:t>
-      </w:r>
-      <w:proofErr w:type="spellEnd"/>
-      <w:r>
-        <w:t>: responsável por criar um servidor de configuração para os micros serviços.</w:t>
+        <w:t>Spring Cloud Config: responsável por criar um servidor de configuração para os micros serviços.</w:t>
       </w:r>
     </w:p>
     <w:p>
@@ -6203,23 +6155,7 @@
         </w:numPr>
       </w:pPr>
       <w:r>
-        <w:t xml:space="preserve">Spring Cloud Circuit </w:t>
-      </w:r>
-      <w:proofErr w:type="spellStart"/>
-      <w:r>
-        <w:t>Breaker</w:t>
-      </w:r>
-      <w:proofErr w:type="spellEnd"/>
-      <w:r>
-        <w:t xml:space="preserve"> Resilience4J: responsável por criar os métodos </w:t>
-      </w:r>
-      <w:proofErr w:type="spellStart"/>
-      <w:r>
-        <w:t>fallback</w:t>
-      </w:r>
-      <w:proofErr w:type="spellEnd"/>
-      <w:r>
-        <w:t xml:space="preserve"> para prevenir falhas.</w:t>
+        <w:t>Spring Cloud Circuit Breaker Resilience4J: responsável por criar os métodos fallback para prevenir falhas.</w:t>
       </w:r>
     </w:p>
     <w:p>
@@ -6311,15 +6247,7 @@
         <w:t>serviços devem</w:t>
       </w:r>
       <w:r>
-        <w:t xml:space="preserve"> ser feita utilizando o broker </w:t>
-      </w:r>
-      <w:proofErr w:type="spellStart"/>
-      <w:r>
-        <w:t>RabbiMQ</w:t>
-      </w:r>
-      <w:proofErr w:type="spellEnd"/>
-      <w:r>
-        <w:t>.</w:t>
+        <w:t xml:space="preserve"> ser feita utilizando o broker RabbiMQ.</w:t>
       </w:r>
     </w:p>
     <w:p/>
@@ -6337,16 +6265,8 @@
         <w:rPr>
           <w:color w:val="000000" w:themeColor="text1"/>
         </w:rPr>
-        <w:t xml:space="preserve">Log </w:t>
-      </w:r>
-      <w:proofErr w:type="spellStart"/>
-      <w:r>
-        <w:rPr>
-          <w:color w:val="000000" w:themeColor="text1"/>
-        </w:rPr>
-        <w:t>agregation</w:t>
-      </w:r>
-      <w:proofErr w:type="spellEnd"/>
+        <w:t>Log agregation</w:t>
+      </w:r>
     </w:p>
     <w:p/>
     <w:p>
@@ -6368,23 +6288,7 @@
         <w:t>Descrição:</w:t>
       </w:r>
       <w:r>
-        <w:t xml:space="preserve">  Os logs gerados pelos micros serviços devem ser centralizados utilizando o log </w:t>
-      </w:r>
-      <w:proofErr w:type="spellStart"/>
-      <w:r>
-        <w:t>agragation</w:t>
-      </w:r>
-      <w:proofErr w:type="spellEnd"/>
-      <w:r>
-        <w:t xml:space="preserve"> </w:t>
-      </w:r>
-      <w:proofErr w:type="spellStart"/>
-      <w:r>
-        <w:t>Elasticsearch</w:t>
-      </w:r>
-      <w:proofErr w:type="spellEnd"/>
-      <w:r>
-        <w:t>.</w:t>
+        <w:t xml:space="preserve">  Os logs gerados pelos micros serviços devem ser centralizados utilizando o log agragation Elasticsearch.</w:t>
       </w:r>
     </w:p>
     <w:p/>
@@ -8359,23 +8263,7 @@
         <w:t>Usuário:</w:t>
       </w:r>
       <w:r>
-        <w:t xml:space="preserve"> Classe que representa os usuários que irão operar o sistema, é composta pelas classes </w:t>
-      </w:r>
-      <w:proofErr w:type="spellStart"/>
-      <w:r>
-        <w:t>UsuarioStatus</w:t>
-      </w:r>
-      <w:proofErr w:type="spellEnd"/>
-      <w:r>
-        <w:t xml:space="preserve"> e </w:t>
-      </w:r>
-      <w:proofErr w:type="spellStart"/>
-      <w:r>
-        <w:t>UsuarioTipo</w:t>
-      </w:r>
-      <w:proofErr w:type="spellEnd"/>
-      <w:r>
-        <w:t>, possui os atributos:</w:t>
+        <w:t xml:space="preserve"> Classe que representa os usuários que irão operar o sistema, é composta pelas classes UsuarioStatus e UsuarioTipo, possui os atributos:</w:t>
       </w:r>
     </w:p>
     <w:p>
@@ -8417,17 +8305,8 @@
                 <w:b/>
                 <w:bCs/>
               </w:rPr>
-              <w:t xml:space="preserve">Atributos da classe </w:t>
-            </w:r>
-            <w:proofErr w:type="spellStart"/>
-            <w:r>
-              <w:rPr>
-                <w:b/>
-                <w:bCs/>
-              </w:rPr>
-              <w:t>Usuario</w:t>
-            </w:r>
-            <w:proofErr w:type="spellEnd"/>
+              <w:t>Atributos da classe Usuario</w:t>
+            </w:r>
           </w:p>
         </w:tc>
       </w:tr>
@@ -8612,7 +8491,6 @@
                 <w:szCs w:val="22"/>
               </w:rPr>
             </w:pPr>
-            <w:proofErr w:type="spellStart"/>
             <w:r>
               <w:rPr>
                 <w:sz w:val="22"/>
@@ -8620,7 +8498,6 @@
               </w:rPr>
               <w:t>String</w:t>
             </w:r>
-            <w:proofErr w:type="spellEnd"/>
           </w:p>
         </w:tc>
       </w:tr>
@@ -8677,7 +8554,6 @@
                 <w:szCs w:val="22"/>
               </w:rPr>
             </w:pPr>
-            <w:proofErr w:type="spellStart"/>
             <w:r>
               <w:rPr>
                 <w:sz w:val="22"/>
@@ -8685,7 +8561,6 @@
               </w:rPr>
               <w:t>String</w:t>
             </w:r>
-            <w:proofErr w:type="spellEnd"/>
           </w:p>
         </w:tc>
       </w:tr>
@@ -8742,7 +8617,6 @@
                 <w:szCs w:val="22"/>
               </w:rPr>
             </w:pPr>
-            <w:proofErr w:type="spellStart"/>
             <w:r>
               <w:rPr>
                 <w:sz w:val="22"/>
@@ -8750,7 +8624,6 @@
               </w:rPr>
               <w:t>String</w:t>
             </w:r>
-            <w:proofErr w:type="spellEnd"/>
           </w:p>
         </w:tc>
       </w:tr>
@@ -8807,7 +8680,6 @@
                 <w:szCs w:val="22"/>
               </w:rPr>
             </w:pPr>
-            <w:proofErr w:type="spellStart"/>
             <w:r>
               <w:rPr>
                 <w:sz w:val="22"/>
@@ -8815,7 +8687,6 @@
               </w:rPr>
               <w:t>String</w:t>
             </w:r>
-            <w:proofErr w:type="spellEnd"/>
           </w:p>
         </w:tc>
       </w:tr>
@@ -8872,7 +8743,6 @@
                 <w:szCs w:val="22"/>
               </w:rPr>
             </w:pPr>
-            <w:proofErr w:type="spellStart"/>
             <w:r>
               <w:rPr>
                 <w:sz w:val="22"/>
@@ -8880,7 +8750,6 @@
               </w:rPr>
               <w:t>String</w:t>
             </w:r>
-            <w:proofErr w:type="spellEnd"/>
           </w:p>
         </w:tc>
       </w:tr>
@@ -8937,7 +8806,6 @@
                 <w:szCs w:val="22"/>
               </w:rPr>
             </w:pPr>
-            <w:proofErr w:type="spellStart"/>
             <w:r>
               <w:rPr>
                 <w:sz w:val="22"/>
@@ -8945,7 +8813,6 @@
               </w:rPr>
               <w:t>UsuarioStatus</w:t>
             </w:r>
-            <w:proofErr w:type="spellEnd"/>
           </w:p>
         </w:tc>
       </w:tr>
@@ -9008,7 +8875,6 @@
                 <w:szCs w:val="22"/>
               </w:rPr>
             </w:pPr>
-            <w:proofErr w:type="spellStart"/>
             <w:r>
               <w:rPr>
                 <w:sz w:val="22"/>
@@ -9016,7 +8882,6 @@
               </w:rPr>
               <w:t>UsuarioPerfil</w:t>
             </w:r>
-            <w:proofErr w:type="spellEnd"/>
           </w:p>
         </w:tc>
       </w:tr>
@@ -9035,15 +8900,7 @@
         </w:r>
       </w:fldSimple>
       <w:r>
-        <w:t xml:space="preserve">: atributos da classe </w:t>
-      </w:r>
-      <w:proofErr w:type="spellStart"/>
-      <w:r>
-        <w:t>Usuario</w:t>
-      </w:r>
-      <w:proofErr w:type="spellEnd"/>
-      <w:r>
-        <w:t xml:space="preserve"> </w:t>
+        <w:t xml:space="preserve">: atributos da classe Usuario </w:t>
       </w:r>
     </w:p>
     <w:p>
@@ -9054,32 +8911,15 @@
           <w:numId w:val="9"/>
         </w:numPr>
       </w:pPr>
-      <w:proofErr w:type="spellStart"/>
       <w:r>
         <w:rPr>
           <w:b/>
           <w:bCs/>
         </w:rPr>
-        <w:t>UsuarioStatus</w:t>
-      </w:r>
-      <w:proofErr w:type="spellEnd"/>
-      <w:r>
-        <w:rPr>
-          <w:b/>
-          <w:bCs/>
-        </w:rPr>
-        <w:t>:</w:t>
-      </w:r>
-      <w:r>
-        <w:t xml:space="preserve"> Classe do tipo ENUM que representa o status do usuário, compõe a classe </w:t>
-      </w:r>
-      <w:proofErr w:type="spellStart"/>
-      <w:r>
-        <w:t>Usuario</w:t>
-      </w:r>
-      <w:proofErr w:type="spellEnd"/>
-      <w:r>
-        <w:t xml:space="preserve">, possui os atributos: </w:t>
+        <w:t>UsuarioStatus:</w:t>
+      </w:r>
+      <w:r>
+        <w:t xml:space="preserve"> Classe do tipo ENUM que representa o status do usuário, compõe a classe Usuario, possui os atributos: </w:t>
       </w:r>
     </w:p>
     <w:p>
@@ -9117,17 +8957,8 @@
                 <w:b/>
                 <w:bCs/>
               </w:rPr>
-              <w:t xml:space="preserve">Atributos da classe </w:t>
-            </w:r>
-            <w:proofErr w:type="spellStart"/>
-            <w:r>
-              <w:rPr>
-                <w:b/>
-                <w:bCs/>
-              </w:rPr>
-              <w:t>UsuarioStatus</w:t>
-            </w:r>
-            <w:proofErr w:type="spellEnd"/>
+              <w:t>Atributos da classe UsuarioStatus</w:t>
+            </w:r>
           </w:p>
         </w:tc>
       </w:tr>
@@ -9282,15 +9113,7 @@
         </w:r>
       </w:fldSimple>
       <w:r>
-        <w:t xml:space="preserve">: atributos da classe </w:t>
-      </w:r>
-      <w:proofErr w:type="spellStart"/>
-      <w:r>
-        <w:t>UsuarioStatus</w:t>
-      </w:r>
-      <w:proofErr w:type="spellEnd"/>
-      <w:r>
-        <w:t xml:space="preserve"> </w:t>
+        <w:t xml:space="preserve">: atributos da classe UsuarioStatus </w:t>
       </w:r>
     </w:p>
     <w:p>
@@ -9301,32 +9124,15 @@
           <w:numId w:val="12"/>
         </w:numPr>
       </w:pPr>
-      <w:proofErr w:type="spellStart"/>
       <w:r>
         <w:rPr>
           <w:b/>
           <w:bCs/>
         </w:rPr>
-        <w:t>UsuarioPerfil</w:t>
-      </w:r>
-      <w:proofErr w:type="spellEnd"/>
-      <w:r>
-        <w:rPr>
-          <w:b/>
-          <w:bCs/>
-        </w:rPr>
-        <w:t>:</w:t>
-      </w:r>
-      <w:r>
-        <w:t xml:space="preserve"> Classe do tipo ENUM que representa o perfil de acesso do usuário, compõe a classe </w:t>
-      </w:r>
-      <w:proofErr w:type="spellStart"/>
-      <w:r>
-        <w:t>Usuario</w:t>
-      </w:r>
-      <w:proofErr w:type="spellEnd"/>
-      <w:r>
-        <w:t xml:space="preserve">, possui os atributos: </w:t>
+        <w:t>UsuarioPerfil:</w:t>
+      </w:r>
+      <w:r>
+        <w:t xml:space="preserve"> Classe do tipo ENUM que representa o perfil de acesso do usuário, compõe a classe Usuario, possui os atributos: </w:t>
       </w:r>
     </w:p>
     <w:p>
@@ -9364,17 +9170,8 @@
                 <w:b/>
                 <w:bCs/>
               </w:rPr>
-              <w:t xml:space="preserve">Atributos da classe </w:t>
-            </w:r>
-            <w:proofErr w:type="spellStart"/>
-            <w:r>
-              <w:rPr>
-                <w:b/>
-                <w:bCs/>
-              </w:rPr>
-              <w:t>UsuarioPerfil</w:t>
-            </w:r>
-            <w:proofErr w:type="spellEnd"/>
+              <w:t>Atributos da classe UsuarioPerfil</w:t>
+            </w:r>
           </w:p>
         </w:tc>
       </w:tr>
@@ -9569,15 +9366,7 @@
         </w:r>
       </w:fldSimple>
       <w:r>
-        <w:t xml:space="preserve">: atributos da classe </w:t>
-      </w:r>
-      <w:proofErr w:type="spellStart"/>
-      <w:r>
-        <w:t>UsuarioPerfil</w:t>
-      </w:r>
-      <w:proofErr w:type="spellEnd"/>
-      <w:r>
-        <w:t xml:space="preserve"> </w:t>
+        <w:t xml:space="preserve">: atributos da classe UsuarioPerfil </w:t>
       </w:r>
     </w:p>
     <w:p>
@@ -10918,19 +10707,11 @@
         </w:rPr>
         <w:tab/>
       </w:r>
-      <w:proofErr w:type="spellStart"/>
-      <w:r>
-        <w:rPr>
-          <w:color w:val="000000" w:themeColor="text1"/>
-        </w:rPr>
-        <w:t>password</w:t>
-      </w:r>
-      <w:proofErr w:type="spellEnd"/>
-      <w:r>
-        <w:rPr>
-          <w:color w:val="000000" w:themeColor="text1"/>
-        </w:rPr>
-        <w:t xml:space="preserve">: </w:t>
+      <w:r>
+        <w:rPr>
+          <w:color w:val="000000" w:themeColor="text1"/>
+        </w:rPr>
+        <w:t xml:space="preserve">password: </w:t>
       </w:r>
       <w:r>
         <w:rPr>
@@ -11012,19 +10793,11 @@
         </w:rPr>
         <w:tab/>
       </w:r>
-      <w:proofErr w:type="spellStart"/>
-      <w:r>
-        <w:rPr>
-          <w:color w:val="000000" w:themeColor="text1"/>
-        </w:rPr>
-        <w:t>email</w:t>
-      </w:r>
-      <w:proofErr w:type="spellEnd"/>
-      <w:r>
-        <w:rPr>
-          <w:color w:val="000000" w:themeColor="text1"/>
-        </w:rPr>
-        <w:t xml:space="preserve">: </w:t>
+      <w:r>
+        <w:rPr>
+          <w:color w:val="000000" w:themeColor="text1"/>
+        </w:rPr>
+        <w:t xml:space="preserve">email: </w:t>
       </w:r>
       <w:r>
         <w:rPr>
@@ -11126,21 +10899,7 @@
         <w:rPr>
           <w:color w:val="000000" w:themeColor="text1"/>
         </w:rPr>
-        <w:t xml:space="preserve">Objeto </w:t>
-      </w:r>
-      <w:proofErr w:type="spellStart"/>
-      <w:r>
-        <w:rPr>
-          <w:color w:val="000000" w:themeColor="text1"/>
-        </w:rPr>
-        <w:t>Usuario</w:t>
-      </w:r>
-      <w:proofErr w:type="spellEnd"/>
-      <w:r>
-        <w:rPr>
-          <w:color w:val="000000" w:themeColor="text1"/>
-        </w:rPr>
-        <w:t xml:space="preserve"> não nulo.</w:t>
+        <w:t>Objeto Usuario não nulo.</w:t>
       </w:r>
     </w:p>
     <w:p>
@@ -11452,16 +11211,8 @@
         <w:rPr>
           <w:color w:val="000000" w:themeColor="text1"/>
         </w:rPr>
-        <w:t xml:space="preserve">nome: </w:t>
-      </w:r>
-      <w:proofErr w:type="spellStart"/>
-      <w:r>
-        <w:rPr>
-          <w:color w:val="000000" w:themeColor="text1"/>
-        </w:rPr>
-        <w:t>null</w:t>
-      </w:r>
-      <w:proofErr w:type="spellEnd"/>
+        <w:t>nome: null</w:t>
+      </w:r>
     </w:p>
     <w:p>
       <w:pPr>
@@ -11485,16 +11236,8 @@
         <w:rPr>
           <w:color w:val="000000" w:themeColor="text1"/>
         </w:rPr>
-        <w:t xml:space="preserve">login: </w:t>
-      </w:r>
-      <w:proofErr w:type="spellStart"/>
-      <w:r>
-        <w:rPr>
-          <w:color w:val="000000" w:themeColor="text1"/>
-        </w:rPr>
-        <w:t>null</w:t>
-      </w:r>
-      <w:proofErr w:type="spellEnd"/>
+        <w:t>login: null</w:t>
+      </w:r>
     </w:p>
     <w:p>
       <w:pPr>
@@ -11544,21 +11287,12 @@
         </w:rPr>
         <w:tab/>
       </w:r>
-      <w:proofErr w:type="spellStart"/>
       <w:r>
         <w:rPr>
           <w:color w:val="000000" w:themeColor="text1"/>
           <w:lang w:val="en-US"/>
         </w:rPr>
-        <w:t>telefone</w:t>
-      </w:r>
-      <w:proofErr w:type="spellEnd"/>
-      <w:r>
-        <w:rPr>
-          <w:color w:val="000000" w:themeColor="text1"/>
-          <w:lang w:val="en-US"/>
-        </w:rPr>
-        <w:t>: null</w:t>
+        <w:t>telefone: null</w:t>
       </w:r>
     </w:p>
     <w:p>
@@ -12064,29 +11798,27 @@
         </w:rPr>
         <w:tab/>
       </w:r>
-      <w:proofErr w:type="spellStart"/>
       <w:r>
         <w:rPr>
           <w:color w:val="000000" w:themeColor="text1"/>
           <w:lang w:val="en-US"/>
         </w:rPr>
-        <w:t>telefone</w:t>
-      </w:r>
-      <w:proofErr w:type="spellEnd"/>
+        <w:t>telefone: “11912345678”</w:t>
+      </w:r>
+    </w:p>
+    <w:p>
+      <w:pPr>
+        <w:rPr>
+          <w:color w:val="000000" w:themeColor="text1"/>
+        </w:rPr>
+      </w:pPr>
       <w:r>
         <w:rPr>
           <w:color w:val="000000" w:themeColor="text1"/>
           <w:lang w:val="en-US"/>
         </w:rPr>
-        <w:t>: “11912345678”</w:t>
-      </w:r>
-    </w:p>
-    <w:p>
-      <w:pPr>
-        <w:rPr>
-          <w:color w:val="000000" w:themeColor="text1"/>
-        </w:rPr>
-      </w:pPr>
+        <w:tab/>
+      </w:r>
       <w:r>
         <w:rPr>
           <w:color w:val="000000" w:themeColor="text1"/>
@@ -12097,23 +11829,8 @@
       <w:r>
         <w:rPr>
           <w:color w:val="000000" w:themeColor="text1"/>
-          <w:lang w:val="en-US"/>
-        </w:rPr>
-        <w:tab/>
-      </w:r>
-      <w:proofErr w:type="spellStart"/>
-      <w:r>
-        <w:rPr>
-          <w:color w:val="000000" w:themeColor="text1"/>
-        </w:rPr>
-        <w:t>email</w:t>
-      </w:r>
-      <w:proofErr w:type="spellEnd"/>
-      <w:r>
-        <w:rPr>
-          <w:color w:val="000000" w:themeColor="text1"/>
-        </w:rPr>
-        <w:t>: “teste@email.com”</w:t>
+        </w:rPr>
+        <w:t>email: “teste@email.com”</w:t>
       </w:r>
     </w:p>
     <w:p>
@@ -12187,21 +11904,7 @@
         <w:rPr>
           <w:color w:val="000000" w:themeColor="text1"/>
         </w:rPr>
-        <w:t xml:space="preserve">Lançar exceção </w:t>
-      </w:r>
-      <w:proofErr w:type="spellStart"/>
-      <w:r>
-        <w:rPr>
-          <w:color w:val="000000" w:themeColor="text1"/>
-        </w:rPr>
-        <w:t>InvalidNameException</w:t>
-      </w:r>
-      <w:proofErr w:type="spellEnd"/>
-      <w:r>
-        <w:rPr>
-          <w:color w:val="000000" w:themeColor="text1"/>
-        </w:rPr>
-        <w:t xml:space="preserve"> com a mensagem “</w:t>
+        <w:t>Lançar exceção InvalidNameException com a mensagem “</w:t>
       </w:r>
       <w:r>
         <w:rPr>
@@ -12508,89 +12211,11 @@
         </w:rPr>
         <w:t>nome: “</w:t>
       </w:r>
-      <w:proofErr w:type="spellStart"/>
-      <w:r>
-        <w:rPr>
-          <w:color w:val="000000" w:themeColor="text1"/>
-        </w:rPr>
-        <w:t>abcd</w:t>
-      </w:r>
-      <w:proofErr w:type="spellEnd"/>
-      <w:r>
-        <w:rPr>
-          <w:color w:val="000000" w:themeColor="text1"/>
-        </w:rPr>
-        <w:t xml:space="preserve"> </w:t>
-      </w:r>
-      <w:proofErr w:type="spellStart"/>
-      <w:r>
-        <w:rPr>
-          <w:color w:val="000000" w:themeColor="text1"/>
-        </w:rPr>
-        <w:t>efgh</w:t>
-      </w:r>
-      <w:proofErr w:type="spellEnd"/>
-      <w:r>
-        <w:rPr>
-          <w:color w:val="000000" w:themeColor="text1"/>
-        </w:rPr>
-        <w:t xml:space="preserve"> </w:t>
-      </w:r>
-      <w:proofErr w:type="spellStart"/>
-      <w:r>
-        <w:rPr>
-          <w:color w:val="000000" w:themeColor="text1"/>
-        </w:rPr>
-        <w:t>ijkl</w:t>
-      </w:r>
-      <w:proofErr w:type="spellEnd"/>
-      <w:r>
-        <w:rPr>
-          <w:color w:val="000000" w:themeColor="text1"/>
-        </w:rPr>
-        <w:t xml:space="preserve"> </w:t>
-      </w:r>
-      <w:proofErr w:type="spellStart"/>
-      <w:r>
-        <w:rPr>
-          <w:color w:val="000000" w:themeColor="text1"/>
-        </w:rPr>
-        <w:t>nmop</w:t>
-      </w:r>
-      <w:proofErr w:type="spellEnd"/>
-      <w:r>
-        <w:rPr>
-          <w:color w:val="000000" w:themeColor="text1"/>
-        </w:rPr>
-        <w:t xml:space="preserve"> </w:t>
-      </w:r>
-      <w:proofErr w:type="spellStart"/>
-      <w:r>
-        <w:rPr>
-          <w:color w:val="000000" w:themeColor="text1"/>
-        </w:rPr>
-        <w:t>qrst</w:t>
-      </w:r>
-      <w:proofErr w:type="spellEnd"/>
-      <w:r>
-        <w:rPr>
-          <w:color w:val="000000" w:themeColor="text1"/>
-        </w:rPr>
-        <w:t xml:space="preserve"> </w:t>
-      </w:r>
-      <w:proofErr w:type="spellStart"/>
-      <w:r>
-        <w:rPr>
-          <w:color w:val="000000" w:themeColor="text1"/>
-        </w:rPr>
-        <w:t>uvxz</w:t>
-      </w:r>
-      <w:proofErr w:type="spellEnd"/>
-      <w:r>
-        <w:rPr>
-          <w:color w:val="000000" w:themeColor="text1"/>
-        </w:rPr>
-        <w:t xml:space="preserve"> 123</w:t>
+      <w:r>
+        <w:rPr>
+          <w:color w:val="000000" w:themeColor="text1"/>
+        </w:rPr>
+        <w:t>abcd efgh ijkl nmop qrst uvxz 123</w:t>
       </w:r>
       <w:r>
         <w:rPr>
@@ -12670,29 +12295,27 @@
         </w:rPr>
         <w:tab/>
       </w:r>
-      <w:proofErr w:type="spellStart"/>
       <w:r>
         <w:rPr>
           <w:color w:val="000000" w:themeColor="text1"/>
           <w:lang w:val="en-US"/>
         </w:rPr>
-        <w:t>telefone</w:t>
-      </w:r>
-      <w:proofErr w:type="spellEnd"/>
+        <w:t>telefone: “11912345678”</w:t>
+      </w:r>
+    </w:p>
+    <w:p>
+      <w:pPr>
+        <w:rPr>
+          <w:color w:val="000000" w:themeColor="text1"/>
+        </w:rPr>
+      </w:pPr>
       <w:r>
         <w:rPr>
           <w:color w:val="000000" w:themeColor="text1"/>
           <w:lang w:val="en-US"/>
         </w:rPr>
-        <w:t>: “11912345678”</w:t>
-      </w:r>
-    </w:p>
-    <w:p>
-      <w:pPr>
-        <w:rPr>
-          <w:color w:val="000000" w:themeColor="text1"/>
-        </w:rPr>
-      </w:pPr>
+        <w:tab/>
+      </w:r>
       <w:r>
         <w:rPr>
           <w:color w:val="000000" w:themeColor="text1"/>
@@ -12703,23 +12326,8 @@
       <w:r>
         <w:rPr>
           <w:color w:val="000000" w:themeColor="text1"/>
-          <w:lang w:val="en-US"/>
-        </w:rPr>
-        <w:tab/>
-      </w:r>
-      <w:proofErr w:type="spellStart"/>
-      <w:r>
-        <w:rPr>
-          <w:color w:val="000000" w:themeColor="text1"/>
-        </w:rPr>
-        <w:t>email</w:t>
-      </w:r>
-      <w:proofErr w:type="spellEnd"/>
-      <w:r>
-        <w:rPr>
-          <w:color w:val="000000" w:themeColor="text1"/>
-        </w:rPr>
-        <w:t>: “teste@email.com”</w:t>
+        </w:rPr>
+        <w:t>email: “teste@email.com”</w:t>
       </w:r>
     </w:p>
     <w:p>
@@ -12793,21 +12401,7 @@
         <w:rPr>
           <w:color w:val="000000" w:themeColor="text1"/>
         </w:rPr>
-        <w:t xml:space="preserve">Lançar exceção </w:t>
-      </w:r>
-      <w:proofErr w:type="spellStart"/>
-      <w:r>
-        <w:rPr>
-          <w:color w:val="000000" w:themeColor="text1"/>
-        </w:rPr>
-        <w:t>InvalidNameException</w:t>
-      </w:r>
-      <w:proofErr w:type="spellEnd"/>
-      <w:r>
-        <w:rPr>
-          <w:color w:val="000000" w:themeColor="text1"/>
-        </w:rPr>
-        <w:t xml:space="preserve"> com a mensagem “O nome do usuário deve ter entre 4 e 32 caracteres”.</w:t>
+        <w:t>Lançar exceção InvalidNameException com a mensagem “O nome do usuário deve ter entre 4 e 32 caracteres”.</w:t>
       </w:r>
     </w:p>
     <w:p>
@@ -13106,27 +12700,13 @@
         <w:rPr>
           <w:color w:val="000000" w:themeColor="text1"/>
         </w:rPr>
-        <w:t xml:space="preserve">nome: </w:t>
-      </w:r>
-      <w:proofErr w:type="gramStart"/>
-      <w:r>
-        <w:rPr>
-          <w:color w:val="000000" w:themeColor="text1"/>
-        </w:rPr>
-        <w:t>“</w:t>
-      </w:r>
-      <w:r>
-        <w:rPr>
-          <w:color w:val="000000" w:themeColor="text1"/>
-        </w:rPr>
-        <w:t xml:space="preserve">  </w:t>
-      </w:r>
-      <w:proofErr w:type="gramEnd"/>
-      <w:r>
-        <w:rPr>
-          <w:color w:val="000000" w:themeColor="text1"/>
-        </w:rPr>
-        <w:t xml:space="preserve">   </w:t>
+        <w:t>nome: “</w:t>
+      </w:r>
+      <w:r>
+        <w:rPr>
+          <w:color w:val="000000" w:themeColor="text1"/>
+        </w:rPr>
+        <w:t xml:space="preserve">     </w:t>
       </w:r>
       <w:r>
         <w:rPr>
@@ -13177,20 +12757,7 @@
           <w:color w:val="000000" w:themeColor="text1"/>
         </w:rPr>
         <w:tab/>
-      </w:r>
-      <w:proofErr w:type="spellStart"/>
-      <w:r>
-        <w:rPr>
-          <w:color w:val="000000" w:themeColor="text1"/>
-        </w:rPr>
-        <w:t>password</w:t>
-      </w:r>
-      <w:proofErr w:type="spellEnd"/>
-      <w:r>
-        <w:rPr>
-          <w:color w:val="000000" w:themeColor="text1"/>
-        </w:rPr>
-        <w:t>: “teste”</w:t>
+        <w:t>password: “teste”</w:t>
       </w:r>
     </w:p>
     <w:p>
@@ -13232,19 +12799,11 @@
         </w:rPr>
         <w:tab/>
       </w:r>
-      <w:proofErr w:type="spellStart"/>
-      <w:r>
-        <w:rPr>
-          <w:color w:val="000000" w:themeColor="text1"/>
-        </w:rPr>
-        <w:t>email</w:t>
-      </w:r>
-      <w:proofErr w:type="spellEnd"/>
-      <w:r>
-        <w:rPr>
-          <w:color w:val="000000" w:themeColor="text1"/>
-        </w:rPr>
-        <w:t>: “teste@email.com”</w:t>
+      <w:r>
+        <w:rPr>
+          <w:color w:val="000000" w:themeColor="text1"/>
+        </w:rPr>
+        <w:t>email: “teste@email.com”</w:t>
       </w:r>
     </w:p>
     <w:p>
@@ -13318,21 +12877,7 @@
         <w:rPr>
           <w:color w:val="000000" w:themeColor="text1"/>
         </w:rPr>
-        <w:t xml:space="preserve">Lançar exceção </w:t>
-      </w:r>
-      <w:proofErr w:type="spellStart"/>
-      <w:r>
-        <w:rPr>
-          <w:color w:val="000000" w:themeColor="text1"/>
-        </w:rPr>
-        <w:t>InvalidNameException</w:t>
-      </w:r>
-      <w:proofErr w:type="spellEnd"/>
-      <w:r>
-        <w:rPr>
-          <w:color w:val="000000" w:themeColor="text1"/>
-        </w:rPr>
-        <w:t xml:space="preserve"> com a mensagem “O nome do usuário </w:t>
+        <w:t xml:space="preserve">Lançar exceção InvalidNameException com a mensagem “O nome do usuário </w:t>
       </w:r>
       <w:r>
         <w:rPr>
@@ -13700,20 +13245,7 @@
           <w:color w:val="000000" w:themeColor="text1"/>
         </w:rPr>
         <w:tab/>
-      </w:r>
-      <w:proofErr w:type="spellStart"/>
-      <w:r>
-        <w:rPr>
-          <w:color w:val="000000" w:themeColor="text1"/>
-        </w:rPr>
-        <w:t>password</w:t>
-      </w:r>
-      <w:proofErr w:type="spellEnd"/>
-      <w:r>
-        <w:rPr>
-          <w:color w:val="000000" w:themeColor="text1"/>
-        </w:rPr>
-        <w:t>: “teste”</w:t>
+        <w:t>password: “teste”</w:t>
       </w:r>
     </w:p>
     <w:p>
@@ -13754,19 +13286,11 @@
         </w:rPr>
         <w:tab/>
       </w:r>
-      <w:proofErr w:type="spellStart"/>
-      <w:r>
-        <w:rPr>
-          <w:color w:val="000000" w:themeColor="text1"/>
-        </w:rPr>
-        <w:t>email</w:t>
-      </w:r>
-      <w:proofErr w:type="spellEnd"/>
-      <w:r>
-        <w:rPr>
-          <w:color w:val="000000" w:themeColor="text1"/>
-        </w:rPr>
-        <w:t>: “teste@email.com”</w:t>
+      <w:r>
+        <w:rPr>
+          <w:color w:val="000000" w:themeColor="text1"/>
+        </w:rPr>
+        <w:t>email: “teste@email.com”</w:t>
       </w:r>
     </w:p>
     <w:p>
@@ -13840,21 +13364,7 @@
         <w:rPr>
           <w:color w:val="000000" w:themeColor="text1"/>
         </w:rPr>
-        <w:t xml:space="preserve">Lançar exceção </w:t>
-      </w:r>
-      <w:proofErr w:type="spellStart"/>
-      <w:r>
-        <w:rPr>
-          <w:color w:val="000000" w:themeColor="text1"/>
-        </w:rPr>
-        <w:t>InvalidNameException</w:t>
-      </w:r>
-      <w:proofErr w:type="spellEnd"/>
-      <w:r>
-        <w:rPr>
-          <w:color w:val="000000" w:themeColor="text1"/>
-        </w:rPr>
-        <w:t xml:space="preserve"> com a mensagem “O nome do usuário não pode conter apenas números”.</w:t>
+        <w:t>Lançar exceção InvalidNameException com a mensagem “O nome do usuário não pode conter apenas números”.</w:t>
       </w:r>
     </w:p>
     <w:p>
@@ -14279,7 +13789,6 @@
         </w:rPr>
         <w:t>login: “</w:t>
       </w:r>
-      <w:proofErr w:type="spellStart"/>
       <w:r>
         <w:rPr>
           <w:color w:val="000000" w:themeColor="text1"/>
@@ -14287,7 +13796,6 @@
         </w:rPr>
         <w:t>abc</w:t>
       </w:r>
-      <w:proofErr w:type="spellEnd"/>
       <w:r>
         <w:rPr>
           <w:color w:val="000000" w:themeColor="text1"/>
@@ -14340,29 +13848,27 @@
         </w:rPr>
         <w:tab/>
       </w:r>
-      <w:proofErr w:type="spellStart"/>
       <w:r>
         <w:rPr>
           <w:color w:val="000000" w:themeColor="text1"/>
           <w:lang w:val="en-US"/>
         </w:rPr>
-        <w:t>telefone</w:t>
-      </w:r>
-      <w:proofErr w:type="spellEnd"/>
+        <w:t>telefone: “11912345678”</w:t>
+      </w:r>
+    </w:p>
+    <w:p>
+      <w:pPr>
+        <w:rPr>
+          <w:color w:val="000000" w:themeColor="text1"/>
+        </w:rPr>
+      </w:pPr>
       <w:r>
         <w:rPr>
           <w:color w:val="000000" w:themeColor="text1"/>
           <w:lang w:val="en-US"/>
         </w:rPr>
-        <w:t>: “11912345678”</w:t>
-      </w:r>
-    </w:p>
-    <w:p>
-      <w:pPr>
-        <w:rPr>
-          <w:color w:val="000000" w:themeColor="text1"/>
-        </w:rPr>
-      </w:pPr>
+        <w:tab/>
+      </w:r>
       <w:r>
         <w:rPr>
           <w:color w:val="000000" w:themeColor="text1"/>
@@ -14373,23 +13879,8 @@
       <w:r>
         <w:rPr>
           <w:color w:val="000000" w:themeColor="text1"/>
-          <w:lang w:val="en-US"/>
-        </w:rPr>
-        <w:tab/>
-      </w:r>
-      <w:proofErr w:type="spellStart"/>
-      <w:r>
-        <w:rPr>
-          <w:color w:val="000000" w:themeColor="text1"/>
-        </w:rPr>
-        <w:t>email</w:t>
-      </w:r>
-      <w:proofErr w:type="spellEnd"/>
-      <w:r>
-        <w:rPr>
-          <w:color w:val="000000" w:themeColor="text1"/>
-        </w:rPr>
-        <w:t>: “teste@email.com”</w:t>
+        </w:rPr>
+        <w:t>email: “teste@email.com”</w:t>
       </w:r>
     </w:p>
     <w:p>
@@ -14463,14 +13954,7 @@
         <w:rPr>
           <w:color w:val="000000" w:themeColor="text1"/>
         </w:rPr>
-        <w:t xml:space="preserve">Lançar exceção </w:t>
-      </w:r>
-      <w:proofErr w:type="spellStart"/>
-      <w:r>
-        <w:rPr>
-          <w:color w:val="000000" w:themeColor="text1"/>
-        </w:rPr>
-        <w:t>Invalid</w:t>
+        <w:t>Lançar exceção Invalid</w:t>
       </w:r>
       <w:r>
         <w:rPr>
@@ -14482,14 +13966,7 @@
         <w:rPr>
           <w:color w:val="000000" w:themeColor="text1"/>
         </w:rPr>
-        <w:t>Exception</w:t>
-      </w:r>
-      <w:proofErr w:type="spellEnd"/>
-      <w:r>
-        <w:rPr>
-          <w:color w:val="000000" w:themeColor="text1"/>
-        </w:rPr>
-        <w:t xml:space="preserve"> com a mensagem “O </w:t>
+        <w:t xml:space="preserve">Exception com a mensagem “O </w:t>
       </w:r>
       <w:r>
         <w:rPr>
@@ -14535,6 +14012,643 @@
           <w:b/>
           <w:color w:val="000000" w:themeColor="text1"/>
         </w:rPr>
+        <w:t>Realização do teste:</w:t>
+      </w:r>
+      <w:r>
+        <w:rPr>
+          <w:color w:val="000000" w:themeColor="text1"/>
+        </w:rPr>
+        <w:t xml:space="preserve"> 00/00/0000.</w:t>
+      </w:r>
+    </w:p>
+    <w:p>
+      <w:pPr>
+        <w:rPr>
+          <w:color w:val="000000" w:themeColor="text1"/>
+        </w:rPr>
+      </w:pPr>
+      <w:r>
+        <w:rPr>
+          <w:b/>
+          <w:color w:val="000000" w:themeColor="text1"/>
+        </w:rPr>
+        <w:t xml:space="preserve">Responsável: </w:t>
+      </w:r>
+      <w:r>
+        <w:rPr>
+          <w:color w:val="000000" w:themeColor="text1"/>
+        </w:rPr>
+        <w:t>A definir.</w:t>
+      </w:r>
+    </w:p>
+    <w:p>
+      <w:pPr>
+        <w:rPr>
+          <w:color w:val="000000" w:themeColor="text1"/>
+        </w:rPr>
+      </w:pPr>
+    </w:p>
+    <w:p>
+      <w:pPr>
+        <w:pStyle w:val="Ttulo4"/>
+        <w:rPr>
+          <w:color w:val="FF0000"/>
+        </w:rPr>
+      </w:pPr>
+      <w:r>
+        <w:t>6.1.1.</w:t>
+      </w:r>
+      <w:r>
+        <w:t>8</w:t>
+      </w:r>
+      <w:r>
+        <w:t xml:space="preserve"> [TU001.0</w:t>
+      </w:r>
+      <w:r>
+        <w:t>8</w:t>
+      </w:r>
+      <w:r>
+        <w:t xml:space="preserve">] </w:t>
+      </w:r>
+      <w:r>
+        <w:rPr>
+          <w:color w:val="000000" w:themeColor="text1"/>
+        </w:rPr>
+        <w:t xml:space="preserve">O sistema não deve cadastrar usuário quando o </w:t>
+      </w:r>
+      <w:r>
+        <w:rPr>
+          <w:color w:val="000000" w:themeColor="text1"/>
+        </w:rPr>
+        <w:t>login</w:t>
+      </w:r>
+      <w:r>
+        <w:rPr>
+          <w:color w:val="000000" w:themeColor="text1"/>
+        </w:rPr>
+        <w:t xml:space="preserve"> tem mais de 32 caracteres</w:t>
+      </w:r>
+    </w:p>
+    <w:p/>
+    <w:p>
+      <w:pPr>
+        <w:rPr>
+          <w:color w:val="000000" w:themeColor="text1"/>
+        </w:rPr>
+      </w:pPr>
+      <w:r>
+        <w:rPr>
+          <w:b/>
+          <w:bCs/>
+          <w:color w:val="000000" w:themeColor="text1"/>
+        </w:rPr>
+        <w:t>Camada:</w:t>
+      </w:r>
+      <w:r>
+        <w:rPr>
+          <w:color w:val="000000" w:themeColor="text1"/>
+        </w:rPr>
+        <w:t xml:space="preserve"> Serviço.</w:t>
+      </w:r>
+    </w:p>
+    <w:p>
+      <w:pPr>
+        <w:rPr>
+          <w:color w:val="000000" w:themeColor="text1"/>
+        </w:rPr>
+      </w:pPr>
+      <w:r>
+        <w:rPr>
+          <w:b/>
+          <w:color w:val="000000" w:themeColor="text1"/>
+        </w:rPr>
+        <w:t>Requisitos associados:</w:t>
+      </w:r>
+      <w:r>
+        <w:rPr>
+          <w:color w:val="000000" w:themeColor="text1"/>
+        </w:rPr>
+        <w:t xml:space="preserve"> RF001.01, RN001.0</w:t>
+      </w:r>
+      <w:r>
+        <w:rPr>
+          <w:color w:val="000000" w:themeColor="text1"/>
+        </w:rPr>
+        <w:t>4</w:t>
+      </w:r>
+      <w:r>
+        <w:rPr>
+          <w:color w:val="000000" w:themeColor="text1"/>
+        </w:rPr>
+        <w:t>.</w:t>
+      </w:r>
+    </w:p>
+    <w:p>
+      <w:pPr>
+        <w:rPr>
+          <w:color w:val="000000" w:themeColor="text1"/>
+        </w:rPr>
+      </w:pPr>
+      <w:r>
+        <w:rPr>
+          <w:b/>
+          <w:color w:val="000000" w:themeColor="text1"/>
+        </w:rPr>
+        <w:t xml:space="preserve">Descrição: </w:t>
+      </w:r>
+      <w:r>
+        <w:rPr>
+          <w:color w:val="000000" w:themeColor="text1"/>
+        </w:rPr>
+        <w:t>O sistema não deve cadastrar usuário.</w:t>
+      </w:r>
+    </w:p>
+    <w:p>
+      <w:pPr>
+        <w:rPr>
+          <w:color w:val="000000" w:themeColor="text1"/>
+        </w:rPr>
+      </w:pPr>
+      <w:r>
+        <w:rPr>
+          <w:b/>
+          <w:color w:val="000000" w:themeColor="text1"/>
+        </w:rPr>
+        <w:t>Condições</w:t>
+      </w:r>
+      <w:r>
+        <w:rPr>
+          <w:color w:val="000000" w:themeColor="text1"/>
+        </w:rPr>
+        <w:t xml:space="preserve">: </w:t>
+      </w:r>
+      <w:r>
+        <w:rPr>
+          <w:color w:val="000000" w:themeColor="text1"/>
+        </w:rPr>
+        <w:t>Login</w:t>
+      </w:r>
+      <w:r>
+        <w:rPr>
+          <w:color w:val="000000" w:themeColor="text1"/>
+        </w:rPr>
+        <w:t xml:space="preserve"> do usuário com 33 caracteres.</w:t>
+      </w:r>
+    </w:p>
+    <w:p>
+      <w:pPr>
+        <w:rPr>
+          <w:color w:val="000000" w:themeColor="text1"/>
+        </w:rPr>
+      </w:pPr>
+      <w:r>
+        <w:rPr>
+          <w:b/>
+          <w:color w:val="000000" w:themeColor="text1"/>
+        </w:rPr>
+        <w:t>Passos:</w:t>
+      </w:r>
+      <w:r>
+        <w:rPr>
+          <w:color w:val="000000" w:themeColor="text1"/>
+        </w:rPr>
+        <w:t xml:space="preserve"> </w:t>
+      </w:r>
+    </w:p>
+    <w:p>
+      <w:pPr>
+        <w:pStyle w:val="PargrafodaLista"/>
+        <w:numPr>
+          <w:ilvl w:val="0"/>
+          <w:numId w:val="35"/>
+        </w:numPr>
+        <w:rPr>
+          <w:color w:val="000000" w:themeColor="text1"/>
+        </w:rPr>
+      </w:pPr>
+      <w:r>
+        <w:rPr>
+          <w:color w:val="000000" w:themeColor="text1"/>
+        </w:rPr>
+        <w:t xml:space="preserve">Informar os dados do usuário com o </w:t>
+      </w:r>
+      <w:r>
+        <w:rPr>
+          <w:color w:val="000000" w:themeColor="text1"/>
+        </w:rPr>
+        <w:t>login</w:t>
+      </w:r>
+      <w:r>
+        <w:rPr>
+          <w:color w:val="000000" w:themeColor="text1"/>
+        </w:rPr>
+        <w:t xml:space="preserve"> com 33 caracteres.</w:t>
+      </w:r>
+    </w:p>
+    <w:p>
+      <w:pPr>
+        <w:pStyle w:val="PargrafodaLista"/>
+        <w:numPr>
+          <w:ilvl w:val="0"/>
+          <w:numId w:val="35"/>
+        </w:numPr>
+        <w:rPr>
+          <w:color w:val="000000" w:themeColor="text1"/>
+        </w:rPr>
+      </w:pPr>
+      <w:r>
+        <w:rPr>
+          <w:color w:val="000000" w:themeColor="text1"/>
+        </w:rPr>
+        <w:t>Validar a quantidade de caracteres do login.</w:t>
+      </w:r>
+    </w:p>
+    <w:p>
+      <w:pPr>
+        <w:pStyle w:val="PargrafodaLista"/>
+        <w:numPr>
+          <w:ilvl w:val="0"/>
+          <w:numId w:val="35"/>
+        </w:numPr>
+        <w:rPr>
+          <w:color w:val="000000" w:themeColor="text1"/>
+        </w:rPr>
+      </w:pPr>
+      <w:r>
+        <w:rPr>
+          <w:color w:val="000000" w:themeColor="text1"/>
+        </w:rPr>
+        <w:t>Receber mensagem de erro ao cadastrar login inválido.</w:t>
+      </w:r>
+    </w:p>
+    <w:p>
+      <w:pPr>
+        <w:rPr>
+          <w:color w:val="000000" w:themeColor="text1"/>
+        </w:rPr>
+      </w:pPr>
+      <w:r>
+        <w:rPr>
+          <w:b/>
+          <w:color w:val="000000" w:themeColor="text1"/>
+        </w:rPr>
+        <w:t>Dados do teste:</w:t>
+      </w:r>
+      <w:r>
+        <w:rPr>
+          <w:color w:val="000000" w:themeColor="text1"/>
+        </w:rPr>
+        <w:t xml:space="preserve"> </w:t>
+      </w:r>
+    </w:p>
+    <w:p>
+      <w:pPr>
+        <w:ind w:firstLine="720"/>
+        <w:rPr>
+          <w:color w:val="000000" w:themeColor="text1"/>
+        </w:rPr>
+      </w:pPr>
+      <w:r>
+        <w:rPr>
+          <w:color w:val="000000" w:themeColor="text1"/>
+        </w:rPr>
+        <w:t>{</w:t>
+      </w:r>
+    </w:p>
+    <w:p>
+      <w:pPr>
+        <w:rPr>
+          <w:color w:val="000000" w:themeColor="text1"/>
+        </w:rPr>
+      </w:pPr>
+      <w:r>
+        <w:rPr>
+          <w:color w:val="000000" w:themeColor="text1"/>
+        </w:rPr>
+        <w:tab/>
+      </w:r>
+      <w:r>
+        <w:rPr>
+          <w:color w:val="000000" w:themeColor="text1"/>
+        </w:rPr>
+        <w:tab/>
+      </w:r>
+      <w:r>
+        <w:rPr>
+          <w:color w:val="000000" w:themeColor="text1"/>
+        </w:rPr>
+        <w:t>nome: “</w:t>
+      </w:r>
+      <w:r>
+        <w:rPr>
+          <w:color w:val="000000" w:themeColor="text1"/>
+        </w:rPr>
+        <w:t>teste</w:t>
+      </w:r>
+      <w:r>
+        <w:rPr>
+          <w:color w:val="000000" w:themeColor="text1"/>
+        </w:rPr>
+        <w:t>”</w:t>
+      </w:r>
+    </w:p>
+    <w:p>
+      <w:pPr>
+        <w:rPr>
+          <w:color w:val="000000" w:themeColor="text1"/>
+          <w:lang w:val="en-US"/>
+        </w:rPr>
+      </w:pPr>
+      <w:r>
+        <w:rPr>
+          <w:color w:val="000000" w:themeColor="text1"/>
+        </w:rPr>
+        <w:tab/>
+      </w:r>
+      <w:r>
+        <w:rPr>
+          <w:color w:val="000000" w:themeColor="text1"/>
+        </w:rPr>
+        <w:tab/>
+      </w:r>
+      <w:r>
+        <w:rPr>
+          <w:color w:val="000000" w:themeColor="text1"/>
+          <w:lang w:val="en-US"/>
+        </w:rPr>
+        <w:t>login: “</w:t>
+      </w:r>
+      <w:r>
+        <w:rPr>
+          <w:color w:val="000000" w:themeColor="text1"/>
+        </w:rPr>
+        <w:t>abcd</w:t>
+      </w:r>
+      <w:r>
+        <w:rPr>
+          <w:color w:val="000000" w:themeColor="text1"/>
+        </w:rPr>
+        <w:t>_</w:t>
+      </w:r>
+      <w:r>
+        <w:rPr>
+          <w:color w:val="000000" w:themeColor="text1"/>
+        </w:rPr>
+        <w:t>efgh</w:t>
+      </w:r>
+      <w:r>
+        <w:rPr>
+          <w:color w:val="000000" w:themeColor="text1"/>
+        </w:rPr>
+        <w:t>_</w:t>
+      </w:r>
+      <w:r>
+        <w:rPr>
+          <w:color w:val="000000" w:themeColor="text1"/>
+        </w:rPr>
+        <w:t>ijkl</w:t>
+      </w:r>
+      <w:r>
+        <w:rPr>
+          <w:color w:val="000000" w:themeColor="text1"/>
+        </w:rPr>
+        <w:t>_</w:t>
+      </w:r>
+      <w:r>
+        <w:rPr>
+          <w:color w:val="000000" w:themeColor="text1"/>
+        </w:rPr>
+        <w:t>nmop</w:t>
+      </w:r>
+      <w:r>
+        <w:rPr>
+          <w:color w:val="000000" w:themeColor="text1"/>
+        </w:rPr>
+        <w:t>_</w:t>
+      </w:r>
+      <w:r>
+        <w:rPr>
+          <w:color w:val="000000" w:themeColor="text1"/>
+        </w:rPr>
+        <w:t>qrst</w:t>
+      </w:r>
+      <w:r>
+        <w:rPr>
+          <w:color w:val="000000" w:themeColor="text1"/>
+        </w:rPr>
+        <w:t>_</w:t>
+      </w:r>
+      <w:r>
+        <w:rPr>
+          <w:color w:val="000000" w:themeColor="text1"/>
+        </w:rPr>
+        <w:t>uvxz</w:t>
+      </w:r>
+      <w:r>
+        <w:rPr>
+          <w:color w:val="000000" w:themeColor="text1"/>
+        </w:rPr>
+        <w:t>_</w:t>
+      </w:r>
+      <w:r>
+        <w:rPr>
+          <w:color w:val="000000" w:themeColor="text1"/>
+        </w:rPr>
+        <w:t>123</w:t>
+      </w:r>
+      <w:r>
+        <w:rPr>
+          <w:color w:val="000000" w:themeColor="text1"/>
+          <w:lang w:val="en-US"/>
+        </w:rPr>
+        <w:t>”</w:t>
+      </w:r>
+    </w:p>
+    <w:p>
+      <w:pPr>
+        <w:rPr>
+          <w:color w:val="000000" w:themeColor="text1"/>
+          <w:lang w:val="en-US"/>
+        </w:rPr>
+      </w:pPr>
+      <w:r>
+        <w:rPr>
+          <w:color w:val="000000" w:themeColor="text1"/>
+          <w:lang w:val="en-US"/>
+        </w:rPr>
+        <w:tab/>
+      </w:r>
+      <w:r>
+        <w:rPr>
+          <w:color w:val="000000" w:themeColor="text1"/>
+          <w:lang w:val="en-US"/>
+        </w:rPr>
+        <w:tab/>
+        <w:t>password: “teste”</w:t>
+      </w:r>
+    </w:p>
+    <w:p>
+      <w:pPr>
+        <w:rPr>
+          <w:color w:val="000000" w:themeColor="text1"/>
+          <w:lang w:val="en-US"/>
+        </w:rPr>
+      </w:pPr>
+      <w:r>
+        <w:rPr>
+          <w:color w:val="000000" w:themeColor="text1"/>
+          <w:lang w:val="en-US"/>
+        </w:rPr>
+        <w:tab/>
+      </w:r>
+      <w:r>
+        <w:rPr>
+          <w:color w:val="000000" w:themeColor="text1"/>
+          <w:lang w:val="en-US"/>
+        </w:rPr>
+        <w:tab/>
+      </w:r>
+      <w:r>
+        <w:rPr>
+          <w:color w:val="000000" w:themeColor="text1"/>
+          <w:lang w:val="en-US"/>
+        </w:rPr>
+        <w:t>telefone: “11912345678”</w:t>
+      </w:r>
+    </w:p>
+    <w:p>
+      <w:pPr>
+        <w:rPr>
+          <w:color w:val="000000" w:themeColor="text1"/>
+        </w:rPr>
+      </w:pPr>
+      <w:r>
+        <w:rPr>
+          <w:color w:val="000000" w:themeColor="text1"/>
+          <w:lang w:val="en-US"/>
+        </w:rPr>
+        <w:tab/>
+      </w:r>
+      <w:r>
+        <w:rPr>
+          <w:color w:val="000000" w:themeColor="text1"/>
+          <w:lang w:val="en-US"/>
+        </w:rPr>
+        <w:tab/>
+      </w:r>
+      <w:r>
+        <w:rPr>
+          <w:color w:val="000000" w:themeColor="text1"/>
+        </w:rPr>
+        <w:t>email: “teste@email.com”</w:t>
+      </w:r>
+    </w:p>
+    <w:p>
+      <w:pPr>
+        <w:rPr>
+          <w:color w:val="000000" w:themeColor="text1"/>
+        </w:rPr>
+      </w:pPr>
+      <w:r>
+        <w:rPr>
+          <w:color w:val="000000" w:themeColor="text1"/>
+        </w:rPr>
+        <w:tab/>
+      </w:r>
+      <w:r>
+        <w:rPr>
+          <w:color w:val="000000" w:themeColor="text1"/>
+        </w:rPr>
+        <w:tab/>
+        <w:t>status: ATIVO</w:t>
+      </w:r>
+    </w:p>
+    <w:p>
+      <w:pPr>
+        <w:rPr>
+          <w:color w:val="000000" w:themeColor="text1"/>
+        </w:rPr>
+      </w:pPr>
+      <w:r>
+        <w:rPr>
+          <w:color w:val="000000" w:themeColor="text1"/>
+        </w:rPr>
+        <w:tab/>
+      </w:r>
+      <w:r>
+        <w:rPr>
+          <w:color w:val="000000" w:themeColor="text1"/>
+        </w:rPr>
+        <w:tab/>
+        <w:t>perfil: ADMIN</w:t>
+      </w:r>
+    </w:p>
+    <w:p>
+      <w:pPr>
+        <w:rPr>
+          <w:color w:val="000000" w:themeColor="text1"/>
+        </w:rPr>
+      </w:pPr>
+      <w:r>
+        <w:rPr>
+          <w:color w:val="000000" w:themeColor="text1"/>
+        </w:rPr>
+        <w:tab/>
+        <w:t>}</w:t>
+      </w:r>
+    </w:p>
+    <w:p>
+      <w:pPr>
+        <w:rPr>
+          <w:color w:val="000000" w:themeColor="text1"/>
+        </w:rPr>
+      </w:pPr>
+      <w:r>
+        <w:rPr>
+          <w:b/>
+          <w:color w:val="000000" w:themeColor="text1"/>
+        </w:rPr>
+        <w:t xml:space="preserve">Resultado esperado: </w:t>
+      </w:r>
+      <w:r>
+        <w:rPr>
+          <w:color w:val="000000" w:themeColor="text1"/>
+        </w:rPr>
+        <w:t>Lançar exceção InvalidNameException com a mensagem “O nome do usuário deve ter entre 4 e 32 caracteres”.</w:t>
+      </w:r>
+    </w:p>
+    <w:p>
+      <w:pPr>
+        <w:rPr>
+          <w:color w:val="000000" w:themeColor="text1"/>
+        </w:rPr>
+      </w:pPr>
+      <w:r>
+        <w:rPr>
+          <w:b/>
+          <w:color w:val="000000" w:themeColor="text1"/>
+        </w:rPr>
+        <w:t>Status:</w:t>
+      </w:r>
+      <w:r>
+        <w:rPr>
+          <w:color w:val="000000" w:themeColor="text1"/>
+        </w:rPr>
+        <w:t xml:space="preserve"> Não realizado.</w:t>
+      </w:r>
+    </w:p>
+    <w:p>
+      <w:pPr>
+        <w:rPr>
+          <w:color w:val="000000" w:themeColor="text1"/>
+        </w:rPr>
+      </w:pPr>
+      <w:r>
+        <w:rPr>
+          <w:b/>
+          <w:color w:val="000000" w:themeColor="text1"/>
+        </w:rPr>
+        <w:lastRenderedPageBreak/>
         <w:t>Realização do teste:</w:t>
       </w:r>
       <w:r>
@@ -14859,7 +14973,6 @@
         </w:rPr>
         <w:t>login: “</w:t>
       </w:r>
-      <w:proofErr w:type="spellStart"/>
       <w:r>
         <w:rPr>
           <w:color w:val="000000" w:themeColor="text1"/>
@@ -14867,7 +14980,6 @@
         </w:rPr>
         <w:t>login_existente</w:t>
       </w:r>
-      <w:proofErr w:type="spellEnd"/>
       <w:r>
         <w:rPr>
           <w:color w:val="000000" w:themeColor="text1"/>
@@ -14943,20 +15055,7 @@
           <w:color w:val="000000" w:themeColor="text1"/>
         </w:rPr>
         <w:tab/>
-      </w:r>
-      <w:proofErr w:type="spellStart"/>
-      <w:r>
-        <w:rPr>
-          <w:color w:val="000000" w:themeColor="text1"/>
-        </w:rPr>
-        <w:t>email</w:t>
-      </w:r>
-      <w:proofErr w:type="spellEnd"/>
-      <w:r>
-        <w:rPr>
-          <w:color w:val="000000" w:themeColor="text1"/>
-        </w:rPr>
-        <w:t>: “teste@email.com”</w:t>
+        <w:t>email: “teste@email.com”</w:t>
       </w:r>
     </w:p>
     <w:p>
@@ -15032,14 +15131,12 @@
         </w:rPr>
         <w:t xml:space="preserve">Lançar exceção </w:t>
       </w:r>
-      <w:proofErr w:type="spellStart"/>
       <w:r>
         <w:rPr>
           <w:color w:val="000000" w:themeColor="text1"/>
         </w:rPr>
         <w:t>EntityAlreadyExisting</w:t>
       </w:r>
-      <w:proofErr w:type="spellEnd"/>
       <w:r>
         <w:rPr>
           <w:color w:val="000000" w:themeColor="text1"/>
@@ -15098,7 +15195,6 @@
           <w:b/>
           <w:color w:val="000000" w:themeColor="text1"/>
         </w:rPr>
-        <w:lastRenderedPageBreak/>
         <w:t xml:space="preserve">Responsável: </w:t>
       </w:r>
       <w:r>
@@ -16294,6 +16390,92 @@
     </w:lvl>
   </w:abstractNum>
   <w:abstractNum w:abstractNumId="7" w15:restartNumberingAfterBreak="0">
+    <w:nsid w:val="1CEC4C74"/>
+    <w:multiLevelType w:val="multilevel"/>
+    <w:tmpl w:val="7EAE38A0"/>
+    <w:lvl w:ilvl="0">
+      <w:start w:val="1"/>
+      <w:numFmt w:val="decimal"/>
+      <w:lvlText w:val="%1."/>
+      <w:lvlJc w:val="left"/>
+      <w:pPr>
+        <w:ind w:left="709" w:hanging="360"/>
+      </w:pPr>
+    </w:lvl>
+    <w:lvl w:ilvl="1">
+      <w:start w:val="1"/>
+      <w:numFmt w:val="lowerLetter"/>
+      <w:lvlText w:val="%2."/>
+      <w:lvlJc w:val="left"/>
+      <w:pPr>
+        <w:ind w:left="1429" w:hanging="360"/>
+      </w:pPr>
+    </w:lvl>
+    <w:lvl w:ilvl="2">
+      <w:start w:val="1"/>
+      <w:numFmt w:val="lowerRoman"/>
+      <w:lvlText w:val="%3."/>
+      <w:lvlJc w:val="right"/>
+      <w:pPr>
+        <w:ind w:left="2149" w:hanging="180"/>
+      </w:pPr>
+    </w:lvl>
+    <w:lvl w:ilvl="3">
+      <w:start w:val="1"/>
+      <w:numFmt w:val="decimal"/>
+      <w:lvlText w:val="%4."/>
+      <w:lvlJc w:val="left"/>
+      <w:pPr>
+        <w:ind w:left="2869" w:hanging="360"/>
+      </w:pPr>
+    </w:lvl>
+    <w:lvl w:ilvl="4">
+      <w:start w:val="1"/>
+      <w:numFmt w:val="lowerLetter"/>
+      <w:lvlText w:val="%5."/>
+      <w:lvlJc w:val="left"/>
+      <w:pPr>
+        <w:ind w:left="3589" w:hanging="360"/>
+      </w:pPr>
+    </w:lvl>
+    <w:lvl w:ilvl="5">
+      <w:start w:val="1"/>
+      <w:numFmt w:val="lowerRoman"/>
+      <w:lvlText w:val="%6."/>
+      <w:lvlJc w:val="right"/>
+      <w:pPr>
+        <w:ind w:left="4309" w:hanging="180"/>
+      </w:pPr>
+    </w:lvl>
+    <w:lvl w:ilvl="6">
+      <w:start w:val="1"/>
+      <w:numFmt w:val="decimal"/>
+      <w:lvlText w:val="%7."/>
+      <w:lvlJc w:val="left"/>
+      <w:pPr>
+        <w:ind w:left="5029" w:hanging="360"/>
+      </w:pPr>
+    </w:lvl>
+    <w:lvl w:ilvl="7">
+      <w:start w:val="1"/>
+      <w:numFmt w:val="lowerLetter"/>
+      <w:lvlText w:val="%8."/>
+      <w:lvlJc w:val="left"/>
+      <w:pPr>
+        <w:ind w:left="5749" w:hanging="360"/>
+      </w:pPr>
+    </w:lvl>
+    <w:lvl w:ilvl="8">
+      <w:start w:val="1"/>
+      <w:numFmt w:val="lowerRoman"/>
+      <w:lvlText w:val="%9."/>
+      <w:lvlJc w:val="right"/>
+      <w:pPr>
+        <w:ind w:left="6469" w:hanging="180"/>
+      </w:pPr>
+    </w:lvl>
+  </w:abstractNum>
+  <w:abstractNum w:abstractNumId="8" w15:restartNumberingAfterBreak="0">
     <w:nsid w:val="2567169C"/>
     <w:multiLevelType w:val="multilevel"/>
     <w:tmpl w:val="7EAE38A0"/>
@@ -16379,7 +16561,7 @@
       </w:pPr>
     </w:lvl>
   </w:abstractNum>
-  <w:abstractNum w:abstractNumId="8" w15:restartNumberingAfterBreak="0">
+  <w:abstractNum w:abstractNumId="9" w15:restartNumberingAfterBreak="0">
     <w:nsid w:val="27687D6D"/>
     <w:multiLevelType w:val="multilevel"/>
     <w:tmpl w:val="33B28994"/>
@@ -16465,7 +16647,7 @@
       </w:pPr>
     </w:lvl>
   </w:abstractNum>
-  <w:abstractNum w:abstractNumId="9" w15:restartNumberingAfterBreak="0">
+  <w:abstractNum w:abstractNumId="10" w15:restartNumberingAfterBreak="0">
     <w:nsid w:val="28492A00"/>
     <w:multiLevelType w:val="multilevel"/>
     <w:tmpl w:val="DF10247E"/>
@@ -16578,7 +16760,7 @@
       </w:rPr>
     </w:lvl>
   </w:abstractNum>
-  <w:abstractNum w:abstractNumId="10" w15:restartNumberingAfterBreak="0">
+  <w:abstractNum w:abstractNumId="11" w15:restartNumberingAfterBreak="0">
     <w:nsid w:val="29530051"/>
     <w:multiLevelType w:val="multilevel"/>
     <w:tmpl w:val="C04CB900"/>
@@ -16691,7 +16873,7 @@
       </w:rPr>
     </w:lvl>
   </w:abstractNum>
-  <w:abstractNum w:abstractNumId="11" w15:restartNumberingAfterBreak="0">
+  <w:abstractNum w:abstractNumId="12" w15:restartNumberingAfterBreak="0">
     <w:nsid w:val="311B04C2"/>
     <w:multiLevelType w:val="multilevel"/>
     <w:tmpl w:val="4B86EAF0"/>
@@ -16804,7 +16986,7 @@
       </w:rPr>
     </w:lvl>
   </w:abstractNum>
-  <w:abstractNum w:abstractNumId="12" w15:restartNumberingAfterBreak="0">
+  <w:abstractNum w:abstractNumId="13" w15:restartNumberingAfterBreak="0">
     <w:nsid w:val="32FE743C"/>
     <w:multiLevelType w:val="multilevel"/>
     <w:tmpl w:val="7EAE38A0"/>
@@ -16890,7 +17072,7 @@
       </w:pPr>
     </w:lvl>
   </w:abstractNum>
-  <w:abstractNum w:abstractNumId="13" w15:restartNumberingAfterBreak="0">
+  <w:abstractNum w:abstractNumId="14" w15:restartNumberingAfterBreak="0">
     <w:nsid w:val="357171FE"/>
     <w:multiLevelType w:val="multilevel"/>
     <w:tmpl w:val="7EAE38A0"/>
@@ -16976,7 +17158,7 @@
       </w:pPr>
     </w:lvl>
   </w:abstractNum>
-  <w:abstractNum w:abstractNumId="14" w15:restartNumberingAfterBreak="0">
+  <w:abstractNum w:abstractNumId="15" w15:restartNumberingAfterBreak="0">
     <w:nsid w:val="35873CED"/>
     <w:multiLevelType w:val="multilevel"/>
     <w:tmpl w:val="316EA91C"/>
@@ -17089,7 +17271,7 @@
       </w:rPr>
     </w:lvl>
   </w:abstractNum>
-  <w:abstractNum w:abstractNumId="15" w15:restartNumberingAfterBreak="0">
+  <w:abstractNum w:abstractNumId="16" w15:restartNumberingAfterBreak="0">
     <w:nsid w:val="35D208BE"/>
     <w:multiLevelType w:val="hybridMultilevel"/>
     <w:tmpl w:val="FEB2915A"/>
@@ -17202,7 +17384,7 @@
       </w:rPr>
     </w:lvl>
   </w:abstractNum>
-  <w:abstractNum w:abstractNumId="16" w15:restartNumberingAfterBreak="0">
+  <w:abstractNum w:abstractNumId="17" w15:restartNumberingAfterBreak="0">
     <w:nsid w:val="3AE82604"/>
     <w:multiLevelType w:val="multilevel"/>
     <w:tmpl w:val="5EC8825C"/>
@@ -17315,7 +17497,7 @@
       </w:rPr>
     </w:lvl>
   </w:abstractNum>
-  <w:abstractNum w:abstractNumId="17" w15:restartNumberingAfterBreak="0">
+  <w:abstractNum w:abstractNumId="18" w15:restartNumberingAfterBreak="0">
     <w:nsid w:val="425F7142"/>
     <w:multiLevelType w:val="multilevel"/>
     <w:tmpl w:val="6C3A65C8"/>
@@ -17428,7 +17610,7 @@
       </w:rPr>
     </w:lvl>
   </w:abstractNum>
-  <w:abstractNum w:abstractNumId="18" w15:restartNumberingAfterBreak="0">
+  <w:abstractNum w:abstractNumId="19" w15:restartNumberingAfterBreak="0">
     <w:nsid w:val="433872DF"/>
     <w:multiLevelType w:val="multilevel"/>
     <w:tmpl w:val="473E9B32"/>
@@ -17541,7 +17723,7 @@
       </w:rPr>
     </w:lvl>
   </w:abstractNum>
-  <w:abstractNum w:abstractNumId="19" w15:restartNumberingAfterBreak="0">
+  <w:abstractNum w:abstractNumId="20" w15:restartNumberingAfterBreak="0">
     <w:nsid w:val="4ABF56A0"/>
     <w:multiLevelType w:val="multilevel"/>
     <w:tmpl w:val="0D8E790A"/>
@@ -17627,7 +17809,7 @@
       </w:pPr>
     </w:lvl>
   </w:abstractNum>
-  <w:abstractNum w:abstractNumId="20" w15:restartNumberingAfterBreak="0">
+  <w:abstractNum w:abstractNumId="21" w15:restartNumberingAfterBreak="0">
     <w:nsid w:val="4C99572E"/>
     <w:multiLevelType w:val="hybridMultilevel"/>
     <w:tmpl w:val="81062254"/>
@@ -17740,7 +17922,7 @@
       </w:rPr>
     </w:lvl>
   </w:abstractNum>
-  <w:abstractNum w:abstractNumId="21" w15:restartNumberingAfterBreak="0">
+  <w:abstractNum w:abstractNumId="22" w15:restartNumberingAfterBreak="0">
     <w:nsid w:val="4DB86243"/>
     <w:multiLevelType w:val="multilevel"/>
     <w:tmpl w:val="D652AE68"/>
@@ -17853,7 +18035,7 @@
       </w:rPr>
     </w:lvl>
   </w:abstractNum>
-  <w:abstractNum w:abstractNumId="22" w15:restartNumberingAfterBreak="0">
+  <w:abstractNum w:abstractNumId="23" w15:restartNumberingAfterBreak="0">
     <w:nsid w:val="5C394BC9"/>
     <w:multiLevelType w:val="multilevel"/>
     <w:tmpl w:val="7EAE38A0"/>
@@ -17939,7 +18121,7 @@
       </w:pPr>
     </w:lvl>
   </w:abstractNum>
-  <w:abstractNum w:abstractNumId="23" w15:restartNumberingAfterBreak="0">
+  <w:abstractNum w:abstractNumId="24" w15:restartNumberingAfterBreak="0">
     <w:nsid w:val="610B3EDF"/>
     <w:multiLevelType w:val="multilevel"/>
     <w:tmpl w:val="7EAE38A0"/>
@@ -18025,7 +18207,7 @@
       </w:pPr>
     </w:lvl>
   </w:abstractNum>
-  <w:abstractNum w:abstractNumId="24" w15:restartNumberingAfterBreak="0">
+  <w:abstractNum w:abstractNumId="25" w15:restartNumberingAfterBreak="0">
     <w:nsid w:val="67403CB5"/>
     <w:multiLevelType w:val="multilevel"/>
     <w:tmpl w:val="75326788"/>
@@ -18138,7 +18320,7 @@
       </w:rPr>
     </w:lvl>
   </w:abstractNum>
-  <w:abstractNum w:abstractNumId="25" w15:restartNumberingAfterBreak="0">
+  <w:abstractNum w:abstractNumId="26" w15:restartNumberingAfterBreak="0">
     <w:nsid w:val="67C547F7"/>
     <w:multiLevelType w:val="multilevel"/>
     <w:tmpl w:val="35EAD4B8"/>
@@ -18224,7 +18406,7 @@
       </w:pPr>
     </w:lvl>
   </w:abstractNum>
-  <w:abstractNum w:abstractNumId="26" w15:restartNumberingAfterBreak="0">
+  <w:abstractNum w:abstractNumId="27" w15:restartNumberingAfterBreak="0">
     <w:nsid w:val="6C8202C1"/>
     <w:multiLevelType w:val="multilevel"/>
     <w:tmpl w:val="981048B2"/>
@@ -18337,7 +18519,7 @@
       </w:rPr>
     </w:lvl>
   </w:abstractNum>
-  <w:abstractNum w:abstractNumId="27" w15:restartNumberingAfterBreak="0">
+  <w:abstractNum w:abstractNumId="28" w15:restartNumberingAfterBreak="0">
     <w:nsid w:val="6CD6232C"/>
     <w:multiLevelType w:val="multilevel"/>
     <w:tmpl w:val="2C50429A"/>
@@ -18450,7 +18632,7 @@
       </w:rPr>
     </w:lvl>
   </w:abstractNum>
-  <w:abstractNum w:abstractNumId="28" w15:restartNumberingAfterBreak="0">
+  <w:abstractNum w:abstractNumId="29" w15:restartNumberingAfterBreak="0">
     <w:nsid w:val="6FBC5385"/>
     <w:multiLevelType w:val="multilevel"/>
     <w:tmpl w:val="9E36186C"/>
@@ -18563,7 +18745,7 @@
       </w:rPr>
     </w:lvl>
   </w:abstractNum>
-  <w:abstractNum w:abstractNumId="29" w15:restartNumberingAfterBreak="0">
+  <w:abstractNum w:abstractNumId="30" w15:restartNumberingAfterBreak="0">
     <w:nsid w:val="74B049B9"/>
     <w:multiLevelType w:val="multilevel"/>
     <w:tmpl w:val="7EAE38A0"/>
@@ -18649,7 +18831,7 @@
       </w:pPr>
     </w:lvl>
   </w:abstractNum>
-  <w:abstractNum w:abstractNumId="30" w15:restartNumberingAfterBreak="0">
+  <w:abstractNum w:abstractNumId="31" w15:restartNumberingAfterBreak="0">
     <w:nsid w:val="7ABF4D30"/>
     <w:multiLevelType w:val="multilevel"/>
     <w:tmpl w:val="C61A779C"/>
@@ -18762,7 +18944,7 @@
       </w:rPr>
     </w:lvl>
   </w:abstractNum>
-  <w:abstractNum w:abstractNumId="31" w15:restartNumberingAfterBreak="0">
+  <w:abstractNum w:abstractNumId="32" w15:restartNumberingAfterBreak="0">
     <w:nsid w:val="7E36314E"/>
     <w:multiLevelType w:val="hybridMultilevel"/>
     <w:tmpl w:val="6FDA89B4"/>
@@ -18875,7 +19057,7 @@
       </w:rPr>
     </w:lvl>
   </w:abstractNum>
-  <w:abstractNum w:abstractNumId="32" w15:restartNumberingAfterBreak="0">
+  <w:abstractNum w:abstractNumId="33" w15:restartNumberingAfterBreak="0">
     <w:nsid w:val="7ED21264"/>
     <w:multiLevelType w:val="multilevel"/>
     <w:tmpl w:val="87B4A5EE"/>
@@ -18988,7 +19170,7 @@
       </w:rPr>
     </w:lvl>
   </w:abstractNum>
-  <w:abstractNum w:abstractNumId="33" w15:restartNumberingAfterBreak="0">
+  <w:abstractNum w:abstractNumId="34" w15:restartNumberingAfterBreak="0">
     <w:nsid w:val="7FF4155E"/>
     <w:multiLevelType w:val="multilevel"/>
     <w:tmpl w:val="F9722B4C"/>
@@ -19081,88 +19263,88 @@
     <w:abstractNumId w:val="1"/>
   </w:num>
   <w:num w:numId="2" w16cid:durableId="88086438">
-    <w:abstractNumId w:val="30"/>
+    <w:abstractNumId w:val="31"/>
   </w:num>
   <w:num w:numId="3" w16cid:durableId="1706714901">
-    <w:abstractNumId w:val="27"/>
+    <w:abstractNumId w:val="28"/>
   </w:num>
   <w:num w:numId="4" w16cid:durableId="113717744">
     <w:abstractNumId w:val="0"/>
   </w:num>
   <w:num w:numId="5" w16cid:durableId="74671158">
+    <w:abstractNumId w:val="12"/>
+  </w:num>
+  <w:num w:numId="6" w16cid:durableId="913590874">
+    <w:abstractNumId w:val="22"/>
+  </w:num>
+  <w:num w:numId="7" w16cid:durableId="1890459348">
+    <w:abstractNumId w:val="34"/>
+  </w:num>
+  <w:num w:numId="8" w16cid:durableId="333532636">
     <w:abstractNumId w:val="11"/>
   </w:num>
-  <w:num w:numId="6" w16cid:durableId="913590874">
-    <w:abstractNumId w:val="21"/>
-  </w:num>
-  <w:num w:numId="7" w16cid:durableId="1890459348">
-    <w:abstractNumId w:val="33"/>
-  </w:num>
-  <w:num w:numId="8" w16cid:durableId="333532636">
-    <w:abstractNumId w:val="10"/>
-  </w:num>
   <w:num w:numId="9" w16cid:durableId="128785046">
-    <w:abstractNumId w:val="26"/>
+    <w:abstractNumId w:val="27"/>
   </w:num>
   <w:num w:numId="10" w16cid:durableId="905458532">
     <w:abstractNumId w:val="6"/>
   </w:num>
   <w:num w:numId="11" w16cid:durableId="1135484454">
-    <w:abstractNumId w:val="14"/>
+    <w:abstractNumId w:val="15"/>
   </w:num>
   <w:num w:numId="12" w16cid:durableId="568999983">
-    <w:abstractNumId w:val="32"/>
+    <w:abstractNumId w:val="33"/>
   </w:num>
   <w:num w:numId="13" w16cid:durableId="1767190151">
     <w:abstractNumId w:val="5"/>
   </w:num>
   <w:num w:numId="14" w16cid:durableId="715394213">
+    <w:abstractNumId w:val="19"/>
+  </w:num>
+  <w:num w:numId="15" w16cid:durableId="1314019323">
+    <w:abstractNumId w:val="17"/>
+  </w:num>
+  <w:num w:numId="16" w16cid:durableId="2108111862">
+    <w:abstractNumId w:val="29"/>
+  </w:num>
+  <w:num w:numId="17" w16cid:durableId="1320620575">
+    <w:abstractNumId w:val="25"/>
+  </w:num>
+  <w:num w:numId="18" w16cid:durableId="1431511382">
+    <w:abstractNumId w:val="10"/>
+  </w:num>
+  <w:num w:numId="19" w16cid:durableId="1528325566">
     <w:abstractNumId w:val="18"/>
   </w:num>
-  <w:num w:numId="15" w16cid:durableId="1314019323">
-    <w:abstractNumId w:val="16"/>
+  <w:num w:numId="20" w16cid:durableId="990518204">
+    <w:abstractNumId w:val="20"/>
   </w:num>
-  <w:num w:numId="16" w16cid:durableId="2108111862">
-    <w:abstractNumId w:val="28"/>
-  </w:num>
-  <w:num w:numId="17" w16cid:durableId="1320620575">
-    <w:abstractNumId w:val="24"/>
-  </w:num>
-  <w:num w:numId="18" w16cid:durableId="1431511382">
+  <w:num w:numId="21" w16cid:durableId="900098538">
     <w:abstractNumId w:val="9"/>
   </w:num>
-  <w:num w:numId="19" w16cid:durableId="1528325566">
-    <w:abstractNumId w:val="17"/>
-  </w:num>
-  <w:num w:numId="20" w16cid:durableId="990518204">
-    <w:abstractNumId w:val="19"/>
-  </w:num>
-  <w:num w:numId="21" w16cid:durableId="900098538">
-    <w:abstractNumId w:val="8"/>
-  </w:num>
   <w:num w:numId="22" w16cid:durableId="1159611945">
-    <w:abstractNumId w:val="25"/>
+    <w:abstractNumId w:val="26"/>
   </w:num>
   <w:num w:numId="23" w16cid:durableId="727652842">
     <w:abstractNumId w:val="3"/>
   </w:num>
   <w:num w:numId="24" w16cid:durableId="1596135007">
+    <w:abstractNumId w:val="24"/>
+  </w:num>
+  <w:num w:numId="25" w16cid:durableId="414478111">
     <w:abstractNumId w:val="23"/>
   </w:num>
-  <w:num w:numId="25" w16cid:durableId="414478111">
-    <w:abstractNumId w:val="22"/>
-  </w:num>
   <w:num w:numId="26" w16cid:durableId="372466584">
-    <w:abstractNumId w:val="7"/>
+    <w:abstractNumId w:val="8"/>
   </w:num>
   <w:num w:numId="27" w16cid:durableId="1787504088">
-    <w:abstractNumId w:val="31"/>
+    <w:abstractNumId w:val="32"/>
   </w:num>
   <w:num w:numId="28" w16cid:durableId="927734810">
-    <w:abstractNumId w:val="20"/>
+    <w:abstractNumId w:val="21"/>
   </w:num>
   <w:num w:numId="29" w16cid:durableId="1914387497">
-    <w:abstractNumId w:val="15"/>
+    <w:abstractNumId w:val="16"/>
   </w:num>
   <w:num w:numId="30" w16cid:durableId="36636164">
     <w:abstractNumId w:val="2"/>
@@ -19171,13 +19353,16 @@
     <w:abstractNumId w:val="4"/>
   </w:num>
   <w:num w:numId="32" w16cid:durableId="1891846306">
-    <w:abstractNumId w:val="29"/>
+    <w:abstractNumId w:val="30"/>
   </w:num>
   <w:num w:numId="33" w16cid:durableId="97263838">
-    <w:abstractNumId w:val="12"/>
+    <w:abstractNumId w:val="13"/>
   </w:num>
   <w:num w:numId="34" w16cid:durableId="1629428421">
-    <w:abstractNumId w:val="13"/>
+    <w:abstractNumId w:val="14"/>
+  </w:num>
+  <w:num w:numId="35" w16cid:durableId="1199733513">
+    <w:abstractNumId w:val="7"/>
   </w:num>
 </w:numbering>
 </file>

</xml_diff>

<commit_message>
docs: Adicionado teste unitário TU001.09
</commit_message>
<xml_diff>
--- a/documentation/Especificacao_de_Requisitos_de_Software.docx
+++ b/documentation/Especificacao_de_Requisitos_de_Software.docx
@@ -6582,7 +6582,7 @@
         </w:rPr>
       </w:pPr>
       <w:r>
-        <w:t>3.3.1.5 [RN001.05] O login do usuário não deve conter apenas espaços em branco</w:t>
+        <w:t>3.3.1.5 [RN001.05] O login do usuário não deve conter espaços em branco</w:t>
       </w:r>
     </w:p>
     <w:p/>
@@ -6605,7 +6605,13 @@
         <w:t>Descrição:</w:t>
       </w:r>
       <w:r>
-        <w:t xml:space="preserve"> O sistema deve validar se o login do usuário contém apenas espaços em branco, caso o login esteja nessa condição o sistema não deve permitir o cadastro e deve retornar a mensagem para o usuário: “Login inválido”. Caso o login esteja fora dessa condição, o sistema deve permitir o cadastro.</w:t>
+        <w:t xml:space="preserve"> O sistema deve validar se o login do usuário contém espaços em branco, caso o login esteja nessa condição o sistema não deve permitir o cadastro e deve retornar a mensagem para o usuário: “</w:t>
+      </w:r>
+      <w:r>
+        <w:t>Login do usuário inválido</w:t>
+      </w:r>
+      <w:r>
+        <w:t>”. Caso o login esteja fora dessa condição, o sistema deve permitir o cadastro.</w:t>
       </w:r>
     </w:p>
     <w:p/>
@@ -12682,6 +12688,7 @@
       <w:pPr>
         <w:rPr>
           <w:color w:val="000000" w:themeColor="text1"/>
+          <w:lang w:val="en-US"/>
         </w:rPr>
       </w:pPr>
       <w:r>
@@ -12699,44 +12706,31 @@
       <w:r>
         <w:rPr>
           <w:color w:val="000000" w:themeColor="text1"/>
-        </w:rPr>
-        <w:t>nome: “</w:t>
-      </w:r>
-      <w:r>
-        <w:rPr>
-          <w:color w:val="000000" w:themeColor="text1"/>
-        </w:rPr>
-        <w:t xml:space="preserve">     </w:t>
-      </w:r>
-      <w:r>
-        <w:rPr>
-          <w:color w:val="000000" w:themeColor="text1"/>
-        </w:rPr>
-        <w:t>”</w:t>
-      </w:r>
-    </w:p>
-    <w:p>
-      <w:pPr>
-        <w:rPr>
-          <w:color w:val="000000" w:themeColor="text1"/>
-        </w:rPr>
-      </w:pPr>
-      <w:r>
-        <w:rPr>
-          <w:color w:val="000000" w:themeColor="text1"/>
+          <w:lang w:val="en-US"/>
+        </w:rPr>
+        <w:t>nome: “     ”</w:t>
+      </w:r>
+    </w:p>
+    <w:p>
+      <w:pPr>
+        <w:rPr>
+          <w:color w:val="000000" w:themeColor="text1"/>
+          <w:lang w:val="en-US"/>
+        </w:rPr>
+      </w:pPr>
+      <w:r>
+        <w:rPr>
+          <w:color w:val="000000" w:themeColor="text1"/>
+          <w:lang w:val="en-US"/>
         </w:rPr>
         <w:tab/>
       </w:r>
       <w:r>
         <w:rPr>
           <w:color w:val="000000" w:themeColor="text1"/>
+          <w:lang w:val="en-US"/>
         </w:rPr>
         <w:tab/>
-      </w:r>
-      <w:r>
-        <w:rPr>
-          <w:color w:val="000000" w:themeColor="text1"/>
-        </w:rPr>
         <w:t>login: “login”</w:t>
       </w:r>
     </w:p>
@@ -12744,17 +12738,20 @@
       <w:pPr>
         <w:rPr>
           <w:color w:val="000000" w:themeColor="text1"/>
-        </w:rPr>
-      </w:pPr>
-      <w:r>
-        <w:rPr>
-          <w:color w:val="000000" w:themeColor="text1"/>
+          <w:lang w:val="en-US"/>
+        </w:rPr>
+      </w:pPr>
+      <w:r>
+        <w:rPr>
+          <w:color w:val="000000" w:themeColor="text1"/>
+          <w:lang w:val="en-US"/>
         </w:rPr>
         <w:tab/>
       </w:r>
       <w:r>
         <w:rPr>
           <w:color w:val="000000" w:themeColor="text1"/>
+          <w:lang w:val="en-US"/>
         </w:rPr>
         <w:tab/>
         <w:t>password: “teste”</w:t>
@@ -12769,14 +12766,21 @@
       <w:r>
         <w:rPr>
           <w:color w:val="000000" w:themeColor="text1"/>
+          <w:lang w:val="en-US"/>
         </w:rPr>
         <w:tab/>
       </w:r>
       <w:r>
         <w:rPr>
           <w:color w:val="000000" w:themeColor="text1"/>
+          <w:lang w:val="en-US"/>
         </w:rPr>
         <w:tab/>
+      </w:r>
+      <w:r>
+        <w:rPr>
+          <w:color w:val="000000" w:themeColor="text1"/>
+        </w:rPr>
         <w:t>telefone: “11912345678”</w:t>
       </w:r>
     </w:p>
@@ -13442,37 +13446,13 @@
         </w:rPr>
       </w:pPr>
       <w:r>
-        <w:t>6.1.1.</w:t>
-      </w:r>
-      <w:r>
-        <w:t>7</w:t>
-      </w:r>
-      <w:r>
-        <w:t xml:space="preserve"> [TU001.0</w:t>
-      </w:r>
-      <w:r>
-        <w:t>7</w:t>
-      </w:r>
-      <w:r>
-        <w:t xml:space="preserve">] </w:t>
-      </w:r>
-      <w:r>
-        <w:rPr>
-          <w:color w:val="000000" w:themeColor="text1"/>
-        </w:rPr>
-        <w:t xml:space="preserve">O sistema não deve cadastrar usuário quando o </w:t>
-      </w:r>
-      <w:r>
-        <w:rPr>
-          <w:color w:val="000000" w:themeColor="text1"/>
-        </w:rPr>
-        <w:t>login</w:t>
-      </w:r>
-      <w:r>
-        <w:rPr>
-          <w:color w:val="000000" w:themeColor="text1"/>
-        </w:rPr>
-        <w:t xml:space="preserve"> tem menos de 4 caracteres</w:t>
+        <w:t xml:space="preserve">6.1.1.7 [TU001.07] </w:t>
+      </w:r>
+      <w:r>
+        <w:rPr>
+          <w:color w:val="000000" w:themeColor="text1"/>
+        </w:rPr>
+        <w:t>O sistema não deve cadastrar usuário quando o login tem menos de 4 caracteres</w:t>
       </w:r>
     </w:p>
     <w:p/>
@@ -13514,19 +13494,7 @@
         <w:rPr>
           <w:color w:val="000000" w:themeColor="text1"/>
         </w:rPr>
-        <w:t xml:space="preserve"> RF001.01, RN001.0</w:t>
-      </w:r>
-      <w:r>
-        <w:rPr>
-          <w:color w:val="000000" w:themeColor="text1"/>
-        </w:rPr>
-        <w:t>4</w:t>
-      </w:r>
-      <w:r>
-        <w:rPr>
-          <w:color w:val="000000" w:themeColor="text1"/>
-        </w:rPr>
-        <w:t>.</w:t>
+        <w:t xml:space="preserve"> RF001.01, RN001.04.</w:t>
       </w:r>
     </w:p>
     <w:p>
@@ -13566,19 +13534,7 @@
         <w:rPr>
           <w:color w:val="000000" w:themeColor="text1"/>
         </w:rPr>
-        <w:t xml:space="preserve">: </w:t>
-      </w:r>
-      <w:r>
-        <w:rPr>
-          <w:color w:val="000000" w:themeColor="text1"/>
-        </w:rPr>
-        <w:t>Login</w:t>
-      </w:r>
-      <w:r>
-        <w:rPr>
-          <w:color w:val="000000" w:themeColor="text1"/>
-        </w:rPr>
-        <w:t xml:space="preserve"> do usuário com 3 caracteres.</w:t>
+        <w:t>: Login do usuário com 3 caracteres.</w:t>
       </w:r>
     </w:p>
     <w:p>
@@ -13617,19 +13573,7 @@
         <w:rPr>
           <w:color w:val="000000" w:themeColor="text1"/>
         </w:rPr>
-        <w:t xml:space="preserve">Informar os dados do usuário com o </w:t>
-      </w:r>
-      <w:r>
-        <w:rPr>
-          <w:color w:val="000000" w:themeColor="text1"/>
-        </w:rPr>
-        <w:t>login</w:t>
-      </w:r>
-      <w:r>
-        <w:rPr>
-          <w:color w:val="000000" w:themeColor="text1"/>
-        </w:rPr>
-        <w:t xml:space="preserve"> com 3 caracteres.</w:t>
+        <w:t>Informar os dados do usuário com o login com 3 caracteres.</w:t>
       </w:r>
     </w:p>
     <w:p>
@@ -13647,19 +13591,7 @@
         <w:rPr>
           <w:color w:val="000000" w:themeColor="text1"/>
         </w:rPr>
-        <w:t xml:space="preserve">Validar a quantidade de caracteres do </w:t>
-      </w:r>
-      <w:r>
-        <w:rPr>
-          <w:color w:val="000000" w:themeColor="text1"/>
-        </w:rPr>
-        <w:t>login</w:t>
-      </w:r>
-      <w:r>
-        <w:rPr>
-          <w:color w:val="000000" w:themeColor="text1"/>
-        </w:rPr>
-        <w:t>.</w:t>
+        <w:t>Validar a quantidade de caracteres do login.</w:t>
       </w:r>
     </w:p>
     <w:p>
@@ -13677,19 +13609,7 @@
         <w:rPr>
           <w:color w:val="000000" w:themeColor="text1"/>
         </w:rPr>
-        <w:t xml:space="preserve">Receber mensagem de erro ao cadastrar </w:t>
-      </w:r>
-      <w:r>
-        <w:rPr>
-          <w:color w:val="000000" w:themeColor="text1"/>
-        </w:rPr>
-        <w:t>login</w:t>
-      </w:r>
-      <w:r>
-        <w:rPr>
-          <w:color w:val="000000" w:themeColor="text1"/>
-        </w:rPr>
-        <w:t xml:space="preserve"> inválido.</w:t>
+        <w:t>Receber mensagem de erro ao cadastrar login inválido.</w:t>
       </w:r>
     </w:p>
     <w:p>
@@ -13860,13 +13780,14 @@
       <w:pPr>
         <w:rPr>
           <w:color w:val="000000" w:themeColor="text1"/>
-        </w:rPr>
-      </w:pPr>
-      <w:r>
-        <w:rPr>
-          <w:color w:val="000000" w:themeColor="text1"/>
           <w:lang w:val="en-US"/>
         </w:rPr>
+      </w:pPr>
+      <w:r>
+        <w:rPr>
+          <w:color w:val="000000" w:themeColor="text1"/>
+          <w:lang w:val="en-US"/>
+        </w:rPr>
         <w:tab/>
       </w:r>
       <w:r>
@@ -13879,6 +13800,7 @@
       <w:r>
         <w:rPr>
           <w:color w:val="000000" w:themeColor="text1"/>
+          <w:lang w:val="en-US"/>
         </w:rPr>
         <w:t>email: “teste@email.com”</w:t>
       </w:r>
@@ -13892,14 +13814,21 @@
       <w:r>
         <w:rPr>
           <w:color w:val="000000" w:themeColor="text1"/>
+          <w:lang w:val="en-US"/>
         </w:rPr>
         <w:tab/>
       </w:r>
       <w:r>
         <w:rPr>
           <w:color w:val="000000" w:themeColor="text1"/>
+          <w:lang w:val="en-US"/>
         </w:rPr>
         <w:tab/>
+      </w:r>
+      <w:r>
+        <w:rPr>
+          <w:color w:val="000000" w:themeColor="text1"/>
+        </w:rPr>
         <w:t>status: ATIVO</w:t>
       </w:r>
     </w:p>
@@ -13954,31 +13883,7 @@
         <w:rPr>
           <w:color w:val="000000" w:themeColor="text1"/>
         </w:rPr>
-        <w:t>Lançar exceção Invalid</w:t>
-      </w:r>
-      <w:r>
-        <w:rPr>
-          <w:color w:val="000000" w:themeColor="text1"/>
-        </w:rPr>
-        <w:t>Login</w:t>
-      </w:r>
-      <w:r>
-        <w:rPr>
-          <w:color w:val="000000" w:themeColor="text1"/>
-        </w:rPr>
-        <w:t xml:space="preserve">Exception com a mensagem “O </w:t>
-      </w:r>
-      <w:r>
-        <w:rPr>
-          <w:color w:val="000000" w:themeColor="text1"/>
-        </w:rPr>
-        <w:t>login</w:t>
-      </w:r>
-      <w:r>
-        <w:rPr>
-          <w:color w:val="000000" w:themeColor="text1"/>
-        </w:rPr>
-        <w:t xml:space="preserve"> do usuário deve ter entre 4 e 32 caracteres”.</w:t>
+        <w:t>Lançar exceção InvalidLoginException com a mensagem “O login do usuário deve ter entre 4 e 32 caracteres”.</w:t>
       </w:r>
     </w:p>
     <w:p>
@@ -14056,37 +13961,13 @@
         </w:rPr>
       </w:pPr>
       <w:r>
-        <w:t>6.1.1.</w:t>
-      </w:r>
-      <w:r>
-        <w:t>8</w:t>
-      </w:r>
-      <w:r>
-        <w:t xml:space="preserve"> [TU001.0</w:t>
-      </w:r>
-      <w:r>
-        <w:t>8</w:t>
-      </w:r>
-      <w:r>
-        <w:t xml:space="preserve">] </w:t>
-      </w:r>
-      <w:r>
-        <w:rPr>
-          <w:color w:val="000000" w:themeColor="text1"/>
-        </w:rPr>
-        <w:t xml:space="preserve">O sistema não deve cadastrar usuário quando o </w:t>
-      </w:r>
-      <w:r>
-        <w:rPr>
-          <w:color w:val="000000" w:themeColor="text1"/>
-        </w:rPr>
-        <w:t>login</w:t>
-      </w:r>
-      <w:r>
-        <w:rPr>
-          <w:color w:val="000000" w:themeColor="text1"/>
-        </w:rPr>
-        <w:t xml:space="preserve"> tem mais de 32 caracteres</w:t>
+        <w:t xml:space="preserve">6.1.1.8 [TU001.08] </w:t>
+      </w:r>
+      <w:r>
+        <w:rPr>
+          <w:color w:val="000000" w:themeColor="text1"/>
+        </w:rPr>
+        <w:t>O sistema não deve cadastrar usuário quando o login tem mais de 32 caracteres</w:t>
       </w:r>
     </w:p>
     <w:p/>
@@ -14128,19 +14009,7 @@
         <w:rPr>
           <w:color w:val="000000" w:themeColor="text1"/>
         </w:rPr>
-        <w:t xml:space="preserve"> RF001.01, RN001.0</w:t>
-      </w:r>
-      <w:r>
-        <w:rPr>
-          <w:color w:val="000000" w:themeColor="text1"/>
-        </w:rPr>
-        <w:t>4</w:t>
-      </w:r>
-      <w:r>
-        <w:rPr>
-          <w:color w:val="000000" w:themeColor="text1"/>
-        </w:rPr>
-        <w:t>.</w:t>
+        <w:t xml:space="preserve"> RF001.01, RN001.04.</w:t>
       </w:r>
     </w:p>
     <w:p>
@@ -14180,19 +14049,7 @@
         <w:rPr>
           <w:color w:val="000000" w:themeColor="text1"/>
         </w:rPr>
-        <w:t xml:space="preserve">: </w:t>
-      </w:r>
-      <w:r>
-        <w:rPr>
-          <w:color w:val="000000" w:themeColor="text1"/>
-        </w:rPr>
-        <w:t>Login</w:t>
-      </w:r>
-      <w:r>
-        <w:rPr>
-          <w:color w:val="000000" w:themeColor="text1"/>
-        </w:rPr>
-        <w:t xml:space="preserve"> do usuário com 33 caracteres.</w:t>
+        <w:t>: Login do usuário com 33 caracteres.</w:t>
       </w:r>
     </w:p>
     <w:p>
@@ -14230,19 +14087,7 @@
         <w:rPr>
           <w:color w:val="000000" w:themeColor="text1"/>
         </w:rPr>
-        <w:t xml:space="preserve">Informar os dados do usuário com o </w:t>
-      </w:r>
-      <w:r>
-        <w:rPr>
-          <w:color w:val="000000" w:themeColor="text1"/>
-        </w:rPr>
-        <w:t>login</w:t>
-      </w:r>
-      <w:r>
-        <w:rPr>
-          <w:color w:val="000000" w:themeColor="text1"/>
-        </w:rPr>
-        <w:t xml:space="preserve"> com 33 caracteres.</w:t>
+        <w:t>Informar os dados do usuário com o login com 33 caracteres.</w:t>
       </w:r>
     </w:p>
     <w:p>
@@ -14337,26 +14182,13 @@
         <w:rPr>
           <w:color w:val="000000" w:themeColor="text1"/>
         </w:rPr>
-        <w:t>nome: “</w:t>
-      </w:r>
-      <w:r>
-        <w:rPr>
-          <w:color w:val="000000" w:themeColor="text1"/>
-        </w:rPr>
-        <w:t>teste</w:t>
-      </w:r>
-      <w:r>
-        <w:rPr>
-          <w:color w:val="000000" w:themeColor="text1"/>
-        </w:rPr>
-        <w:t>”</w:t>
-      </w:r>
-    </w:p>
-    <w:p>
-      <w:pPr>
-        <w:rPr>
-          <w:color w:val="000000" w:themeColor="text1"/>
-          <w:lang w:val="en-US"/>
+        <w:t>nome: “teste”</w:t>
+      </w:r>
+    </w:p>
+    <w:p>
+      <w:pPr>
+        <w:rPr>
+          <w:color w:val="000000" w:themeColor="text1"/>
         </w:rPr>
       </w:pPr>
       <w:r>
@@ -14370,118 +14202,24 @@
           <w:color w:val="000000" w:themeColor="text1"/>
         </w:rPr>
         <w:tab/>
-      </w:r>
-      <w:r>
-        <w:rPr>
-          <w:color w:val="000000" w:themeColor="text1"/>
-          <w:lang w:val="en-US"/>
-        </w:rPr>
-        <w:t>login: “</w:t>
-      </w:r>
-      <w:r>
-        <w:rPr>
-          <w:color w:val="000000" w:themeColor="text1"/>
-        </w:rPr>
-        <w:t>abcd</w:t>
-      </w:r>
-      <w:r>
-        <w:rPr>
-          <w:color w:val="000000" w:themeColor="text1"/>
-        </w:rPr>
-        <w:t>_</w:t>
-      </w:r>
-      <w:r>
-        <w:rPr>
-          <w:color w:val="000000" w:themeColor="text1"/>
-        </w:rPr>
-        <w:t>efgh</w:t>
-      </w:r>
-      <w:r>
-        <w:rPr>
-          <w:color w:val="000000" w:themeColor="text1"/>
-        </w:rPr>
-        <w:t>_</w:t>
-      </w:r>
-      <w:r>
-        <w:rPr>
-          <w:color w:val="000000" w:themeColor="text1"/>
-        </w:rPr>
-        <w:t>ijkl</w:t>
-      </w:r>
-      <w:r>
-        <w:rPr>
-          <w:color w:val="000000" w:themeColor="text1"/>
-        </w:rPr>
-        <w:t>_</w:t>
-      </w:r>
-      <w:r>
-        <w:rPr>
-          <w:color w:val="000000" w:themeColor="text1"/>
-        </w:rPr>
-        <w:t>nmop</w:t>
-      </w:r>
-      <w:r>
-        <w:rPr>
-          <w:color w:val="000000" w:themeColor="text1"/>
-        </w:rPr>
-        <w:t>_</w:t>
-      </w:r>
-      <w:r>
-        <w:rPr>
-          <w:color w:val="000000" w:themeColor="text1"/>
-        </w:rPr>
-        <w:t>qrst</w:t>
-      </w:r>
-      <w:r>
-        <w:rPr>
-          <w:color w:val="000000" w:themeColor="text1"/>
-        </w:rPr>
-        <w:t>_</w:t>
-      </w:r>
-      <w:r>
-        <w:rPr>
-          <w:color w:val="000000" w:themeColor="text1"/>
-        </w:rPr>
-        <w:t>uvxz</w:t>
-      </w:r>
-      <w:r>
-        <w:rPr>
-          <w:color w:val="000000" w:themeColor="text1"/>
-        </w:rPr>
-        <w:t>_</w:t>
-      </w:r>
-      <w:r>
-        <w:rPr>
-          <w:color w:val="000000" w:themeColor="text1"/>
-        </w:rPr>
-        <w:t>123</w:t>
-      </w:r>
-      <w:r>
-        <w:rPr>
-          <w:color w:val="000000" w:themeColor="text1"/>
-          <w:lang w:val="en-US"/>
-        </w:rPr>
-        <w:t>”</w:t>
-      </w:r>
-    </w:p>
-    <w:p>
-      <w:pPr>
-        <w:rPr>
-          <w:color w:val="000000" w:themeColor="text1"/>
-          <w:lang w:val="en-US"/>
-        </w:rPr>
-      </w:pPr>
-      <w:r>
-        <w:rPr>
-          <w:color w:val="000000" w:themeColor="text1"/>
-          <w:lang w:val="en-US"/>
+        <w:t>login: “abcd_efgh_ijkl_nmop_qrst_uvxz_123”</w:t>
+      </w:r>
+    </w:p>
+    <w:p>
+      <w:pPr>
+        <w:rPr>
+          <w:color w:val="000000" w:themeColor="text1"/>
+        </w:rPr>
+      </w:pPr>
+      <w:r>
+        <w:rPr>
+          <w:color w:val="000000" w:themeColor="text1"/>
         </w:rPr>
         <w:tab/>
       </w:r>
       <w:r>
         <w:rPr>
           <w:color w:val="000000" w:themeColor="text1"/>
-          <w:lang w:val="en-US"/>
         </w:rPr>
         <w:tab/>
         <w:t>password: “teste”</w:t>
@@ -14491,28 +14229,19 @@
       <w:pPr>
         <w:rPr>
           <w:color w:val="000000" w:themeColor="text1"/>
-          <w:lang w:val="en-US"/>
-        </w:rPr>
-      </w:pPr>
-      <w:r>
-        <w:rPr>
-          <w:color w:val="000000" w:themeColor="text1"/>
-          <w:lang w:val="en-US"/>
+        </w:rPr>
+      </w:pPr>
+      <w:r>
+        <w:rPr>
+          <w:color w:val="000000" w:themeColor="text1"/>
         </w:rPr>
         <w:tab/>
       </w:r>
       <w:r>
         <w:rPr>
           <w:color w:val="000000" w:themeColor="text1"/>
-          <w:lang w:val="en-US"/>
         </w:rPr>
         <w:tab/>
-      </w:r>
-      <w:r>
-        <w:rPr>
-          <w:color w:val="000000" w:themeColor="text1"/>
-          <w:lang w:val="en-US"/>
-        </w:rPr>
         <w:t>telefone: “11912345678”</w:t>
       </w:r>
     </w:p>
@@ -14525,14 +14254,12 @@
       <w:r>
         <w:rPr>
           <w:color w:val="000000" w:themeColor="text1"/>
-          <w:lang w:val="en-US"/>
         </w:rPr>
         <w:tab/>
       </w:r>
       <w:r>
         <w:rPr>
           <w:color w:val="000000" w:themeColor="text1"/>
-          <w:lang w:val="en-US"/>
         </w:rPr>
         <w:tab/>
       </w:r>
@@ -14649,6 +14376,554 @@
           <w:color w:val="000000" w:themeColor="text1"/>
         </w:rPr>
         <w:lastRenderedPageBreak/>
+        <w:t>Realização do teste:</w:t>
+      </w:r>
+      <w:r>
+        <w:rPr>
+          <w:color w:val="000000" w:themeColor="text1"/>
+        </w:rPr>
+        <w:t xml:space="preserve"> 00/00/0000.</w:t>
+      </w:r>
+    </w:p>
+    <w:p>
+      <w:pPr>
+        <w:rPr>
+          <w:color w:val="000000" w:themeColor="text1"/>
+        </w:rPr>
+      </w:pPr>
+      <w:r>
+        <w:rPr>
+          <w:b/>
+          <w:color w:val="000000" w:themeColor="text1"/>
+        </w:rPr>
+        <w:t xml:space="preserve">Responsável: </w:t>
+      </w:r>
+      <w:r>
+        <w:rPr>
+          <w:color w:val="000000" w:themeColor="text1"/>
+        </w:rPr>
+        <w:t>A definir.</w:t>
+      </w:r>
+    </w:p>
+    <w:p>
+      <w:pPr>
+        <w:rPr>
+          <w:color w:val="000000" w:themeColor="text1"/>
+        </w:rPr>
+      </w:pPr>
+    </w:p>
+    <w:p>
+      <w:pPr>
+        <w:pStyle w:val="Ttulo4"/>
+        <w:rPr>
+          <w:color w:val="FF0000"/>
+        </w:rPr>
+      </w:pPr>
+      <w:r>
+        <w:t>6.1.1.</w:t>
+      </w:r>
+      <w:r>
+        <w:t>9</w:t>
+      </w:r>
+      <w:r>
+        <w:t xml:space="preserve"> [TU001.0</w:t>
+      </w:r>
+      <w:r>
+        <w:t>9</w:t>
+      </w:r>
+      <w:r>
+        <w:t xml:space="preserve">] </w:t>
+      </w:r>
+      <w:r>
+        <w:rPr>
+          <w:color w:val="000000" w:themeColor="text1"/>
+        </w:rPr>
+        <w:t xml:space="preserve">O sistema não deve cadastrar usuário quando o login tem </w:t>
+      </w:r>
+      <w:r>
+        <w:rPr>
+          <w:color w:val="000000" w:themeColor="text1"/>
+        </w:rPr>
+        <w:t>espaços em branco</w:t>
+      </w:r>
+    </w:p>
+    <w:p/>
+    <w:p>
+      <w:pPr>
+        <w:rPr>
+          <w:color w:val="000000" w:themeColor="text1"/>
+        </w:rPr>
+      </w:pPr>
+      <w:r>
+        <w:rPr>
+          <w:b/>
+          <w:bCs/>
+          <w:color w:val="000000" w:themeColor="text1"/>
+        </w:rPr>
+        <w:t>Camada:</w:t>
+      </w:r>
+      <w:r>
+        <w:rPr>
+          <w:color w:val="000000" w:themeColor="text1"/>
+        </w:rPr>
+        <w:t xml:space="preserve"> Serviço.</w:t>
+      </w:r>
+    </w:p>
+    <w:p>
+      <w:pPr>
+        <w:rPr>
+          <w:color w:val="000000" w:themeColor="text1"/>
+        </w:rPr>
+      </w:pPr>
+      <w:r>
+        <w:rPr>
+          <w:b/>
+          <w:color w:val="000000" w:themeColor="text1"/>
+        </w:rPr>
+        <w:t>Requisitos associados:</w:t>
+      </w:r>
+      <w:r>
+        <w:rPr>
+          <w:color w:val="000000" w:themeColor="text1"/>
+        </w:rPr>
+        <w:t xml:space="preserve"> RF001.01, RN001.0</w:t>
+      </w:r>
+      <w:r>
+        <w:rPr>
+          <w:color w:val="000000" w:themeColor="text1"/>
+        </w:rPr>
+        <w:t>5</w:t>
+      </w:r>
+      <w:r>
+        <w:rPr>
+          <w:color w:val="000000" w:themeColor="text1"/>
+        </w:rPr>
+        <w:t>.</w:t>
+      </w:r>
+    </w:p>
+    <w:p>
+      <w:pPr>
+        <w:rPr>
+          <w:color w:val="000000" w:themeColor="text1"/>
+        </w:rPr>
+      </w:pPr>
+      <w:r>
+        <w:rPr>
+          <w:b/>
+          <w:color w:val="000000" w:themeColor="text1"/>
+        </w:rPr>
+        <w:t xml:space="preserve">Descrição: </w:t>
+      </w:r>
+      <w:r>
+        <w:rPr>
+          <w:color w:val="000000" w:themeColor="text1"/>
+        </w:rPr>
+        <w:t>O sistema não deve cadastrar usuário.</w:t>
+      </w:r>
+    </w:p>
+    <w:p>
+      <w:pPr>
+        <w:rPr>
+          <w:color w:val="000000" w:themeColor="text1"/>
+        </w:rPr>
+      </w:pPr>
+      <w:r>
+        <w:rPr>
+          <w:b/>
+          <w:color w:val="000000" w:themeColor="text1"/>
+        </w:rPr>
+        <w:t>Condições</w:t>
+      </w:r>
+      <w:r>
+        <w:rPr>
+          <w:color w:val="000000" w:themeColor="text1"/>
+        </w:rPr>
+        <w:t xml:space="preserve">: Login do usuário com </w:t>
+      </w:r>
+      <w:r>
+        <w:rPr>
+          <w:color w:val="000000" w:themeColor="text1"/>
+        </w:rPr>
+        <w:t>espaços em branco</w:t>
+      </w:r>
+      <w:r>
+        <w:rPr>
+          <w:color w:val="000000" w:themeColor="text1"/>
+        </w:rPr>
+        <w:t>.</w:t>
+      </w:r>
+    </w:p>
+    <w:p>
+      <w:pPr>
+        <w:rPr>
+          <w:color w:val="000000" w:themeColor="text1"/>
+        </w:rPr>
+      </w:pPr>
+      <w:r>
+        <w:rPr>
+          <w:b/>
+          <w:color w:val="000000" w:themeColor="text1"/>
+        </w:rPr>
+        <w:t>Passos:</w:t>
+      </w:r>
+      <w:r>
+        <w:rPr>
+          <w:color w:val="000000" w:themeColor="text1"/>
+        </w:rPr>
+        <w:t xml:space="preserve"> </w:t>
+      </w:r>
+    </w:p>
+    <w:p>
+      <w:pPr>
+        <w:pStyle w:val="PargrafodaLista"/>
+        <w:numPr>
+          <w:ilvl w:val="0"/>
+          <w:numId w:val="36"/>
+        </w:numPr>
+        <w:rPr>
+          <w:color w:val="000000" w:themeColor="text1"/>
+        </w:rPr>
+      </w:pPr>
+      <w:r>
+        <w:rPr>
+          <w:color w:val="000000" w:themeColor="text1"/>
+        </w:rPr>
+        <w:t xml:space="preserve">Informar os dados do usuário com o login com </w:t>
+      </w:r>
+      <w:r>
+        <w:rPr>
+          <w:color w:val="000000" w:themeColor="text1"/>
+        </w:rPr>
+        <w:t>espaços</w:t>
+      </w:r>
+      <w:r>
+        <w:rPr>
+          <w:color w:val="000000" w:themeColor="text1"/>
+        </w:rPr>
+        <w:t>.</w:t>
+      </w:r>
+    </w:p>
+    <w:p>
+      <w:pPr>
+        <w:pStyle w:val="PargrafodaLista"/>
+        <w:numPr>
+          <w:ilvl w:val="0"/>
+          <w:numId w:val="36"/>
+        </w:numPr>
+        <w:rPr>
+          <w:color w:val="000000" w:themeColor="text1"/>
+        </w:rPr>
+      </w:pPr>
+      <w:r>
+        <w:rPr>
+          <w:color w:val="000000" w:themeColor="text1"/>
+        </w:rPr>
+        <w:t xml:space="preserve">Validar </w:t>
+      </w:r>
+      <w:r>
+        <w:rPr>
+          <w:color w:val="000000" w:themeColor="text1"/>
+        </w:rPr>
+        <w:t xml:space="preserve">caracteres de espaço no atributo </w:t>
+      </w:r>
+      <w:r>
+        <w:rPr>
+          <w:color w:val="000000" w:themeColor="text1"/>
+        </w:rPr>
+        <w:t>login.</w:t>
+      </w:r>
+    </w:p>
+    <w:p>
+      <w:pPr>
+        <w:pStyle w:val="PargrafodaLista"/>
+        <w:numPr>
+          <w:ilvl w:val="0"/>
+          <w:numId w:val="36"/>
+        </w:numPr>
+        <w:rPr>
+          <w:color w:val="000000" w:themeColor="text1"/>
+        </w:rPr>
+      </w:pPr>
+      <w:r>
+        <w:rPr>
+          <w:color w:val="000000" w:themeColor="text1"/>
+        </w:rPr>
+        <w:t>Receber mensagem de erro ao cadastrar login inválido.</w:t>
+      </w:r>
+    </w:p>
+    <w:p>
+      <w:pPr>
+        <w:rPr>
+          <w:color w:val="000000" w:themeColor="text1"/>
+        </w:rPr>
+      </w:pPr>
+      <w:r>
+        <w:rPr>
+          <w:b/>
+          <w:color w:val="000000" w:themeColor="text1"/>
+        </w:rPr>
+        <w:t>Dados do teste:</w:t>
+      </w:r>
+      <w:r>
+        <w:rPr>
+          <w:color w:val="000000" w:themeColor="text1"/>
+        </w:rPr>
+        <w:t xml:space="preserve"> </w:t>
+      </w:r>
+    </w:p>
+    <w:p>
+      <w:pPr>
+        <w:ind w:firstLine="720"/>
+        <w:rPr>
+          <w:color w:val="000000" w:themeColor="text1"/>
+        </w:rPr>
+      </w:pPr>
+      <w:r>
+        <w:rPr>
+          <w:color w:val="000000" w:themeColor="text1"/>
+        </w:rPr>
+        <w:t>{</w:t>
+      </w:r>
+    </w:p>
+    <w:p>
+      <w:pPr>
+        <w:rPr>
+          <w:color w:val="000000" w:themeColor="text1"/>
+        </w:rPr>
+      </w:pPr>
+      <w:r>
+        <w:rPr>
+          <w:color w:val="000000" w:themeColor="text1"/>
+        </w:rPr>
+        <w:tab/>
+      </w:r>
+      <w:r>
+        <w:rPr>
+          <w:color w:val="000000" w:themeColor="text1"/>
+        </w:rPr>
+        <w:tab/>
+      </w:r>
+      <w:r>
+        <w:rPr>
+          <w:color w:val="000000" w:themeColor="text1"/>
+        </w:rPr>
+        <w:t>nome: “teste”</w:t>
+      </w:r>
+    </w:p>
+    <w:p>
+      <w:pPr>
+        <w:rPr>
+          <w:color w:val="000000" w:themeColor="text1"/>
+        </w:rPr>
+      </w:pPr>
+      <w:r>
+        <w:rPr>
+          <w:color w:val="000000" w:themeColor="text1"/>
+        </w:rPr>
+        <w:tab/>
+      </w:r>
+      <w:r>
+        <w:rPr>
+          <w:color w:val="000000" w:themeColor="text1"/>
+        </w:rPr>
+        <w:tab/>
+        <w:t>login: “</w:t>
+      </w:r>
+      <w:r>
+        <w:rPr>
+          <w:color w:val="000000" w:themeColor="text1"/>
+        </w:rPr>
+        <w:t>login teste</w:t>
+      </w:r>
+      <w:r>
+        <w:rPr>
+          <w:color w:val="000000" w:themeColor="text1"/>
+        </w:rPr>
+        <w:t>”</w:t>
+      </w:r>
+    </w:p>
+    <w:p>
+      <w:pPr>
+        <w:rPr>
+          <w:color w:val="000000" w:themeColor="text1"/>
+        </w:rPr>
+      </w:pPr>
+      <w:r>
+        <w:rPr>
+          <w:color w:val="000000" w:themeColor="text1"/>
+        </w:rPr>
+        <w:tab/>
+      </w:r>
+      <w:r>
+        <w:rPr>
+          <w:color w:val="000000" w:themeColor="text1"/>
+        </w:rPr>
+        <w:tab/>
+        <w:t>password: “teste”</w:t>
+      </w:r>
+    </w:p>
+    <w:p>
+      <w:pPr>
+        <w:rPr>
+          <w:color w:val="000000" w:themeColor="text1"/>
+        </w:rPr>
+      </w:pPr>
+      <w:r>
+        <w:rPr>
+          <w:color w:val="000000" w:themeColor="text1"/>
+        </w:rPr>
+        <w:tab/>
+      </w:r>
+      <w:r>
+        <w:rPr>
+          <w:color w:val="000000" w:themeColor="text1"/>
+        </w:rPr>
+        <w:tab/>
+        <w:t>telefone: “11912345678”</w:t>
+      </w:r>
+    </w:p>
+    <w:p>
+      <w:pPr>
+        <w:rPr>
+          <w:color w:val="000000" w:themeColor="text1"/>
+        </w:rPr>
+      </w:pPr>
+      <w:r>
+        <w:rPr>
+          <w:color w:val="000000" w:themeColor="text1"/>
+        </w:rPr>
+        <w:tab/>
+      </w:r>
+      <w:r>
+        <w:rPr>
+          <w:color w:val="000000" w:themeColor="text1"/>
+        </w:rPr>
+        <w:tab/>
+      </w:r>
+      <w:r>
+        <w:rPr>
+          <w:color w:val="000000" w:themeColor="text1"/>
+        </w:rPr>
+        <w:t>email: “teste@email.com”</w:t>
+      </w:r>
+    </w:p>
+    <w:p>
+      <w:pPr>
+        <w:rPr>
+          <w:color w:val="000000" w:themeColor="text1"/>
+        </w:rPr>
+      </w:pPr>
+      <w:r>
+        <w:rPr>
+          <w:color w:val="000000" w:themeColor="text1"/>
+        </w:rPr>
+        <w:tab/>
+      </w:r>
+      <w:r>
+        <w:rPr>
+          <w:color w:val="000000" w:themeColor="text1"/>
+        </w:rPr>
+        <w:tab/>
+        <w:t>status: ATIVO</w:t>
+      </w:r>
+    </w:p>
+    <w:p>
+      <w:pPr>
+        <w:rPr>
+          <w:color w:val="000000" w:themeColor="text1"/>
+        </w:rPr>
+      </w:pPr>
+      <w:r>
+        <w:rPr>
+          <w:color w:val="000000" w:themeColor="text1"/>
+        </w:rPr>
+        <w:tab/>
+      </w:r>
+      <w:r>
+        <w:rPr>
+          <w:color w:val="000000" w:themeColor="text1"/>
+        </w:rPr>
+        <w:tab/>
+        <w:t>perfil: ADMIN</w:t>
+      </w:r>
+    </w:p>
+    <w:p>
+      <w:pPr>
+        <w:rPr>
+          <w:color w:val="000000" w:themeColor="text1"/>
+        </w:rPr>
+      </w:pPr>
+      <w:r>
+        <w:rPr>
+          <w:color w:val="000000" w:themeColor="text1"/>
+        </w:rPr>
+        <w:tab/>
+        <w:t>}</w:t>
+      </w:r>
+    </w:p>
+    <w:p>
+      <w:pPr>
+        <w:rPr>
+          <w:color w:val="000000" w:themeColor="text1"/>
+        </w:rPr>
+      </w:pPr>
+      <w:r>
+        <w:rPr>
+          <w:b/>
+          <w:color w:val="000000" w:themeColor="text1"/>
+        </w:rPr>
+        <w:t xml:space="preserve">Resultado esperado: </w:t>
+      </w:r>
+      <w:r>
+        <w:rPr>
+          <w:color w:val="000000" w:themeColor="text1"/>
+        </w:rPr>
+        <w:t>Lançar exceção InvalidNameException com a mensagem “</w:t>
+      </w:r>
+      <w:r>
+        <w:rPr>
+          <w:color w:val="000000" w:themeColor="text1"/>
+        </w:rPr>
+        <w:t>O login não deve conter espaços em branco</w:t>
+      </w:r>
+      <w:r>
+        <w:rPr>
+          <w:color w:val="000000" w:themeColor="text1"/>
+        </w:rPr>
+        <w:t>”.</w:t>
+      </w:r>
+    </w:p>
+    <w:p>
+      <w:pPr>
+        <w:rPr>
+          <w:color w:val="000000" w:themeColor="text1"/>
+        </w:rPr>
+      </w:pPr>
+      <w:r>
+        <w:rPr>
+          <w:b/>
+          <w:color w:val="000000" w:themeColor="text1"/>
+        </w:rPr>
+        <w:t>Status:</w:t>
+      </w:r>
+      <w:r>
+        <w:rPr>
+          <w:color w:val="000000" w:themeColor="text1"/>
+        </w:rPr>
+        <w:t xml:space="preserve"> Não realizado.</w:t>
+      </w:r>
+    </w:p>
+    <w:p>
+      <w:pPr>
+        <w:rPr>
+          <w:color w:val="000000" w:themeColor="text1"/>
+        </w:rPr>
+      </w:pPr>
+      <w:r>
+        <w:rPr>
+          <w:b/>
+          <w:color w:val="000000" w:themeColor="text1"/>
+        </w:rPr>
         <w:t>Realização do teste:</w:t>
       </w:r>
       <w:r>
@@ -15000,6 +15275,7 @@
           <w:color w:val="000000" w:themeColor="text1"/>
           <w:lang w:val="en-US"/>
         </w:rPr>
+        <w:lastRenderedPageBreak/>
         <w:tab/>
       </w:r>
       <w:r>
@@ -18832,6 +19108,92 @@
     </w:lvl>
   </w:abstractNum>
   <w:abstractNum w:abstractNumId="31" w15:restartNumberingAfterBreak="0">
+    <w:nsid w:val="74C61032"/>
+    <w:multiLevelType w:val="multilevel"/>
+    <w:tmpl w:val="7EAE38A0"/>
+    <w:lvl w:ilvl="0">
+      <w:start w:val="1"/>
+      <w:numFmt w:val="decimal"/>
+      <w:lvlText w:val="%1."/>
+      <w:lvlJc w:val="left"/>
+      <w:pPr>
+        <w:ind w:left="709" w:hanging="360"/>
+      </w:pPr>
+    </w:lvl>
+    <w:lvl w:ilvl="1">
+      <w:start w:val="1"/>
+      <w:numFmt w:val="lowerLetter"/>
+      <w:lvlText w:val="%2."/>
+      <w:lvlJc w:val="left"/>
+      <w:pPr>
+        <w:ind w:left="1429" w:hanging="360"/>
+      </w:pPr>
+    </w:lvl>
+    <w:lvl w:ilvl="2">
+      <w:start w:val="1"/>
+      <w:numFmt w:val="lowerRoman"/>
+      <w:lvlText w:val="%3."/>
+      <w:lvlJc w:val="right"/>
+      <w:pPr>
+        <w:ind w:left="2149" w:hanging="180"/>
+      </w:pPr>
+    </w:lvl>
+    <w:lvl w:ilvl="3">
+      <w:start w:val="1"/>
+      <w:numFmt w:val="decimal"/>
+      <w:lvlText w:val="%4."/>
+      <w:lvlJc w:val="left"/>
+      <w:pPr>
+        <w:ind w:left="2869" w:hanging="360"/>
+      </w:pPr>
+    </w:lvl>
+    <w:lvl w:ilvl="4">
+      <w:start w:val="1"/>
+      <w:numFmt w:val="lowerLetter"/>
+      <w:lvlText w:val="%5."/>
+      <w:lvlJc w:val="left"/>
+      <w:pPr>
+        <w:ind w:left="3589" w:hanging="360"/>
+      </w:pPr>
+    </w:lvl>
+    <w:lvl w:ilvl="5">
+      <w:start w:val="1"/>
+      <w:numFmt w:val="lowerRoman"/>
+      <w:lvlText w:val="%6."/>
+      <w:lvlJc w:val="right"/>
+      <w:pPr>
+        <w:ind w:left="4309" w:hanging="180"/>
+      </w:pPr>
+    </w:lvl>
+    <w:lvl w:ilvl="6">
+      <w:start w:val="1"/>
+      <w:numFmt w:val="decimal"/>
+      <w:lvlText w:val="%7."/>
+      <w:lvlJc w:val="left"/>
+      <w:pPr>
+        <w:ind w:left="5029" w:hanging="360"/>
+      </w:pPr>
+    </w:lvl>
+    <w:lvl w:ilvl="7">
+      <w:start w:val="1"/>
+      <w:numFmt w:val="lowerLetter"/>
+      <w:lvlText w:val="%8."/>
+      <w:lvlJc w:val="left"/>
+      <w:pPr>
+        <w:ind w:left="5749" w:hanging="360"/>
+      </w:pPr>
+    </w:lvl>
+    <w:lvl w:ilvl="8">
+      <w:start w:val="1"/>
+      <w:numFmt w:val="lowerRoman"/>
+      <w:lvlText w:val="%9."/>
+      <w:lvlJc w:val="right"/>
+      <w:pPr>
+        <w:ind w:left="6469" w:hanging="180"/>
+      </w:pPr>
+    </w:lvl>
+  </w:abstractNum>
+  <w:abstractNum w:abstractNumId="32" w15:restartNumberingAfterBreak="0">
     <w:nsid w:val="7ABF4D30"/>
     <w:multiLevelType w:val="multilevel"/>
     <w:tmpl w:val="C61A779C"/>
@@ -18944,7 +19306,7 @@
       </w:rPr>
     </w:lvl>
   </w:abstractNum>
-  <w:abstractNum w:abstractNumId="32" w15:restartNumberingAfterBreak="0">
+  <w:abstractNum w:abstractNumId="33" w15:restartNumberingAfterBreak="0">
     <w:nsid w:val="7E36314E"/>
     <w:multiLevelType w:val="hybridMultilevel"/>
     <w:tmpl w:val="6FDA89B4"/>
@@ -19057,7 +19419,7 @@
       </w:rPr>
     </w:lvl>
   </w:abstractNum>
-  <w:abstractNum w:abstractNumId="33" w15:restartNumberingAfterBreak="0">
+  <w:abstractNum w:abstractNumId="34" w15:restartNumberingAfterBreak="0">
     <w:nsid w:val="7ED21264"/>
     <w:multiLevelType w:val="multilevel"/>
     <w:tmpl w:val="87B4A5EE"/>
@@ -19170,7 +19532,7 @@
       </w:rPr>
     </w:lvl>
   </w:abstractNum>
-  <w:abstractNum w:abstractNumId="34" w15:restartNumberingAfterBreak="0">
+  <w:abstractNum w:abstractNumId="35" w15:restartNumberingAfterBreak="0">
     <w:nsid w:val="7FF4155E"/>
     <w:multiLevelType w:val="multilevel"/>
     <w:tmpl w:val="F9722B4C"/>
@@ -19263,7 +19625,7 @@
     <w:abstractNumId w:val="1"/>
   </w:num>
   <w:num w:numId="2" w16cid:durableId="88086438">
-    <w:abstractNumId w:val="31"/>
+    <w:abstractNumId w:val="32"/>
   </w:num>
   <w:num w:numId="3" w16cid:durableId="1706714901">
     <w:abstractNumId w:val="28"/>
@@ -19278,7 +19640,7 @@
     <w:abstractNumId w:val="22"/>
   </w:num>
   <w:num w:numId="7" w16cid:durableId="1890459348">
-    <w:abstractNumId w:val="34"/>
+    <w:abstractNumId w:val="35"/>
   </w:num>
   <w:num w:numId="8" w16cid:durableId="333532636">
     <w:abstractNumId w:val="11"/>
@@ -19293,7 +19655,7 @@
     <w:abstractNumId w:val="15"/>
   </w:num>
   <w:num w:numId="12" w16cid:durableId="568999983">
-    <w:abstractNumId w:val="33"/>
+    <w:abstractNumId w:val="34"/>
   </w:num>
   <w:num w:numId="13" w16cid:durableId="1767190151">
     <w:abstractNumId w:val="5"/>
@@ -19338,7 +19700,7 @@
     <w:abstractNumId w:val="8"/>
   </w:num>
   <w:num w:numId="27" w16cid:durableId="1787504088">
-    <w:abstractNumId w:val="32"/>
+    <w:abstractNumId w:val="33"/>
   </w:num>
   <w:num w:numId="28" w16cid:durableId="927734810">
     <w:abstractNumId w:val="21"/>
@@ -19363,6 +19725,9 @@
   </w:num>
   <w:num w:numId="35" w16cid:durableId="1199733513">
     <w:abstractNumId w:val="7"/>
+  </w:num>
+  <w:num w:numId="36" w16cid:durableId="289866735">
+    <w:abstractNumId w:val="31"/>
   </w:num>
 </w:numbering>
 </file>

</xml_diff>

<commit_message>
docs: Adicionado teste unitário TU001.10
</commit_message>
<xml_diff>
--- a/documentation/Especificacao_de_Requisitos_de_Software.docx
+++ b/documentation/Especificacao_de_Requisitos_de_Software.docx
@@ -14341,7 +14341,19 @@
         <w:rPr>
           <w:color w:val="000000" w:themeColor="text1"/>
         </w:rPr>
-        <w:t>Lançar exceção InvalidNameException com a mensagem “O nome do usuário deve ter entre 4 e 32 caracteres”.</w:t>
+        <w:t>Lançar exceção Invalid</w:t>
+      </w:r>
+      <w:r>
+        <w:rPr>
+          <w:color w:val="000000" w:themeColor="text1"/>
+        </w:rPr>
+        <w:t>Login</w:t>
+      </w:r>
+      <w:r>
+        <w:rPr>
+          <w:color w:val="000000" w:themeColor="text1"/>
+        </w:rPr>
+        <w:t>Exception com a mensagem “O nome do usuário deve ter entre 4 e 32 caracteres”.</w:t>
       </w:r>
     </w:p>
     <w:p>
@@ -14878,13 +14890,593 @@
         <w:rPr>
           <w:color w:val="000000" w:themeColor="text1"/>
         </w:rPr>
-        <w:t>Lançar exceção InvalidNameException com a mensagem “</w:t>
+        <w:t xml:space="preserve">Lançar exceção </w:t>
+      </w:r>
+      <w:r>
+        <w:rPr>
+          <w:color w:val="000000" w:themeColor="text1"/>
+        </w:rPr>
+        <w:t xml:space="preserve">InvalidLoginException </w:t>
+      </w:r>
+      <w:r>
+        <w:rPr>
+          <w:color w:val="000000" w:themeColor="text1"/>
+        </w:rPr>
+        <w:t>com a mensagem “</w:t>
       </w:r>
       <w:r>
         <w:rPr>
           <w:color w:val="000000" w:themeColor="text1"/>
         </w:rPr>
         <w:t>O login não deve conter espaços em branco</w:t>
+      </w:r>
+      <w:r>
+        <w:rPr>
+          <w:color w:val="000000" w:themeColor="text1"/>
+        </w:rPr>
+        <w:t>”.</w:t>
+      </w:r>
+    </w:p>
+    <w:p>
+      <w:pPr>
+        <w:rPr>
+          <w:color w:val="000000" w:themeColor="text1"/>
+        </w:rPr>
+      </w:pPr>
+      <w:r>
+        <w:rPr>
+          <w:b/>
+          <w:color w:val="000000" w:themeColor="text1"/>
+        </w:rPr>
+        <w:t>Status:</w:t>
+      </w:r>
+      <w:r>
+        <w:rPr>
+          <w:color w:val="000000" w:themeColor="text1"/>
+        </w:rPr>
+        <w:t xml:space="preserve"> Não realizado.</w:t>
+      </w:r>
+    </w:p>
+    <w:p>
+      <w:pPr>
+        <w:rPr>
+          <w:color w:val="000000" w:themeColor="text1"/>
+        </w:rPr>
+      </w:pPr>
+      <w:r>
+        <w:rPr>
+          <w:b/>
+          <w:color w:val="000000" w:themeColor="text1"/>
+        </w:rPr>
+        <w:t>Realização do teste:</w:t>
+      </w:r>
+      <w:r>
+        <w:rPr>
+          <w:color w:val="000000" w:themeColor="text1"/>
+        </w:rPr>
+        <w:t xml:space="preserve"> 00/00/0000.</w:t>
+      </w:r>
+    </w:p>
+    <w:p>
+      <w:pPr>
+        <w:rPr>
+          <w:color w:val="000000" w:themeColor="text1"/>
+        </w:rPr>
+      </w:pPr>
+      <w:r>
+        <w:rPr>
+          <w:b/>
+          <w:color w:val="000000" w:themeColor="text1"/>
+        </w:rPr>
+        <w:t xml:space="preserve">Responsável: </w:t>
+      </w:r>
+      <w:r>
+        <w:rPr>
+          <w:color w:val="000000" w:themeColor="text1"/>
+        </w:rPr>
+        <w:t>A definir.</w:t>
+      </w:r>
+    </w:p>
+    <w:p>
+      <w:pPr>
+        <w:rPr>
+          <w:color w:val="000000" w:themeColor="text1"/>
+        </w:rPr>
+      </w:pPr>
+    </w:p>
+    <w:p>
+      <w:pPr>
+        <w:pStyle w:val="Ttulo4"/>
+        <w:rPr>
+          <w:color w:val="FF0000"/>
+        </w:rPr>
+      </w:pPr>
+      <w:r>
+        <w:t>6.1.1.</w:t>
+      </w:r>
+      <w:r>
+        <w:t>10</w:t>
+      </w:r>
+      <w:r>
+        <w:t xml:space="preserve"> [TU001.</w:t>
+      </w:r>
+      <w:r>
+        <w:t>10</w:t>
+      </w:r>
+      <w:r>
+        <w:t xml:space="preserve">] </w:t>
+      </w:r>
+      <w:r>
+        <w:rPr>
+          <w:color w:val="000000" w:themeColor="text1"/>
+        </w:rPr>
+        <w:t xml:space="preserve">O sistema não deve cadastrar usuário quando o login tem </w:t>
+      </w:r>
+      <w:r>
+        <w:rPr>
+          <w:color w:val="000000" w:themeColor="text1"/>
+        </w:rPr>
+        <w:t>apenas números</w:t>
+      </w:r>
+    </w:p>
+    <w:p/>
+    <w:p>
+      <w:pPr>
+        <w:rPr>
+          <w:color w:val="000000" w:themeColor="text1"/>
+        </w:rPr>
+      </w:pPr>
+      <w:r>
+        <w:rPr>
+          <w:b/>
+          <w:bCs/>
+          <w:color w:val="000000" w:themeColor="text1"/>
+        </w:rPr>
+        <w:t>Camada:</w:t>
+      </w:r>
+      <w:r>
+        <w:rPr>
+          <w:color w:val="000000" w:themeColor="text1"/>
+        </w:rPr>
+        <w:t xml:space="preserve"> Serviço.</w:t>
+      </w:r>
+    </w:p>
+    <w:p>
+      <w:pPr>
+        <w:rPr>
+          <w:color w:val="000000" w:themeColor="text1"/>
+        </w:rPr>
+      </w:pPr>
+      <w:r>
+        <w:rPr>
+          <w:b/>
+          <w:color w:val="000000" w:themeColor="text1"/>
+        </w:rPr>
+        <w:t>Requisitos associados:</w:t>
+      </w:r>
+      <w:r>
+        <w:rPr>
+          <w:color w:val="000000" w:themeColor="text1"/>
+        </w:rPr>
+        <w:t xml:space="preserve"> RF001.01, RN001.0</w:t>
+      </w:r>
+      <w:r>
+        <w:rPr>
+          <w:color w:val="000000" w:themeColor="text1"/>
+        </w:rPr>
+        <w:t>6</w:t>
+      </w:r>
+      <w:r>
+        <w:rPr>
+          <w:color w:val="000000" w:themeColor="text1"/>
+        </w:rPr>
+        <w:t>.</w:t>
+      </w:r>
+    </w:p>
+    <w:p>
+      <w:pPr>
+        <w:rPr>
+          <w:color w:val="000000" w:themeColor="text1"/>
+        </w:rPr>
+      </w:pPr>
+      <w:r>
+        <w:rPr>
+          <w:b/>
+          <w:color w:val="000000" w:themeColor="text1"/>
+        </w:rPr>
+        <w:t xml:space="preserve">Descrição: </w:t>
+      </w:r>
+      <w:r>
+        <w:rPr>
+          <w:color w:val="000000" w:themeColor="text1"/>
+        </w:rPr>
+        <w:t>O sistema não deve cadastrar usuário.</w:t>
+      </w:r>
+    </w:p>
+    <w:p>
+      <w:pPr>
+        <w:rPr>
+          <w:color w:val="000000" w:themeColor="text1"/>
+        </w:rPr>
+      </w:pPr>
+      <w:r>
+        <w:rPr>
+          <w:b/>
+          <w:color w:val="000000" w:themeColor="text1"/>
+        </w:rPr>
+        <w:t>Condições</w:t>
+      </w:r>
+      <w:r>
+        <w:rPr>
+          <w:color w:val="000000" w:themeColor="text1"/>
+        </w:rPr>
+        <w:t xml:space="preserve">: Login do usuário com espaços </w:t>
+      </w:r>
+      <w:r>
+        <w:rPr>
+          <w:color w:val="000000" w:themeColor="text1"/>
+        </w:rPr>
+        <w:t>números</w:t>
+      </w:r>
+      <w:r>
+        <w:rPr>
+          <w:color w:val="000000" w:themeColor="text1"/>
+        </w:rPr>
+        <w:t>.</w:t>
+      </w:r>
+    </w:p>
+    <w:p>
+      <w:pPr>
+        <w:rPr>
+          <w:color w:val="000000" w:themeColor="text1"/>
+        </w:rPr>
+      </w:pPr>
+      <w:r>
+        <w:rPr>
+          <w:b/>
+          <w:color w:val="000000" w:themeColor="text1"/>
+        </w:rPr>
+        <w:t>Passos:</w:t>
+      </w:r>
+      <w:r>
+        <w:rPr>
+          <w:color w:val="000000" w:themeColor="text1"/>
+        </w:rPr>
+        <w:t xml:space="preserve"> </w:t>
+      </w:r>
+    </w:p>
+    <w:p>
+      <w:pPr>
+        <w:pStyle w:val="PargrafodaLista"/>
+        <w:numPr>
+          <w:ilvl w:val="0"/>
+          <w:numId w:val="37"/>
+        </w:numPr>
+        <w:rPr>
+          <w:color w:val="000000" w:themeColor="text1"/>
+        </w:rPr>
+      </w:pPr>
+      <w:r>
+        <w:rPr>
+          <w:color w:val="000000" w:themeColor="text1"/>
+        </w:rPr>
+        <w:t xml:space="preserve">Informar os dados do usuário com o login com </w:t>
+      </w:r>
+      <w:r>
+        <w:rPr>
+          <w:color w:val="000000" w:themeColor="text1"/>
+        </w:rPr>
+        <w:t>apenas números</w:t>
+      </w:r>
+      <w:r>
+        <w:rPr>
+          <w:color w:val="000000" w:themeColor="text1"/>
+        </w:rPr>
+        <w:t>.</w:t>
+      </w:r>
+    </w:p>
+    <w:p>
+      <w:pPr>
+        <w:pStyle w:val="PargrafodaLista"/>
+        <w:numPr>
+          <w:ilvl w:val="0"/>
+          <w:numId w:val="37"/>
+        </w:numPr>
+        <w:rPr>
+          <w:color w:val="000000" w:themeColor="text1"/>
+        </w:rPr>
+      </w:pPr>
+      <w:r>
+        <w:rPr>
+          <w:color w:val="000000" w:themeColor="text1"/>
+        </w:rPr>
+        <w:t xml:space="preserve">Validar caracteres </w:t>
+      </w:r>
+      <w:r>
+        <w:rPr>
+          <w:color w:val="000000" w:themeColor="text1"/>
+        </w:rPr>
+        <w:t>numéricos</w:t>
+      </w:r>
+      <w:r>
+        <w:rPr>
+          <w:color w:val="000000" w:themeColor="text1"/>
+        </w:rPr>
+        <w:t xml:space="preserve"> no atributo login.</w:t>
+      </w:r>
+    </w:p>
+    <w:p>
+      <w:pPr>
+        <w:pStyle w:val="PargrafodaLista"/>
+        <w:numPr>
+          <w:ilvl w:val="0"/>
+          <w:numId w:val="37"/>
+        </w:numPr>
+        <w:rPr>
+          <w:color w:val="000000" w:themeColor="text1"/>
+        </w:rPr>
+      </w:pPr>
+      <w:r>
+        <w:rPr>
+          <w:color w:val="000000" w:themeColor="text1"/>
+        </w:rPr>
+        <w:t>Receber mensagem de erro ao cadastrar login inválido.</w:t>
+      </w:r>
+    </w:p>
+    <w:p>
+      <w:pPr>
+        <w:rPr>
+          <w:color w:val="000000" w:themeColor="text1"/>
+        </w:rPr>
+      </w:pPr>
+      <w:r>
+        <w:rPr>
+          <w:b/>
+          <w:color w:val="000000" w:themeColor="text1"/>
+        </w:rPr>
+        <w:t>Dados do teste:</w:t>
+      </w:r>
+      <w:r>
+        <w:rPr>
+          <w:color w:val="000000" w:themeColor="text1"/>
+        </w:rPr>
+        <w:t xml:space="preserve"> </w:t>
+      </w:r>
+    </w:p>
+    <w:p>
+      <w:pPr>
+        <w:ind w:firstLine="720"/>
+        <w:rPr>
+          <w:color w:val="000000" w:themeColor="text1"/>
+        </w:rPr>
+      </w:pPr>
+      <w:r>
+        <w:rPr>
+          <w:color w:val="000000" w:themeColor="text1"/>
+        </w:rPr>
+        <w:t>{</w:t>
+      </w:r>
+    </w:p>
+    <w:p>
+      <w:pPr>
+        <w:rPr>
+          <w:color w:val="000000" w:themeColor="text1"/>
+        </w:rPr>
+      </w:pPr>
+      <w:r>
+        <w:rPr>
+          <w:color w:val="000000" w:themeColor="text1"/>
+        </w:rPr>
+        <w:tab/>
+      </w:r>
+      <w:r>
+        <w:rPr>
+          <w:color w:val="000000" w:themeColor="text1"/>
+        </w:rPr>
+        <w:tab/>
+      </w:r>
+      <w:r>
+        <w:rPr>
+          <w:color w:val="000000" w:themeColor="text1"/>
+        </w:rPr>
+        <w:t>nome: “teste”</w:t>
+      </w:r>
+    </w:p>
+    <w:p>
+      <w:pPr>
+        <w:rPr>
+          <w:color w:val="000000" w:themeColor="text1"/>
+          <w:lang w:val="en-US"/>
+        </w:rPr>
+      </w:pPr>
+      <w:r>
+        <w:rPr>
+          <w:color w:val="000000" w:themeColor="text1"/>
+        </w:rPr>
+        <w:lastRenderedPageBreak/>
+        <w:tab/>
+      </w:r>
+      <w:r>
+        <w:rPr>
+          <w:color w:val="000000" w:themeColor="text1"/>
+        </w:rPr>
+        <w:tab/>
+      </w:r>
+      <w:r>
+        <w:rPr>
+          <w:color w:val="000000" w:themeColor="text1"/>
+          <w:lang w:val="en-US"/>
+        </w:rPr>
+        <w:t>login: “</w:t>
+      </w:r>
+      <w:r>
+        <w:rPr>
+          <w:color w:val="000000" w:themeColor="text1"/>
+          <w:lang w:val="en-US"/>
+        </w:rPr>
+        <w:t>1234</w:t>
+      </w:r>
+      <w:r>
+        <w:rPr>
+          <w:color w:val="000000" w:themeColor="text1"/>
+          <w:lang w:val="en-US"/>
+        </w:rPr>
+        <w:t>”</w:t>
+      </w:r>
+    </w:p>
+    <w:p>
+      <w:pPr>
+        <w:rPr>
+          <w:color w:val="000000" w:themeColor="text1"/>
+          <w:lang w:val="en-US"/>
+        </w:rPr>
+      </w:pPr>
+      <w:r>
+        <w:rPr>
+          <w:color w:val="000000" w:themeColor="text1"/>
+          <w:lang w:val="en-US"/>
+        </w:rPr>
+        <w:tab/>
+      </w:r>
+      <w:r>
+        <w:rPr>
+          <w:color w:val="000000" w:themeColor="text1"/>
+          <w:lang w:val="en-US"/>
+        </w:rPr>
+        <w:tab/>
+        <w:t>password: “teste”</w:t>
+      </w:r>
+    </w:p>
+    <w:p>
+      <w:pPr>
+        <w:rPr>
+          <w:color w:val="000000" w:themeColor="text1"/>
+        </w:rPr>
+      </w:pPr>
+      <w:r>
+        <w:rPr>
+          <w:color w:val="000000" w:themeColor="text1"/>
+          <w:lang w:val="en-US"/>
+        </w:rPr>
+        <w:tab/>
+      </w:r>
+      <w:r>
+        <w:rPr>
+          <w:color w:val="000000" w:themeColor="text1"/>
+          <w:lang w:val="en-US"/>
+        </w:rPr>
+        <w:tab/>
+      </w:r>
+      <w:r>
+        <w:rPr>
+          <w:color w:val="000000" w:themeColor="text1"/>
+        </w:rPr>
+        <w:t>telefone: “11912345678”</w:t>
+      </w:r>
+    </w:p>
+    <w:p>
+      <w:pPr>
+        <w:rPr>
+          <w:color w:val="000000" w:themeColor="text1"/>
+        </w:rPr>
+      </w:pPr>
+      <w:r>
+        <w:rPr>
+          <w:color w:val="000000" w:themeColor="text1"/>
+        </w:rPr>
+        <w:tab/>
+      </w:r>
+      <w:r>
+        <w:rPr>
+          <w:color w:val="000000" w:themeColor="text1"/>
+        </w:rPr>
+        <w:tab/>
+      </w:r>
+      <w:r>
+        <w:rPr>
+          <w:color w:val="000000" w:themeColor="text1"/>
+        </w:rPr>
+        <w:t>email: “teste@email.com”</w:t>
+      </w:r>
+    </w:p>
+    <w:p>
+      <w:pPr>
+        <w:rPr>
+          <w:color w:val="000000" w:themeColor="text1"/>
+        </w:rPr>
+      </w:pPr>
+      <w:r>
+        <w:rPr>
+          <w:color w:val="000000" w:themeColor="text1"/>
+        </w:rPr>
+        <w:tab/>
+      </w:r>
+      <w:r>
+        <w:rPr>
+          <w:color w:val="000000" w:themeColor="text1"/>
+        </w:rPr>
+        <w:tab/>
+        <w:t>status: ATIVO</w:t>
+      </w:r>
+    </w:p>
+    <w:p>
+      <w:pPr>
+        <w:rPr>
+          <w:color w:val="000000" w:themeColor="text1"/>
+        </w:rPr>
+      </w:pPr>
+      <w:r>
+        <w:rPr>
+          <w:color w:val="000000" w:themeColor="text1"/>
+        </w:rPr>
+        <w:tab/>
+      </w:r>
+      <w:r>
+        <w:rPr>
+          <w:color w:val="000000" w:themeColor="text1"/>
+        </w:rPr>
+        <w:tab/>
+        <w:t>perfil: ADMIN</w:t>
+      </w:r>
+    </w:p>
+    <w:p>
+      <w:pPr>
+        <w:rPr>
+          <w:color w:val="000000" w:themeColor="text1"/>
+        </w:rPr>
+      </w:pPr>
+      <w:r>
+        <w:rPr>
+          <w:color w:val="000000" w:themeColor="text1"/>
+        </w:rPr>
+        <w:tab/>
+        <w:t>}</w:t>
+      </w:r>
+    </w:p>
+    <w:p>
+      <w:pPr>
+        <w:rPr>
+          <w:color w:val="000000" w:themeColor="text1"/>
+        </w:rPr>
+      </w:pPr>
+      <w:r>
+        <w:rPr>
+          <w:b/>
+          <w:color w:val="000000" w:themeColor="text1"/>
+        </w:rPr>
+        <w:t xml:space="preserve">Resultado esperado: </w:t>
+      </w:r>
+      <w:r>
+        <w:rPr>
+          <w:color w:val="000000" w:themeColor="text1"/>
+        </w:rPr>
+        <w:t xml:space="preserve">Lançar exceção InvalidLoginException com a mensagem “O login não deve conter </w:t>
+      </w:r>
+      <w:r>
+        <w:rPr>
+          <w:color w:val="000000" w:themeColor="text1"/>
+        </w:rPr>
+        <w:t>apenas números</w:t>
       </w:r>
       <w:r>
         <w:rPr>
@@ -15275,7 +15867,6 @@
           <w:color w:val="000000" w:themeColor="text1"/>
           <w:lang w:val="en-US"/>
         </w:rPr>
-        <w:lastRenderedPageBreak/>
         <w:tab/>
       </w:r>
       <w:r>
@@ -15530,6 +16121,7 @@
       </w:pPr>
       <w:bookmarkStart w:id="52" w:name="_Toc191065912"/>
       <w:r>
+        <w:lastRenderedPageBreak/>
         <w:t>6.</w:t>
       </w:r>
       <w:r>
@@ -17661,6 +18253,92 @@
     </w:lvl>
   </w:abstractNum>
   <w:abstractNum w:abstractNumId="17" w15:restartNumberingAfterBreak="0">
+    <w:nsid w:val="388742F9"/>
+    <w:multiLevelType w:val="multilevel"/>
+    <w:tmpl w:val="7EAE38A0"/>
+    <w:lvl w:ilvl="0">
+      <w:start w:val="1"/>
+      <w:numFmt w:val="decimal"/>
+      <w:lvlText w:val="%1."/>
+      <w:lvlJc w:val="left"/>
+      <w:pPr>
+        <w:ind w:left="709" w:hanging="360"/>
+      </w:pPr>
+    </w:lvl>
+    <w:lvl w:ilvl="1">
+      <w:start w:val="1"/>
+      <w:numFmt w:val="lowerLetter"/>
+      <w:lvlText w:val="%2."/>
+      <w:lvlJc w:val="left"/>
+      <w:pPr>
+        <w:ind w:left="1429" w:hanging="360"/>
+      </w:pPr>
+    </w:lvl>
+    <w:lvl w:ilvl="2">
+      <w:start w:val="1"/>
+      <w:numFmt w:val="lowerRoman"/>
+      <w:lvlText w:val="%3."/>
+      <w:lvlJc w:val="right"/>
+      <w:pPr>
+        <w:ind w:left="2149" w:hanging="180"/>
+      </w:pPr>
+    </w:lvl>
+    <w:lvl w:ilvl="3">
+      <w:start w:val="1"/>
+      <w:numFmt w:val="decimal"/>
+      <w:lvlText w:val="%4."/>
+      <w:lvlJc w:val="left"/>
+      <w:pPr>
+        <w:ind w:left="2869" w:hanging="360"/>
+      </w:pPr>
+    </w:lvl>
+    <w:lvl w:ilvl="4">
+      <w:start w:val="1"/>
+      <w:numFmt w:val="lowerLetter"/>
+      <w:lvlText w:val="%5."/>
+      <w:lvlJc w:val="left"/>
+      <w:pPr>
+        <w:ind w:left="3589" w:hanging="360"/>
+      </w:pPr>
+    </w:lvl>
+    <w:lvl w:ilvl="5">
+      <w:start w:val="1"/>
+      <w:numFmt w:val="lowerRoman"/>
+      <w:lvlText w:val="%6."/>
+      <w:lvlJc w:val="right"/>
+      <w:pPr>
+        <w:ind w:left="4309" w:hanging="180"/>
+      </w:pPr>
+    </w:lvl>
+    <w:lvl w:ilvl="6">
+      <w:start w:val="1"/>
+      <w:numFmt w:val="decimal"/>
+      <w:lvlText w:val="%7."/>
+      <w:lvlJc w:val="left"/>
+      <w:pPr>
+        <w:ind w:left="5029" w:hanging="360"/>
+      </w:pPr>
+    </w:lvl>
+    <w:lvl w:ilvl="7">
+      <w:start w:val="1"/>
+      <w:numFmt w:val="lowerLetter"/>
+      <w:lvlText w:val="%8."/>
+      <w:lvlJc w:val="left"/>
+      <w:pPr>
+        <w:ind w:left="5749" w:hanging="360"/>
+      </w:pPr>
+    </w:lvl>
+    <w:lvl w:ilvl="8">
+      <w:start w:val="1"/>
+      <w:numFmt w:val="lowerRoman"/>
+      <w:lvlText w:val="%9."/>
+      <w:lvlJc w:val="right"/>
+      <w:pPr>
+        <w:ind w:left="6469" w:hanging="180"/>
+      </w:pPr>
+    </w:lvl>
+  </w:abstractNum>
+  <w:abstractNum w:abstractNumId="18" w15:restartNumberingAfterBreak="0">
     <w:nsid w:val="3AE82604"/>
     <w:multiLevelType w:val="multilevel"/>
     <w:tmpl w:val="5EC8825C"/>
@@ -17773,7 +18451,7 @@
       </w:rPr>
     </w:lvl>
   </w:abstractNum>
-  <w:abstractNum w:abstractNumId="18" w15:restartNumberingAfterBreak="0">
+  <w:abstractNum w:abstractNumId="19" w15:restartNumberingAfterBreak="0">
     <w:nsid w:val="425F7142"/>
     <w:multiLevelType w:val="multilevel"/>
     <w:tmpl w:val="6C3A65C8"/>
@@ -17886,7 +18564,7 @@
       </w:rPr>
     </w:lvl>
   </w:abstractNum>
-  <w:abstractNum w:abstractNumId="19" w15:restartNumberingAfterBreak="0">
+  <w:abstractNum w:abstractNumId="20" w15:restartNumberingAfterBreak="0">
     <w:nsid w:val="433872DF"/>
     <w:multiLevelType w:val="multilevel"/>
     <w:tmpl w:val="473E9B32"/>
@@ -17999,7 +18677,7 @@
       </w:rPr>
     </w:lvl>
   </w:abstractNum>
-  <w:abstractNum w:abstractNumId="20" w15:restartNumberingAfterBreak="0">
+  <w:abstractNum w:abstractNumId="21" w15:restartNumberingAfterBreak="0">
     <w:nsid w:val="4ABF56A0"/>
     <w:multiLevelType w:val="multilevel"/>
     <w:tmpl w:val="0D8E790A"/>
@@ -18085,7 +18763,7 @@
       </w:pPr>
     </w:lvl>
   </w:abstractNum>
-  <w:abstractNum w:abstractNumId="21" w15:restartNumberingAfterBreak="0">
+  <w:abstractNum w:abstractNumId="22" w15:restartNumberingAfterBreak="0">
     <w:nsid w:val="4C99572E"/>
     <w:multiLevelType w:val="hybridMultilevel"/>
     <w:tmpl w:val="81062254"/>
@@ -18198,7 +18876,7 @@
       </w:rPr>
     </w:lvl>
   </w:abstractNum>
-  <w:abstractNum w:abstractNumId="22" w15:restartNumberingAfterBreak="0">
+  <w:abstractNum w:abstractNumId="23" w15:restartNumberingAfterBreak="0">
     <w:nsid w:val="4DB86243"/>
     <w:multiLevelType w:val="multilevel"/>
     <w:tmpl w:val="D652AE68"/>
@@ -18311,7 +18989,7 @@
       </w:rPr>
     </w:lvl>
   </w:abstractNum>
-  <w:abstractNum w:abstractNumId="23" w15:restartNumberingAfterBreak="0">
+  <w:abstractNum w:abstractNumId="24" w15:restartNumberingAfterBreak="0">
     <w:nsid w:val="5C394BC9"/>
     <w:multiLevelType w:val="multilevel"/>
     <w:tmpl w:val="7EAE38A0"/>
@@ -18397,7 +19075,7 @@
       </w:pPr>
     </w:lvl>
   </w:abstractNum>
-  <w:abstractNum w:abstractNumId="24" w15:restartNumberingAfterBreak="0">
+  <w:abstractNum w:abstractNumId="25" w15:restartNumberingAfterBreak="0">
     <w:nsid w:val="610B3EDF"/>
     <w:multiLevelType w:val="multilevel"/>
     <w:tmpl w:val="7EAE38A0"/>
@@ -18483,7 +19161,7 @@
       </w:pPr>
     </w:lvl>
   </w:abstractNum>
-  <w:abstractNum w:abstractNumId="25" w15:restartNumberingAfterBreak="0">
+  <w:abstractNum w:abstractNumId="26" w15:restartNumberingAfterBreak="0">
     <w:nsid w:val="67403CB5"/>
     <w:multiLevelType w:val="multilevel"/>
     <w:tmpl w:val="75326788"/>
@@ -18596,7 +19274,7 @@
       </w:rPr>
     </w:lvl>
   </w:abstractNum>
-  <w:abstractNum w:abstractNumId="26" w15:restartNumberingAfterBreak="0">
+  <w:abstractNum w:abstractNumId="27" w15:restartNumberingAfterBreak="0">
     <w:nsid w:val="67C547F7"/>
     <w:multiLevelType w:val="multilevel"/>
     <w:tmpl w:val="35EAD4B8"/>
@@ -18682,7 +19360,7 @@
       </w:pPr>
     </w:lvl>
   </w:abstractNum>
-  <w:abstractNum w:abstractNumId="27" w15:restartNumberingAfterBreak="0">
+  <w:abstractNum w:abstractNumId="28" w15:restartNumberingAfterBreak="0">
     <w:nsid w:val="6C8202C1"/>
     <w:multiLevelType w:val="multilevel"/>
     <w:tmpl w:val="981048B2"/>
@@ -18795,7 +19473,7 @@
       </w:rPr>
     </w:lvl>
   </w:abstractNum>
-  <w:abstractNum w:abstractNumId="28" w15:restartNumberingAfterBreak="0">
+  <w:abstractNum w:abstractNumId="29" w15:restartNumberingAfterBreak="0">
     <w:nsid w:val="6CD6232C"/>
     <w:multiLevelType w:val="multilevel"/>
     <w:tmpl w:val="2C50429A"/>
@@ -18908,7 +19586,7 @@
       </w:rPr>
     </w:lvl>
   </w:abstractNum>
-  <w:abstractNum w:abstractNumId="29" w15:restartNumberingAfterBreak="0">
+  <w:abstractNum w:abstractNumId="30" w15:restartNumberingAfterBreak="0">
     <w:nsid w:val="6FBC5385"/>
     <w:multiLevelType w:val="multilevel"/>
     <w:tmpl w:val="9E36186C"/>
@@ -19021,7 +19699,7 @@
       </w:rPr>
     </w:lvl>
   </w:abstractNum>
-  <w:abstractNum w:abstractNumId="30" w15:restartNumberingAfterBreak="0">
+  <w:abstractNum w:abstractNumId="31" w15:restartNumberingAfterBreak="0">
     <w:nsid w:val="74B049B9"/>
     <w:multiLevelType w:val="multilevel"/>
     <w:tmpl w:val="7EAE38A0"/>
@@ -19107,7 +19785,7 @@
       </w:pPr>
     </w:lvl>
   </w:abstractNum>
-  <w:abstractNum w:abstractNumId="31" w15:restartNumberingAfterBreak="0">
+  <w:abstractNum w:abstractNumId="32" w15:restartNumberingAfterBreak="0">
     <w:nsid w:val="74C61032"/>
     <w:multiLevelType w:val="multilevel"/>
     <w:tmpl w:val="7EAE38A0"/>
@@ -19193,7 +19871,7 @@
       </w:pPr>
     </w:lvl>
   </w:abstractNum>
-  <w:abstractNum w:abstractNumId="32" w15:restartNumberingAfterBreak="0">
+  <w:abstractNum w:abstractNumId="33" w15:restartNumberingAfterBreak="0">
     <w:nsid w:val="7ABF4D30"/>
     <w:multiLevelType w:val="multilevel"/>
     <w:tmpl w:val="C61A779C"/>
@@ -19306,7 +19984,7 @@
       </w:rPr>
     </w:lvl>
   </w:abstractNum>
-  <w:abstractNum w:abstractNumId="33" w15:restartNumberingAfterBreak="0">
+  <w:abstractNum w:abstractNumId="34" w15:restartNumberingAfterBreak="0">
     <w:nsid w:val="7E36314E"/>
     <w:multiLevelType w:val="hybridMultilevel"/>
     <w:tmpl w:val="6FDA89B4"/>
@@ -19419,7 +20097,7 @@
       </w:rPr>
     </w:lvl>
   </w:abstractNum>
-  <w:abstractNum w:abstractNumId="34" w15:restartNumberingAfterBreak="0">
+  <w:abstractNum w:abstractNumId="35" w15:restartNumberingAfterBreak="0">
     <w:nsid w:val="7ED21264"/>
     <w:multiLevelType w:val="multilevel"/>
     <w:tmpl w:val="87B4A5EE"/>
@@ -19532,7 +20210,7 @@
       </w:rPr>
     </w:lvl>
   </w:abstractNum>
-  <w:abstractNum w:abstractNumId="35" w15:restartNumberingAfterBreak="0">
+  <w:abstractNum w:abstractNumId="36" w15:restartNumberingAfterBreak="0">
     <w:nsid w:val="7FF4155E"/>
     <w:multiLevelType w:val="multilevel"/>
     <w:tmpl w:val="F9722B4C"/>
@@ -19625,10 +20303,10 @@
     <w:abstractNumId w:val="1"/>
   </w:num>
   <w:num w:numId="2" w16cid:durableId="88086438">
-    <w:abstractNumId w:val="32"/>
+    <w:abstractNumId w:val="33"/>
   </w:num>
   <w:num w:numId="3" w16cid:durableId="1706714901">
-    <w:abstractNumId w:val="28"/>
+    <w:abstractNumId w:val="29"/>
   </w:num>
   <w:num w:numId="4" w16cid:durableId="113717744">
     <w:abstractNumId w:val="0"/>
@@ -19637,16 +20315,16 @@
     <w:abstractNumId w:val="12"/>
   </w:num>
   <w:num w:numId="6" w16cid:durableId="913590874">
-    <w:abstractNumId w:val="22"/>
+    <w:abstractNumId w:val="23"/>
   </w:num>
   <w:num w:numId="7" w16cid:durableId="1890459348">
-    <w:abstractNumId w:val="35"/>
+    <w:abstractNumId w:val="36"/>
   </w:num>
   <w:num w:numId="8" w16cid:durableId="333532636">
     <w:abstractNumId w:val="11"/>
   </w:num>
   <w:num w:numId="9" w16cid:durableId="128785046">
-    <w:abstractNumId w:val="27"/>
+    <w:abstractNumId w:val="28"/>
   </w:num>
   <w:num w:numId="10" w16cid:durableId="905458532">
     <w:abstractNumId w:val="6"/>
@@ -19655,55 +20333,55 @@
     <w:abstractNumId w:val="15"/>
   </w:num>
   <w:num w:numId="12" w16cid:durableId="568999983">
-    <w:abstractNumId w:val="34"/>
+    <w:abstractNumId w:val="35"/>
   </w:num>
   <w:num w:numId="13" w16cid:durableId="1767190151">
     <w:abstractNumId w:val="5"/>
   </w:num>
   <w:num w:numId="14" w16cid:durableId="715394213">
-    <w:abstractNumId w:val="19"/>
+    <w:abstractNumId w:val="20"/>
   </w:num>
   <w:num w:numId="15" w16cid:durableId="1314019323">
-    <w:abstractNumId w:val="17"/>
+    <w:abstractNumId w:val="18"/>
   </w:num>
   <w:num w:numId="16" w16cid:durableId="2108111862">
-    <w:abstractNumId w:val="29"/>
+    <w:abstractNumId w:val="30"/>
   </w:num>
   <w:num w:numId="17" w16cid:durableId="1320620575">
-    <w:abstractNumId w:val="25"/>
+    <w:abstractNumId w:val="26"/>
   </w:num>
   <w:num w:numId="18" w16cid:durableId="1431511382">
     <w:abstractNumId w:val="10"/>
   </w:num>
   <w:num w:numId="19" w16cid:durableId="1528325566">
-    <w:abstractNumId w:val="18"/>
+    <w:abstractNumId w:val="19"/>
   </w:num>
   <w:num w:numId="20" w16cid:durableId="990518204">
-    <w:abstractNumId w:val="20"/>
+    <w:abstractNumId w:val="21"/>
   </w:num>
   <w:num w:numId="21" w16cid:durableId="900098538">
     <w:abstractNumId w:val="9"/>
   </w:num>
   <w:num w:numId="22" w16cid:durableId="1159611945">
-    <w:abstractNumId w:val="26"/>
+    <w:abstractNumId w:val="27"/>
   </w:num>
   <w:num w:numId="23" w16cid:durableId="727652842">
     <w:abstractNumId w:val="3"/>
   </w:num>
   <w:num w:numId="24" w16cid:durableId="1596135007">
-    <w:abstractNumId w:val="24"/>
+    <w:abstractNumId w:val="25"/>
   </w:num>
   <w:num w:numId="25" w16cid:durableId="414478111">
-    <w:abstractNumId w:val="23"/>
+    <w:abstractNumId w:val="24"/>
   </w:num>
   <w:num w:numId="26" w16cid:durableId="372466584">
     <w:abstractNumId w:val="8"/>
   </w:num>
   <w:num w:numId="27" w16cid:durableId="1787504088">
-    <w:abstractNumId w:val="33"/>
+    <w:abstractNumId w:val="34"/>
   </w:num>
   <w:num w:numId="28" w16cid:durableId="927734810">
-    <w:abstractNumId w:val="21"/>
+    <w:abstractNumId w:val="22"/>
   </w:num>
   <w:num w:numId="29" w16cid:durableId="1914387497">
     <w:abstractNumId w:val="16"/>
@@ -19715,7 +20393,7 @@
     <w:abstractNumId w:val="4"/>
   </w:num>
   <w:num w:numId="32" w16cid:durableId="1891846306">
-    <w:abstractNumId w:val="30"/>
+    <w:abstractNumId w:val="31"/>
   </w:num>
   <w:num w:numId="33" w16cid:durableId="97263838">
     <w:abstractNumId w:val="13"/>
@@ -19727,7 +20405,10 @@
     <w:abstractNumId w:val="7"/>
   </w:num>
   <w:num w:numId="36" w16cid:durableId="289866735">
-    <w:abstractNumId w:val="31"/>
+    <w:abstractNumId w:val="32"/>
+  </w:num>
+  <w:num w:numId="37" w16cid:durableId="106699201">
+    <w:abstractNumId w:val="17"/>
   </w:num>
 </w:numbering>
 </file>

</xml_diff>

<commit_message>
docs: Adicionado teste unitário TU001.11
</commit_message>
<xml_diff>
--- a/documentation/Especificacao_de_Requisitos_de_Software.docx
+++ b/documentation/Especificacao_de_Requisitos_de_Software.docx
@@ -15560,22 +15560,16 @@
         </w:rPr>
       </w:pPr>
       <w:r>
-        <w:t>6.1.1.</w:t>
-      </w:r>
-      <w:r>
-        <w:t>X</w:t>
-      </w:r>
-      <w:r>
-        <w:t xml:space="preserve"> [</w:t>
-      </w:r>
-      <w:r>
-        <w:t>TU</w:t>
-      </w:r>
-      <w:r>
-        <w:t>001.0</w:t>
-      </w:r>
-      <w:r>
-        <w:t>X</w:t>
+        <w:t>6.1.1.1</w:t>
+      </w:r>
+      <w:r>
+        <w:t>1</w:t>
+      </w:r>
+      <w:r>
+        <w:t xml:space="preserve"> [TU001.1</w:t>
+      </w:r>
+      <w:r>
+        <w:t>1</w:t>
       </w:r>
       <w:r>
         <w:t xml:space="preserve">] </w:t>
@@ -15584,7 +15578,13 @@
         <w:rPr>
           <w:color w:val="000000" w:themeColor="text1"/>
         </w:rPr>
-        <w:t>O sistema não deve cadastrar usuário quando o login já existe</w:t>
+        <w:t xml:space="preserve">O sistema não deve cadastrar usuário quando o login </w:t>
+      </w:r>
+      <w:r>
+        <w:rPr>
+          <w:color w:val="000000" w:themeColor="text1"/>
+        </w:rPr>
+        <w:t>já existe</w:t>
       </w:r>
     </w:p>
     <w:p/>
@@ -15626,6 +15626,592 @@
         <w:rPr>
           <w:color w:val="000000" w:themeColor="text1"/>
         </w:rPr>
+        <w:t xml:space="preserve"> RF001.01, RN001.0</w:t>
+      </w:r>
+      <w:r>
+        <w:rPr>
+          <w:color w:val="000000" w:themeColor="text1"/>
+        </w:rPr>
+        <w:t>7</w:t>
+      </w:r>
+      <w:r>
+        <w:rPr>
+          <w:color w:val="000000" w:themeColor="text1"/>
+        </w:rPr>
+        <w:t>.</w:t>
+      </w:r>
+    </w:p>
+    <w:p>
+      <w:pPr>
+        <w:rPr>
+          <w:color w:val="000000" w:themeColor="text1"/>
+        </w:rPr>
+      </w:pPr>
+      <w:r>
+        <w:rPr>
+          <w:b/>
+          <w:color w:val="000000" w:themeColor="text1"/>
+        </w:rPr>
+        <w:t xml:space="preserve">Descrição: </w:t>
+      </w:r>
+      <w:r>
+        <w:rPr>
+          <w:color w:val="000000" w:themeColor="text1"/>
+        </w:rPr>
+        <w:t>O sistema não deve cadastrar usuário.</w:t>
+      </w:r>
+    </w:p>
+    <w:p>
+      <w:pPr>
+        <w:rPr>
+          <w:color w:val="000000" w:themeColor="text1"/>
+        </w:rPr>
+      </w:pPr>
+      <w:r>
+        <w:rPr>
+          <w:b/>
+          <w:color w:val="000000" w:themeColor="text1"/>
+        </w:rPr>
+        <w:t>Condições</w:t>
+      </w:r>
+      <w:r>
+        <w:rPr>
+          <w:color w:val="000000" w:themeColor="text1"/>
+        </w:rPr>
+        <w:t xml:space="preserve">: Login do usuário </w:t>
+      </w:r>
+      <w:r>
+        <w:rPr>
+          <w:color w:val="000000" w:themeColor="text1"/>
+        </w:rPr>
+        <w:t>existente</w:t>
+      </w:r>
+      <w:r>
+        <w:rPr>
+          <w:color w:val="000000" w:themeColor="text1"/>
+        </w:rPr>
+        <w:t>.</w:t>
+      </w:r>
+    </w:p>
+    <w:p>
+      <w:pPr>
+        <w:rPr>
+          <w:color w:val="000000" w:themeColor="text1"/>
+        </w:rPr>
+      </w:pPr>
+      <w:r>
+        <w:rPr>
+          <w:b/>
+          <w:color w:val="000000" w:themeColor="text1"/>
+        </w:rPr>
+        <w:t>Passos:</w:t>
+      </w:r>
+      <w:r>
+        <w:rPr>
+          <w:color w:val="000000" w:themeColor="text1"/>
+        </w:rPr>
+        <w:t xml:space="preserve"> </w:t>
+      </w:r>
+    </w:p>
+    <w:p>
+      <w:pPr>
+        <w:pStyle w:val="PargrafodaLista"/>
+        <w:numPr>
+          <w:ilvl w:val="0"/>
+          <w:numId w:val="38"/>
+        </w:numPr>
+        <w:rPr>
+          <w:color w:val="000000" w:themeColor="text1"/>
+        </w:rPr>
+      </w:pPr>
+      <w:r>
+        <w:rPr>
+          <w:color w:val="000000" w:themeColor="text1"/>
+        </w:rPr>
+        <w:t xml:space="preserve">Informar os dados do usuário com o login </w:t>
+      </w:r>
+      <w:r>
+        <w:rPr>
+          <w:color w:val="000000" w:themeColor="text1"/>
+        </w:rPr>
+        <w:t>existente</w:t>
+      </w:r>
+      <w:r>
+        <w:rPr>
+          <w:color w:val="000000" w:themeColor="text1"/>
+        </w:rPr>
+        <w:t>.</w:t>
+      </w:r>
+    </w:p>
+    <w:p>
+      <w:pPr>
+        <w:pStyle w:val="PargrafodaLista"/>
+        <w:numPr>
+          <w:ilvl w:val="0"/>
+          <w:numId w:val="38"/>
+        </w:numPr>
+        <w:rPr>
+          <w:color w:val="000000" w:themeColor="text1"/>
+        </w:rPr>
+      </w:pPr>
+      <w:r>
+        <w:rPr>
+          <w:color w:val="000000" w:themeColor="text1"/>
+        </w:rPr>
+        <w:t xml:space="preserve">Validar </w:t>
+      </w:r>
+      <w:r>
+        <w:rPr>
+          <w:color w:val="000000" w:themeColor="text1"/>
+        </w:rPr>
+        <w:t>login existente</w:t>
+      </w:r>
+      <w:r>
+        <w:rPr>
+          <w:color w:val="000000" w:themeColor="text1"/>
+        </w:rPr>
+        <w:t>.</w:t>
+      </w:r>
+    </w:p>
+    <w:p>
+      <w:pPr>
+        <w:pStyle w:val="PargrafodaLista"/>
+        <w:numPr>
+          <w:ilvl w:val="0"/>
+          <w:numId w:val="38"/>
+        </w:numPr>
+        <w:rPr>
+          <w:color w:val="000000" w:themeColor="text1"/>
+        </w:rPr>
+      </w:pPr>
+      <w:r>
+        <w:rPr>
+          <w:color w:val="000000" w:themeColor="text1"/>
+        </w:rPr>
+        <w:t xml:space="preserve">Receber mensagem de erro ao cadastrar login </w:t>
+      </w:r>
+      <w:r>
+        <w:rPr>
+          <w:color w:val="000000" w:themeColor="text1"/>
+        </w:rPr>
+        <w:t>existente</w:t>
+      </w:r>
+      <w:r>
+        <w:rPr>
+          <w:color w:val="000000" w:themeColor="text1"/>
+        </w:rPr>
+        <w:t>.</w:t>
+      </w:r>
+    </w:p>
+    <w:p>
+      <w:pPr>
+        <w:rPr>
+          <w:color w:val="000000" w:themeColor="text1"/>
+        </w:rPr>
+      </w:pPr>
+      <w:r>
+        <w:rPr>
+          <w:b/>
+          <w:color w:val="000000" w:themeColor="text1"/>
+        </w:rPr>
+        <w:t>Dados do teste:</w:t>
+      </w:r>
+      <w:r>
+        <w:rPr>
+          <w:color w:val="000000" w:themeColor="text1"/>
+        </w:rPr>
+        <w:t xml:space="preserve"> </w:t>
+      </w:r>
+    </w:p>
+    <w:p>
+      <w:pPr>
+        <w:ind w:firstLine="720"/>
+        <w:rPr>
+          <w:color w:val="000000" w:themeColor="text1"/>
+        </w:rPr>
+      </w:pPr>
+      <w:r>
+        <w:rPr>
+          <w:color w:val="000000" w:themeColor="text1"/>
+        </w:rPr>
+        <w:t>{</w:t>
+      </w:r>
+    </w:p>
+    <w:p>
+      <w:pPr>
+        <w:rPr>
+          <w:color w:val="000000" w:themeColor="text1"/>
+        </w:rPr>
+      </w:pPr>
+      <w:r>
+        <w:rPr>
+          <w:color w:val="000000" w:themeColor="text1"/>
+        </w:rPr>
+        <w:tab/>
+      </w:r>
+      <w:r>
+        <w:rPr>
+          <w:color w:val="000000" w:themeColor="text1"/>
+        </w:rPr>
+        <w:tab/>
+      </w:r>
+      <w:r>
+        <w:rPr>
+          <w:color w:val="000000" w:themeColor="text1"/>
+        </w:rPr>
+        <w:t>nome: “teste”</w:t>
+      </w:r>
+    </w:p>
+    <w:p>
+      <w:pPr>
+        <w:rPr>
+          <w:color w:val="000000" w:themeColor="text1"/>
+          <w:lang w:val="en-US"/>
+        </w:rPr>
+      </w:pPr>
+      <w:r>
+        <w:rPr>
+          <w:color w:val="000000" w:themeColor="text1"/>
+        </w:rPr>
+        <w:tab/>
+      </w:r>
+      <w:r>
+        <w:rPr>
+          <w:color w:val="000000" w:themeColor="text1"/>
+        </w:rPr>
+        <w:tab/>
+      </w:r>
+      <w:r>
+        <w:rPr>
+          <w:color w:val="000000" w:themeColor="text1"/>
+          <w:lang w:val="en-US"/>
+        </w:rPr>
+        <w:t>login: “</w:t>
+      </w:r>
+      <w:r>
+        <w:rPr>
+          <w:color w:val="000000" w:themeColor="text1"/>
+          <w:lang w:val="en-US"/>
+        </w:rPr>
+        <w:t>login.existente</w:t>
+      </w:r>
+      <w:r>
+        <w:rPr>
+          <w:color w:val="000000" w:themeColor="text1"/>
+          <w:lang w:val="en-US"/>
+        </w:rPr>
+        <w:t>”</w:t>
+      </w:r>
+    </w:p>
+    <w:p>
+      <w:pPr>
+        <w:rPr>
+          <w:color w:val="000000" w:themeColor="text1"/>
+          <w:lang w:val="en-US"/>
+        </w:rPr>
+      </w:pPr>
+      <w:r>
+        <w:rPr>
+          <w:color w:val="000000" w:themeColor="text1"/>
+          <w:lang w:val="en-US"/>
+        </w:rPr>
+        <w:tab/>
+      </w:r>
+      <w:r>
+        <w:rPr>
+          <w:color w:val="000000" w:themeColor="text1"/>
+          <w:lang w:val="en-US"/>
+        </w:rPr>
+        <w:tab/>
+        <w:t>password: “teste”</w:t>
+      </w:r>
+    </w:p>
+    <w:p>
+      <w:pPr>
+        <w:rPr>
+          <w:color w:val="000000" w:themeColor="text1"/>
+          <w:lang w:val="en-US"/>
+        </w:rPr>
+      </w:pPr>
+      <w:r>
+        <w:rPr>
+          <w:color w:val="000000" w:themeColor="text1"/>
+          <w:lang w:val="en-US"/>
+        </w:rPr>
+        <w:tab/>
+      </w:r>
+      <w:r>
+        <w:rPr>
+          <w:color w:val="000000" w:themeColor="text1"/>
+          <w:lang w:val="en-US"/>
+        </w:rPr>
+        <w:tab/>
+      </w:r>
+      <w:r>
+        <w:rPr>
+          <w:color w:val="000000" w:themeColor="text1"/>
+          <w:lang w:val="en-US"/>
+        </w:rPr>
+        <w:t>telefone: “11912345678”</w:t>
+      </w:r>
+    </w:p>
+    <w:p>
+      <w:pPr>
+        <w:rPr>
+          <w:color w:val="000000" w:themeColor="text1"/>
+          <w:lang w:val="en-US"/>
+        </w:rPr>
+      </w:pPr>
+      <w:r>
+        <w:rPr>
+          <w:color w:val="000000" w:themeColor="text1"/>
+          <w:lang w:val="en-US"/>
+        </w:rPr>
+        <w:tab/>
+      </w:r>
+      <w:r>
+        <w:rPr>
+          <w:color w:val="000000" w:themeColor="text1"/>
+          <w:lang w:val="en-US"/>
+        </w:rPr>
+        <w:tab/>
+        <w:t>email: “teste@email.com”</w:t>
+      </w:r>
+    </w:p>
+    <w:p>
+      <w:pPr>
+        <w:rPr>
+          <w:color w:val="000000" w:themeColor="text1"/>
+        </w:rPr>
+      </w:pPr>
+      <w:r>
+        <w:rPr>
+          <w:color w:val="000000" w:themeColor="text1"/>
+          <w:lang w:val="en-US"/>
+        </w:rPr>
+        <w:tab/>
+      </w:r>
+      <w:r>
+        <w:rPr>
+          <w:color w:val="000000" w:themeColor="text1"/>
+          <w:lang w:val="en-US"/>
+        </w:rPr>
+        <w:tab/>
+      </w:r>
+      <w:r>
+        <w:rPr>
+          <w:color w:val="000000" w:themeColor="text1"/>
+        </w:rPr>
+        <w:t>status: ATIVO</w:t>
+      </w:r>
+    </w:p>
+    <w:p>
+      <w:pPr>
+        <w:rPr>
+          <w:color w:val="000000" w:themeColor="text1"/>
+        </w:rPr>
+      </w:pPr>
+      <w:r>
+        <w:rPr>
+          <w:color w:val="000000" w:themeColor="text1"/>
+        </w:rPr>
+        <w:tab/>
+      </w:r>
+      <w:r>
+        <w:rPr>
+          <w:color w:val="000000" w:themeColor="text1"/>
+        </w:rPr>
+        <w:tab/>
+        <w:t>perfil: ADMIN</w:t>
+      </w:r>
+    </w:p>
+    <w:p>
+      <w:pPr>
+        <w:rPr>
+          <w:color w:val="000000" w:themeColor="text1"/>
+        </w:rPr>
+      </w:pPr>
+      <w:r>
+        <w:rPr>
+          <w:color w:val="000000" w:themeColor="text1"/>
+        </w:rPr>
+        <w:tab/>
+        <w:t>}</w:t>
+      </w:r>
+    </w:p>
+    <w:p>
+      <w:pPr>
+        <w:rPr>
+          <w:color w:val="000000" w:themeColor="text1"/>
+        </w:rPr>
+      </w:pPr>
+      <w:r>
+        <w:rPr>
+          <w:b/>
+          <w:color w:val="000000" w:themeColor="text1"/>
+        </w:rPr>
+        <w:t xml:space="preserve">Resultado esperado: </w:t>
+      </w:r>
+      <w:r>
+        <w:rPr>
+          <w:color w:val="000000" w:themeColor="text1"/>
+        </w:rPr>
+        <w:t>Lançar exceção InvalidLoginException com a mensagem “</w:t>
+      </w:r>
+      <w:r>
+        <w:rPr>
+          <w:color w:val="000000" w:themeColor="text1"/>
+        </w:rPr>
+        <w:t>Login já cadastrado</w:t>
+      </w:r>
+      <w:r>
+        <w:rPr>
+          <w:color w:val="000000" w:themeColor="text1"/>
+        </w:rPr>
+        <w:t>”.</w:t>
+      </w:r>
+    </w:p>
+    <w:p>
+      <w:pPr>
+        <w:rPr>
+          <w:color w:val="000000" w:themeColor="text1"/>
+        </w:rPr>
+      </w:pPr>
+      <w:r>
+        <w:rPr>
+          <w:b/>
+          <w:color w:val="000000" w:themeColor="text1"/>
+        </w:rPr>
+        <w:t>Status:</w:t>
+      </w:r>
+      <w:r>
+        <w:rPr>
+          <w:color w:val="000000" w:themeColor="text1"/>
+        </w:rPr>
+        <w:t xml:space="preserve"> Não realizado.</w:t>
+      </w:r>
+    </w:p>
+    <w:p>
+      <w:pPr>
+        <w:rPr>
+          <w:color w:val="000000" w:themeColor="text1"/>
+        </w:rPr>
+      </w:pPr>
+      <w:r>
+        <w:rPr>
+          <w:b/>
+          <w:color w:val="000000" w:themeColor="text1"/>
+        </w:rPr>
+        <w:t>Realização do teste:</w:t>
+      </w:r>
+      <w:r>
+        <w:rPr>
+          <w:color w:val="000000" w:themeColor="text1"/>
+        </w:rPr>
+        <w:t xml:space="preserve"> 00/00/0000.</w:t>
+      </w:r>
+    </w:p>
+    <w:p>
+      <w:pPr>
+        <w:rPr>
+          <w:color w:val="000000" w:themeColor="text1"/>
+        </w:rPr>
+      </w:pPr>
+      <w:r>
+        <w:rPr>
+          <w:b/>
+          <w:color w:val="000000" w:themeColor="text1"/>
+        </w:rPr>
+        <w:t xml:space="preserve">Responsável: </w:t>
+      </w:r>
+      <w:r>
+        <w:rPr>
+          <w:color w:val="000000" w:themeColor="text1"/>
+        </w:rPr>
+        <w:t>A definir.</w:t>
+      </w:r>
+    </w:p>
+    <w:p>
+      <w:pPr>
+        <w:rPr>
+          <w:color w:val="000000" w:themeColor="text1"/>
+        </w:rPr>
+      </w:pPr>
+    </w:p>
+    <w:p>
+      <w:pPr>
+        <w:pStyle w:val="Ttulo4"/>
+        <w:rPr>
+          <w:color w:val="FF0000"/>
+        </w:rPr>
+      </w:pPr>
+      <w:r>
+        <w:t>6.1.1.</w:t>
+      </w:r>
+      <w:r>
+        <w:t>X</w:t>
+      </w:r>
+      <w:r>
+        <w:t xml:space="preserve"> [</w:t>
+      </w:r>
+      <w:r>
+        <w:t>TU</w:t>
+      </w:r>
+      <w:r>
+        <w:t>001.0</w:t>
+      </w:r>
+      <w:r>
+        <w:t>X</w:t>
+      </w:r>
+      <w:r>
+        <w:t xml:space="preserve">] </w:t>
+      </w:r>
+      <w:r>
+        <w:rPr>
+          <w:color w:val="000000" w:themeColor="text1"/>
+        </w:rPr>
+        <w:t>O sistema não deve cadastrar usuário quando o login já existe</w:t>
+      </w:r>
+    </w:p>
+    <w:p/>
+    <w:p>
+      <w:pPr>
+        <w:rPr>
+          <w:color w:val="000000" w:themeColor="text1"/>
+        </w:rPr>
+      </w:pPr>
+      <w:r>
+        <w:rPr>
+          <w:b/>
+          <w:bCs/>
+          <w:color w:val="000000" w:themeColor="text1"/>
+        </w:rPr>
+        <w:t>Camada:</w:t>
+      </w:r>
+      <w:r>
+        <w:rPr>
+          <w:color w:val="000000" w:themeColor="text1"/>
+        </w:rPr>
+        <w:t xml:space="preserve"> Serviço.</w:t>
+      </w:r>
+    </w:p>
+    <w:p>
+      <w:pPr>
+        <w:rPr>
+          <w:color w:val="000000" w:themeColor="text1"/>
+        </w:rPr>
+      </w:pPr>
+      <w:r>
+        <w:rPr>
+          <w:b/>
+          <w:color w:val="000000" w:themeColor="text1"/>
+        </w:rPr>
+        <w:t>Requisitos associados:</w:t>
+      </w:r>
+      <w:r>
+        <w:rPr>
+          <w:color w:val="000000" w:themeColor="text1"/>
+        </w:rPr>
         <w:t xml:space="preserve"> RF001.01</w:t>
       </w:r>
       <w:r>
@@ -15672,6 +16258,7 @@
           <w:b/>
           <w:color w:val="000000" w:themeColor="text1"/>
         </w:rPr>
+        <w:lastRenderedPageBreak/>
         <w:t>Condições</w:t>
       </w:r>
       <w:r>
@@ -16121,7 +16708,6 @@
       </w:pPr>
       <w:bookmarkStart w:id="52" w:name="_Toc191065912"/>
       <w:r>
-        <w:lastRenderedPageBreak/>
         <w:t>6.</w:t>
       </w:r>
       <w:r>
@@ -19361,6 +19947,92 @@
     </w:lvl>
   </w:abstractNum>
   <w:abstractNum w:abstractNumId="28" w15:restartNumberingAfterBreak="0">
+    <w:nsid w:val="6A841B74"/>
+    <w:multiLevelType w:val="multilevel"/>
+    <w:tmpl w:val="7EAE38A0"/>
+    <w:lvl w:ilvl="0">
+      <w:start w:val="1"/>
+      <w:numFmt w:val="decimal"/>
+      <w:lvlText w:val="%1."/>
+      <w:lvlJc w:val="left"/>
+      <w:pPr>
+        <w:ind w:left="709" w:hanging="360"/>
+      </w:pPr>
+    </w:lvl>
+    <w:lvl w:ilvl="1">
+      <w:start w:val="1"/>
+      <w:numFmt w:val="lowerLetter"/>
+      <w:lvlText w:val="%2."/>
+      <w:lvlJc w:val="left"/>
+      <w:pPr>
+        <w:ind w:left="1429" w:hanging="360"/>
+      </w:pPr>
+    </w:lvl>
+    <w:lvl w:ilvl="2">
+      <w:start w:val="1"/>
+      <w:numFmt w:val="lowerRoman"/>
+      <w:lvlText w:val="%3."/>
+      <w:lvlJc w:val="right"/>
+      <w:pPr>
+        <w:ind w:left="2149" w:hanging="180"/>
+      </w:pPr>
+    </w:lvl>
+    <w:lvl w:ilvl="3">
+      <w:start w:val="1"/>
+      <w:numFmt w:val="decimal"/>
+      <w:lvlText w:val="%4."/>
+      <w:lvlJc w:val="left"/>
+      <w:pPr>
+        <w:ind w:left="2869" w:hanging="360"/>
+      </w:pPr>
+    </w:lvl>
+    <w:lvl w:ilvl="4">
+      <w:start w:val="1"/>
+      <w:numFmt w:val="lowerLetter"/>
+      <w:lvlText w:val="%5."/>
+      <w:lvlJc w:val="left"/>
+      <w:pPr>
+        <w:ind w:left="3589" w:hanging="360"/>
+      </w:pPr>
+    </w:lvl>
+    <w:lvl w:ilvl="5">
+      <w:start w:val="1"/>
+      <w:numFmt w:val="lowerRoman"/>
+      <w:lvlText w:val="%6."/>
+      <w:lvlJc w:val="right"/>
+      <w:pPr>
+        <w:ind w:left="4309" w:hanging="180"/>
+      </w:pPr>
+    </w:lvl>
+    <w:lvl w:ilvl="6">
+      <w:start w:val="1"/>
+      <w:numFmt w:val="decimal"/>
+      <w:lvlText w:val="%7."/>
+      <w:lvlJc w:val="left"/>
+      <w:pPr>
+        <w:ind w:left="5029" w:hanging="360"/>
+      </w:pPr>
+    </w:lvl>
+    <w:lvl w:ilvl="7">
+      <w:start w:val="1"/>
+      <w:numFmt w:val="lowerLetter"/>
+      <w:lvlText w:val="%8."/>
+      <w:lvlJc w:val="left"/>
+      <w:pPr>
+        <w:ind w:left="5749" w:hanging="360"/>
+      </w:pPr>
+    </w:lvl>
+    <w:lvl w:ilvl="8">
+      <w:start w:val="1"/>
+      <w:numFmt w:val="lowerRoman"/>
+      <w:lvlText w:val="%9."/>
+      <w:lvlJc w:val="right"/>
+      <w:pPr>
+        <w:ind w:left="6469" w:hanging="180"/>
+      </w:pPr>
+    </w:lvl>
+  </w:abstractNum>
+  <w:abstractNum w:abstractNumId="29" w15:restartNumberingAfterBreak="0">
     <w:nsid w:val="6C8202C1"/>
     <w:multiLevelType w:val="multilevel"/>
     <w:tmpl w:val="981048B2"/>
@@ -19473,7 +20145,7 @@
       </w:rPr>
     </w:lvl>
   </w:abstractNum>
-  <w:abstractNum w:abstractNumId="29" w15:restartNumberingAfterBreak="0">
+  <w:abstractNum w:abstractNumId="30" w15:restartNumberingAfterBreak="0">
     <w:nsid w:val="6CD6232C"/>
     <w:multiLevelType w:val="multilevel"/>
     <w:tmpl w:val="2C50429A"/>
@@ -19586,7 +20258,7 @@
       </w:rPr>
     </w:lvl>
   </w:abstractNum>
-  <w:abstractNum w:abstractNumId="30" w15:restartNumberingAfterBreak="0">
+  <w:abstractNum w:abstractNumId="31" w15:restartNumberingAfterBreak="0">
     <w:nsid w:val="6FBC5385"/>
     <w:multiLevelType w:val="multilevel"/>
     <w:tmpl w:val="9E36186C"/>
@@ -19699,7 +20371,7 @@
       </w:rPr>
     </w:lvl>
   </w:abstractNum>
-  <w:abstractNum w:abstractNumId="31" w15:restartNumberingAfterBreak="0">
+  <w:abstractNum w:abstractNumId="32" w15:restartNumberingAfterBreak="0">
     <w:nsid w:val="74B049B9"/>
     <w:multiLevelType w:val="multilevel"/>
     <w:tmpl w:val="7EAE38A0"/>
@@ -19785,7 +20457,7 @@
       </w:pPr>
     </w:lvl>
   </w:abstractNum>
-  <w:abstractNum w:abstractNumId="32" w15:restartNumberingAfterBreak="0">
+  <w:abstractNum w:abstractNumId="33" w15:restartNumberingAfterBreak="0">
     <w:nsid w:val="74C61032"/>
     <w:multiLevelType w:val="multilevel"/>
     <w:tmpl w:val="7EAE38A0"/>
@@ -19871,7 +20543,7 @@
       </w:pPr>
     </w:lvl>
   </w:abstractNum>
-  <w:abstractNum w:abstractNumId="33" w15:restartNumberingAfterBreak="0">
+  <w:abstractNum w:abstractNumId="34" w15:restartNumberingAfterBreak="0">
     <w:nsid w:val="7ABF4D30"/>
     <w:multiLevelType w:val="multilevel"/>
     <w:tmpl w:val="C61A779C"/>
@@ -19984,7 +20656,7 @@
       </w:rPr>
     </w:lvl>
   </w:abstractNum>
-  <w:abstractNum w:abstractNumId="34" w15:restartNumberingAfterBreak="0">
+  <w:abstractNum w:abstractNumId="35" w15:restartNumberingAfterBreak="0">
     <w:nsid w:val="7E36314E"/>
     <w:multiLevelType w:val="hybridMultilevel"/>
     <w:tmpl w:val="6FDA89B4"/>
@@ -20097,7 +20769,7 @@
       </w:rPr>
     </w:lvl>
   </w:abstractNum>
-  <w:abstractNum w:abstractNumId="35" w15:restartNumberingAfterBreak="0">
+  <w:abstractNum w:abstractNumId="36" w15:restartNumberingAfterBreak="0">
     <w:nsid w:val="7ED21264"/>
     <w:multiLevelType w:val="multilevel"/>
     <w:tmpl w:val="87B4A5EE"/>
@@ -20210,7 +20882,7 @@
       </w:rPr>
     </w:lvl>
   </w:abstractNum>
-  <w:abstractNum w:abstractNumId="36" w15:restartNumberingAfterBreak="0">
+  <w:abstractNum w:abstractNumId="37" w15:restartNumberingAfterBreak="0">
     <w:nsid w:val="7FF4155E"/>
     <w:multiLevelType w:val="multilevel"/>
     <w:tmpl w:val="F9722B4C"/>
@@ -20303,10 +20975,10 @@
     <w:abstractNumId w:val="1"/>
   </w:num>
   <w:num w:numId="2" w16cid:durableId="88086438">
-    <w:abstractNumId w:val="33"/>
+    <w:abstractNumId w:val="34"/>
   </w:num>
   <w:num w:numId="3" w16cid:durableId="1706714901">
-    <w:abstractNumId w:val="29"/>
+    <w:abstractNumId w:val="30"/>
   </w:num>
   <w:num w:numId="4" w16cid:durableId="113717744">
     <w:abstractNumId w:val="0"/>
@@ -20318,13 +20990,13 @@
     <w:abstractNumId w:val="23"/>
   </w:num>
   <w:num w:numId="7" w16cid:durableId="1890459348">
-    <w:abstractNumId w:val="36"/>
+    <w:abstractNumId w:val="37"/>
   </w:num>
   <w:num w:numId="8" w16cid:durableId="333532636">
     <w:abstractNumId w:val="11"/>
   </w:num>
   <w:num w:numId="9" w16cid:durableId="128785046">
-    <w:abstractNumId w:val="28"/>
+    <w:abstractNumId w:val="29"/>
   </w:num>
   <w:num w:numId="10" w16cid:durableId="905458532">
     <w:abstractNumId w:val="6"/>
@@ -20333,7 +21005,7 @@
     <w:abstractNumId w:val="15"/>
   </w:num>
   <w:num w:numId="12" w16cid:durableId="568999983">
-    <w:abstractNumId w:val="35"/>
+    <w:abstractNumId w:val="36"/>
   </w:num>
   <w:num w:numId="13" w16cid:durableId="1767190151">
     <w:abstractNumId w:val="5"/>
@@ -20345,7 +21017,7 @@
     <w:abstractNumId w:val="18"/>
   </w:num>
   <w:num w:numId="16" w16cid:durableId="2108111862">
-    <w:abstractNumId w:val="30"/>
+    <w:abstractNumId w:val="31"/>
   </w:num>
   <w:num w:numId="17" w16cid:durableId="1320620575">
     <w:abstractNumId w:val="26"/>
@@ -20378,7 +21050,7 @@
     <w:abstractNumId w:val="8"/>
   </w:num>
   <w:num w:numId="27" w16cid:durableId="1787504088">
-    <w:abstractNumId w:val="34"/>
+    <w:abstractNumId w:val="35"/>
   </w:num>
   <w:num w:numId="28" w16cid:durableId="927734810">
     <w:abstractNumId w:val="22"/>
@@ -20393,7 +21065,7 @@
     <w:abstractNumId w:val="4"/>
   </w:num>
   <w:num w:numId="32" w16cid:durableId="1891846306">
-    <w:abstractNumId w:val="31"/>
+    <w:abstractNumId w:val="32"/>
   </w:num>
   <w:num w:numId="33" w16cid:durableId="97263838">
     <w:abstractNumId w:val="13"/>
@@ -20405,10 +21077,13 @@
     <w:abstractNumId w:val="7"/>
   </w:num>
   <w:num w:numId="36" w16cid:durableId="289866735">
-    <w:abstractNumId w:val="32"/>
+    <w:abstractNumId w:val="33"/>
   </w:num>
   <w:num w:numId="37" w16cid:durableId="106699201">
     <w:abstractNumId w:val="17"/>
+  </w:num>
+  <w:num w:numId="38" w16cid:durableId="1859270063">
+    <w:abstractNumId w:val="28"/>
   </w:num>
 </w:numbering>
 </file>

</xml_diff>

<commit_message>
docs: Adicionado teste unitário TU001.12
</commit_message>
<xml_diff>
--- a/documentation/Especificacao_de_Requisitos_de_Software.docx
+++ b/documentation/Especificacao_de_Requisitos_de_Software.docx
@@ -16146,22 +16146,16 @@
         </w:rPr>
       </w:pPr>
       <w:r>
-        <w:t>6.1.1.</w:t>
-      </w:r>
-      <w:r>
-        <w:t>X</w:t>
-      </w:r>
-      <w:r>
-        <w:t xml:space="preserve"> [</w:t>
-      </w:r>
-      <w:r>
-        <w:t>TU</w:t>
-      </w:r>
-      <w:r>
-        <w:t>001.0</w:t>
-      </w:r>
-      <w:r>
-        <w:t>X</w:t>
+        <w:t>6.1.1.1</w:t>
+      </w:r>
+      <w:r>
+        <w:t>2</w:t>
+      </w:r>
+      <w:r>
+        <w:t xml:space="preserve"> [TU001.1</w:t>
+      </w:r>
+      <w:r>
+        <w:t>2</w:t>
       </w:r>
       <w:r>
         <w:t xml:space="preserve">] </w:t>
@@ -16170,7 +16164,25 @@
         <w:rPr>
           <w:color w:val="000000" w:themeColor="text1"/>
         </w:rPr>
-        <w:t>O sistema não deve cadastrar usuário quando o login já existe</w:t>
+        <w:t xml:space="preserve">O sistema não deve </w:t>
+      </w:r>
+      <w:r>
+        <w:rPr>
+          <w:color w:val="000000" w:themeColor="text1"/>
+        </w:rPr>
+        <w:t>atualizar</w:t>
+      </w:r>
+      <w:r>
+        <w:rPr>
+          <w:color w:val="000000" w:themeColor="text1"/>
+        </w:rPr>
+        <w:t xml:space="preserve"> usuário quando o login </w:t>
+      </w:r>
+      <w:r>
+        <w:rPr>
+          <w:color w:val="000000" w:themeColor="text1"/>
+        </w:rPr>
+        <w:t>foi alterado</w:t>
       </w:r>
     </w:p>
     <w:p/>
@@ -16212,6 +16224,584 @@
         <w:rPr>
           <w:color w:val="000000" w:themeColor="text1"/>
         </w:rPr>
+        <w:t xml:space="preserve"> RF001.01, RN001.0</w:t>
+      </w:r>
+      <w:r>
+        <w:rPr>
+          <w:color w:val="000000" w:themeColor="text1"/>
+        </w:rPr>
+        <w:t>8</w:t>
+      </w:r>
+      <w:r>
+        <w:rPr>
+          <w:color w:val="000000" w:themeColor="text1"/>
+        </w:rPr>
+        <w:t>.</w:t>
+      </w:r>
+    </w:p>
+    <w:p>
+      <w:pPr>
+        <w:rPr>
+          <w:color w:val="000000" w:themeColor="text1"/>
+        </w:rPr>
+      </w:pPr>
+      <w:r>
+        <w:rPr>
+          <w:b/>
+          <w:color w:val="000000" w:themeColor="text1"/>
+        </w:rPr>
+        <w:t xml:space="preserve">Descrição: </w:t>
+      </w:r>
+      <w:r>
+        <w:rPr>
+          <w:color w:val="000000" w:themeColor="text1"/>
+        </w:rPr>
+        <w:t xml:space="preserve">O sistema não deve </w:t>
+      </w:r>
+      <w:r>
+        <w:rPr>
+          <w:color w:val="000000" w:themeColor="text1"/>
+        </w:rPr>
+        <w:t>atualizar</w:t>
+      </w:r>
+      <w:r>
+        <w:rPr>
+          <w:color w:val="000000" w:themeColor="text1"/>
+        </w:rPr>
+        <w:t xml:space="preserve"> usuário.</w:t>
+      </w:r>
+    </w:p>
+    <w:p>
+      <w:pPr>
+        <w:rPr>
+          <w:color w:val="000000" w:themeColor="text1"/>
+        </w:rPr>
+      </w:pPr>
+      <w:r>
+        <w:rPr>
+          <w:b/>
+          <w:color w:val="000000" w:themeColor="text1"/>
+        </w:rPr>
+        <w:lastRenderedPageBreak/>
+        <w:t>Condições</w:t>
+      </w:r>
+      <w:r>
+        <w:rPr>
+          <w:color w:val="000000" w:themeColor="text1"/>
+        </w:rPr>
+        <w:t xml:space="preserve">: </w:t>
+      </w:r>
+      <w:r>
+        <w:rPr>
+          <w:color w:val="000000" w:themeColor="text1"/>
+        </w:rPr>
+        <w:t>Alteração do atributo login</w:t>
+      </w:r>
+      <w:r>
+        <w:rPr>
+          <w:color w:val="000000" w:themeColor="text1"/>
+        </w:rPr>
+        <w:t>.</w:t>
+      </w:r>
+    </w:p>
+    <w:p>
+      <w:pPr>
+        <w:rPr>
+          <w:color w:val="000000" w:themeColor="text1"/>
+        </w:rPr>
+      </w:pPr>
+      <w:r>
+        <w:rPr>
+          <w:b/>
+          <w:color w:val="000000" w:themeColor="text1"/>
+        </w:rPr>
+        <w:t>Passos:</w:t>
+      </w:r>
+      <w:r>
+        <w:rPr>
+          <w:color w:val="000000" w:themeColor="text1"/>
+        </w:rPr>
+        <w:t xml:space="preserve"> </w:t>
+      </w:r>
+    </w:p>
+    <w:p>
+      <w:pPr>
+        <w:pStyle w:val="PargrafodaLista"/>
+        <w:numPr>
+          <w:ilvl w:val="0"/>
+          <w:numId w:val="39"/>
+        </w:numPr>
+        <w:rPr>
+          <w:color w:val="000000" w:themeColor="text1"/>
+        </w:rPr>
+      </w:pPr>
+      <w:r>
+        <w:rPr>
+          <w:color w:val="000000" w:themeColor="text1"/>
+        </w:rPr>
+        <w:t xml:space="preserve">Informar os dados do usuário com o login </w:t>
+      </w:r>
+      <w:r>
+        <w:rPr>
+          <w:color w:val="000000" w:themeColor="text1"/>
+        </w:rPr>
+        <w:t>alterado</w:t>
+      </w:r>
+      <w:r>
+        <w:rPr>
+          <w:color w:val="000000" w:themeColor="text1"/>
+        </w:rPr>
+        <w:t>.</w:t>
+      </w:r>
+    </w:p>
+    <w:p>
+      <w:pPr>
+        <w:pStyle w:val="PargrafodaLista"/>
+        <w:numPr>
+          <w:ilvl w:val="0"/>
+          <w:numId w:val="39"/>
+        </w:numPr>
+        <w:rPr>
+          <w:color w:val="000000" w:themeColor="text1"/>
+        </w:rPr>
+      </w:pPr>
+      <w:r>
+        <w:rPr>
+          <w:color w:val="000000" w:themeColor="text1"/>
+        </w:rPr>
+        <w:t xml:space="preserve">Validar </w:t>
+      </w:r>
+      <w:r>
+        <w:rPr>
+          <w:color w:val="000000" w:themeColor="text1"/>
+        </w:rPr>
+        <w:t>alteração do login</w:t>
+      </w:r>
+      <w:r>
+        <w:rPr>
+          <w:color w:val="000000" w:themeColor="text1"/>
+        </w:rPr>
+        <w:t>.</w:t>
+      </w:r>
+    </w:p>
+    <w:p>
+      <w:pPr>
+        <w:pStyle w:val="PargrafodaLista"/>
+        <w:numPr>
+          <w:ilvl w:val="0"/>
+          <w:numId w:val="39"/>
+        </w:numPr>
+        <w:rPr>
+          <w:color w:val="000000" w:themeColor="text1"/>
+        </w:rPr>
+      </w:pPr>
+      <w:r>
+        <w:rPr>
+          <w:color w:val="000000" w:themeColor="text1"/>
+        </w:rPr>
+        <w:t>Receber mensagem de erro ao</w:t>
+      </w:r>
+      <w:r>
+        <w:rPr>
+          <w:color w:val="000000" w:themeColor="text1"/>
+        </w:rPr>
+        <w:t xml:space="preserve"> alterar o login</w:t>
+      </w:r>
+      <w:r>
+        <w:rPr>
+          <w:color w:val="000000" w:themeColor="text1"/>
+        </w:rPr>
+        <w:t>.</w:t>
+      </w:r>
+    </w:p>
+    <w:p>
+      <w:pPr>
+        <w:rPr>
+          <w:color w:val="000000" w:themeColor="text1"/>
+        </w:rPr>
+      </w:pPr>
+      <w:r>
+        <w:rPr>
+          <w:b/>
+          <w:color w:val="000000" w:themeColor="text1"/>
+        </w:rPr>
+        <w:t>Dados do teste:</w:t>
+      </w:r>
+      <w:r>
+        <w:rPr>
+          <w:color w:val="000000" w:themeColor="text1"/>
+        </w:rPr>
+        <w:t xml:space="preserve"> </w:t>
+      </w:r>
+    </w:p>
+    <w:p>
+      <w:pPr>
+        <w:ind w:firstLine="720"/>
+        <w:rPr>
+          <w:color w:val="000000" w:themeColor="text1"/>
+        </w:rPr>
+      </w:pPr>
+      <w:r>
+        <w:rPr>
+          <w:color w:val="000000" w:themeColor="text1"/>
+        </w:rPr>
+        <w:t>{</w:t>
+      </w:r>
+    </w:p>
+    <w:p>
+      <w:pPr>
+        <w:rPr>
+          <w:color w:val="000000" w:themeColor="text1"/>
+        </w:rPr>
+      </w:pPr>
+      <w:r>
+        <w:rPr>
+          <w:color w:val="000000" w:themeColor="text1"/>
+        </w:rPr>
+        <w:tab/>
+      </w:r>
+      <w:r>
+        <w:rPr>
+          <w:color w:val="000000" w:themeColor="text1"/>
+        </w:rPr>
+        <w:tab/>
+      </w:r>
+      <w:r>
+        <w:rPr>
+          <w:color w:val="000000" w:themeColor="text1"/>
+        </w:rPr>
+        <w:t>nome: “teste”</w:t>
+      </w:r>
+    </w:p>
+    <w:p>
+      <w:pPr>
+        <w:rPr>
+          <w:color w:val="000000" w:themeColor="text1"/>
+        </w:rPr>
+      </w:pPr>
+      <w:r>
+        <w:rPr>
+          <w:color w:val="000000" w:themeColor="text1"/>
+        </w:rPr>
+        <w:tab/>
+      </w:r>
+      <w:r>
+        <w:rPr>
+          <w:color w:val="000000" w:themeColor="text1"/>
+        </w:rPr>
+        <w:tab/>
+      </w:r>
+      <w:r>
+        <w:rPr>
+          <w:color w:val="000000" w:themeColor="text1"/>
+        </w:rPr>
+        <w:t>login: “login.</w:t>
+      </w:r>
+      <w:r>
+        <w:rPr>
+          <w:color w:val="000000" w:themeColor="text1"/>
+        </w:rPr>
+        <w:t>alterado</w:t>
+      </w:r>
+      <w:r>
+        <w:rPr>
+          <w:color w:val="000000" w:themeColor="text1"/>
+        </w:rPr>
+        <w:t>”</w:t>
+      </w:r>
+    </w:p>
+    <w:p>
+      <w:pPr>
+        <w:rPr>
+          <w:color w:val="000000" w:themeColor="text1"/>
+        </w:rPr>
+      </w:pPr>
+      <w:r>
+        <w:rPr>
+          <w:color w:val="000000" w:themeColor="text1"/>
+        </w:rPr>
+        <w:tab/>
+      </w:r>
+      <w:r>
+        <w:rPr>
+          <w:color w:val="000000" w:themeColor="text1"/>
+        </w:rPr>
+        <w:tab/>
+        <w:t>password: “teste”</w:t>
+      </w:r>
+    </w:p>
+    <w:p>
+      <w:pPr>
+        <w:rPr>
+          <w:color w:val="000000" w:themeColor="text1"/>
+        </w:rPr>
+      </w:pPr>
+      <w:r>
+        <w:rPr>
+          <w:color w:val="000000" w:themeColor="text1"/>
+        </w:rPr>
+        <w:tab/>
+      </w:r>
+      <w:r>
+        <w:rPr>
+          <w:color w:val="000000" w:themeColor="text1"/>
+        </w:rPr>
+        <w:tab/>
+        <w:t>telefone: “11912345678”</w:t>
+      </w:r>
+    </w:p>
+    <w:p>
+      <w:pPr>
+        <w:rPr>
+          <w:color w:val="000000" w:themeColor="text1"/>
+        </w:rPr>
+      </w:pPr>
+      <w:r>
+        <w:rPr>
+          <w:color w:val="000000" w:themeColor="text1"/>
+        </w:rPr>
+        <w:tab/>
+      </w:r>
+      <w:r>
+        <w:rPr>
+          <w:color w:val="000000" w:themeColor="text1"/>
+        </w:rPr>
+        <w:tab/>
+        <w:t>email: “teste@email.com”</w:t>
+      </w:r>
+    </w:p>
+    <w:p>
+      <w:pPr>
+        <w:rPr>
+          <w:color w:val="000000" w:themeColor="text1"/>
+        </w:rPr>
+      </w:pPr>
+      <w:r>
+        <w:rPr>
+          <w:color w:val="000000" w:themeColor="text1"/>
+        </w:rPr>
+        <w:tab/>
+      </w:r>
+      <w:r>
+        <w:rPr>
+          <w:color w:val="000000" w:themeColor="text1"/>
+        </w:rPr>
+        <w:tab/>
+      </w:r>
+      <w:r>
+        <w:rPr>
+          <w:color w:val="000000" w:themeColor="text1"/>
+        </w:rPr>
+        <w:t>status: ATIVO</w:t>
+      </w:r>
+    </w:p>
+    <w:p>
+      <w:pPr>
+        <w:rPr>
+          <w:color w:val="000000" w:themeColor="text1"/>
+        </w:rPr>
+      </w:pPr>
+      <w:r>
+        <w:rPr>
+          <w:color w:val="000000" w:themeColor="text1"/>
+        </w:rPr>
+        <w:tab/>
+      </w:r>
+      <w:r>
+        <w:rPr>
+          <w:color w:val="000000" w:themeColor="text1"/>
+        </w:rPr>
+        <w:tab/>
+        <w:t>perfil: ADMIN</w:t>
+      </w:r>
+    </w:p>
+    <w:p>
+      <w:pPr>
+        <w:rPr>
+          <w:color w:val="000000" w:themeColor="text1"/>
+        </w:rPr>
+      </w:pPr>
+      <w:r>
+        <w:rPr>
+          <w:color w:val="000000" w:themeColor="text1"/>
+        </w:rPr>
+        <w:tab/>
+        <w:t>}</w:t>
+      </w:r>
+    </w:p>
+    <w:p>
+      <w:pPr>
+        <w:rPr>
+          <w:color w:val="000000" w:themeColor="text1"/>
+        </w:rPr>
+      </w:pPr>
+      <w:r>
+        <w:rPr>
+          <w:b/>
+          <w:color w:val="000000" w:themeColor="text1"/>
+        </w:rPr>
+        <w:t xml:space="preserve">Resultado esperado: </w:t>
+      </w:r>
+      <w:r>
+        <w:rPr>
+          <w:color w:val="000000" w:themeColor="text1"/>
+        </w:rPr>
+        <w:t xml:space="preserve">Lançar exceção InvalidLoginException com a mensagem “Login </w:t>
+      </w:r>
+      <w:r>
+        <w:rPr>
+          <w:color w:val="000000" w:themeColor="text1"/>
+        </w:rPr>
+        <w:t>não pode ser alterado</w:t>
+      </w:r>
+      <w:r>
+        <w:rPr>
+          <w:color w:val="000000" w:themeColor="text1"/>
+        </w:rPr>
+        <w:t>”.</w:t>
+      </w:r>
+    </w:p>
+    <w:p>
+      <w:pPr>
+        <w:rPr>
+          <w:color w:val="000000" w:themeColor="text1"/>
+        </w:rPr>
+      </w:pPr>
+      <w:r>
+        <w:rPr>
+          <w:b/>
+          <w:color w:val="000000" w:themeColor="text1"/>
+        </w:rPr>
+        <w:t>Status:</w:t>
+      </w:r>
+      <w:r>
+        <w:rPr>
+          <w:color w:val="000000" w:themeColor="text1"/>
+        </w:rPr>
+        <w:t xml:space="preserve"> Não realizado.</w:t>
+      </w:r>
+    </w:p>
+    <w:p>
+      <w:pPr>
+        <w:rPr>
+          <w:color w:val="000000" w:themeColor="text1"/>
+        </w:rPr>
+      </w:pPr>
+      <w:r>
+        <w:rPr>
+          <w:b/>
+          <w:color w:val="000000" w:themeColor="text1"/>
+        </w:rPr>
+        <w:t>Realização do teste:</w:t>
+      </w:r>
+      <w:r>
+        <w:rPr>
+          <w:color w:val="000000" w:themeColor="text1"/>
+        </w:rPr>
+        <w:t xml:space="preserve"> 00/00/0000.</w:t>
+      </w:r>
+    </w:p>
+    <w:p>
+      <w:pPr>
+        <w:rPr>
+          <w:color w:val="000000" w:themeColor="text1"/>
+        </w:rPr>
+      </w:pPr>
+      <w:r>
+        <w:rPr>
+          <w:b/>
+          <w:color w:val="000000" w:themeColor="text1"/>
+        </w:rPr>
+        <w:t xml:space="preserve">Responsável: </w:t>
+      </w:r>
+      <w:r>
+        <w:rPr>
+          <w:color w:val="000000" w:themeColor="text1"/>
+        </w:rPr>
+        <w:t>A definir.</w:t>
+      </w:r>
+    </w:p>
+    <w:p>
+      <w:pPr>
+        <w:rPr>
+          <w:color w:val="000000" w:themeColor="text1"/>
+        </w:rPr>
+      </w:pPr>
+    </w:p>
+    <w:p>
+      <w:pPr>
+        <w:pStyle w:val="Ttulo4"/>
+        <w:rPr>
+          <w:color w:val="FF0000"/>
+        </w:rPr>
+      </w:pPr>
+      <w:r>
+        <w:t>6.1.1.</w:t>
+      </w:r>
+      <w:r>
+        <w:t>X</w:t>
+      </w:r>
+      <w:r>
+        <w:t xml:space="preserve"> [</w:t>
+      </w:r>
+      <w:r>
+        <w:t>TU</w:t>
+      </w:r>
+      <w:r>
+        <w:t>001.0</w:t>
+      </w:r>
+      <w:r>
+        <w:t>X</w:t>
+      </w:r>
+      <w:r>
+        <w:t xml:space="preserve">] </w:t>
+      </w:r>
+      <w:r>
+        <w:rPr>
+          <w:color w:val="000000" w:themeColor="text1"/>
+        </w:rPr>
+        <w:t>O sistema não deve cadastrar usuário quando o login já existe</w:t>
+      </w:r>
+    </w:p>
+    <w:p/>
+    <w:p>
+      <w:pPr>
+        <w:rPr>
+          <w:color w:val="000000" w:themeColor="text1"/>
+        </w:rPr>
+      </w:pPr>
+      <w:r>
+        <w:rPr>
+          <w:b/>
+          <w:bCs/>
+          <w:color w:val="000000" w:themeColor="text1"/>
+        </w:rPr>
+        <w:t>Camada:</w:t>
+      </w:r>
+      <w:r>
+        <w:rPr>
+          <w:color w:val="000000" w:themeColor="text1"/>
+        </w:rPr>
+        <w:t xml:space="preserve"> Serviço.</w:t>
+      </w:r>
+    </w:p>
+    <w:p>
+      <w:pPr>
+        <w:rPr>
+          <w:color w:val="000000" w:themeColor="text1"/>
+        </w:rPr>
+      </w:pPr>
+      <w:r>
+        <w:rPr>
+          <w:b/>
+          <w:color w:val="000000" w:themeColor="text1"/>
+        </w:rPr>
+        <w:t>Requisitos associados:</w:t>
+      </w:r>
+      <w:r>
+        <w:rPr>
+          <w:color w:val="000000" w:themeColor="text1"/>
+        </w:rPr>
         <w:t xml:space="preserve"> RF001.01</w:t>
       </w:r>
       <w:r>
@@ -16258,7 +16848,6 @@
           <w:b/>
           <w:color w:val="000000" w:themeColor="text1"/>
         </w:rPr>
-        <w:lastRenderedPageBreak/>
         <w:t>Condições</w:t>
       </w:r>
       <w:r>
@@ -16629,6 +17218,7 @@
           <w:b/>
           <w:color w:val="000000" w:themeColor="text1"/>
         </w:rPr>
+        <w:lastRenderedPageBreak/>
         <w:t>Realização do teste:</w:t>
       </w:r>
       <w:r>
@@ -17731,6 +18321,92 @@
     </w:lvl>
   </w:abstractNum>
   <w:abstractNum w:abstractNumId="6" w15:restartNumberingAfterBreak="0">
+    <w:nsid w:val="15A10665"/>
+    <w:multiLevelType w:val="multilevel"/>
+    <w:tmpl w:val="7EAE38A0"/>
+    <w:lvl w:ilvl="0">
+      <w:start w:val="1"/>
+      <w:numFmt w:val="decimal"/>
+      <w:lvlText w:val="%1."/>
+      <w:lvlJc w:val="left"/>
+      <w:pPr>
+        <w:ind w:left="709" w:hanging="360"/>
+      </w:pPr>
+    </w:lvl>
+    <w:lvl w:ilvl="1">
+      <w:start w:val="1"/>
+      <w:numFmt w:val="lowerLetter"/>
+      <w:lvlText w:val="%2."/>
+      <w:lvlJc w:val="left"/>
+      <w:pPr>
+        <w:ind w:left="1429" w:hanging="360"/>
+      </w:pPr>
+    </w:lvl>
+    <w:lvl w:ilvl="2">
+      <w:start w:val="1"/>
+      <w:numFmt w:val="lowerRoman"/>
+      <w:lvlText w:val="%3."/>
+      <w:lvlJc w:val="right"/>
+      <w:pPr>
+        <w:ind w:left="2149" w:hanging="180"/>
+      </w:pPr>
+    </w:lvl>
+    <w:lvl w:ilvl="3">
+      <w:start w:val="1"/>
+      <w:numFmt w:val="decimal"/>
+      <w:lvlText w:val="%4."/>
+      <w:lvlJc w:val="left"/>
+      <w:pPr>
+        <w:ind w:left="2869" w:hanging="360"/>
+      </w:pPr>
+    </w:lvl>
+    <w:lvl w:ilvl="4">
+      <w:start w:val="1"/>
+      <w:numFmt w:val="lowerLetter"/>
+      <w:lvlText w:val="%5."/>
+      <w:lvlJc w:val="left"/>
+      <w:pPr>
+        <w:ind w:left="3589" w:hanging="360"/>
+      </w:pPr>
+    </w:lvl>
+    <w:lvl w:ilvl="5">
+      <w:start w:val="1"/>
+      <w:numFmt w:val="lowerRoman"/>
+      <w:lvlText w:val="%6."/>
+      <w:lvlJc w:val="right"/>
+      <w:pPr>
+        <w:ind w:left="4309" w:hanging="180"/>
+      </w:pPr>
+    </w:lvl>
+    <w:lvl w:ilvl="6">
+      <w:start w:val="1"/>
+      <w:numFmt w:val="decimal"/>
+      <w:lvlText w:val="%7."/>
+      <w:lvlJc w:val="left"/>
+      <w:pPr>
+        <w:ind w:left="5029" w:hanging="360"/>
+      </w:pPr>
+    </w:lvl>
+    <w:lvl w:ilvl="7">
+      <w:start w:val="1"/>
+      <w:numFmt w:val="lowerLetter"/>
+      <w:lvlText w:val="%8."/>
+      <w:lvlJc w:val="left"/>
+      <w:pPr>
+        <w:ind w:left="5749" w:hanging="360"/>
+      </w:pPr>
+    </w:lvl>
+    <w:lvl w:ilvl="8">
+      <w:start w:val="1"/>
+      <w:numFmt w:val="lowerRoman"/>
+      <w:lvlText w:val="%9."/>
+      <w:lvlJc w:val="right"/>
+      <w:pPr>
+        <w:ind w:left="6469" w:hanging="180"/>
+      </w:pPr>
+    </w:lvl>
+  </w:abstractNum>
+  <w:abstractNum w:abstractNumId="7" w15:restartNumberingAfterBreak="0">
     <w:nsid w:val="1C297EA4"/>
     <w:multiLevelType w:val="multilevel"/>
     <w:tmpl w:val="4C245F70"/>
@@ -17843,7 +18519,7 @@
       </w:rPr>
     </w:lvl>
   </w:abstractNum>
-  <w:abstractNum w:abstractNumId="7" w15:restartNumberingAfterBreak="0">
+  <w:abstractNum w:abstractNumId="8" w15:restartNumberingAfterBreak="0">
     <w:nsid w:val="1CEC4C74"/>
     <w:multiLevelType w:val="multilevel"/>
     <w:tmpl w:val="7EAE38A0"/>
@@ -17929,7 +18605,7 @@
       </w:pPr>
     </w:lvl>
   </w:abstractNum>
-  <w:abstractNum w:abstractNumId="8" w15:restartNumberingAfterBreak="0">
+  <w:abstractNum w:abstractNumId="9" w15:restartNumberingAfterBreak="0">
     <w:nsid w:val="2567169C"/>
     <w:multiLevelType w:val="multilevel"/>
     <w:tmpl w:val="7EAE38A0"/>
@@ -18015,7 +18691,7 @@
       </w:pPr>
     </w:lvl>
   </w:abstractNum>
-  <w:abstractNum w:abstractNumId="9" w15:restartNumberingAfterBreak="0">
+  <w:abstractNum w:abstractNumId="10" w15:restartNumberingAfterBreak="0">
     <w:nsid w:val="27687D6D"/>
     <w:multiLevelType w:val="multilevel"/>
     <w:tmpl w:val="33B28994"/>
@@ -18101,7 +18777,7 @@
       </w:pPr>
     </w:lvl>
   </w:abstractNum>
-  <w:abstractNum w:abstractNumId="10" w15:restartNumberingAfterBreak="0">
+  <w:abstractNum w:abstractNumId="11" w15:restartNumberingAfterBreak="0">
     <w:nsid w:val="28492A00"/>
     <w:multiLevelType w:val="multilevel"/>
     <w:tmpl w:val="DF10247E"/>
@@ -18214,7 +18890,7 @@
       </w:rPr>
     </w:lvl>
   </w:abstractNum>
-  <w:abstractNum w:abstractNumId="11" w15:restartNumberingAfterBreak="0">
+  <w:abstractNum w:abstractNumId="12" w15:restartNumberingAfterBreak="0">
     <w:nsid w:val="29530051"/>
     <w:multiLevelType w:val="multilevel"/>
     <w:tmpl w:val="C04CB900"/>
@@ -18327,7 +19003,7 @@
       </w:rPr>
     </w:lvl>
   </w:abstractNum>
-  <w:abstractNum w:abstractNumId="12" w15:restartNumberingAfterBreak="0">
+  <w:abstractNum w:abstractNumId="13" w15:restartNumberingAfterBreak="0">
     <w:nsid w:val="311B04C2"/>
     <w:multiLevelType w:val="multilevel"/>
     <w:tmpl w:val="4B86EAF0"/>
@@ -18440,7 +19116,7 @@
       </w:rPr>
     </w:lvl>
   </w:abstractNum>
-  <w:abstractNum w:abstractNumId="13" w15:restartNumberingAfterBreak="0">
+  <w:abstractNum w:abstractNumId="14" w15:restartNumberingAfterBreak="0">
     <w:nsid w:val="32FE743C"/>
     <w:multiLevelType w:val="multilevel"/>
     <w:tmpl w:val="7EAE38A0"/>
@@ -18526,7 +19202,7 @@
       </w:pPr>
     </w:lvl>
   </w:abstractNum>
-  <w:abstractNum w:abstractNumId="14" w15:restartNumberingAfterBreak="0">
+  <w:abstractNum w:abstractNumId="15" w15:restartNumberingAfterBreak="0">
     <w:nsid w:val="357171FE"/>
     <w:multiLevelType w:val="multilevel"/>
     <w:tmpl w:val="7EAE38A0"/>
@@ -18612,7 +19288,7 @@
       </w:pPr>
     </w:lvl>
   </w:abstractNum>
-  <w:abstractNum w:abstractNumId="15" w15:restartNumberingAfterBreak="0">
+  <w:abstractNum w:abstractNumId="16" w15:restartNumberingAfterBreak="0">
     <w:nsid w:val="35873CED"/>
     <w:multiLevelType w:val="multilevel"/>
     <w:tmpl w:val="316EA91C"/>
@@ -18725,7 +19401,7 @@
       </w:rPr>
     </w:lvl>
   </w:abstractNum>
-  <w:abstractNum w:abstractNumId="16" w15:restartNumberingAfterBreak="0">
+  <w:abstractNum w:abstractNumId="17" w15:restartNumberingAfterBreak="0">
     <w:nsid w:val="35D208BE"/>
     <w:multiLevelType w:val="hybridMultilevel"/>
     <w:tmpl w:val="FEB2915A"/>
@@ -18838,7 +19514,7 @@
       </w:rPr>
     </w:lvl>
   </w:abstractNum>
-  <w:abstractNum w:abstractNumId="17" w15:restartNumberingAfterBreak="0">
+  <w:abstractNum w:abstractNumId="18" w15:restartNumberingAfterBreak="0">
     <w:nsid w:val="388742F9"/>
     <w:multiLevelType w:val="multilevel"/>
     <w:tmpl w:val="7EAE38A0"/>
@@ -18924,7 +19600,7 @@
       </w:pPr>
     </w:lvl>
   </w:abstractNum>
-  <w:abstractNum w:abstractNumId="18" w15:restartNumberingAfterBreak="0">
+  <w:abstractNum w:abstractNumId="19" w15:restartNumberingAfterBreak="0">
     <w:nsid w:val="3AE82604"/>
     <w:multiLevelType w:val="multilevel"/>
     <w:tmpl w:val="5EC8825C"/>
@@ -19037,7 +19713,7 @@
       </w:rPr>
     </w:lvl>
   </w:abstractNum>
-  <w:abstractNum w:abstractNumId="19" w15:restartNumberingAfterBreak="0">
+  <w:abstractNum w:abstractNumId="20" w15:restartNumberingAfterBreak="0">
     <w:nsid w:val="425F7142"/>
     <w:multiLevelType w:val="multilevel"/>
     <w:tmpl w:val="6C3A65C8"/>
@@ -19150,7 +19826,7 @@
       </w:rPr>
     </w:lvl>
   </w:abstractNum>
-  <w:abstractNum w:abstractNumId="20" w15:restartNumberingAfterBreak="0">
+  <w:abstractNum w:abstractNumId="21" w15:restartNumberingAfterBreak="0">
     <w:nsid w:val="433872DF"/>
     <w:multiLevelType w:val="multilevel"/>
     <w:tmpl w:val="473E9B32"/>
@@ -19263,7 +19939,7 @@
       </w:rPr>
     </w:lvl>
   </w:abstractNum>
-  <w:abstractNum w:abstractNumId="21" w15:restartNumberingAfterBreak="0">
+  <w:abstractNum w:abstractNumId="22" w15:restartNumberingAfterBreak="0">
     <w:nsid w:val="4ABF56A0"/>
     <w:multiLevelType w:val="multilevel"/>
     <w:tmpl w:val="0D8E790A"/>
@@ -19349,7 +20025,7 @@
       </w:pPr>
     </w:lvl>
   </w:abstractNum>
-  <w:abstractNum w:abstractNumId="22" w15:restartNumberingAfterBreak="0">
+  <w:abstractNum w:abstractNumId="23" w15:restartNumberingAfterBreak="0">
     <w:nsid w:val="4C99572E"/>
     <w:multiLevelType w:val="hybridMultilevel"/>
     <w:tmpl w:val="81062254"/>
@@ -19462,7 +20138,7 @@
       </w:rPr>
     </w:lvl>
   </w:abstractNum>
-  <w:abstractNum w:abstractNumId="23" w15:restartNumberingAfterBreak="0">
+  <w:abstractNum w:abstractNumId="24" w15:restartNumberingAfterBreak="0">
     <w:nsid w:val="4DB86243"/>
     <w:multiLevelType w:val="multilevel"/>
     <w:tmpl w:val="D652AE68"/>
@@ -19575,7 +20251,7 @@
       </w:rPr>
     </w:lvl>
   </w:abstractNum>
-  <w:abstractNum w:abstractNumId="24" w15:restartNumberingAfterBreak="0">
+  <w:abstractNum w:abstractNumId="25" w15:restartNumberingAfterBreak="0">
     <w:nsid w:val="5C394BC9"/>
     <w:multiLevelType w:val="multilevel"/>
     <w:tmpl w:val="7EAE38A0"/>
@@ -19661,7 +20337,7 @@
       </w:pPr>
     </w:lvl>
   </w:abstractNum>
-  <w:abstractNum w:abstractNumId="25" w15:restartNumberingAfterBreak="0">
+  <w:abstractNum w:abstractNumId="26" w15:restartNumberingAfterBreak="0">
     <w:nsid w:val="610B3EDF"/>
     <w:multiLevelType w:val="multilevel"/>
     <w:tmpl w:val="7EAE38A0"/>
@@ -19747,7 +20423,7 @@
       </w:pPr>
     </w:lvl>
   </w:abstractNum>
-  <w:abstractNum w:abstractNumId="26" w15:restartNumberingAfterBreak="0">
+  <w:abstractNum w:abstractNumId="27" w15:restartNumberingAfterBreak="0">
     <w:nsid w:val="67403CB5"/>
     <w:multiLevelType w:val="multilevel"/>
     <w:tmpl w:val="75326788"/>
@@ -19860,7 +20536,7 @@
       </w:rPr>
     </w:lvl>
   </w:abstractNum>
-  <w:abstractNum w:abstractNumId="27" w15:restartNumberingAfterBreak="0">
+  <w:abstractNum w:abstractNumId="28" w15:restartNumberingAfterBreak="0">
     <w:nsid w:val="67C547F7"/>
     <w:multiLevelType w:val="multilevel"/>
     <w:tmpl w:val="35EAD4B8"/>
@@ -19946,7 +20622,7 @@
       </w:pPr>
     </w:lvl>
   </w:abstractNum>
-  <w:abstractNum w:abstractNumId="28" w15:restartNumberingAfterBreak="0">
+  <w:abstractNum w:abstractNumId="29" w15:restartNumberingAfterBreak="0">
     <w:nsid w:val="6A841B74"/>
     <w:multiLevelType w:val="multilevel"/>
     <w:tmpl w:val="7EAE38A0"/>
@@ -20032,7 +20708,7 @@
       </w:pPr>
     </w:lvl>
   </w:abstractNum>
-  <w:abstractNum w:abstractNumId="29" w15:restartNumberingAfterBreak="0">
+  <w:abstractNum w:abstractNumId="30" w15:restartNumberingAfterBreak="0">
     <w:nsid w:val="6C8202C1"/>
     <w:multiLevelType w:val="multilevel"/>
     <w:tmpl w:val="981048B2"/>
@@ -20145,7 +20821,7 @@
       </w:rPr>
     </w:lvl>
   </w:abstractNum>
-  <w:abstractNum w:abstractNumId="30" w15:restartNumberingAfterBreak="0">
+  <w:abstractNum w:abstractNumId="31" w15:restartNumberingAfterBreak="0">
     <w:nsid w:val="6CD6232C"/>
     <w:multiLevelType w:val="multilevel"/>
     <w:tmpl w:val="2C50429A"/>
@@ -20258,7 +20934,7 @@
       </w:rPr>
     </w:lvl>
   </w:abstractNum>
-  <w:abstractNum w:abstractNumId="31" w15:restartNumberingAfterBreak="0">
+  <w:abstractNum w:abstractNumId="32" w15:restartNumberingAfterBreak="0">
     <w:nsid w:val="6FBC5385"/>
     <w:multiLevelType w:val="multilevel"/>
     <w:tmpl w:val="9E36186C"/>
@@ -20371,7 +21047,7 @@
       </w:rPr>
     </w:lvl>
   </w:abstractNum>
-  <w:abstractNum w:abstractNumId="32" w15:restartNumberingAfterBreak="0">
+  <w:abstractNum w:abstractNumId="33" w15:restartNumberingAfterBreak="0">
     <w:nsid w:val="74B049B9"/>
     <w:multiLevelType w:val="multilevel"/>
     <w:tmpl w:val="7EAE38A0"/>
@@ -20457,7 +21133,7 @@
       </w:pPr>
     </w:lvl>
   </w:abstractNum>
-  <w:abstractNum w:abstractNumId="33" w15:restartNumberingAfterBreak="0">
+  <w:abstractNum w:abstractNumId="34" w15:restartNumberingAfterBreak="0">
     <w:nsid w:val="74C61032"/>
     <w:multiLevelType w:val="multilevel"/>
     <w:tmpl w:val="7EAE38A0"/>
@@ -20543,7 +21219,7 @@
       </w:pPr>
     </w:lvl>
   </w:abstractNum>
-  <w:abstractNum w:abstractNumId="34" w15:restartNumberingAfterBreak="0">
+  <w:abstractNum w:abstractNumId="35" w15:restartNumberingAfterBreak="0">
     <w:nsid w:val="7ABF4D30"/>
     <w:multiLevelType w:val="multilevel"/>
     <w:tmpl w:val="C61A779C"/>
@@ -20656,7 +21332,7 @@
       </w:rPr>
     </w:lvl>
   </w:abstractNum>
-  <w:abstractNum w:abstractNumId="35" w15:restartNumberingAfterBreak="0">
+  <w:abstractNum w:abstractNumId="36" w15:restartNumberingAfterBreak="0">
     <w:nsid w:val="7E36314E"/>
     <w:multiLevelType w:val="hybridMultilevel"/>
     <w:tmpl w:val="6FDA89B4"/>
@@ -20769,7 +21445,7 @@
       </w:rPr>
     </w:lvl>
   </w:abstractNum>
-  <w:abstractNum w:abstractNumId="36" w15:restartNumberingAfterBreak="0">
+  <w:abstractNum w:abstractNumId="37" w15:restartNumberingAfterBreak="0">
     <w:nsid w:val="7ED21264"/>
     <w:multiLevelType w:val="multilevel"/>
     <w:tmpl w:val="87B4A5EE"/>
@@ -20882,7 +21558,7 @@
       </w:rPr>
     </w:lvl>
   </w:abstractNum>
-  <w:abstractNum w:abstractNumId="37" w15:restartNumberingAfterBreak="0">
+  <w:abstractNum w:abstractNumId="38" w15:restartNumberingAfterBreak="0">
     <w:nsid w:val="7FF4155E"/>
     <w:multiLevelType w:val="multilevel"/>
     <w:tmpl w:val="F9722B4C"/>
@@ -20975,88 +21651,88 @@
     <w:abstractNumId w:val="1"/>
   </w:num>
   <w:num w:numId="2" w16cid:durableId="88086438">
-    <w:abstractNumId w:val="34"/>
+    <w:abstractNumId w:val="35"/>
   </w:num>
   <w:num w:numId="3" w16cid:durableId="1706714901">
-    <w:abstractNumId w:val="30"/>
+    <w:abstractNumId w:val="31"/>
   </w:num>
   <w:num w:numId="4" w16cid:durableId="113717744">
     <w:abstractNumId w:val="0"/>
   </w:num>
   <w:num w:numId="5" w16cid:durableId="74671158">
+    <w:abstractNumId w:val="13"/>
+  </w:num>
+  <w:num w:numId="6" w16cid:durableId="913590874">
+    <w:abstractNumId w:val="24"/>
+  </w:num>
+  <w:num w:numId="7" w16cid:durableId="1890459348">
+    <w:abstractNumId w:val="38"/>
+  </w:num>
+  <w:num w:numId="8" w16cid:durableId="333532636">
     <w:abstractNumId w:val="12"/>
   </w:num>
-  <w:num w:numId="6" w16cid:durableId="913590874">
-    <w:abstractNumId w:val="23"/>
-  </w:num>
-  <w:num w:numId="7" w16cid:durableId="1890459348">
-    <w:abstractNumId w:val="37"/>
-  </w:num>
-  <w:num w:numId="8" w16cid:durableId="333532636">
-    <w:abstractNumId w:val="11"/>
-  </w:num>
   <w:num w:numId="9" w16cid:durableId="128785046">
-    <w:abstractNumId w:val="29"/>
+    <w:abstractNumId w:val="30"/>
   </w:num>
   <w:num w:numId="10" w16cid:durableId="905458532">
-    <w:abstractNumId w:val="6"/>
+    <w:abstractNumId w:val="7"/>
   </w:num>
   <w:num w:numId="11" w16cid:durableId="1135484454">
-    <w:abstractNumId w:val="15"/>
+    <w:abstractNumId w:val="16"/>
   </w:num>
   <w:num w:numId="12" w16cid:durableId="568999983">
-    <w:abstractNumId w:val="36"/>
+    <w:abstractNumId w:val="37"/>
   </w:num>
   <w:num w:numId="13" w16cid:durableId="1767190151">
     <w:abstractNumId w:val="5"/>
   </w:num>
   <w:num w:numId="14" w16cid:durableId="715394213">
+    <w:abstractNumId w:val="21"/>
+  </w:num>
+  <w:num w:numId="15" w16cid:durableId="1314019323">
+    <w:abstractNumId w:val="19"/>
+  </w:num>
+  <w:num w:numId="16" w16cid:durableId="2108111862">
+    <w:abstractNumId w:val="32"/>
+  </w:num>
+  <w:num w:numId="17" w16cid:durableId="1320620575">
+    <w:abstractNumId w:val="27"/>
+  </w:num>
+  <w:num w:numId="18" w16cid:durableId="1431511382">
+    <w:abstractNumId w:val="11"/>
+  </w:num>
+  <w:num w:numId="19" w16cid:durableId="1528325566">
     <w:abstractNumId w:val="20"/>
   </w:num>
-  <w:num w:numId="15" w16cid:durableId="1314019323">
-    <w:abstractNumId w:val="18"/>
+  <w:num w:numId="20" w16cid:durableId="990518204">
+    <w:abstractNumId w:val="22"/>
   </w:num>
-  <w:num w:numId="16" w16cid:durableId="2108111862">
-    <w:abstractNumId w:val="31"/>
-  </w:num>
-  <w:num w:numId="17" w16cid:durableId="1320620575">
-    <w:abstractNumId w:val="26"/>
-  </w:num>
-  <w:num w:numId="18" w16cid:durableId="1431511382">
+  <w:num w:numId="21" w16cid:durableId="900098538">
     <w:abstractNumId w:val="10"/>
   </w:num>
-  <w:num w:numId="19" w16cid:durableId="1528325566">
-    <w:abstractNumId w:val="19"/>
-  </w:num>
-  <w:num w:numId="20" w16cid:durableId="990518204">
-    <w:abstractNumId w:val="21"/>
-  </w:num>
-  <w:num w:numId="21" w16cid:durableId="900098538">
-    <w:abstractNumId w:val="9"/>
-  </w:num>
   <w:num w:numId="22" w16cid:durableId="1159611945">
-    <w:abstractNumId w:val="27"/>
+    <w:abstractNumId w:val="28"/>
   </w:num>
   <w:num w:numId="23" w16cid:durableId="727652842">
     <w:abstractNumId w:val="3"/>
   </w:num>
   <w:num w:numId="24" w16cid:durableId="1596135007">
+    <w:abstractNumId w:val="26"/>
+  </w:num>
+  <w:num w:numId="25" w16cid:durableId="414478111">
     <w:abstractNumId w:val="25"/>
   </w:num>
-  <w:num w:numId="25" w16cid:durableId="414478111">
-    <w:abstractNumId w:val="24"/>
-  </w:num>
   <w:num w:numId="26" w16cid:durableId="372466584">
-    <w:abstractNumId w:val="8"/>
+    <w:abstractNumId w:val="9"/>
   </w:num>
   <w:num w:numId="27" w16cid:durableId="1787504088">
-    <w:abstractNumId w:val="35"/>
+    <w:abstractNumId w:val="36"/>
   </w:num>
   <w:num w:numId="28" w16cid:durableId="927734810">
-    <w:abstractNumId w:val="22"/>
+    <w:abstractNumId w:val="23"/>
   </w:num>
   <w:num w:numId="29" w16cid:durableId="1914387497">
-    <w:abstractNumId w:val="16"/>
+    <w:abstractNumId w:val="17"/>
   </w:num>
   <w:num w:numId="30" w16cid:durableId="36636164">
     <w:abstractNumId w:val="2"/>
@@ -21065,25 +21741,28 @@
     <w:abstractNumId w:val="4"/>
   </w:num>
   <w:num w:numId="32" w16cid:durableId="1891846306">
-    <w:abstractNumId w:val="32"/>
+    <w:abstractNumId w:val="33"/>
   </w:num>
   <w:num w:numId="33" w16cid:durableId="97263838">
-    <w:abstractNumId w:val="13"/>
+    <w:abstractNumId w:val="14"/>
   </w:num>
   <w:num w:numId="34" w16cid:durableId="1629428421">
-    <w:abstractNumId w:val="14"/>
+    <w:abstractNumId w:val="15"/>
   </w:num>
   <w:num w:numId="35" w16cid:durableId="1199733513">
-    <w:abstractNumId w:val="7"/>
+    <w:abstractNumId w:val="8"/>
   </w:num>
   <w:num w:numId="36" w16cid:durableId="289866735">
-    <w:abstractNumId w:val="33"/>
+    <w:abstractNumId w:val="34"/>
   </w:num>
   <w:num w:numId="37" w16cid:durableId="106699201">
-    <w:abstractNumId w:val="17"/>
+    <w:abstractNumId w:val="18"/>
   </w:num>
   <w:num w:numId="38" w16cid:durableId="1859270063">
-    <w:abstractNumId w:val="28"/>
+    <w:abstractNumId w:val="29"/>
+  </w:num>
+  <w:num w:numId="39" w16cid:durableId="1472174">
+    <w:abstractNumId w:val="6"/>
   </w:num>
 </w:numbering>
 </file>

</xml_diff>

<commit_message>
docs: Adicionado teste unitário TU001.13
</commit_message>
<xml_diff>
--- a/documentation/Especificacao_de_Requisitos_de_Software.docx
+++ b/documentation/Especificacao_de_Requisitos_de_Software.docx
@@ -6047,7 +6047,15 @@
         <w:t>Descrição:</w:t>
       </w:r>
       <w:r>
-        <w:t xml:space="preserve">  O backend do sistema deve ser elaborado utilizando framework Spring  na versão 3.3.3, utilizando dos seguintes projetos:</w:t>
+        <w:t xml:space="preserve">  O backend do sistema deve ser elaborado utilizando framework </w:t>
+      </w:r>
+      <w:proofErr w:type="gramStart"/>
+      <w:r>
+        <w:t>Spring  na</w:t>
+      </w:r>
+      <w:proofErr w:type="gramEnd"/>
+      <w:r>
+        <w:t xml:space="preserve"> versão 3.3.3, utilizando dos seguintes projetos:</w:t>
       </w:r>
     </w:p>
     <w:p>
@@ -6059,7 +6067,23 @@
         </w:numPr>
       </w:pPr>
       <w:r>
-        <w:t>Spring Web MVC: responsável por arquitetar as camadas de model e controller do projeto para criar as APIs Restful.</w:t>
+        <w:t xml:space="preserve">Spring Web MVC: responsável por arquitetar as camadas de model e </w:t>
+      </w:r>
+      <w:proofErr w:type="spellStart"/>
+      <w:r>
+        <w:t>controller</w:t>
+      </w:r>
+      <w:proofErr w:type="spellEnd"/>
+      <w:r>
+        <w:t xml:space="preserve"> do projeto para criar as APIs </w:t>
+      </w:r>
+      <w:proofErr w:type="spellStart"/>
+      <w:r>
+        <w:t>Restful</w:t>
+      </w:r>
+      <w:proofErr w:type="spellEnd"/>
+      <w:r>
+        <w:t>.</w:t>
       </w:r>
     </w:p>
     <w:p>
@@ -6071,7 +6095,15 @@
         </w:numPr>
       </w:pPr>
       <w:r>
-        <w:t>Spring Validation: responsável por definir as validações dos dados.</w:t>
+        <w:t xml:space="preserve">Spring </w:t>
+      </w:r>
+      <w:proofErr w:type="spellStart"/>
+      <w:r>
+        <w:t>Validation</w:t>
+      </w:r>
+      <w:proofErr w:type="spellEnd"/>
+      <w:r>
+        <w:t>: responsável por definir as validações dos dados.</w:t>
       </w:r>
     </w:p>
     <w:p>
@@ -6107,7 +6139,15 @@
         </w:numPr>
       </w:pPr>
       <w:r>
-        <w:t>Spring AMQP: responsável por fazer a comunicação assíncrona utilizando um broker de mensageiria entre os micros serviços.</w:t>
+        <w:t xml:space="preserve">Spring AMQP: responsável por fazer a comunicação assíncrona utilizando um broker de </w:t>
+      </w:r>
+      <w:proofErr w:type="spellStart"/>
+      <w:r>
+        <w:t>mensageiria</w:t>
+      </w:r>
+      <w:proofErr w:type="spellEnd"/>
+      <w:r>
+        <w:t xml:space="preserve"> entre os micros serviços.</w:t>
       </w:r>
     </w:p>
     <w:p>
@@ -6143,7 +6183,15 @@
         </w:numPr>
       </w:pPr>
       <w:r>
-        <w:t>Spring Cloud Config: responsável por criar um servidor de configuração para os micros serviços.</w:t>
+        <w:t xml:space="preserve">Spring Cloud </w:t>
+      </w:r>
+      <w:proofErr w:type="spellStart"/>
+      <w:r>
+        <w:t>Config</w:t>
+      </w:r>
+      <w:proofErr w:type="spellEnd"/>
+      <w:r>
+        <w:t>: responsável por criar um servidor de configuração para os micros serviços.</w:t>
       </w:r>
     </w:p>
     <w:p>
@@ -6155,7 +6203,23 @@
         </w:numPr>
       </w:pPr>
       <w:r>
-        <w:t>Spring Cloud Circuit Breaker Resilience4J: responsável por criar os métodos fallback para prevenir falhas.</w:t>
+        <w:t xml:space="preserve">Spring Cloud Circuit </w:t>
+      </w:r>
+      <w:proofErr w:type="spellStart"/>
+      <w:r>
+        <w:t>Breaker</w:t>
+      </w:r>
+      <w:proofErr w:type="spellEnd"/>
+      <w:r>
+        <w:t xml:space="preserve"> Resilience4J: responsável por criar os métodos </w:t>
+      </w:r>
+      <w:proofErr w:type="spellStart"/>
+      <w:r>
+        <w:t>fallback</w:t>
+      </w:r>
+      <w:proofErr w:type="spellEnd"/>
+      <w:r>
+        <w:t xml:space="preserve"> para prevenir falhas.</w:t>
       </w:r>
     </w:p>
     <w:p>
@@ -6247,7 +6311,15 @@
         <w:t>serviços devem</w:t>
       </w:r>
       <w:r>
-        <w:t xml:space="preserve"> ser feita utilizando o broker RabbiMQ.</w:t>
+        <w:t xml:space="preserve"> ser feita utilizando o broker </w:t>
+      </w:r>
+      <w:proofErr w:type="spellStart"/>
+      <w:r>
+        <w:t>RabbiMQ</w:t>
+      </w:r>
+      <w:proofErr w:type="spellEnd"/>
+      <w:r>
+        <w:t>.</w:t>
       </w:r>
     </w:p>
     <w:p/>
@@ -6265,8 +6337,16 @@
         <w:rPr>
           <w:color w:val="000000" w:themeColor="text1"/>
         </w:rPr>
-        <w:t>Log agregation</w:t>
-      </w:r>
+        <w:t xml:space="preserve">Log </w:t>
+      </w:r>
+      <w:proofErr w:type="spellStart"/>
+      <w:r>
+        <w:rPr>
+          <w:color w:val="000000" w:themeColor="text1"/>
+        </w:rPr>
+        <w:t>agregation</w:t>
+      </w:r>
+      <w:proofErr w:type="spellEnd"/>
     </w:p>
     <w:p/>
     <w:p>
@@ -6288,7 +6368,23 @@
         <w:t>Descrição:</w:t>
       </w:r>
       <w:r>
-        <w:t xml:space="preserve">  Os logs gerados pelos micros serviços devem ser centralizados utilizando o log agragation Elasticsearch.</w:t>
+        <w:t xml:space="preserve">  Os logs gerados pelos micros serviços devem ser centralizados utilizando o log </w:t>
+      </w:r>
+      <w:proofErr w:type="spellStart"/>
+      <w:r>
+        <w:t>agragation</w:t>
+      </w:r>
+      <w:proofErr w:type="spellEnd"/>
+      <w:r>
+        <w:t xml:space="preserve"> </w:t>
+      </w:r>
+      <w:proofErr w:type="spellStart"/>
+      <w:r>
+        <w:t>Elasticsearch</w:t>
+      </w:r>
+      <w:proofErr w:type="spellEnd"/>
+      <w:r>
+        <w:t>.</w:t>
       </w:r>
     </w:p>
     <w:p/>
@@ -8269,7 +8365,23 @@
         <w:t>Usuário:</w:t>
       </w:r>
       <w:r>
-        <w:t xml:space="preserve"> Classe que representa os usuários que irão operar o sistema, é composta pelas classes UsuarioStatus e UsuarioTipo, possui os atributos:</w:t>
+        <w:t xml:space="preserve"> Classe que representa os usuários que irão operar o sistema, é composta pelas classes </w:t>
+      </w:r>
+      <w:proofErr w:type="spellStart"/>
+      <w:r>
+        <w:t>UsuarioStatus</w:t>
+      </w:r>
+      <w:proofErr w:type="spellEnd"/>
+      <w:r>
+        <w:t xml:space="preserve"> e </w:t>
+      </w:r>
+      <w:proofErr w:type="spellStart"/>
+      <w:r>
+        <w:t>UsuarioTipo</w:t>
+      </w:r>
+      <w:proofErr w:type="spellEnd"/>
+      <w:r>
+        <w:t>, possui os atributos:</w:t>
       </w:r>
     </w:p>
     <w:p>
@@ -8311,8 +8423,17 @@
                 <w:b/>
                 <w:bCs/>
               </w:rPr>
-              <w:t>Atributos da classe Usuario</w:t>
-            </w:r>
+              <w:t xml:space="preserve">Atributos da classe </w:t>
+            </w:r>
+            <w:proofErr w:type="spellStart"/>
+            <w:r>
+              <w:rPr>
+                <w:b/>
+                <w:bCs/>
+              </w:rPr>
+              <w:t>Usuario</w:t>
+            </w:r>
+            <w:proofErr w:type="spellEnd"/>
           </w:p>
         </w:tc>
       </w:tr>
@@ -8497,6 +8618,7 @@
                 <w:szCs w:val="22"/>
               </w:rPr>
             </w:pPr>
+            <w:proofErr w:type="spellStart"/>
             <w:r>
               <w:rPr>
                 <w:sz w:val="22"/>
@@ -8504,6 +8626,7 @@
               </w:rPr>
               <w:t>String</w:t>
             </w:r>
+            <w:proofErr w:type="spellEnd"/>
           </w:p>
         </w:tc>
       </w:tr>
@@ -8560,6 +8683,7 @@
                 <w:szCs w:val="22"/>
               </w:rPr>
             </w:pPr>
+            <w:proofErr w:type="spellStart"/>
             <w:r>
               <w:rPr>
                 <w:sz w:val="22"/>
@@ -8567,6 +8691,7 @@
               </w:rPr>
               <w:t>String</w:t>
             </w:r>
+            <w:proofErr w:type="spellEnd"/>
           </w:p>
         </w:tc>
       </w:tr>
@@ -8623,6 +8748,7 @@
                 <w:szCs w:val="22"/>
               </w:rPr>
             </w:pPr>
+            <w:proofErr w:type="spellStart"/>
             <w:r>
               <w:rPr>
                 <w:sz w:val="22"/>
@@ -8630,6 +8756,7 @@
               </w:rPr>
               <w:t>String</w:t>
             </w:r>
+            <w:proofErr w:type="spellEnd"/>
           </w:p>
         </w:tc>
       </w:tr>
@@ -8686,6 +8813,7 @@
                 <w:szCs w:val="22"/>
               </w:rPr>
             </w:pPr>
+            <w:proofErr w:type="spellStart"/>
             <w:r>
               <w:rPr>
                 <w:sz w:val="22"/>
@@ -8693,6 +8821,7 @@
               </w:rPr>
               <w:t>String</w:t>
             </w:r>
+            <w:proofErr w:type="spellEnd"/>
           </w:p>
         </w:tc>
       </w:tr>
@@ -8749,6 +8878,7 @@
                 <w:szCs w:val="22"/>
               </w:rPr>
             </w:pPr>
+            <w:proofErr w:type="spellStart"/>
             <w:r>
               <w:rPr>
                 <w:sz w:val="22"/>
@@ -8756,6 +8886,7 @@
               </w:rPr>
               <w:t>String</w:t>
             </w:r>
+            <w:proofErr w:type="spellEnd"/>
           </w:p>
         </w:tc>
       </w:tr>
@@ -8812,6 +8943,7 @@
                 <w:szCs w:val="22"/>
               </w:rPr>
             </w:pPr>
+            <w:proofErr w:type="spellStart"/>
             <w:r>
               <w:rPr>
                 <w:sz w:val="22"/>
@@ -8819,6 +8951,7 @@
               </w:rPr>
               <w:t>UsuarioStatus</w:t>
             </w:r>
+            <w:proofErr w:type="spellEnd"/>
           </w:p>
         </w:tc>
       </w:tr>
@@ -8881,6 +9014,7 @@
                 <w:szCs w:val="22"/>
               </w:rPr>
             </w:pPr>
+            <w:proofErr w:type="spellStart"/>
             <w:r>
               <w:rPr>
                 <w:sz w:val="22"/>
@@ -8888,6 +9022,7 @@
               </w:rPr>
               <w:t>UsuarioPerfil</w:t>
             </w:r>
+            <w:proofErr w:type="spellEnd"/>
           </w:p>
         </w:tc>
       </w:tr>
@@ -8906,7 +9041,15 @@
         </w:r>
       </w:fldSimple>
       <w:r>
-        <w:t xml:space="preserve">: atributos da classe Usuario </w:t>
+        <w:t xml:space="preserve">: atributos da classe </w:t>
+      </w:r>
+      <w:proofErr w:type="spellStart"/>
+      <w:r>
+        <w:t>Usuario</w:t>
+      </w:r>
+      <w:proofErr w:type="spellEnd"/>
+      <w:r>
+        <w:t xml:space="preserve"> </w:t>
       </w:r>
     </w:p>
     <w:p>
@@ -8917,15 +9060,32 @@
           <w:numId w:val="9"/>
         </w:numPr>
       </w:pPr>
+      <w:proofErr w:type="spellStart"/>
       <w:r>
         <w:rPr>
           <w:b/>
           <w:bCs/>
         </w:rPr>
-        <w:t>UsuarioStatus:</w:t>
-      </w:r>
-      <w:r>
-        <w:t xml:space="preserve"> Classe do tipo ENUM que representa o status do usuário, compõe a classe Usuario, possui os atributos: </w:t>
+        <w:t>UsuarioStatus</w:t>
+      </w:r>
+      <w:proofErr w:type="spellEnd"/>
+      <w:r>
+        <w:rPr>
+          <w:b/>
+          <w:bCs/>
+        </w:rPr>
+        <w:t>:</w:t>
+      </w:r>
+      <w:r>
+        <w:t xml:space="preserve"> Classe do tipo ENUM que representa o status do usuário, compõe a classe </w:t>
+      </w:r>
+      <w:proofErr w:type="spellStart"/>
+      <w:r>
+        <w:t>Usuario</w:t>
+      </w:r>
+      <w:proofErr w:type="spellEnd"/>
+      <w:r>
+        <w:t xml:space="preserve">, possui os atributos: </w:t>
       </w:r>
     </w:p>
     <w:p>
@@ -8963,8 +9123,17 @@
                 <w:b/>
                 <w:bCs/>
               </w:rPr>
-              <w:t>Atributos da classe UsuarioStatus</w:t>
-            </w:r>
+              <w:t xml:space="preserve">Atributos da classe </w:t>
+            </w:r>
+            <w:proofErr w:type="spellStart"/>
+            <w:r>
+              <w:rPr>
+                <w:b/>
+                <w:bCs/>
+              </w:rPr>
+              <w:t>UsuarioStatus</w:t>
+            </w:r>
+            <w:proofErr w:type="spellEnd"/>
           </w:p>
         </w:tc>
       </w:tr>
@@ -9119,7 +9288,15 @@
         </w:r>
       </w:fldSimple>
       <w:r>
-        <w:t xml:space="preserve">: atributos da classe UsuarioStatus </w:t>
+        <w:t xml:space="preserve">: atributos da classe </w:t>
+      </w:r>
+      <w:proofErr w:type="spellStart"/>
+      <w:r>
+        <w:t>UsuarioStatus</w:t>
+      </w:r>
+      <w:proofErr w:type="spellEnd"/>
+      <w:r>
+        <w:t xml:space="preserve"> </w:t>
       </w:r>
     </w:p>
     <w:p>
@@ -9130,15 +9307,32 @@
           <w:numId w:val="12"/>
         </w:numPr>
       </w:pPr>
+      <w:proofErr w:type="spellStart"/>
       <w:r>
         <w:rPr>
           <w:b/>
           <w:bCs/>
         </w:rPr>
-        <w:t>UsuarioPerfil:</w:t>
-      </w:r>
-      <w:r>
-        <w:t xml:space="preserve"> Classe do tipo ENUM que representa o perfil de acesso do usuário, compõe a classe Usuario, possui os atributos: </w:t>
+        <w:t>UsuarioPerfil</w:t>
+      </w:r>
+      <w:proofErr w:type="spellEnd"/>
+      <w:r>
+        <w:rPr>
+          <w:b/>
+          <w:bCs/>
+        </w:rPr>
+        <w:t>:</w:t>
+      </w:r>
+      <w:r>
+        <w:t xml:space="preserve"> Classe do tipo ENUM que representa o perfil de acesso do usuário, compõe a classe </w:t>
+      </w:r>
+      <w:proofErr w:type="spellStart"/>
+      <w:r>
+        <w:t>Usuario</w:t>
+      </w:r>
+      <w:proofErr w:type="spellEnd"/>
+      <w:r>
+        <w:t xml:space="preserve">, possui os atributos: </w:t>
       </w:r>
     </w:p>
     <w:p>
@@ -9176,8 +9370,17 @@
                 <w:b/>
                 <w:bCs/>
               </w:rPr>
-              <w:t>Atributos da classe UsuarioPerfil</w:t>
-            </w:r>
+              <w:t xml:space="preserve">Atributos da classe </w:t>
+            </w:r>
+            <w:proofErr w:type="spellStart"/>
+            <w:r>
+              <w:rPr>
+                <w:b/>
+                <w:bCs/>
+              </w:rPr>
+              <w:t>UsuarioPerfil</w:t>
+            </w:r>
+            <w:proofErr w:type="spellEnd"/>
           </w:p>
         </w:tc>
       </w:tr>
@@ -9372,7 +9575,15 @@
         </w:r>
       </w:fldSimple>
       <w:r>
-        <w:t xml:space="preserve">: atributos da classe UsuarioPerfil </w:t>
+        <w:t xml:space="preserve">: atributos da classe </w:t>
+      </w:r>
+      <w:proofErr w:type="spellStart"/>
+      <w:r>
+        <w:t>UsuarioPerfil</w:t>
+      </w:r>
+      <w:proofErr w:type="spellEnd"/>
+      <w:r>
+        <w:t xml:space="preserve"> </w:t>
       </w:r>
     </w:p>
     <w:p>
@@ -10713,11 +10924,19 @@
         </w:rPr>
         <w:tab/>
       </w:r>
-      <w:r>
-        <w:rPr>
-          <w:color w:val="000000" w:themeColor="text1"/>
-        </w:rPr>
-        <w:t xml:space="preserve">password: </w:t>
+      <w:proofErr w:type="spellStart"/>
+      <w:r>
+        <w:rPr>
+          <w:color w:val="000000" w:themeColor="text1"/>
+        </w:rPr>
+        <w:t>password</w:t>
+      </w:r>
+      <w:proofErr w:type="spellEnd"/>
+      <w:r>
+        <w:rPr>
+          <w:color w:val="000000" w:themeColor="text1"/>
+        </w:rPr>
+        <w:t xml:space="preserve">: </w:t>
       </w:r>
       <w:r>
         <w:rPr>
@@ -10799,11 +11018,19 @@
         </w:rPr>
         <w:tab/>
       </w:r>
-      <w:r>
-        <w:rPr>
-          <w:color w:val="000000" w:themeColor="text1"/>
-        </w:rPr>
-        <w:t xml:space="preserve">email: </w:t>
+      <w:proofErr w:type="spellStart"/>
+      <w:r>
+        <w:rPr>
+          <w:color w:val="000000" w:themeColor="text1"/>
+        </w:rPr>
+        <w:t>email</w:t>
+      </w:r>
+      <w:proofErr w:type="spellEnd"/>
+      <w:r>
+        <w:rPr>
+          <w:color w:val="000000" w:themeColor="text1"/>
+        </w:rPr>
+        <w:t xml:space="preserve">: </w:t>
       </w:r>
       <w:r>
         <w:rPr>
@@ -10905,7 +11132,21 @@
         <w:rPr>
           <w:color w:val="000000" w:themeColor="text1"/>
         </w:rPr>
-        <w:t>Objeto Usuario não nulo.</w:t>
+        <w:t xml:space="preserve">Objeto </w:t>
+      </w:r>
+      <w:proofErr w:type="spellStart"/>
+      <w:r>
+        <w:rPr>
+          <w:color w:val="000000" w:themeColor="text1"/>
+        </w:rPr>
+        <w:t>Usuario</w:t>
+      </w:r>
+      <w:proofErr w:type="spellEnd"/>
+      <w:r>
+        <w:rPr>
+          <w:color w:val="000000" w:themeColor="text1"/>
+        </w:rPr>
+        <w:t xml:space="preserve"> não nulo.</w:t>
       </w:r>
     </w:p>
     <w:p>
@@ -11217,8 +11458,16 @@
         <w:rPr>
           <w:color w:val="000000" w:themeColor="text1"/>
         </w:rPr>
-        <w:t>nome: null</w:t>
-      </w:r>
+        <w:t xml:space="preserve">nome: </w:t>
+      </w:r>
+      <w:proofErr w:type="spellStart"/>
+      <w:r>
+        <w:rPr>
+          <w:color w:val="000000" w:themeColor="text1"/>
+        </w:rPr>
+        <w:t>null</w:t>
+      </w:r>
+      <w:proofErr w:type="spellEnd"/>
     </w:p>
     <w:p>
       <w:pPr>
@@ -11242,8 +11491,16 @@
         <w:rPr>
           <w:color w:val="000000" w:themeColor="text1"/>
         </w:rPr>
-        <w:t>login: null</w:t>
-      </w:r>
+        <w:t xml:space="preserve">login: </w:t>
+      </w:r>
+      <w:proofErr w:type="spellStart"/>
+      <w:r>
+        <w:rPr>
+          <w:color w:val="000000" w:themeColor="text1"/>
+        </w:rPr>
+        <w:t>null</w:t>
+      </w:r>
+      <w:proofErr w:type="spellEnd"/>
     </w:p>
     <w:p>
       <w:pPr>
@@ -11293,12 +11550,21 @@
         </w:rPr>
         <w:tab/>
       </w:r>
+      <w:proofErr w:type="spellStart"/>
       <w:r>
         <w:rPr>
           <w:color w:val="000000" w:themeColor="text1"/>
           <w:lang w:val="en-US"/>
         </w:rPr>
-        <w:t>telefone: null</w:t>
+        <w:t>telefone</w:t>
+      </w:r>
+      <w:proofErr w:type="spellEnd"/>
+      <w:r>
+        <w:rPr>
+          <w:color w:val="000000" w:themeColor="text1"/>
+          <w:lang w:val="en-US"/>
+        </w:rPr>
+        <w:t>: null</w:t>
       </w:r>
     </w:p>
     <w:p>
@@ -11804,25 +12070,34 @@
         </w:rPr>
         <w:tab/>
       </w:r>
+      <w:proofErr w:type="spellStart"/>
       <w:r>
         <w:rPr>
           <w:color w:val="000000" w:themeColor="text1"/>
           <w:lang w:val="en-US"/>
         </w:rPr>
-        <w:t>telefone: “11912345678”</w:t>
-      </w:r>
-    </w:p>
-    <w:p>
-      <w:pPr>
-        <w:rPr>
-          <w:color w:val="000000" w:themeColor="text1"/>
-        </w:rPr>
-      </w:pPr>
+        <w:t>telefone</w:t>
+      </w:r>
+      <w:proofErr w:type="spellEnd"/>
       <w:r>
         <w:rPr>
           <w:color w:val="000000" w:themeColor="text1"/>
           <w:lang w:val="en-US"/>
         </w:rPr>
+        <w:t>: “11912345678”</w:t>
+      </w:r>
+    </w:p>
+    <w:p>
+      <w:pPr>
+        <w:rPr>
+          <w:color w:val="000000" w:themeColor="text1"/>
+        </w:rPr>
+      </w:pPr>
+      <w:r>
+        <w:rPr>
+          <w:color w:val="000000" w:themeColor="text1"/>
+          <w:lang w:val="en-US"/>
+        </w:rPr>
         <w:tab/>
       </w:r>
       <w:r>
@@ -11832,11 +12107,19 @@
         </w:rPr>
         <w:tab/>
       </w:r>
-      <w:r>
-        <w:rPr>
-          <w:color w:val="000000" w:themeColor="text1"/>
-        </w:rPr>
-        <w:t>email: “teste@email.com”</w:t>
+      <w:proofErr w:type="spellStart"/>
+      <w:r>
+        <w:rPr>
+          <w:color w:val="000000" w:themeColor="text1"/>
+        </w:rPr>
+        <w:t>email</w:t>
+      </w:r>
+      <w:proofErr w:type="spellEnd"/>
+      <w:r>
+        <w:rPr>
+          <w:color w:val="000000" w:themeColor="text1"/>
+        </w:rPr>
+        <w:t>: “teste@email.com”</w:t>
       </w:r>
     </w:p>
     <w:p>
@@ -11910,7 +12193,21 @@
         <w:rPr>
           <w:color w:val="000000" w:themeColor="text1"/>
         </w:rPr>
-        <w:t>Lançar exceção InvalidNameException com a mensagem “</w:t>
+        <w:t xml:space="preserve">Lançar exceção </w:t>
+      </w:r>
+      <w:proofErr w:type="spellStart"/>
+      <w:r>
+        <w:rPr>
+          <w:color w:val="000000" w:themeColor="text1"/>
+        </w:rPr>
+        <w:t>InvalidNameException</w:t>
+      </w:r>
+      <w:proofErr w:type="spellEnd"/>
+      <w:r>
+        <w:rPr>
+          <w:color w:val="000000" w:themeColor="text1"/>
+        </w:rPr>
+        <w:t xml:space="preserve"> com a mensagem “</w:t>
       </w:r>
       <w:r>
         <w:rPr>
@@ -12217,11 +12514,89 @@
         </w:rPr>
         <w:t>nome: “</w:t>
       </w:r>
-      <w:r>
-        <w:rPr>
-          <w:color w:val="000000" w:themeColor="text1"/>
-        </w:rPr>
-        <w:t>abcd efgh ijkl nmop qrst uvxz 123</w:t>
+      <w:proofErr w:type="spellStart"/>
+      <w:r>
+        <w:rPr>
+          <w:color w:val="000000" w:themeColor="text1"/>
+        </w:rPr>
+        <w:t>abcd</w:t>
+      </w:r>
+      <w:proofErr w:type="spellEnd"/>
+      <w:r>
+        <w:rPr>
+          <w:color w:val="000000" w:themeColor="text1"/>
+        </w:rPr>
+        <w:t xml:space="preserve"> </w:t>
+      </w:r>
+      <w:proofErr w:type="spellStart"/>
+      <w:r>
+        <w:rPr>
+          <w:color w:val="000000" w:themeColor="text1"/>
+        </w:rPr>
+        <w:t>efgh</w:t>
+      </w:r>
+      <w:proofErr w:type="spellEnd"/>
+      <w:r>
+        <w:rPr>
+          <w:color w:val="000000" w:themeColor="text1"/>
+        </w:rPr>
+        <w:t xml:space="preserve"> </w:t>
+      </w:r>
+      <w:proofErr w:type="spellStart"/>
+      <w:r>
+        <w:rPr>
+          <w:color w:val="000000" w:themeColor="text1"/>
+        </w:rPr>
+        <w:t>ijkl</w:t>
+      </w:r>
+      <w:proofErr w:type="spellEnd"/>
+      <w:r>
+        <w:rPr>
+          <w:color w:val="000000" w:themeColor="text1"/>
+        </w:rPr>
+        <w:t xml:space="preserve"> </w:t>
+      </w:r>
+      <w:proofErr w:type="spellStart"/>
+      <w:r>
+        <w:rPr>
+          <w:color w:val="000000" w:themeColor="text1"/>
+        </w:rPr>
+        <w:t>nmop</w:t>
+      </w:r>
+      <w:proofErr w:type="spellEnd"/>
+      <w:r>
+        <w:rPr>
+          <w:color w:val="000000" w:themeColor="text1"/>
+        </w:rPr>
+        <w:t xml:space="preserve"> </w:t>
+      </w:r>
+      <w:proofErr w:type="spellStart"/>
+      <w:r>
+        <w:rPr>
+          <w:color w:val="000000" w:themeColor="text1"/>
+        </w:rPr>
+        <w:t>qrst</w:t>
+      </w:r>
+      <w:proofErr w:type="spellEnd"/>
+      <w:r>
+        <w:rPr>
+          <w:color w:val="000000" w:themeColor="text1"/>
+        </w:rPr>
+        <w:t xml:space="preserve"> </w:t>
+      </w:r>
+      <w:proofErr w:type="spellStart"/>
+      <w:r>
+        <w:rPr>
+          <w:color w:val="000000" w:themeColor="text1"/>
+        </w:rPr>
+        <w:t>uvxz</w:t>
+      </w:r>
+      <w:proofErr w:type="spellEnd"/>
+      <w:r>
+        <w:rPr>
+          <w:color w:val="000000" w:themeColor="text1"/>
+        </w:rPr>
+        <w:t xml:space="preserve"> 123</w:t>
       </w:r>
       <w:r>
         <w:rPr>
@@ -12301,25 +12676,34 @@
         </w:rPr>
         <w:tab/>
       </w:r>
+      <w:proofErr w:type="spellStart"/>
       <w:r>
         <w:rPr>
           <w:color w:val="000000" w:themeColor="text1"/>
           <w:lang w:val="en-US"/>
         </w:rPr>
-        <w:t>telefone: “11912345678”</w:t>
-      </w:r>
-    </w:p>
-    <w:p>
-      <w:pPr>
-        <w:rPr>
-          <w:color w:val="000000" w:themeColor="text1"/>
-        </w:rPr>
-      </w:pPr>
+        <w:t>telefone</w:t>
+      </w:r>
+      <w:proofErr w:type="spellEnd"/>
       <w:r>
         <w:rPr>
           <w:color w:val="000000" w:themeColor="text1"/>
           <w:lang w:val="en-US"/>
         </w:rPr>
+        <w:t>: “11912345678”</w:t>
+      </w:r>
+    </w:p>
+    <w:p>
+      <w:pPr>
+        <w:rPr>
+          <w:color w:val="000000" w:themeColor="text1"/>
+        </w:rPr>
+      </w:pPr>
+      <w:r>
+        <w:rPr>
+          <w:color w:val="000000" w:themeColor="text1"/>
+          <w:lang w:val="en-US"/>
+        </w:rPr>
         <w:tab/>
       </w:r>
       <w:r>
@@ -12329,11 +12713,19 @@
         </w:rPr>
         <w:tab/>
       </w:r>
-      <w:r>
-        <w:rPr>
-          <w:color w:val="000000" w:themeColor="text1"/>
-        </w:rPr>
-        <w:t>email: “teste@email.com”</w:t>
+      <w:proofErr w:type="spellStart"/>
+      <w:r>
+        <w:rPr>
+          <w:color w:val="000000" w:themeColor="text1"/>
+        </w:rPr>
+        <w:t>email</w:t>
+      </w:r>
+      <w:proofErr w:type="spellEnd"/>
+      <w:r>
+        <w:rPr>
+          <w:color w:val="000000" w:themeColor="text1"/>
+        </w:rPr>
+        <w:t>: “teste@email.com”</w:t>
       </w:r>
     </w:p>
     <w:p>
@@ -12407,7 +12799,21 @@
         <w:rPr>
           <w:color w:val="000000" w:themeColor="text1"/>
         </w:rPr>
-        <w:t>Lançar exceção InvalidNameException com a mensagem “O nome do usuário deve ter entre 4 e 32 caracteres”.</w:t>
+        <w:t xml:space="preserve">Lançar exceção </w:t>
+      </w:r>
+      <w:proofErr w:type="spellStart"/>
+      <w:r>
+        <w:rPr>
+          <w:color w:val="000000" w:themeColor="text1"/>
+        </w:rPr>
+        <w:t>InvalidNameException</w:t>
+      </w:r>
+      <w:proofErr w:type="spellEnd"/>
+      <w:r>
+        <w:rPr>
+          <w:color w:val="000000" w:themeColor="text1"/>
+        </w:rPr>
+        <w:t xml:space="preserve"> com a mensagem “O nome do usuário deve ter entre 4 e 32 caracteres”.</w:t>
       </w:r>
     </w:p>
     <w:p>
@@ -12703,12 +13109,37 @@
         </w:rPr>
         <w:tab/>
       </w:r>
+      <w:proofErr w:type="spellStart"/>
       <w:r>
         <w:rPr>
           <w:color w:val="000000" w:themeColor="text1"/>
           <w:lang w:val="en-US"/>
         </w:rPr>
-        <w:t>nome: “     ”</w:t>
+        <w:t>nome</w:t>
+      </w:r>
+      <w:proofErr w:type="spellEnd"/>
+      <w:r>
+        <w:rPr>
+          <w:color w:val="000000" w:themeColor="text1"/>
+          <w:lang w:val="en-US"/>
+        </w:rPr>
+        <w:t xml:space="preserve">: </w:t>
+      </w:r>
+      <w:proofErr w:type="gramStart"/>
+      <w:r>
+        <w:rPr>
+          <w:color w:val="000000" w:themeColor="text1"/>
+          <w:lang w:val="en-US"/>
+        </w:rPr>
+        <w:t xml:space="preserve">“  </w:t>
+      </w:r>
+      <w:proofErr w:type="gramEnd"/>
+      <w:r>
+        <w:rPr>
+          <w:color w:val="000000" w:themeColor="text1"/>
+          <w:lang w:val="en-US"/>
+        </w:rPr>
+        <w:t xml:space="preserve">   ”</w:t>
       </w:r>
     </w:p>
     <w:p>
@@ -12803,11 +13234,19 @@
         </w:rPr>
         <w:tab/>
       </w:r>
-      <w:r>
-        <w:rPr>
-          <w:color w:val="000000" w:themeColor="text1"/>
-        </w:rPr>
-        <w:t>email: “teste@email.com”</w:t>
+      <w:proofErr w:type="spellStart"/>
+      <w:r>
+        <w:rPr>
+          <w:color w:val="000000" w:themeColor="text1"/>
+        </w:rPr>
+        <w:t>email</w:t>
+      </w:r>
+      <w:proofErr w:type="spellEnd"/>
+      <w:r>
+        <w:rPr>
+          <w:color w:val="000000" w:themeColor="text1"/>
+        </w:rPr>
+        <w:t>: “teste@email.com”</w:t>
       </w:r>
     </w:p>
     <w:p>
@@ -12881,7 +13320,21 @@
         <w:rPr>
           <w:color w:val="000000" w:themeColor="text1"/>
         </w:rPr>
-        <w:t xml:space="preserve">Lançar exceção InvalidNameException com a mensagem “O nome do usuário </w:t>
+        <w:t xml:space="preserve">Lançar exceção </w:t>
+      </w:r>
+      <w:proofErr w:type="spellStart"/>
+      <w:r>
+        <w:rPr>
+          <w:color w:val="000000" w:themeColor="text1"/>
+        </w:rPr>
+        <w:t>InvalidNameException</w:t>
+      </w:r>
+      <w:proofErr w:type="spellEnd"/>
+      <w:r>
+        <w:rPr>
+          <w:color w:val="000000" w:themeColor="text1"/>
+        </w:rPr>
+        <w:t xml:space="preserve"> com a mensagem “O nome do usuário </w:t>
       </w:r>
       <w:r>
         <w:rPr>
@@ -13249,7 +13702,20 @@
           <w:color w:val="000000" w:themeColor="text1"/>
         </w:rPr>
         <w:tab/>
-        <w:t>password: “teste”</w:t>
+      </w:r>
+      <w:proofErr w:type="spellStart"/>
+      <w:r>
+        <w:rPr>
+          <w:color w:val="000000" w:themeColor="text1"/>
+        </w:rPr>
+        <w:t>password</w:t>
+      </w:r>
+      <w:proofErr w:type="spellEnd"/>
+      <w:r>
+        <w:rPr>
+          <w:color w:val="000000" w:themeColor="text1"/>
+        </w:rPr>
+        <w:t>: “teste”</w:t>
       </w:r>
     </w:p>
     <w:p>
@@ -13290,11 +13756,19 @@
         </w:rPr>
         <w:tab/>
       </w:r>
-      <w:r>
-        <w:rPr>
-          <w:color w:val="000000" w:themeColor="text1"/>
-        </w:rPr>
-        <w:t>email: “teste@email.com”</w:t>
+      <w:proofErr w:type="spellStart"/>
+      <w:r>
+        <w:rPr>
+          <w:color w:val="000000" w:themeColor="text1"/>
+        </w:rPr>
+        <w:t>email</w:t>
+      </w:r>
+      <w:proofErr w:type="spellEnd"/>
+      <w:r>
+        <w:rPr>
+          <w:color w:val="000000" w:themeColor="text1"/>
+        </w:rPr>
+        <w:t>: “teste@email.com”</w:t>
       </w:r>
     </w:p>
     <w:p>
@@ -13368,7 +13842,21 @@
         <w:rPr>
           <w:color w:val="000000" w:themeColor="text1"/>
         </w:rPr>
-        <w:t>Lançar exceção InvalidNameException com a mensagem “O nome do usuário não pode conter apenas números”.</w:t>
+        <w:t xml:space="preserve">Lançar exceção </w:t>
+      </w:r>
+      <w:proofErr w:type="spellStart"/>
+      <w:r>
+        <w:rPr>
+          <w:color w:val="000000" w:themeColor="text1"/>
+        </w:rPr>
+        <w:t>InvalidNameException</w:t>
+      </w:r>
+      <w:proofErr w:type="spellEnd"/>
+      <w:r>
+        <w:rPr>
+          <w:color w:val="000000" w:themeColor="text1"/>
+        </w:rPr>
+        <w:t xml:space="preserve"> com a mensagem “O nome do usuário não pode conter apenas números”.</w:t>
       </w:r>
     </w:p>
     <w:p>
@@ -13709,6 +14197,7 @@
         </w:rPr>
         <w:t>login: “</w:t>
       </w:r>
+      <w:proofErr w:type="spellStart"/>
       <w:r>
         <w:rPr>
           <w:color w:val="000000" w:themeColor="text1"/>
@@ -13716,6 +14205,7 @@
         </w:rPr>
         <w:t>abc</w:t>
       </w:r>
+      <w:proofErr w:type="spellEnd"/>
       <w:r>
         <w:rPr>
           <w:color w:val="000000" w:themeColor="text1"/>
@@ -13768,12 +14258,21 @@
         </w:rPr>
         <w:tab/>
       </w:r>
+      <w:proofErr w:type="spellStart"/>
       <w:r>
         <w:rPr>
           <w:color w:val="000000" w:themeColor="text1"/>
           <w:lang w:val="en-US"/>
         </w:rPr>
-        <w:t>telefone: “11912345678”</w:t>
+        <w:t>telefone</w:t>
+      </w:r>
+      <w:proofErr w:type="spellEnd"/>
+      <w:r>
+        <w:rPr>
+          <w:color w:val="000000" w:themeColor="text1"/>
+          <w:lang w:val="en-US"/>
+        </w:rPr>
+        <w:t>: “11912345678”</w:t>
       </w:r>
     </w:p>
     <w:p>
@@ -13883,7 +14382,21 @@
         <w:rPr>
           <w:color w:val="000000" w:themeColor="text1"/>
         </w:rPr>
-        <w:t>Lançar exceção InvalidLoginException com a mensagem “O login do usuário deve ter entre 4 e 32 caracteres”.</w:t>
+        <w:t xml:space="preserve">Lançar exceção </w:t>
+      </w:r>
+      <w:proofErr w:type="spellStart"/>
+      <w:r>
+        <w:rPr>
+          <w:color w:val="000000" w:themeColor="text1"/>
+        </w:rPr>
+        <w:t>InvalidLoginException</w:t>
+      </w:r>
+      <w:proofErr w:type="spellEnd"/>
+      <w:r>
+        <w:rPr>
+          <w:color w:val="000000" w:themeColor="text1"/>
+        </w:rPr>
+        <w:t xml:space="preserve"> com a mensagem “O login do usuário deve ter entre 4 e 32 caracteres”.</w:t>
       </w:r>
     </w:p>
     <w:p>
@@ -14222,7 +14735,20 @@
           <w:color w:val="000000" w:themeColor="text1"/>
         </w:rPr>
         <w:tab/>
-        <w:t>password: “teste”</w:t>
+      </w:r>
+      <w:proofErr w:type="spellStart"/>
+      <w:r>
+        <w:rPr>
+          <w:color w:val="000000" w:themeColor="text1"/>
+        </w:rPr>
+        <w:t>password</w:t>
+      </w:r>
+      <w:proofErr w:type="spellEnd"/>
+      <w:r>
+        <w:rPr>
+          <w:color w:val="000000" w:themeColor="text1"/>
+        </w:rPr>
+        <w:t>: “teste”</w:t>
       </w:r>
     </w:p>
     <w:p>
@@ -14263,11 +14789,19 @@
         </w:rPr>
         <w:tab/>
       </w:r>
-      <w:r>
-        <w:rPr>
-          <w:color w:val="000000" w:themeColor="text1"/>
-        </w:rPr>
-        <w:t>email: “teste@email.com”</w:t>
+      <w:proofErr w:type="spellStart"/>
+      <w:r>
+        <w:rPr>
+          <w:color w:val="000000" w:themeColor="text1"/>
+        </w:rPr>
+        <w:t>email</w:t>
+      </w:r>
+      <w:proofErr w:type="spellEnd"/>
+      <w:r>
+        <w:rPr>
+          <w:color w:val="000000" w:themeColor="text1"/>
+        </w:rPr>
+        <w:t>: “teste@email.com”</w:t>
       </w:r>
     </w:p>
     <w:p>
@@ -14341,7 +14875,14 @@
         <w:rPr>
           <w:color w:val="000000" w:themeColor="text1"/>
         </w:rPr>
-        <w:t>Lançar exceção Invalid</w:t>
+        <w:t xml:space="preserve">Lançar exceção </w:t>
+      </w:r>
+      <w:proofErr w:type="spellStart"/>
+      <w:r>
+        <w:rPr>
+          <w:color w:val="000000" w:themeColor="text1"/>
+        </w:rPr>
+        <w:t>Invalid</w:t>
       </w:r>
       <w:r>
         <w:rPr>
@@ -14353,7 +14894,14 @@
         <w:rPr>
           <w:color w:val="000000" w:themeColor="text1"/>
         </w:rPr>
-        <w:t>Exception com a mensagem “O nome do usuário deve ter entre 4 e 32 caracteres”.</w:t>
+        <w:t>Exception</w:t>
+      </w:r>
+      <w:proofErr w:type="spellEnd"/>
+      <w:r>
+        <w:rPr>
+          <w:color w:val="000000" w:themeColor="text1"/>
+        </w:rPr>
+        <w:t xml:space="preserve"> com a mensagem “O nome do usuário deve ter entre 4 e 32 caracteres”.</w:t>
       </w:r>
     </w:p>
     <w:p>
@@ -14771,7 +15319,20 @@
           <w:color w:val="000000" w:themeColor="text1"/>
         </w:rPr>
         <w:tab/>
-        <w:t>password: “teste”</w:t>
+      </w:r>
+      <w:proofErr w:type="spellStart"/>
+      <w:r>
+        <w:rPr>
+          <w:color w:val="000000" w:themeColor="text1"/>
+        </w:rPr>
+        <w:t>password</w:t>
+      </w:r>
+      <w:proofErr w:type="spellEnd"/>
+      <w:r>
+        <w:rPr>
+          <w:color w:val="000000" w:themeColor="text1"/>
+        </w:rPr>
+        <w:t>: “teste”</w:t>
       </w:r>
     </w:p>
     <w:p>
@@ -14812,11 +15373,19 @@
         </w:rPr>
         <w:tab/>
       </w:r>
-      <w:r>
-        <w:rPr>
-          <w:color w:val="000000" w:themeColor="text1"/>
-        </w:rPr>
-        <w:t>email: “teste@email.com”</w:t>
+      <w:proofErr w:type="spellStart"/>
+      <w:r>
+        <w:rPr>
+          <w:color w:val="000000" w:themeColor="text1"/>
+        </w:rPr>
+        <w:t>email</w:t>
+      </w:r>
+      <w:proofErr w:type="spellEnd"/>
+      <w:r>
+        <w:rPr>
+          <w:color w:val="000000" w:themeColor="text1"/>
+        </w:rPr>
+        <w:t>: “teste@email.com”</w:t>
       </w:r>
     </w:p>
     <w:p>
@@ -14892,11 +15461,19 @@
         </w:rPr>
         <w:t xml:space="preserve">Lançar exceção </w:t>
       </w:r>
-      <w:r>
-        <w:rPr>
-          <w:color w:val="000000" w:themeColor="text1"/>
-        </w:rPr>
-        <w:t xml:space="preserve">InvalidLoginException </w:t>
+      <w:proofErr w:type="spellStart"/>
+      <w:r>
+        <w:rPr>
+          <w:color w:val="000000" w:themeColor="text1"/>
+        </w:rPr>
+        <w:t>InvalidLoginException</w:t>
+      </w:r>
+      <w:proofErr w:type="spellEnd"/>
+      <w:r>
+        <w:rPr>
+          <w:color w:val="000000" w:themeColor="text1"/>
+        </w:rPr>
+        <w:t xml:space="preserve"> </w:t>
       </w:r>
       <w:r>
         <w:rPr>
@@ -15392,11 +15969,19 @@
         </w:rPr>
         <w:tab/>
       </w:r>
-      <w:r>
-        <w:rPr>
-          <w:color w:val="000000" w:themeColor="text1"/>
-        </w:rPr>
-        <w:t>email: “teste@email.com”</w:t>
+      <w:proofErr w:type="spellStart"/>
+      <w:r>
+        <w:rPr>
+          <w:color w:val="000000" w:themeColor="text1"/>
+        </w:rPr>
+        <w:t>email</w:t>
+      </w:r>
+      <w:proofErr w:type="spellEnd"/>
+      <w:r>
+        <w:rPr>
+          <w:color w:val="000000" w:themeColor="text1"/>
+        </w:rPr>
+        <w:t>: “teste@email.com”</w:t>
       </w:r>
     </w:p>
     <w:p>
@@ -15470,7 +16055,21 @@
         <w:rPr>
           <w:color w:val="000000" w:themeColor="text1"/>
         </w:rPr>
-        <w:t xml:space="preserve">Lançar exceção InvalidLoginException com a mensagem “O login não deve conter </w:t>
+        <w:t xml:space="preserve">Lançar exceção </w:t>
+      </w:r>
+      <w:proofErr w:type="spellStart"/>
+      <w:r>
+        <w:rPr>
+          <w:color w:val="000000" w:themeColor="text1"/>
+        </w:rPr>
+        <w:t>InvalidLoginException</w:t>
+      </w:r>
+      <w:proofErr w:type="spellEnd"/>
+      <w:r>
+        <w:rPr>
+          <w:color w:val="000000" w:themeColor="text1"/>
+        </w:rPr>
+        <w:t xml:space="preserve"> com a mensagem “O login não deve conter </w:t>
       </w:r>
       <w:r>
         <w:rPr>
@@ -15888,6 +16487,8 @@
         </w:rPr>
         <w:t>login: “</w:t>
       </w:r>
+      <w:proofErr w:type="spellStart"/>
+      <w:proofErr w:type="gramStart"/>
       <w:r>
         <w:rPr>
           <w:color w:val="000000" w:themeColor="text1"/>
@@ -15895,6 +16496,8 @@
         </w:rPr>
         <w:t>login.existente</w:t>
       </w:r>
+      <w:proofErr w:type="spellEnd"/>
+      <w:proofErr w:type="gramEnd"/>
       <w:r>
         <w:rPr>
           <w:color w:val="000000" w:themeColor="text1"/>
@@ -15947,12 +16550,21 @@
         </w:rPr>
         <w:tab/>
       </w:r>
+      <w:proofErr w:type="spellStart"/>
       <w:r>
         <w:rPr>
           <w:color w:val="000000" w:themeColor="text1"/>
           <w:lang w:val="en-US"/>
         </w:rPr>
-        <w:t>telefone: “11912345678”</w:t>
+        <w:t>telefone</w:t>
+      </w:r>
+      <w:proofErr w:type="spellEnd"/>
+      <w:r>
+        <w:rPr>
+          <w:color w:val="000000" w:themeColor="text1"/>
+          <w:lang w:val="en-US"/>
+        </w:rPr>
+        <w:t>: “11912345678”</w:t>
       </w:r>
     </w:p>
     <w:p>
@@ -16056,7 +16668,21 @@
         <w:rPr>
           <w:color w:val="000000" w:themeColor="text1"/>
         </w:rPr>
-        <w:t>Lançar exceção InvalidLoginException com a mensagem “</w:t>
+        <w:t xml:space="preserve">Lançar exceção </w:t>
+      </w:r>
+      <w:proofErr w:type="spellStart"/>
+      <w:r>
+        <w:rPr>
+          <w:color w:val="000000" w:themeColor="text1"/>
+        </w:rPr>
+        <w:t>InvalidLoginException</w:t>
+      </w:r>
+      <w:proofErr w:type="spellEnd"/>
+      <w:r>
+        <w:rPr>
+          <w:color w:val="000000" w:themeColor="text1"/>
+        </w:rPr>
+        <w:t xml:space="preserve"> com a mensagem “</w:t>
       </w:r>
       <w:r>
         <w:rPr>
@@ -16224,7 +16850,19 @@
         <w:rPr>
           <w:color w:val="000000" w:themeColor="text1"/>
         </w:rPr>
-        <w:t xml:space="preserve"> RF001.01, RN001.0</w:t>
+        <w:t xml:space="preserve"> RF001.0</w:t>
+      </w:r>
+      <w:r>
+        <w:rPr>
+          <w:color w:val="000000" w:themeColor="text1"/>
+        </w:rPr>
+        <w:t>2</w:t>
+      </w:r>
+      <w:r>
+        <w:rPr>
+          <w:color w:val="000000" w:themeColor="text1"/>
+        </w:rPr>
+        <w:t>, RN001.0</w:t>
       </w:r>
       <w:r>
         <w:rPr>
@@ -16495,7 +17133,15 @@
         <w:rPr>
           <w:color w:val="000000" w:themeColor="text1"/>
         </w:rPr>
-        <w:t>login: “login.</w:t>
+        <w:t>login: “</w:t>
+      </w:r>
+      <w:proofErr w:type="spellStart"/>
+      <w:proofErr w:type="gramStart"/>
+      <w:r>
+        <w:rPr>
+          <w:color w:val="000000" w:themeColor="text1"/>
+        </w:rPr>
+        <w:t>login.</w:t>
       </w:r>
       <w:r>
         <w:rPr>
@@ -16503,6 +17149,8 @@
         </w:rPr>
         <w:t>alterado</w:t>
       </w:r>
+      <w:proofErr w:type="spellEnd"/>
+      <w:proofErr w:type="gramEnd"/>
       <w:r>
         <w:rPr>
           <w:color w:val="000000" w:themeColor="text1"/>
@@ -16527,7 +17175,20 @@
           <w:color w:val="000000" w:themeColor="text1"/>
         </w:rPr>
         <w:tab/>
-        <w:t>password: “teste”</w:t>
+      </w:r>
+      <w:proofErr w:type="spellStart"/>
+      <w:r>
+        <w:rPr>
+          <w:color w:val="000000" w:themeColor="text1"/>
+        </w:rPr>
+        <w:t>password</w:t>
+      </w:r>
+      <w:proofErr w:type="spellEnd"/>
+      <w:r>
+        <w:rPr>
+          <w:color w:val="000000" w:themeColor="text1"/>
+        </w:rPr>
+        <w:t>: “teste”</w:t>
       </w:r>
     </w:p>
     <w:p>
@@ -16567,7 +17228,20 @@
           <w:color w:val="000000" w:themeColor="text1"/>
         </w:rPr>
         <w:tab/>
-        <w:t>email: “teste@email.com”</w:t>
+      </w:r>
+      <w:proofErr w:type="spellStart"/>
+      <w:r>
+        <w:rPr>
+          <w:color w:val="000000" w:themeColor="text1"/>
+        </w:rPr>
+        <w:t>email</w:t>
+      </w:r>
+      <w:proofErr w:type="spellEnd"/>
+      <w:r>
+        <w:rPr>
+          <w:color w:val="000000" w:themeColor="text1"/>
+        </w:rPr>
+        <w:t>: “teste@email.com”</w:t>
       </w:r>
     </w:p>
     <w:p>
@@ -16646,7 +17320,21 @@
         <w:rPr>
           <w:color w:val="000000" w:themeColor="text1"/>
         </w:rPr>
-        <w:t xml:space="preserve">Lançar exceção InvalidLoginException com a mensagem “Login </w:t>
+        <w:t xml:space="preserve">Lançar exceção </w:t>
+      </w:r>
+      <w:proofErr w:type="spellStart"/>
+      <w:r>
+        <w:rPr>
+          <w:color w:val="000000" w:themeColor="text1"/>
+        </w:rPr>
+        <w:t>InvalidLoginException</w:t>
+      </w:r>
+      <w:proofErr w:type="spellEnd"/>
+      <w:r>
+        <w:rPr>
+          <w:color w:val="000000" w:themeColor="text1"/>
+        </w:rPr>
+        <w:t xml:space="preserve"> com a mensagem “Login </w:t>
       </w:r>
       <w:r>
         <w:rPr>
@@ -16672,6 +17360,642 @@
           <w:b/>
           <w:color w:val="000000" w:themeColor="text1"/>
         </w:rPr>
+        <w:t>Status:</w:t>
+      </w:r>
+      <w:r>
+        <w:rPr>
+          <w:color w:val="000000" w:themeColor="text1"/>
+        </w:rPr>
+        <w:t xml:space="preserve"> Não realizado.</w:t>
+      </w:r>
+    </w:p>
+    <w:p>
+      <w:pPr>
+        <w:rPr>
+          <w:color w:val="000000" w:themeColor="text1"/>
+        </w:rPr>
+      </w:pPr>
+      <w:r>
+        <w:rPr>
+          <w:b/>
+          <w:color w:val="000000" w:themeColor="text1"/>
+        </w:rPr>
+        <w:t>Realização do teste:</w:t>
+      </w:r>
+      <w:r>
+        <w:rPr>
+          <w:color w:val="000000" w:themeColor="text1"/>
+        </w:rPr>
+        <w:t xml:space="preserve"> 00/00/0000.</w:t>
+      </w:r>
+    </w:p>
+    <w:p>
+      <w:pPr>
+        <w:rPr>
+          <w:color w:val="000000" w:themeColor="text1"/>
+        </w:rPr>
+      </w:pPr>
+      <w:r>
+        <w:rPr>
+          <w:b/>
+          <w:color w:val="000000" w:themeColor="text1"/>
+        </w:rPr>
+        <w:t xml:space="preserve">Responsável: </w:t>
+      </w:r>
+      <w:r>
+        <w:rPr>
+          <w:color w:val="000000" w:themeColor="text1"/>
+        </w:rPr>
+        <w:t>A definir.</w:t>
+      </w:r>
+    </w:p>
+    <w:p>
+      <w:pPr>
+        <w:rPr>
+          <w:color w:val="000000" w:themeColor="text1"/>
+        </w:rPr>
+      </w:pPr>
+    </w:p>
+    <w:p>
+      <w:pPr>
+        <w:pStyle w:val="Ttulo4"/>
+        <w:rPr>
+          <w:color w:val="FF0000"/>
+        </w:rPr>
+      </w:pPr>
+      <w:r>
+        <w:t>6.1.1.1</w:t>
+      </w:r>
+      <w:r>
+        <w:t>3</w:t>
+      </w:r>
+      <w:r>
+        <w:t xml:space="preserve"> [TU001.1</w:t>
+      </w:r>
+      <w:r>
+        <w:t>3</w:t>
+      </w:r>
+      <w:r>
+        <w:t xml:space="preserve">] </w:t>
+      </w:r>
+      <w:r>
+        <w:rPr>
+          <w:color w:val="000000" w:themeColor="text1"/>
+        </w:rPr>
+        <w:t xml:space="preserve">O sistema não deve </w:t>
+      </w:r>
+      <w:r>
+        <w:rPr>
+          <w:color w:val="000000" w:themeColor="text1"/>
+        </w:rPr>
+        <w:t>cadastrar usuário quando a senha tem menos de 4 caracteres</w:t>
+      </w:r>
+    </w:p>
+    <w:p/>
+    <w:p>
+      <w:pPr>
+        <w:rPr>
+          <w:color w:val="000000" w:themeColor="text1"/>
+        </w:rPr>
+      </w:pPr>
+      <w:r>
+        <w:rPr>
+          <w:b/>
+          <w:bCs/>
+          <w:color w:val="000000" w:themeColor="text1"/>
+        </w:rPr>
+        <w:t>Camada:</w:t>
+      </w:r>
+      <w:r>
+        <w:rPr>
+          <w:color w:val="000000" w:themeColor="text1"/>
+        </w:rPr>
+        <w:t xml:space="preserve"> Serviço.</w:t>
+      </w:r>
+    </w:p>
+    <w:p>
+      <w:pPr>
+        <w:rPr>
+          <w:color w:val="000000" w:themeColor="text1"/>
+        </w:rPr>
+      </w:pPr>
+      <w:r>
+        <w:rPr>
+          <w:b/>
+          <w:color w:val="000000" w:themeColor="text1"/>
+        </w:rPr>
+        <w:t>Requisitos associados:</w:t>
+      </w:r>
+      <w:r>
+        <w:rPr>
+          <w:color w:val="000000" w:themeColor="text1"/>
+        </w:rPr>
+        <w:t xml:space="preserve"> RF001.01, RN001.0</w:t>
+      </w:r>
+      <w:r>
+        <w:rPr>
+          <w:color w:val="000000" w:themeColor="text1"/>
+        </w:rPr>
+        <w:t>9</w:t>
+      </w:r>
+      <w:r>
+        <w:rPr>
+          <w:color w:val="000000" w:themeColor="text1"/>
+        </w:rPr>
+        <w:t>.</w:t>
+      </w:r>
+    </w:p>
+    <w:p>
+      <w:pPr>
+        <w:rPr>
+          <w:color w:val="000000" w:themeColor="text1"/>
+        </w:rPr>
+      </w:pPr>
+      <w:r>
+        <w:rPr>
+          <w:b/>
+          <w:color w:val="000000" w:themeColor="text1"/>
+        </w:rPr>
+        <w:t xml:space="preserve">Descrição: </w:t>
+      </w:r>
+      <w:r>
+        <w:rPr>
+          <w:color w:val="000000" w:themeColor="text1"/>
+        </w:rPr>
+        <w:t xml:space="preserve">O sistema não deve </w:t>
+      </w:r>
+      <w:r>
+        <w:rPr>
+          <w:color w:val="000000" w:themeColor="text1"/>
+        </w:rPr>
+        <w:t>cadastrar</w:t>
+      </w:r>
+      <w:r>
+        <w:rPr>
+          <w:color w:val="000000" w:themeColor="text1"/>
+        </w:rPr>
+        <w:t xml:space="preserve"> usuário.</w:t>
+      </w:r>
+    </w:p>
+    <w:p>
+      <w:pPr>
+        <w:rPr>
+          <w:color w:val="000000" w:themeColor="text1"/>
+        </w:rPr>
+      </w:pPr>
+      <w:r>
+        <w:rPr>
+          <w:b/>
+          <w:color w:val="000000" w:themeColor="text1"/>
+        </w:rPr>
+        <w:t>Condições</w:t>
+      </w:r>
+      <w:r>
+        <w:rPr>
+          <w:color w:val="000000" w:themeColor="text1"/>
+        </w:rPr>
+        <w:t xml:space="preserve">: </w:t>
+      </w:r>
+      <w:r>
+        <w:rPr>
+          <w:color w:val="000000" w:themeColor="text1"/>
+        </w:rPr>
+        <w:t>Senha do usuário com 3 caracteres</w:t>
+      </w:r>
+      <w:r>
+        <w:rPr>
+          <w:color w:val="000000" w:themeColor="text1"/>
+        </w:rPr>
+        <w:t>.</w:t>
+      </w:r>
+    </w:p>
+    <w:p>
+      <w:pPr>
+        <w:rPr>
+          <w:color w:val="000000" w:themeColor="text1"/>
+        </w:rPr>
+      </w:pPr>
+      <w:r>
+        <w:rPr>
+          <w:b/>
+          <w:color w:val="000000" w:themeColor="text1"/>
+        </w:rPr>
+        <w:t>Passos:</w:t>
+      </w:r>
+      <w:r>
+        <w:rPr>
+          <w:color w:val="000000" w:themeColor="text1"/>
+        </w:rPr>
+        <w:t xml:space="preserve"> </w:t>
+      </w:r>
+    </w:p>
+    <w:p>
+      <w:pPr>
+        <w:pStyle w:val="PargrafodaLista"/>
+        <w:numPr>
+          <w:ilvl w:val="0"/>
+          <w:numId w:val="40"/>
+        </w:numPr>
+        <w:rPr>
+          <w:color w:val="000000" w:themeColor="text1"/>
+        </w:rPr>
+      </w:pPr>
+      <w:r>
+        <w:rPr>
+          <w:color w:val="000000" w:themeColor="text1"/>
+        </w:rPr>
+        <w:t xml:space="preserve">Informar os dados do usuário com </w:t>
+      </w:r>
+      <w:r>
+        <w:rPr>
+          <w:color w:val="000000" w:themeColor="text1"/>
+        </w:rPr>
+        <w:t xml:space="preserve">a senha com 3 </w:t>
+      </w:r>
+      <w:r>
+        <w:rPr>
+          <w:color w:val="000000" w:themeColor="text1"/>
+        </w:rPr>
+        <w:t>caracteres</w:t>
+      </w:r>
+      <w:r>
+        <w:rPr>
+          <w:color w:val="000000" w:themeColor="text1"/>
+        </w:rPr>
+        <w:t>.</w:t>
+      </w:r>
+    </w:p>
+    <w:p>
+      <w:pPr>
+        <w:pStyle w:val="PargrafodaLista"/>
+        <w:numPr>
+          <w:ilvl w:val="0"/>
+          <w:numId w:val="40"/>
+        </w:numPr>
+        <w:rPr>
+          <w:color w:val="000000" w:themeColor="text1"/>
+        </w:rPr>
+      </w:pPr>
+      <w:r>
+        <w:rPr>
+          <w:color w:val="000000" w:themeColor="text1"/>
+        </w:rPr>
+        <w:t xml:space="preserve">Validar </w:t>
+      </w:r>
+      <w:r>
+        <w:rPr>
+          <w:color w:val="000000" w:themeColor="text1"/>
+        </w:rPr>
+        <w:t>quantidade de caracteres da senha</w:t>
+      </w:r>
+      <w:r>
+        <w:rPr>
+          <w:color w:val="000000" w:themeColor="text1"/>
+        </w:rPr>
+        <w:t>.</w:t>
+      </w:r>
+    </w:p>
+    <w:p>
+      <w:pPr>
+        <w:pStyle w:val="PargrafodaLista"/>
+        <w:numPr>
+          <w:ilvl w:val="0"/>
+          <w:numId w:val="40"/>
+        </w:numPr>
+        <w:rPr>
+          <w:color w:val="000000" w:themeColor="text1"/>
+        </w:rPr>
+      </w:pPr>
+      <w:r>
+        <w:rPr>
+          <w:color w:val="000000" w:themeColor="text1"/>
+        </w:rPr>
+        <w:t xml:space="preserve">Receber mensagem de erro ao </w:t>
+      </w:r>
+      <w:r>
+        <w:rPr>
+          <w:color w:val="000000" w:themeColor="text1"/>
+        </w:rPr>
+        <w:t>cadastrar senha inválida</w:t>
+      </w:r>
+      <w:r>
+        <w:rPr>
+          <w:color w:val="000000" w:themeColor="text1"/>
+        </w:rPr>
+        <w:t>.</w:t>
+      </w:r>
+    </w:p>
+    <w:p>
+      <w:pPr>
+        <w:rPr>
+          <w:color w:val="000000" w:themeColor="text1"/>
+        </w:rPr>
+      </w:pPr>
+      <w:r>
+        <w:rPr>
+          <w:b/>
+          <w:color w:val="000000" w:themeColor="text1"/>
+        </w:rPr>
+        <w:t>Dados do teste:</w:t>
+      </w:r>
+      <w:r>
+        <w:rPr>
+          <w:color w:val="000000" w:themeColor="text1"/>
+        </w:rPr>
+        <w:t xml:space="preserve"> </w:t>
+      </w:r>
+    </w:p>
+    <w:p>
+      <w:pPr>
+        <w:ind w:firstLine="720"/>
+        <w:rPr>
+          <w:color w:val="000000" w:themeColor="text1"/>
+        </w:rPr>
+      </w:pPr>
+      <w:r>
+        <w:rPr>
+          <w:color w:val="000000" w:themeColor="text1"/>
+        </w:rPr>
+        <w:t>{</w:t>
+      </w:r>
+    </w:p>
+    <w:p>
+      <w:pPr>
+        <w:rPr>
+          <w:color w:val="000000" w:themeColor="text1"/>
+        </w:rPr>
+      </w:pPr>
+      <w:r>
+        <w:rPr>
+          <w:color w:val="000000" w:themeColor="text1"/>
+        </w:rPr>
+        <w:tab/>
+      </w:r>
+      <w:r>
+        <w:rPr>
+          <w:color w:val="000000" w:themeColor="text1"/>
+        </w:rPr>
+        <w:tab/>
+      </w:r>
+      <w:r>
+        <w:rPr>
+          <w:color w:val="000000" w:themeColor="text1"/>
+        </w:rPr>
+        <w:t>nome: “teste”</w:t>
+      </w:r>
+    </w:p>
+    <w:p>
+      <w:pPr>
+        <w:rPr>
+          <w:color w:val="000000" w:themeColor="text1"/>
+        </w:rPr>
+      </w:pPr>
+      <w:r>
+        <w:rPr>
+          <w:color w:val="000000" w:themeColor="text1"/>
+        </w:rPr>
+        <w:tab/>
+      </w:r>
+      <w:r>
+        <w:rPr>
+          <w:color w:val="000000" w:themeColor="text1"/>
+        </w:rPr>
+        <w:tab/>
+      </w:r>
+      <w:r>
+        <w:rPr>
+          <w:color w:val="000000" w:themeColor="text1"/>
+        </w:rPr>
+        <w:t>login: “login”</w:t>
+      </w:r>
+    </w:p>
+    <w:p>
+      <w:pPr>
+        <w:rPr>
+          <w:color w:val="000000" w:themeColor="text1"/>
+        </w:rPr>
+      </w:pPr>
+      <w:r>
+        <w:rPr>
+          <w:color w:val="000000" w:themeColor="text1"/>
+        </w:rPr>
+        <w:tab/>
+      </w:r>
+      <w:r>
+        <w:rPr>
+          <w:color w:val="000000" w:themeColor="text1"/>
+        </w:rPr>
+        <w:tab/>
+      </w:r>
+      <w:proofErr w:type="spellStart"/>
+      <w:r>
+        <w:rPr>
+          <w:color w:val="000000" w:themeColor="text1"/>
+        </w:rPr>
+        <w:t>password</w:t>
+      </w:r>
+      <w:proofErr w:type="spellEnd"/>
+      <w:r>
+        <w:rPr>
+          <w:color w:val="000000" w:themeColor="text1"/>
+        </w:rPr>
+        <w:t>: “</w:t>
+      </w:r>
+      <w:r>
+        <w:rPr>
+          <w:color w:val="000000" w:themeColor="text1"/>
+        </w:rPr>
+        <w:t>123</w:t>
+      </w:r>
+      <w:r>
+        <w:rPr>
+          <w:color w:val="000000" w:themeColor="text1"/>
+        </w:rPr>
+        <w:t>”</w:t>
+      </w:r>
+    </w:p>
+    <w:p>
+      <w:pPr>
+        <w:rPr>
+          <w:color w:val="000000" w:themeColor="text1"/>
+        </w:rPr>
+      </w:pPr>
+      <w:r>
+        <w:rPr>
+          <w:color w:val="000000" w:themeColor="text1"/>
+        </w:rPr>
+        <w:tab/>
+      </w:r>
+      <w:r>
+        <w:rPr>
+          <w:color w:val="000000" w:themeColor="text1"/>
+        </w:rPr>
+        <w:tab/>
+        <w:t>telefone: “11912345678”</w:t>
+      </w:r>
+    </w:p>
+    <w:p>
+      <w:pPr>
+        <w:rPr>
+          <w:color w:val="000000" w:themeColor="text1"/>
+        </w:rPr>
+      </w:pPr>
+      <w:r>
+        <w:rPr>
+          <w:color w:val="000000" w:themeColor="text1"/>
+        </w:rPr>
+        <w:tab/>
+      </w:r>
+      <w:r>
+        <w:rPr>
+          <w:color w:val="000000" w:themeColor="text1"/>
+        </w:rPr>
+        <w:tab/>
+      </w:r>
+      <w:proofErr w:type="spellStart"/>
+      <w:r>
+        <w:rPr>
+          <w:color w:val="000000" w:themeColor="text1"/>
+        </w:rPr>
+        <w:t>email</w:t>
+      </w:r>
+      <w:proofErr w:type="spellEnd"/>
+      <w:r>
+        <w:rPr>
+          <w:color w:val="000000" w:themeColor="text1"/>
+        </w:rPr>
+        <w:t>: “teste@email.com”</w:t>
+      </w:r>
+    </w:p>
+    <w:p>
+      <w:pPr>
+        <w:rPr>
+          <w:color w:val="000000" w:themeColor="text1"/>
+        </w:rPr>
+      </w:pPr>
+      <w:r>
+        <w:rPr>
+          <w:color w:val="000000" w:themeColor="text1"/>
+        </w:rPr>
+        <w:tab/>
+      </w:r>
+      <w:r>
+        <w:rPr>
+          <w:color w:val="000000" w:themeColor="text1"/>
+        </w:rPr>
+        <w:tab/>
+      </w:r>
+      <w:r>
+        <w:rPr>
+          <w:color w:val="000000" w:themeColor="text1"/>
+        </w:rPr>
+        <w:t>status: ATIVO</w:t>
+      </w:r>
+    </w:p>
+    <w:p>
+      <w:pPr>
+        <w:rPr>
+          <w:color w:val="000000" w:themeColor="text1"/>
+        </w:rPr>
+      </w:pPr>
+      <w:r>
+        <w:rPr>
+          <w:color w:val="000000" w:themeColor="text1"/>
+        </w:rPr>
+        <w:tab/>
+      </w:r>
+      <w:r>
+        <w:rPr>
+          <w:color w:val="000000" w:themeColor="text1"/>
+        </w:rPr>
+        <w:tab/>
+        <w:t>perfil: ADMIN</w:t>
+      </w:r>
+    </w:p>
+    <w:p>
+      <w:pPr>
+        <w:rPr>
+          <w:color w:val="000000" w:themeColor="text1"/>
+        </w:rPr>
+      </w:pPr>
+      <w:r>
+        <w:rPr>
+          <w:color w:val="000000" w:themeColor="text1"/>
+        </w:rPr>
+        <w:tab/>
+        <w:t>}</w:t>
+      </w:r>
+    </w:p>
+    <w:p>
+      <w:pPr>
+        <w:rPr>
+          <w:color w:val="000000" w:themeColor="text1"/>
+        </w:rPr>
+      </w:pPr>
+      <w:r>
+        <w:rPr>
+          <w:b/>
+          <w:color w:val="000000" w:themeColor="text1"/>
+        </w:rPr>
+        <w:t xml:space="preserve">Resultado esperado: </w:t>
+      </w:r>
+      <w:r>
+        <w:rPr>
+          <w:color w:val="000000" w:themeColor="text1"/>
+        </w:rPr>
+        <w:t xml:space="preserve">Lançar exceção </w:t>
+      </w:r>
+      <w:proofErr w:type="spellStart"/>
+      <w:r>
+        <w:rPr>
+          <w:color w:val="000000" w:themeColor="text1"/>
+        </w:rPr>
+        <w:t>Invalid</w:t>
+      </w:r>
+      <w:r>
+        <w:rPr>
+          <w:color w:val="000000" w:themeColor="text1"/>
+        </w:rPr>
+        <w:t>Password</w:t>
+      </w:r>
+      <w:r>
+        <w:rPr>
+          <w:color w:val="000000" w:themeColor="text1"/>
+        </w:rPr>
+        <w:t>Exception</w:t>
+      </w:r>
+      <w:proofErr w:type="spellEnd"/>
+      <w:r>
+        <w:rPr>
+          <w:color w:val="000000" w:themeColor="text1"/>
+        </w:rPr>
+        <w:t xml:space="preserve"> com a mensagem “</w:t>
+      </w:r>
+      <w:r>
+        <w:rPr>
+          <w:color w:val="000000" w:themeColor="text1"/>
+        </w:rPr>
+        <w:t>Senha do usuário deve ter entre 4 e 32 caracteres</w:t>
+      </w:r>
+      <w:r>
+        <w:rPr>
+          <w:color w:val="000000" w:themeColor="text1"/>
+        </w:rPr>
+        <w:t>”.</w:t>
+      </w:r>
+    </w:p>
+    <w:p>
+      <w:pPr>
+        <w:rPr>
+          <w:color w:val="000000" w:themeColor="text1"/>
+        </w:rPr>
+      </w:pPr>
+      <w:r>
+        <w:rPr>
+          <w:b/>
+          <w:color w:val="000000" w:themeColor="text1"/>
+        </w:rPr>
+        <w:lastRenderedPageBreak/>
         <w:t>Status:</w:t>
       </w:r>
       <w:r>
@@ -17016,6 +18340,7 @@
         </w:rPr>
         <w:t>login: “</w:t>
       </w:r>
+      <w:proofErr w:type="spellStart"/>
       <w:r>
         <w:rPr>
           <w:color w:val="000000" w:themeColor="text1"/>
@@ -17023,6 +18348,7 @@
         </w:rPr>
         <w:t>login_existente</w:t>
       </w:r>
+      <w:proofErr w:type="spellEnd"/>
       <w:r>
         <w:rPr>
           <w:color w:val="000000" w:themeColor="text1"/>
@@ -17098,7 +18424,20 @@
           <w:color w:val="000000" w:themeColor="text1"/>
         </w:rPr>
         <w:tab/>
-        <w:t>email: “teste@email.com”</w:t>
+      </w:r>
+      <w:proofErr w:type="spellStart"/>
+      <w:r>
+        <w:rPr>
+          <w:color w:val="000000" w:themeColor="text1"/>
+        </w:rPr>
+        <w:t>email</w:t>
+      </w:r>
+      <w:proofErr w:type="spellEnd"/>
+      <w:r>
+        <w:rPr>
+          <w:color w:val="000000" w:themeColor="text1"/>
+        </w:rPr>
+        <w:t>: “teste@email.com”</w:t>
       </w:r>
     </w:p>
     <w:p>
@@ -17174,12 +18513,14 @@
         </w:rPr>
         <w:t xml:space="preserve">Lançar exceção </w:t>
       </w:r>
+      <w:proofErr w:type="spellStart"/>
       <w:r>
         <w:rPr>
           <w:color w:val="000000" w:themeColor="text1"/>
         </w:rPr>
         <w:t>EntityAlreadyExisting</w:t>
       </w:r>
+      <w:proofErr w:type="spellEnd"/>
       <w:r>
         <w:rPr>
           <w:color w:val="000000" w:themeColor="text1"/>
@@ -17218,7 +18559,6 @@
           <w:b/>
           <w:color w:val="000000" w:themeColor="text1"/>
         </w:rPr>
-        <w:lastRenderedPageBreak/>
         <w:t>Realização do teste:</w:t>
       </w:r>
       <w:r>
@@ -18036,6 +19376,92 @@
     </w:lvl>
   </w:abstractNum>
   <w:abstractNum w:abstractNumId="3" w15:restartNumberingAfterBreak="0">
+    <w:nsid w:val="0CF70501"/>
+    <w:multiLevelType w:val="multilevel"/>
+    <w:tmpl w:val="7EAE38A0"/>
+    <w:lvl w:ilvl="0">
+      <w:start w:val="1"/>
+      <w:numFmt w:val="decimal"/>
+      <w:lvlText w:val="%1."/>
+      <w:lvlJc w:val="left"/>
+      <w:pPr>
+        <w:ind w:left="709" w:hanging="360"/>
+      </w:pPr>
+    </w:lvl>
+    <w:lvl w:ilvl="1">
+      <w:start w:val="1"/>
+      <w:numFmt w:val="lowerLetter"/>
+      <w:lvlText w:val="%2."/>
+      <w:lvlJc w:val="left"/>
+      <w:pPr>
+        <w:ind w:left="1429" w:hanging="360"/>
+      </w:pPr>
+    </w:lvl>
+    <w:lvl w:ilvl="2">
+      <w:start w:val="1"/>
+      <w:numFmt w:val="lowerRoman"/>
+      <w:lvlText w:val="%3."/>
+      <w:lvlJc w:val="right"/>
+      <w:pPr>
+        <w:ind w:left="2149" w:hanging="180"/>
+      </w:pPr>
+    </w:lvl>
+    <w:lvl w:ilvl="3">
+      <w:start w:val="1"/>
+      <w:numFmt w:val="decimal"/>
+      <w:lvlText w:val="%4."/>
+      <w:lvlJc w:val="left"/>
+      <w:pPr>
+        <w:ind w:left="2869" w:hanging="360"/>
+      </w:pPr>
+    </w:lvl>
+    <w:lvl w:ilvl="4">
+      <w:start w:val="1"/>
+      <w:numFmt w:val="lowerLetter"/>
+      <w:lvlText w:val="%5."/>
+      <w:lvlJc w:val="left"/>
+      <w:pPr>
+        <w:ind w:left="3589" w:hanging="360"/>
+      </w:pPr>
+    </w:lvl>
+    <w:lvl w:ilvl="5">
+      <w:start w:val="1"/>
+      <w:numFmt w:val="lowerRoman"/>
+      <w:lvlText w:val="%6."/>
+      <w:lvlJc w:val="right"/>
+      <w:pPr>
+        <w:ind w:left="4309" w:hanging="180"/>
+      </w:pPr>
+    </w:lvl>
+    <w:lvl w:ilvl="6">
+      <w:start w:val="1"/>
+      <w:numFmt w:val="decimal"/>
+      <w:lvlText w:val="%7."/>
+      <w:lvlJc w:val="left"/>
+      <w:pPr>
+        <w:ind w:left="5029" w:hanging="360"/>
+      </w:pPr>
+    </w:lvl>
+    <w:lvl w:ilvl="7">
+      <w:start w:val="1"/>
+      <w:numFmt w:val="lowerLetter"/>
+      <w:lvlText w:val="%8."/>
+      <w:lvlJc w:val="left"/>
+      <w:pPr>
+        <w:ind w:left="5749" w:hanging="360"/>
+      </w:pPr>
+    </w:lvl>
+    <w:lvl w:ilvl="8">
+      <w:start w:val="1"/>
+      <w:numFmt w:val="lowerRoman"/>
+      <w:lvlText w:val="%9."/>
+      <w:lvlJc w:val="right"/>
+      <w:pPr>
+        <w:ind w:left="6469" w:hanging="180"/>
+      </w:pPr>
+    </w:lvl>
+  </w:abstractNum>
+  <w:abstractNum w:abstractNumId="4" w15:restartNumberingAfterBreak="0">
     <w:nsid w:val="0F7126F9"/>
     <w:multiLevelType w:val="multilevel"/>
     <w:tmpl w:val="992CC7A0"/>
@@ -18121,7 +19547,7 @@
       </w:pPr>
     </w:lvl>
   </w:abstractNum>
-  <w:abstractNum w:abstractNumId="4" w15:restartNumberingAfterBreak="0">
+  <w:abstractNum w:abstractNumId="5" w15:restartNumberingAfterBreak="0">
     <w:nsid w:val="101F3353"/>
     <w:multiLevelType w:val="multilevel"/>
     <w:tmpl w:val="7EAE38A0"/>
@@ -18207,7 +19633,7 @@
       </w:pPr>
     </w:lvl>
   </w:abstractNum>
-  <w:abstractNum w:abstractNumId="5" w15:restartNumberingAfterBreak="0">
+  <w:abstractNum w:abstractNumId="6" w15:restartNumberingAfterBreak="0">
     <w:nsid w:val="10C87B59"/>
     <w:multiLevelType w:val="multilevel"/>
     <w:tmpl w:val="98CC4F86"/>
@@ -18320,7 +19746,7 @@
       </w:rPr>
     </w:lvl>
   </w:abstractNum>
-  <w:abstractNum w:abstractNumId="6" w15:restartNumberingAfterBreak="0">
+  <w:abstractNum w:abstractNumId="7" w15:restartNumberingAfterBreak="0">
     <w:nsid w:val="15A10665"/>
     <w:multiLevelType w:val="multilevel"/>
     <w:tmpl w:val="7EAE38A0"/>
@@ -18406,7 +19832,7 @@
       </w:pPr>
     </w:lvl>
   </w:abstractNum>
-  <w:abstractNum w:abstractNumId="7" w15:restartNumberingAfterBreak="0">
+  <w:abstractNum w:abstractNumId="8" w15:restartNumberingAfterBreak="0">
     <w:nsid w:val="1C297EA4"/>
     <w:multiLevelType w:val="multilevel"/>
     <w:tmpl w:val="4C245F70"/>
@@ -18519,7 +19945,7 @@
       </w:rPr>
     </w:lvl>
   </w:abstractNum>
-  <w:abstractNum w:abstractNumId="8" w15:restartNumberingAfterBreak="0">
+  <w:abstractNum w:abstractNumId="9" w15:restartNumberingAfterBreak="0">
     <w:nsid w:val="1CEC4C74"/>
     <w:multiLevelType w:val="multilevel"/>
     <w:tmpl w:val="7EAE38A0"/>
@@ -18605,7 +20031,7 @@
       </w:pPr>
     </w:lvl>
   </w:abstractNum>
-  <w:abstractNum w:abstractNumId="9" w15:restartNumberingAfterBreak="0">
+  <w:abstractNum w:abstractNumId="10" w15:restartNumberingAfterBreak="0">
     <w:nsid w:val="2567169C"/>
     <w:multiLevelType w:val="multilevel"/>
     <w:tmpl w:val="7EAE38A0"/>
@@ -18691,7 +20117,7 @@
       </w:pPr>
     </w:lvl>
   </w:abstractNum>
-  <w:abstractNum w:abstractNumId="10" w15:restartNumberingAfterBreak="0">
+  <w:abstractNum w:abstractNumId="11" w15:restartNumberingAfterBreak="0">
     <w:nsid w:val="27687D6D"/>
     <w:multiLevelType w:val="multilevel"/>
     <w:tmpl w:val="33B28994"/>
@@ -18777,7 +20203,7 @@
       </w:pPr>
     </w:lvl>
   </w:abstractNum>
-  <w:abstractNum w:abstractNumId="11" w15:restartNumberingAfterBreak="0">
+  <w:abstractNum w:abstractNumId="12" w15:restartNumberingAfterBreak="0">
     <w:nsid w:val="28492A00"/>
     <w:multiLevelType w:val="multilevel"/>
     <w:tmpl w:val="DF10247E"/>
@@ -18890,7 +20316,7 @@
       </w:rPr>
     </w:lvl>
   </w:abstractNum>
-  <w:abstractNum w:abstractNumId="12" w15:restartNumberingAfterBreak="0">
+  <w:abstractNum w:abstractNumId="13" w15:restartNumberingAfterBreak="0">
     <w:nsid w:val="29530051"/>
     <w:multiLevelType w:val="multilevel"/>
     <w:tmpl w:val="C04CB900"/>
@@ -19003,7 +20429,7 @@
       </w:rPr>
     </w:lvl>
   </w:abstractNum>
-  <w:abstractNum w:abstractNumId="13" w15:restartNumberingAfterBreak="0">
+  <w:abstractNum w:abstractNumId="14" w15:restartNumberingAfterBreak="0">
     <w:nsid w:val="311B04C2"/>
     <w:multiLevelType w:val="multilevel"/>
     <w:tmpl w:val="4B86EAF0"/>
@@ -19116,7 +20542,7 @@
       </w:rPr>
     </w:lvl>
   </w:abstractNum>
-  <w:abstractNum w:abstractNumId="14" w15:restartNumberingAfterBreak="0">
+  <w:abstractNum w:abstractNumId="15" w15:restartNumberingAfterBreak="0">
     <w:nsid w:val="32FE743C"/>
     <w:multiLevelType w:val="multilevel"/>
     <w:tmpl w:val="7EAE38A0"/>
@@ -19202,7 +20628,7 @@
       </w:pPr>
     </w:lvl>
   </w:abstractNum>
-  <w:abstractNum w:abstractNumId="15" w15:restartNumberingAfterBreak="0">
+  <w:abstractNum w:abstractNumId="16" w15:restartNumberingAfterBreak="0">
     <w:nsid w:val="357171FE"/>
     <w:multiLevelType w:val="multilevel"/>
     <w:tmpl w:val="7EAE38A0"/>
@@ -19288,7 +20714,7 @@
       </w:pPr>
     </w:lvl>
   </w:abstractNum>
-  <w:abstractNum w:abstractNumId="16" w15:restartNumberingAfterBreak="0">
+  <w:abstractNum w:abstractNumId="17" w15:restartNumberingAfterBreak="0">
     <w:nsid w:val="35873CED"/>
     <w:multiLevelType w:val="multilevel"/>
     <w:tmpl w:val="316EA91C"/>
@@ -19401,7 +20827,7 @@
       </w:rPr>
     </w:lvl>
   </w:abstractNum>
-  <w:abstractNum w:abstractNumId="17" w15:restartNumberingAfterBreak="0">
+  <w:abstractNum w:abstractNumId="18" w15:restartNumberingAfterBreak="0">
     <w:nsid w:val="35D208BE"/>
     <w:multiLevelType w:val="hybridMultilevel"/>
     <w:tmpl w:val="FEB2915A"/>
@@ -19514,7 +20940,7 @@
       </w:rPr>
     </w:lvl>
   </w:abstractNum>
-  <w:abstractNum w:abstractNumId="18" w15:restartNumberingAfterBreak="0">
+  <w:abstractNum w:abstractNumId="19" w15:restartNumberingAfterBreak="0">
     <w:nsid w:val="388742F9"/>
     <w:multiLevelType w:val="multilevel"/>
     <w:tmpl w:val="7EAE38A0"/>
@@ -19600,7 +21026,7 @@
       </w:pPr>
     </w:lvl>
   </w:abstractNum>
-  <w:abstractNum w:abstractNumId="19" w15:restartNumberingAfterBreak="0">
+  <w:abstractNum w:abstractNumId="20" w15:restartNumberingAfterBreak="0">
     <w:nsid w:val="3AE82604"/>
     <w:multiLevelType w:val="multilevel"/>
     <w:tmpl w:val="5EC8825C"/>
@@ -19713,7 +21139,7 @@
       </w:rPr>
     </w:lvl>
   </w:abstractNum>
-  <w:abstractNum w:abstractNumId="20" w15:restartNumberingAfterBreak="0">
+  <w:abstractNum w:abstractNumId="21" w15:restartNumberingAfterBreak="0">
     <w:nsid w:val="425F7142"/>
     <w:multiLevelType w:val="multilevel"/>
     <w:tmpl w:val="6C3A65C8"/>
@@ -19826,7 +21252,7 @@
       </w:rPr>
     </w:lvl>
   </w:abstractNum>
-  <w:abstractNum w:abstractNumId="21" w15:restartNumberingAfterBreak="0">
+  <w:abstractNum w:abstractNumId="22" w15:restartNumberingAfterBreak="0">
     <w:nsid w:val="433872DF"/>
     <w:multiLevelType w:val="multilevel"/>
     <w:tmpl w:val="473E9B32"/>
@@ -19939,7 +21365,7 @@
       </w:rPr>
     </w:lvl>
   </w:abstractNum>
-  <w:abstractNum w:abstractNumId="22" w15:restartNumberingAfterBreak="0">
+  <w:abstractNum w:abstractNumId="23" w15:restartNumberingAfterBreak="0">
     <w:nsid w:val="4ABF56A0"/>
     <w:multiLevelType w:val="multilevel"/>
     <w:tmpl w:val="0D8E790A"/>
@@ -20025,7 +21451,7 @@
       </w:pPr>
     </w:lvl>
   </w:abstractNum>
-  <w:abstractNum w:abstractNumId="23" w15:restartNumberingAfterBreak="0">
+  <w:abstractNum w:abstractNumId="24" w15:restartNumberingAfterBreak="0">
     <w:nsid w:val="4C99572E"/>
     <w:multiLevelType w:val="hybridMultilevel"/>
     <w:tmpl w:val="81062254"/>
@@ -20138,7 +21564,7 @@
       </w:rPr>
     </w:lvl>
   </w:abstractNum>
-  <w:abstractNum w:abstractNumId="24" w15:restartNumberingAfterBreak="0">
+  <w:abstractNum w:abstractNumId="25" w15:restartNumberingAfterBreak="0">
     <w:nsid w:val="4DB86243"/>
     <w:multiLevelType w:val="multilevel"/>
     <w:tmpl w:val="D652AE68"/>
@@ -20251,7 +21677,7 @@
       </w:rPr>
     </w:lvl>
   </w:abstractNum>
-  <w:abstractNum w:abstractNumId="25" w15:restartNumberingAfterBreak="0">
+  <w:abstractNum w:abstractNumId="26" w15:restartNumberingAfterBreak="0">
     <w:nsid w:val="5C394BC9"/>
     <w:multiLevelType w:val="multilevel"/>
     <w:tmpl w:val="7EAE38A0"/>
@@ -20337,7 +21763,7 @@
       </w:pPr>
     </w:lvl>
   </w:abstractNum>
-  <w:abstractNum w:abstractNumId="26" w15:restartNumberingAfterBreak="0">
+  <w:abstractNum w:abstractNumId="27" w15:restartNumberingAfterBreak="0">
     <w:nsid w:val="610B3EDF"/>
     <w:multiLevelType w:val="multilevel"/>
     <w:tmpl w:val="7EAE38A0"/>
@@ -20423,7 +21849,7 @@
       </w:pPr>
     </w:lvl>
   </w:abstractNum>
-  <w:abstractNum w:abstractNumId="27" w15:restartNumberingAfterBreak="0">
+  <w:abstractNum w:abstractNumId="28" w15:restartNumberingAfterBreak="0">
     <w:nsid w:val="67403CB5"/>
     <w:multiLevelType w:val="multilevel"/>
     <w:tmpl w:val="75326788"/>
@@ -20536,7 +21962,7 @@
       </w:rPr>
     </w:lvl>
   </w:abstractNum>
-  <w:abstractNum w:abstractNumId="28" w15:restartNumberingAfterBreak="0">
+  <w:abstractNum w:abstractNumId="29" w15:restartNumberingAfterBreak="0">
     <w:nsid w:val="67C547F7"/>
     <w:multiLevelType w:val="multilevel"/>
     <w:tmpl w:val="35EAD4B8"/>
@@ -20622,7 +22048,7 @@
       </w:pPr>
     </w:lvl>
   </w:abstractNum>
-  <w:abstractNum w:abstractNumId="29" w15:restartNumberingAfterBreak="0">
+  <w:abstractNum w:abstractNumId="30" w15:restartNumberingAfterBreak="0">
     <w:nsid w:val="6A841B74"/>
     <w:multiLevelType w:val="multilevel"/>
     <w:tmpl w:val="7EAE38A0"/>
@@ -20708,7 +22134,7 @@
       </w:pPr>
     </w:lvl>
   </w:abstractNum>
-  <w:abstractNum w:abstractNumId="30" w15:restartNumberingAfterBreak="0">
+  <w:abstractNum w:abstractNumId="31" w15:restartNumberingAfterBreak="0">
     <w:nsid w:val="6C8202C1"/>
     <w:multiLevelType w:val="multilevel"/>
     <w:tmpl w:val="981048B2"/>
@@ -20821,7 +22247,7 @@
       </w:rPr>
     </w:lvl>
   </w:abstractNum>
-  <w:abstractNum w:abstractNumId="31" w15:restartNumberingAfterBreak="0">
+  <w:abstractNum w:abstractNumId="32" w15:restartNumberingAfterBreak="0">
     <w:nsid w:val="6CD6232C"/>
     <w:multiLevelType w:val="multilevel"/>
     <w:tmpl w:val="2C50429A"/>
@@ -20934,7 +22360,7 @@
       </w:rPr>
     </w:lvl>
   </w:abstractNum>
-  <w:abstractNum w:abstractNumId="32" w15:restartNumberingAfterBreak="0">
+  <w:abstractNum w:abstractNumId="33" w15:restartNumberingAfterBreak="0">
     <w:nsid w:val="6FBC5385"/>
     <w:multiLevelType w:val="multilevel"/>
     <w:tmpl w:val="9E36186C"/>
@@ -21047,7 +22473,7 @@
       </w:rPr>
     </w:lvl>
   </w:abstractNum>
-  <w:abstractNum w:abstractNumId="33" w15:restartNumberingAfterBreak="0">
+  <w:abstractNum w:abstractNumId="34" w15:restartNumberingAfterBreak="0">
     <w:nsid w:val="74B049B9"/>
     <w:multiLevelType w:val="multilevel"/>
     <w:tmpl w:val="7EAE38A0"/>
@@ -21133,7 +22559,7 @@
       </w:pPr>
     </w:lvl>
   </w:abstractNum>
-  <w:abstractNum w:abstractNumId="34" w15:restartNumberingAfterBreak="0">
+  <w:abstractNum w:abstractNumId="35" w15:restartNumberingAfterBreak="0">
     <w:nsid w:val="74C61032"/>
     <w:multiLevelType w:val="multilevel"/>
     <w:tmpl w:val="7EAE38A0"/>
@@ -21219,7 +22645,7 @@
       </w:pPr>
     </w:lvl>
   </w:abstractNum>
-  <w:abstractNum w:abstractNumId="35" w15:restartNumberingAfterBreak="0">
+  <w:abstractNum w:abstractNumId="36" w15:restartNumberingAfterBreak="0">
     <w:nsid w:val="7ABF4D30"/>
     <w:multiLevelType w:val="multilevel"/>
     <w:tmpl w:val="C61A779C"/>
@@ -21332,7 +22758,7 @@
       </w:rPr>
     </w:lvl>
   </w:abstractNum>
-  <w:abstractNum w:abstractNumId="36" w15:restartNumberingAfterBreak="0">
+  <w:abstractNum w:abstractNumId="37" w15:restartNumberingAfterBreak="0">
     <w:nsid w:val="7E36314E"/>
     <w:multiLevelType w:val="hybridMultilevel"/>
     <w:tmpl w:val="6FDA89B4"/>
@@ -21445,7 +22871,7 @@
       </w:rPr>
     </w:lvl>
   </w:abstractNum>
-  <w:abstractNum w:abstractNumId="37" w15:restartNumberingAfterBreak="0">
+  <w:abstractNum w:abstractNumId="38" w15:restartNumberingAfterBreak="0">
     <w:nsid w:val="7ED21264"/>
     <w:multiLevelType w:val="multilevel"/>
     <w:tmpl w:val="87B4A5EE"/>
@@ -21558,7 +22984,7 @@
       </w:rPr>
     </w:lvl>
   </w:abstractNum>
-  <w:abstractNum w:abstractNumId="38" w15:restartNumberingAfterBreak="0">
+  <w:abstractNum w:abstractNumId="39" w15:restartNumberingAfterBreak="0">
     <w:nsid w:val="7FF4155E"/>
     <w:multiLevelType w:val="multilevel"/>
     <w:tmpl w:val="F9722B4C"/>
@@ -21651,118 +23077,121 @@
     <w:abstractNumId w:val="1"/>
   </w:num>
   <w:num w:numId="2" w16cid:durableId="88086438">
-    <w:abstractNumId w:val="35"/>
+    <w:abstractNumId w:val="36"/>
   </w:num>
   <w:num w:numId="3" w16cid:durableId="1706714901">
-    <w:abstractNumId w:val="31"/>
+    <w:abstractNumId w:val="32"/>
   </w:num>
   <w:num w:numId="4" w16cid:durableId="113717744">
     <w:abstractNumId w:val="0"/>
   </w:num>
   <w:num w:numId="5" w16cid:durableId="74671158">
+    <w:abstractNumId w:val="14"/>
+  </w:num>
+  <w:num w:numId="6" w16cid:durableId="913590874">
+    <w:abstractNumId w:val="25"/>
+  </w:num>
+  <w:num w:numId="7" w16cid:durableId="1890459348">
+    <w:abstractNumId w:val="39"/>
+  </w:num>
+  <w:num w:numId="8" w16cid:durableId="333532636">
     <w:abstractNumId w:val="13"/>
   </w:num>
-  <w:num w:numId="6" w16cid:durableId="913590874">
+  <w:num w:numId="9" w16cid:durableId="128785046">
+    <w:abstractNumId w:val="31"/>
+  </w:num>
+  <w:num w:numId="10" w16cid:durableId="905458532">
+    <w:abstractNumId w:val="8"/>
+  </w:num>
+  <w:num w:numId="11" w16cid:durableId="1135484454">
+    <w:abstractNumId w:val="17"/>
+  </w:num>
+  <w:num w:numId="12" w16cid:durableId="568999983">
+    <w:abstractNumId w:val="38"/>
+  </w:num>
+  <w:num w:numId="13" w16cid:durableId="1767190151">
+    <w:abstractNumId w:val="6"/>
+  </w:num>
+  <w:num w:numId="14" w16cid:durableId="715394213">
+    <w:abstractNumId w:val="22"/>
+  </w:num>
+  <w:num w:numId="15" w16cid:durableId="1314019323">
+    <w:abstractNumId w:val="20"/>
+  </w:num>
+  <w:num w:numId="16" w16cid:durableId="2108111862">
+    <w:abstractNumId w:val="33"/>
+  </w:num>
+  <w:num w:numId="17" w16cid:durableId="1320620575">
+    <w:abstractNumId w:val="28"/>
+  </w:num>
+  <w:num w:numId="18" w16cid:durableId="1431511382">
+    <w:abstractNumId w:val="12"/>
+  </w:num>
+  <w:num w:numId="19" w16cid:durableId="1528325566">
+    <w:abstractNumId w:val="21"/>
+  </w:num>
+  <w:num w:numId="20" w16cid:durableId="990518204">
+    <w:abstractNumId w:val="23"/>
+  </w:num>
+  <w:num w:numId="21" w16cid:durableId="900098538">
+    <w:abstractNumId w:val="11"/>
+  </w:num>
+  <w:num w:numId="22" w16cid:durableId="1159611945">
+    <w:abstractNumId w:val="29"/>
+  </w:num>
+  <w:num w:numId="23" w16cid:durableId="727652842">
+    <w:abstractNumId w:val="4"/>
+  </w:num>
+  <w:num w:numId="24" w16cid:durableId="1596135007">
+    <w:abstractNumId w:val="27"/>
+  </w:num>
+  <w:num w:numId="25" w16cid:durableId="414478111">
+    <w:abstractNumId w:val="26"/>
+  </w:num>
+  <w:num w:numId="26" w16cid:durableId="372466584">
+    <w:abstractNumId w:val="10"/>
+  </w:num>
+  <w:num w:numId="27" w16cid:durableId="1787504088">
+    <w:abstractNumId w:val="37"/>
+  </w:num>
+  <w:num w:numId="28" w16cid:durableId="927734810">
     <w:abstractNumId w:val="24"/>
   </w:num>
-  <w:num w:numId="7" w16cid:durableId="1890459348">
-    <w:abstractNumId w:val="38"/>
-  </w:num>
-  <w:num w:numId="8" w16cid:durableId="333532636">
-    <w:abstractNumId w:val="12"/>
-  </w:num>
-  <w:num w:numId="9" w16cid:durableId="128785046">
-    <w:abstractNumId w:val="30"/>
-  </w:num>
-  <w:num w:numId="10" w16cid:durableId="905458532">
-    <w:abstractNumId w:val="7"/>
-  </w:num>
-  <w:num w:numId="11" w16cid:durableId="1135484454">
-    <w:abstractNumId w:val="16"/>
-  </w:num>
-  <w:num w:numId="12" w16cid:durableId="568999983">
-    <w:abstractNumId w:val="37"/>
-  </w:num>
-  <w:num w:numId="13" w16cid:durableId="1767190151">
-    <w:abstractNumId w:val="5"/>
-  </w:num>
-  <w:num w:numId="14" w16cid:durableId="715394213">
-    <w:abstractNumId w:val="21"/>
-  </w:num>
-  <w:num w:numId="15" w16cid:durableId="1314019323">
-    <w:abstractNumId w:val="19"/>
-  </w:num>
-  <w:num w:numId="16" w16cid:durableId="2108111862">
-    <w:abstractNumId w:val="32"/>
-  </w:num>
-  <w:num w:numId="17" w16cid:durableId="1320620575">
-    <w:abstractNumId w:val="27"/>
-  </w:num>
-  <w:num w:numId="18" w16cid:durableId="1431511382">
-    <w:abstractNumId w:val="11"/>
-  </w:num>
-  <w:num w:numId="19" w16cid:durableId="1528325566">
-    <w:abstractNumId w:val="20"/>
-  </w:num>
-  <w:num w:numId="20" w16cid:durableId="990518204">
-    <w:abstractNumId w:val="22"/>
-  </w:num>
-  <w:num w:numId="21" w16cid:durableId="900098538">
-    <w:abstractNumId w:val="10"/>
-  </w:num>
-  <w:num w:numId="22" w16cid:durableId="1159611945">
-    <w:abstractNumId w:val="28"/>
-  </w:num>
-  <w:num w:numId="23" w16cid:durableId="727652842">
-    <w:abstractNumId w:val="3"/>
-  </w:num>
-  <w:num w:numId="24" w16cid:durableId="1596135007">
-    <w:abstractNumId w:val="26"/>
-  </w:num>
-  <w:num w:numId="25" w16cid:durableId="414478111">
-    <w:abstractNumId w:val="25"/>
-  </w:num>
-  <w:num w:numId="26" w16cid:durableId="372466584">
-    <w:abstractNumId w:val="9"/>
-  </w:num>
-  <w:num w:numId="27" w16cid:durableId="1787504088">
-    <w:abstractNumId w:val="36"/>
-  </w:num>
-  <w:num w:numId="28" w16cid:durableId="927734810">
-    <w:abstractNumId w:val="23"/>
-  </w:num>
   <w:num w:numId="29" w16cid:durableId="1914387497">
-    <w:abstractNumId w:val="17"/>
+    <w:abstractNumId w:val="18"/>
   </w:num>
   <w:num w:numId="30" w16cid:durableId="36636164">
     <w:abstractNumId w:val="2"/>
   </w:num>
   <w:num w:numId="31" w16cid:durableId="1094086007">
-    <w:abstractNumId w:val="4"/>
+    <w:abstractNumId w:val="5"/>
   </w:num>
   <w:num w:numId="32" w16cid:durableId="1891846306">
-    <w:abstractNumId w:val="33"/>
+    <w:abstractNumId w:val="34"/>
   </w:num>
   <w:num w:numId="33" w16cid:durableId="97263838">
-    <w:abstractNumId w:val="14"/>
+    <w:abstractNumId w:val="15"/>
   </w:num>
   <w:num w:numId="34" w16cid:durableId="1629428421">
-    <w:abstractNumId w:val="15"/>
+    <w:abstractNumId w:val="16"/>
   </w:num>
   <w:num w:numId="35" w16cid:durableId="1199733513">
-    <w:abstractNumId w:val="8"/>
+    <w:abstractNumId w:val="9"/>
   </w:num>
   <w:num w:numId="36" w16cid:durableId="289866735">
-    <w:abstractNumId w:val="34"/>
+    <w:abstractNumId w:val="35"/>
   </w:num>
   <w:num w:numId="37" w16cid:durableId="106699201">
-    <w:abstractNumId w:val="18"/>
+    <w:abstractNumId w:val="19"/>
   </w:num>
   <w:num w:numId="38" w16cid:durableId="1859270063">
-    <w:abstractNumId w:val="29"/>
+    <w:abstractNumId w:val="30"/>
   </w:num>
   <w:num w:numId="39" w16cid:durableId="1472174">
-    <w:abstractNumId w:val="6"/>
+    <w:abstractNumId w:val="7"/>
+  </w:num>
+  <w:num w:numId="40" w16cid:durableId="800656694">
+    <w:abstractNumId w:val="3"/>
   </w:num>
 </w:numbering>
 </file>

</xml_diff>

<commit_message>
docs: Adicionado teste unitário TU001.15
</commit_message>
<xml_diff>
--- a/documentation/Especificacao_de_Requisitos_de_Software.docx
+++ b/documentation/Especificacao_de_Requisitos_de_Software.docx
@@ -25152,12 +25152,959 @@
         <w:ind/>
         <w:rPr>
           <w:color w:val="000000" w:themeColor="text1"/>
+        </w:rPr>
+      </w:pPr>
+      <w:r>
+        <w:rPr>
+          <w:b/>
+          <w:color w:val="000000" w:themeColor="text1"/>
+        </w:rPr>
+        <w:t xml:space="preserve">Responsável: </w:t>
+      </w:r>
+      <w:r>
+        <w:rPr>
+          <w:color w:val="000000" w:themeColor="text1"/>
+        </w:rPr>
+        <w:t xml:space="preserve">A definir.</w:t>
+      </w:r>
+      <w:r>
+        <w:rPr>
+          <w:color w:val="000000" w:themeColor="text1"/>
           <w:highlight w:val="none"/>
         </w:rPr>
+      </w:r>
+    </w:p>
+    <w:p>
+      <w:pPr>
+        <w:pBdr/>
+        <w:tabs>
+          <w:tab w:val="left" w:leader="none" w:pos="2703"/>
+        </w:tabs>
+        <w:spacing/>
+        <w:ind/>
+        <w:rPr>
+          <w:color w:val="000000" w:themeColor="text1"/>
+          <w:highlight w:val="none"/>
+        </w:rPr>
+      </w:pPr>
+      <w:r>
+        <w:rPr>
+          <w:color w:val="000000" w:themeColor="text1"/>
+          <w:highlight w:val="none"/>
+        </w:rPr>
+      </w:r>
+      <w:r>
+        <w:rPr>
+          <w:color w:val="000000" w:themeColor="text1"/>
+          <w:highlight w:val="none"/>
+        </w:rPr>
+      </w:r>
+    </w:p>
+    <w:p>
+      <w:pPr>
+        <w:pStyle w:val="793"/>
+        <w:pBdr/>
+        <w:spacing/>
+        <w:ind/>
+        <w:rPr>
+          <w:color w:val="ff0000"/>
+        </w:rPr>
+      </w:pPr>
+      <w:r>
+        <w:t xml:space="preserve">6.1.1.1</w:t>
+      </w:r>
+      <w:r>
+        <w:t xml:space="preserve">5 [TU001.1</w:t>
+      </w:r>
+      <w:r>
+        <w:t xml:space="preserve">5] </w:t>
+      </w:r>
+      <w:r>
+        <w:rPr>
+          <w:color w:val="000000" w:themeColor="text1"/>
+        </w:rPr>
+        <w:t xml:space="preserve">O sistema não deve </w:t>
+      </w:r>
+      <w:r>
+        <w:rPr>
+          <w:color w:val="000000" w:themeColor="text1"/>
+        </w:rPr>
+        <w:t xml:space="preserve">cadastrar usuário quando a senha tem apenas espaços em branco</w:t>
+      </w:r>
+      <w:r>
+        <w:rPr>
+          <w:color w:val="ff0000"/>
+        </w:rPr>
+      </w:r>
+    </w:p>
+    <w:p>
+      <w:pPr>
+        <w:pBdr/>
+        <w:spacing/>
+        <w:ind/>
+        <w:rPr/>
+      </w:pPr>
+      <w:r/>
+      <w:r/>
+      <w:r/>
+    </w:p>
+    <w:p>
+      <w:pPr>
+        <w:pBdr/>
+        <w:spacing/>
+        <w:ind/>
+        <w:rPr>
+          <w:color w:val="000000" w:themeColor="text1"/>
+        </w:rPr>
       </w:pPr>
       <w:r>
         <w:rPr>
           <w:b/>
+          <w:bCs/>
+          <w:color w:val="000000" w:themeColor="text1"/>
+        </w:rPr>
+        <w:t xml:space="preserve">Camada:</w:t>
+      </w:r>
+      <w:r>
+        <w:rPr>
+          <w:color w:val="000000" w:themeColor="text1"/>
+        </w:rPr>
+        <w:t xml:space="preserve"> Serviço.</w:t>
+      </w:r>
+      <w:r>
+        <w:rPr>
+          <w:color w:val="000000" w:themeColor="text1"/>
+        </w:rPr>
+      </w:r>
+      <w:r>
+        <w:rPr>
+          <w:color w:val="000000" w:themeColor="text1"/>
+        </w:rPr>
+      </w:r>
+    </w:p>
+    <w:p>
+      <w:pPr>
+        <w:pBdr/>
+        <w:spacing/>
+        <w:ind/>
+        <w:rPr>
+          <w:color w:val="000000" w:themeColor="text1"/>
+        </w:rPr>
+      </w:pPr>
+      <w:r>
+        <w:rPr>
+          <w:b/>
+          <w:color w:val="000000" w:themeColor="text1"/>
+        </w:rPr>
+        <w:t xml:space="preserve">Requisitos associados:</w:t>
+      </w:r>
+      <w:r>
+        <w:rPr>
+          <w:color w:val="000000" w:themeColor="text1"/>
+        </w:rPr>
+        <w:t xml:space="preserve"> RF001.01, RN001.10</w:t>
+      </w:r>
+      <w:r>
+        <w:rPr>
+          <w:color w:val="000000" w:themeColor="text1"/>
+        </w:rPr>
+        <w:t xml:space="preserve">.</w:t>
+      </w:r>
+      <w:r>
+        <w:rPr>
+          <w:color w:val="000000" w:themeColor="text1"/>
+        </w:rPr>
+      </w:r>
+      <w:r>
+        <w:rPr>
+          <w:color w:val="000000" w:themeColor="text1"/>
+        </w:rPr>
+      </w:r>
+    </w:p>
+    <w:p>
+      <w:pPr>
+        <w:pBdr/>
+        <w:spacing/>
+        <w:ind/>
+        <w:rPr>
+          <w:color w:val="000000" w:themeColor="text1"/>
+        </w:rPr>
+      </w:pPr>
+      <w:r>
+        <w:rPr>
+          <w:b/>
+          <w:color w:val="000000" w:themeColor="text1"/>
+        </w:rPr>
+        <w:t xml:space="preserve">Descrição: </w:t>
+      </w:r>
+      <w:r>
+        <w:rPr>
+          <w:color w:val="000000" w:themeColor="text1"/>
+        </w:rPr>
+        <w:t xml:space="preserve">O sistema não deve </w:t>
+      </w:r>
+      <w:r>
+        <w:rPr>
+          <w:color w:val="000000" w:themeColor="text1"/>
+        </w:rPr>
+        <w:t xml:space="preserve">cadastrar</w:t>
+      </w:r>
+      <w:r>
+        <w:rPr>
+          <w:color w:val="000000" w:themeColor="text1"/>
+        </w:rPr>
+        <w:t xml:space="preserve"> usuário.</w:t>
+      </w:r>
+      <w:r>
+        <w:rPr>
+          <w:color w:val="000000" w:themeColor="text1"/>
+        </w:rPr>
+      </w:r>
+      <w:r>
+        <w:rPr>
+          <w:color w:val="000000" w:themeColor="text1"/>
+        </w:rPr>
+      </w:r>
+    </w:p>
+    <w:p>
+      <w:pPr>
+        <w:pBdr/>
+        <w:spacing/>
+        <w:ind/>
+        <w:rPr>
+          <w:color w:val="000000" w:themeColor="text1"/>
+        </w:rPr>
+      </w:pPr>
+      <w:r>
+        <w:rPr>
+          <w:b/>
+          <w:color w:val="000000" w:themeColor="text1"/>
+        </w:rPr>
+        <w:t xml:space="preserve">Condições</w:t>
+      </w:r>
+      <w:r>
+        <w:rPr>
+          <w:color w:val="000000" w:themeColor="text1"/>
+        </w:rPr>
+        <w:t xml:space="preserve">: </w:t>
+      </w:r>
+      <w:r>
+        <w:rPr>
+          <w:color w:val="000000" w:themeColor="text1"/>
+        </w:rPr>
+        <w:t xml:space="preserve">Senha do usuário com 4 caracteres em branco</w:t>
+      </w:r>
+      <w:r>
+        <w:rPr>
+          <w:color w:val="000000" w:themeColor="text1"/>
+        </w:rPr>
+        <w:t xml:space="preserve">.</w:t>
+      </w:r>
+      <w:r>
+        <w:rPr>
+          <w:color w:val="000000" w:themeColor="text1"/>
+        </w:rPr>
+      </w:r>
+      <w:r>
+        <w:rPr>
+          <w:color w:val="000000" w:themeColor="text1"/>
+        </w:rPr>
+      </w:r>
+    </w:p>
+    <w:p>
+      <w:pPr>
+        <w:pBdr/>
+        <w:spacing/>
+        <w:ind/>
+        <w:rPr>
+          <w:color w:val="000000" w:themeColor="text1"/>
+        </w:rPr>
+      </w:pPr>
+      <w:r>
+        <w:rPr>
+          <w:b/>
+          <w:color w:val="000000" w:themeColor="text1"/>
+        </w:rPr>
+        <w:t xml:space="preserve">Passos:</w:t>
+      </w:r>
+      <w:r>
+        <w:rPr>
+          <w:color w:val="000000" w:themeColor="text1"/>
+        </w:rPr>
+        <w:t xml:space="preserve"> </w:t>
+      </w:r>
+      <w:r>
+        <w:rPr>
+          <w:color w:val="000000" w:themeColor="text1"/>
+        </w:rPr>
+      </w:r>
+      <w:r>
+        <w:rPr>
+          <w:color w:val="000000" w:themeColor="text1"/>
+        </w:rPr>
+      </w:r>
+    </w:p>
+    <w:p>
+      <w:pPr>
+        <w:pStyle w:val="951"/>
+        <w:numPr>
+          <w:ilvl w:val="0"/>
+          <w:numId w:val="42"/>
+        </w:numPr>
+        <w:pBdr/>
+        <w:spacing/>
+        <w:ind/>
+        <w:rPr>
+          <w:color w:val="000000" w:themeColor="text1"/>
+        </w:rPr>
+      </w:pPr>
+      <w:r>
+        <w:rPr>
+          <w:color w:val="000000" w:themeColor="text1"/>
+        </w:rPr>
+        <w:t xml:space="preserve">Informar os dados do usuário com </w:t>
+      </w:r>
+      <w:r>
+        <w:rPr>
+          <w:color w:val="000000" w:themeColor="text1"/>
+        </w:rPr>
+        <w:t xml:space="preserve">a senha com 4 </w:t>
+      </w:r>
+      <w:r>
+        <w:rPr>
+          <w:color w:val="000000" w:themeColor="text1"/>
+        </w:rPr>
+        <w:t xml:space="preserve">caracteres em branco</w:t>
+      </w:r>
+      <w:r>
+        <w:rPr>
+          <w:color w:val="000000" w:themeColor="text1"/>
+        </w:rPr>
+        <w:t xml:space="preserve">.</w:t>
+      </w:r>
+      <w:r>
+        <w:rPr>
+          <w:color w:val="000000" w:themeColor="text1"/>
+        </w:rPr>
+      </w:r>
+      <w:r>
+        <w:rPr>
+          <w:color w:val="000000" w:themeColor="text1"/>
+        </w:rPr>
+      </w:r>
+    </w:p>
+    <w:p>
+      <w:pPr>
+        <w:pStyle w:val="951"/>
+        <w:numPr>
+          <w:ilvl w:val="0"/>
+          <w:numId w:val="42"/>
+        </w:numPr>
+        <w:pBdr/>
+        <w:spacing/>
+        <w:ind/>
+        <w:rPr>
+          <w:color w:val="000000" w:themeColor="text1"/>
+        </w:rPr>
+      </w:pPr>
+      <w:r>
+        <w:rPr>
+          <w:color w:val="000000" w:themeColor="text1"/>
+        </w:rPr>
+        <w:t xml:space="preserve">Validar </w:t>
+      </w:r>
+      <w:r>
+        <w:rPr>
+          <w:color w:val="000000" w:themeColor="text1"/>
+        </w:rPr>
+        <w:t xml:space="preserve">os caracteres da senha</w:t>
+      </w:r>
+      <w:r>
+        <w:rPr>
+          <w:color w:val="000000" w:themeColor="text1"/>
+        </w:rPr>
+        <w:t xml:space="preserve">.</w:t>
+      </w:r>
+      <w:r>
+        <w:rPr>
+          <w:color w:val="000000" w:themeColor="text1"/>
+        </w:rPr>
+      </w:r>
+      <w:r>
+        <w:rPr>
+          <w:color w:val="000000" w:themeColor="text1"/>
+        </w:rPr>
+      </w:r>
+    </w:p>
+    <w:p>
+      <w:pPr>
+        <w:pStyle w:val="951"/>
+        <w:numPr>
+          <w:ilvl w:val="0"/>
+          <w:numId w:val="42"/>
+        </w:numPr>
+        <w:pBdr/>
+        <w:spacing/>
+        <w:ind/>
+        <w:rPr>
+          <w:color w:val="000000" w:themeColor="text1"/>
+        </w:rPr>
+      </w:pPr>
+      <w:r>
+        <w:rPr>
+          <w:color w:val="000000" w:themeColor="text1"/>
+        </w:rPr>
+        <w:t xml:space="preserve">Receber mensagem de erro ao </w:t>
+      </w:r>
+      <w:r>
+        <w:rPr>
+          <w:color w:val="000000" w:themeColor="text1"/>
+        </w:rPr>
+        <w:t xml:space="preserve">cadastrar senha inválida</w:t>
+      </w:r>
+      <w:r>
+        <w:rPr>
+          <w:color w:val="000000" w:themeColor="text1"/>
+        </w:rPr>
+        <w:t xml:space="preserve">.</w:t>
+      </w:r>
+      <w:r>
+        <w:rPr>
+          <w:color w:val="000000" w:themeColor="text1"/>
+        </w:rPr>
+      </w:r>
+      <w:r>
+        <w:rPr>
+          <w:color w:val="000000" w:themeColor="text1"/>
+        </w:rPr>
+      </w:r>
+    </w:p>
+    <w:p>
+      <w:pPr>
+        <w:pBdr/>
+        <w:spacing/>
+        <w:ind/>
+        <w:rPr>
+          <w:color w:val="000000" w:themeColor="text1"/>
+        </w:rPr>
+      </w:pPr>
+      <w:r>
+        <w:rPr>
+          <w:b/>
+          <w:color w:val="000000" w:themeColor="text1"/>
+        </w:rPr>
+        <w:t xml:space="preserve">Dados do teste:</w:t>
+      </w:r>
+      <w:r>
+        <w:rPr>
+          <w:color w:val="000000" w:themeColor="text1"/>
+        </w:rPr>
+        <w:t xml:space="preserve"> </w:t>
+      </w:r>
+      <w:r>
+        <w:rPr>
+          <w:color w:val="000000" w:themeColor="text1"/>
+        </w:rPr>
+      </w:r>
+      <w:r>
+        <w:rPr>
+          <w:color w:val="000000" w:themeColor="text1"/>
+        </w:rPr>
+      </w:r>
+    </w:p>
+    <w:p>
+      <w:pPr>
+        <w:pBdr/>
+        <w:spacing/>
+        <w:ind w:firstLine="720"/>
+        <w:rPr>
+          <w:color w:val="000000" w:themeColor="text1"/>
+        </w:rPr>
+      </w:pPr>
+      <w:r>
+        <w:rPr>
+          <w:color w:val="000000" w:themeColor="text1"/>
+        </w:rPr>
+        <w:t xml:space="preserve">{</w:t>
+      </w:r>
+      <w:r>
+        <w:rPr>
+          <w:color w:val="000000" w:themeColor="text1"/>
+        </w:rPr>
+      </w:r>
+      <w:r>
+        <w:rPr>
+          <w:color w:val="000000" w:themeColor="text1"/>
+        </w:rPr>
+      </w:r>
+    </w:p>
+    <w:p>
+      <w:pPr>
+        <w:pBdr/>
+        <w:spacing/>
+        <w:ind/>
+        <w:rPr>
+          <w:color w:val="000000" w:themeColor="text1"/>
+        </w:rPr>
+      </w:pPr>
+      <w:r>
+        <w:rPr>
+          <w:color w:val="000000" w:themeColor="text1"/>
+        </w:rPr>
+        <w:tab/>
+      </w:r>
+      <w:r>
+        <w:rPr>
+          <w:color w:val="000000" w:themeColor="text1"/>
+        </w:rPr>
+        <w:tab/>
+      </w:r>
+      <w:r>
+        <w:rPr>
+          <w:color w:val="000000" w:themeColor="text1"/>
+        </w:rPr>
+        <w:t xml:space="preserve">nome: “teste”</w:t>
+      </w:r>
+      <w:r>
+        <w:rPr>
+          <w:color w:val="000000" w:themeColor="text1"/>
+        </w:rPr>
+      </w:r>
+      <w:r>
+        <w:rPr>
+          <w:color w:val="000000" w:themeColor="text1"/>
+        </w:rPr>
+      </w:r>
+    </w:p>
+    <w:p>
+      <w:pPr>
+        <w:pBdr/>
+        <w:spacing/>
+        <w:ind/>
+        <w:rPr>
+          <w:color w:val="000000" w:themeColor="text1"/>
+        </w:rPr>
+      </w:pPr>
+      <w:r>
+        <w:rPr>
+          <w:color w:val="000000" w:themeColor="text1"/>
+        </w:rPr>
+        <w:tab/>
+      </w:r>
+      <w:r>
+        <w:rPr>
+          <w:color w:val="000000" w:themeColor="text1"/>
+        </w:rPr>
+        <w:tab/>
+      </w:r>
+      <w:r>
+        <w:rPr>
+          <w:color w:val="000000" w:themeColor="text1"/>
+        </w:rPr>
+        <w:t xml:space="preserve">login: “login”</w:t>
+      </w:r>
+      <w:r>
+        <w:rPr>
+          <w:color w:val="000000" w:themeColor="text1"/>
+        </w:rPr>
+      </w:r>
+      <w:r>
+        <w:rPr>
+          <w:color w:val="000000" w:themeColor="text1"/>
+        </w:rPr>
+      </w:r>
+    </w:p>
+    <w:p>
+      <w:pPr>
+        <w:pBdr/>
+        <w:spacing/>
+        <w:ind/>
+        <w:rPr>
+          <w:color w:val="000000" w:themeColor="text1"/>
+        </w:rPr>
+      </w:pPr>
+      <w:r>
+        <w:rPr>
+          <w:color w:val="000000" w:themeColor="text1"/>
+        </w:rPr>
+        <w:tab/>
+      </w:r>
+      <w:r>
+        <w:rPr>
+          <w:color w:val="000000" w:themeColor="text1"/>
+        </w:rPr>
+        <w:tab/>
+      </w:r>
+      <w:r>
+        <w:rPr>
+          <w:color w:val="000000" w:themeColor="text1"/>
+        </w:rPr>
+        <w:t xml:space="preserve">password</w:t>
+      </w:r>
+      <w:r>
+        <w:rPr>
+          <w:color w:val="000000" w:themeColor="text1"/>
+        </w:rPr>
+        <w:t xml:space="preserve">: “</w:t>
+      </w:r>
+      <w:r>
+        <w:rPr>
+          <w:color w:val="000000" w:themeColor="text1"/>
+        </w:rPr>
+        <w:t xml:space="preserve">123456789012345678901234567890123</w:t>
+      </w:r>
+      <w:r>
+        <w:rPr>
+          <w:color w:val="000000" w:themeColor="text1"/>
+        </w:rPr>
+        <w:t xml:space="preserve">”</w:t>
+      </w:r>
+      <w:r>
+        <w:rPr>
+          <w:color w:val="000000" w:themeColor="text1"/>
+        </w:rPr>
+      </w:r>
+      <w:r>
+        <w:rPr>
+          <w:color w:val="000000" w:themeColor="text1"/>
+        </w:rPr>
+      </w:r>
+    </w:p>
+    <w:p>
+      <w:pPr>
+        <w:pBdr/>
+        <w:spacing/>
+        <w:ind/>
+        <w:rPr>
+          <w:color w:val="000000" w:themeColor="text1"/>
+        </w:rPr>
+      </w:pPr>
+      <w:r>
+        <w:rPr>
+          <w:color w:val="000000" w:themeColor="text1"/>
+        </w:rPr>
+        <w:tab/>
+      </w:r>
+      <w:r>
+        <w:rPr>
+          <w:color w:val="000000" w:themeColor="text1"/>
+        </w:rPr>
+        <w:tab/>
+        <w:t xml:space="preserve">telefone: “11912345678”</w:t>
+      </w:r>
+      <w:r>
+        <w:rPr>
+          <w:color w:val="000000" w:themeColor="text1"/>
+        </w:rPr>
+      </w:r>
+      <w:r>
+        <w:rPr>
+          <w:color w:val="000000" w:themeColor="text1"/>
+        </w:rPr>
+      </w:r>
+    </w:p>
+    <w:p>
+      <w:pPr>
+        <w:pBdr/>
+        <w:spacing/>
+        <w:ind/>
+        <w:rPr>
+          <w:color w:val="000000" w:themeColor="text1"/>
+        </w:rPr>
+      </w:pPr>
+      <w:r>
+        <w:rPr>
+          <w:color w:val="000000" w:themeColor="text1"/>
+        </w:rPr>
+        <w:tab/>
+      </w:r>
+      <w:r>
+        <w:rPr>
+          <w:color w:val="000000" w:themeColor="text1"/>
+        </w:rPr>
+        <w:tab/>
+      </w:r>
+      <w:r>
+        <w:rPr>
+          <w:color w:val="000000" w:themeColor="text1"/>
+        </w:rPr>
+        <w:t xml:space="preserve">email</w:t>
+      </w:r>
+      <w:r>
+        <w:rPr>
+          <w:color w:val="000000" w:themeColor="text1"/>
+        </w:rPr>
+        <w:t xml:space="preserve">: “teste@email.com”</w:t>
+      </w:r>
+      <w:r>
+        <w:rPr>
+          <w:color w:val="000000" w:themeColor="text1"/>
+        </w:rPr>
+      </w:r>
+      <w:r>
+        <w:rPr>
+          <w:color w:val="000000" w:themeColor="text1"/>
+        </w:rPr>
+      </w:r>
+    </w:p>
+    <w:p>
+      <w:pPr>
+        <w:pBdr/>
+        <w:spacing/>
+        <w:ind/>
+        <w:rPr>
+          <w:color w:val="000000" w:themeColor="text1"/>
+        </w:rPr>
+      </w:pPr>
+      <w:r>
+        <w:rPr>
+          <w:color w:val="000000" w:themeColor="text1"/>
+        </w:rPr>
+        <w:tab/>
+      </w:r>
+      <w:r>
+        <w:rPr>
+          <w:color w:val="000000" w:themeColor="text1"/>
+        </w:rPr>
+        <w:tab/>
+      </w:r>
+      <w:r>
+        <w:rPr>
+          <w:color w:val="000000" w:themeColor="text1"/>
+        </w:rPr>
+        <w:t xml:space="preserve">status: ATIVO</w:t>
+      </w:r>
+      <w:r>
+        <w:rPr>
+          <w:color w:val="000000" w:themeColor="text1"/>
+        </w:rPr>
+      </w:r>
+      <w:r>
+        <w:rPr>
+          <w:color w:val="000000" w:themeColor="text1"/>
+        </w:rPr>
+      </w:r>
+    </w:p>
+    <w:p>
+      <w:pPr>
+        <w:pBdr/>
+        <w:spacing/>
+        <w:ind/>
+        <w:rPr>
+          <w:color w:val="000000" w:themeColor="text1"/>
+        </w:rPr>
+      </w:pPr>
+      <w:r>
+        <w:rPr>
+          <w:color w:val="000000" w:themeColor="text1"/>
+        </w:rPr>
+        <w:tab/>
+      </w:r>
+      <w:r>
+        <w:rPr>
+          <w:color w:val="000000" w:themeColor="text1"/>
+        </w:rPr>
+        <w:tab/>
+        <w:t xml:space="preserve">perfil: ADMIN</w:t>
+      </w:r>
+      <w:r>
+        <w:rPr>
+          <w:color w:val="000000" w:themeColor="text1"/>
+        </w:rPr>
+      </w:r>
+      <w:r>
+        <w:rPr>
+          <w:color w:val="000000" w:themeColor="text1"/>
+        </w:rPr>
+      </w:r>
+    </w:p>
+    <w:p>
+      <w:pPr>
+        <w:pBdr/>
+        <w:spacing/>
+        <w:ind/>
+        <w:rPr>
+          <w:color w:val="000000" w:themeColor="text1"/>
+        </w:rPr>
+      </w:pPr>
+      <w:r>
+        <w:rPr>
+          <w:color w:val="000000" w:themeColor="text1"/>
+        </w:rPr>
+        <w:tab/>
+        <w:t xml:space="preserve">}</w:t>
+      </w:r>
+      <w:r>
+        <w:rPr>
+          <w:color w:val="000000" w:themeColor="text1"/>
+        </w:rPr>
+      </w:r>
+      <w:r>
+        <w:rPr>
+          <w:color w:val="000000" w:themeColor="text1"/>
+        </w:rPr>
+      </w:r>
+    </w:p>
+    <w:p>
+      <w:pPr>
+        <w:pBdr/>
+        <w:spacing/>
+        <w:ind/>
+        <w:rPr>
+          <w:color w:val="000000" w:themeColor="text1"/>
+        </w:rPr>
+      </w:pPr>
+      <w:r>
+        <w:rPr>
+          <w:b/>
+          <w:color w:val="000000" w:themeColor="text1"/>
+        </w:rPr>
+        <w:t xml:space="preserve">Resultado esperado: </w:t>
+      </w:r>
+      <w:r>
+        <w:rPr>
+          <w:color w:val="000000" w:themeColor="text1"/>
+        </w:rPr>
+        <w:t xml:space="preserve">Lançar exceção </w:t>
+      </w:r>
+      <w:r>
+        <w:rPr>
+          <w:color w:val="000000" w:themeColor="text1"/>
+        </w:rPr>
+        <w:t xml:space="preserve">Invalid</w:t>
+      </w:r>
+      <w:r>
+        <w:rPr>
+          <w:color w:val="000000" w:themeColor="text1"/>
+        </w:rPr>
+        <w:t xml:space="preserve">Password</w:t>
+      </w:r>
+      <w:r>
+        <w:rPr>
+          <w:color w:val="000000" w:themeColor="text1"/>
+        </w:rPr>
+        <w:t xml:space="preserve">Exception</w:t>
+      </w:r>
+      <w:r>
+        <w:rPr>
+          <w:color w:val="000000" w:themeColor="text1"/>
+        </w:rPr>
+        <w:t xml:space="preserve"> com a mensagem “</w:t>
+      </w:r>
+      <w:r>
+        <w:rPr>
+          <w:color w:val="000000" w:themeColor="text1"/>
+        </w:rPr>
+        <w:t xml:space="preserve">Senha do usuário não deve conter apenas espaços em branco</w:t>
+      </w:r>
+      <w:r>
+        <w:rPr>
+          <w:color w:val="000000" w:themeColor="text1"/>
+        </w:rPr>
+        <w:t xml:space="preserve">”.</w:t>
+      </w:r>
+      <w:r>
+        <w:rPr>
+          <w:color w:val="000000" w:themeColor="text1"/>
+        </w:rPr>
+      </w:r>
+      <w:r>
+        <w:rPr>
+          <w:color w:val="000000" w:themeColor="text1"/>
+        </w:rPr>
+      </w:r>
+    </w:p>
+    <w:p>
+      <w:pPr>
+        <w:pBdr/>
+        <w:tabs>
+          <w:tab w:val="left" w:leader="none" w:pos="2703"/>
+        </w:tabs>
+        <w:spacing/>
+        <w:ind/>
+        <w:rPr>
+          <w:color w:val="000000" w:themeColor="text1"/>
+        </w:rPr>
+      </w:pPr>
+      <w:r>
+        <w:rPr>
+          <w:b/>
+          <w:color w:val="000000" w:themeColor="text1"/>
+        </w:rPr>
+        <w:t xml:space="preserve">Status:</w:t>
+      </w:r>
+      <w:r>
+        <w:rPr>
+          <w:color w:val="000000" w:themeColor="text1"/>
+        </w:rPr>
+        <w:t xml:space="preserve"> Não realizado.</w:t>
+      </w:r>
+      <w:r>
+        <w:rPr>
+          <w:color w:val="000000" w:themeColor="text1"/>
+        </w:rPr>
+        <w:tab/>
+      </w:r>
+      <w:r>
+        <w:rPr>
+          <w:color w:val="000000" w:themeColor="text1"/>
+        </w:rPr>
+      </w:r>
+      <w:r>
+        <w:rPr>
+          <w:color w:val="000000" w:themeColor="text1"/>
+        </w:rPr>
+      </w:r>
+    </w:p>
+    <w:p>
+      <w:pPr>
+        <w:pBdr/>
+        <w:spacing/>
+        <w:ind/>
+        <w:rPr>
+          <w:color w:val="000000" w:themeColor="text1"/>
+        </w:rPr>
+      </w:pPr>
+      <w:r>
+        <w:rPr>
+          <w:b/>
+          <w:color w:val="000000" w:themeColor="text1"/>
+        </w:rPr>
+        <w:t xml:space="preserve">Realização do teste:</w:t>
+      </w:r>
+      <w:r>
+        <w:rPr>
+          <w:color w:val="000000" w:themeColor="text1"/>
+        </w:rPr>
+        <w:t xml:space="preserve"> 00/00/0000.</w:t>
+      </w:r>
+      <w:r>
+        <w:rPr>
+          <w:color w:val="000000" w:themeColor="text1"/>
+        </w:rPr>
+      </w:r>
+      <w:r>
+        <w:rPr>
+          <w:color w:val="000000" w:themeColor="text1"/>
+        </w:rPr>
+      </w:r>
+    </w:p>
+    <w:p>
+      <w:pPr>
+        <w:pBdr/>
+        <w:tabs>
+          <w:tab w:val="left" w:leader="none" w:pos="2703"/>
+        </w:tabs>
+        <w:spacing/>
+        <w:ind/>
+        <w:rPr>
+          <w:color w:val="000000" w:themeColor="text1"/>
+          <w:highlight w:val="none"/>
+        </w:rPr>
+      </w:pPr>
+      <w:r>
+        <w:rPr>
+          <w:b/>
           <w:color w:val="000000" w:themeColor="text1"/>
         </w:rPr>
         <w:t xml:space="preserve">Responsável: </w:t>
@@ -25172,6 +26119,12 @@
       <w:r>
         <w:rPr>
           <w:color w:val="000000" w:themeColor="text1"/>
+          <w:highlight w:val="none"/>
+        </w:rPr>
+      </w:r>
+      <w:r>
+        <w:rPr>
+          <w:color w:val="000000" w:themeColor="text1"/>
         </w:rPr>
       </w:r>
       <w:r>
@@ -25180,11 +26133,7 @@
         </w:rPr>
         <w:tab/>
       </w:r>
-      <w:r>
-        <w:rPr>
-          <w:color w:val="000000" w:themeColor="text1"/>
-        </w:rPr>
-      </w:r>
+      <w:r/>
       <w:r/>
     </w:p>
     <w:p>
@@ -32218,6 +33167,134 @@
     </w:lvl>
   </w:abstractNum>
   <w:abstractNum w:abstractNumId="40">
+    <w:lvl w:ilvl="0">
+      <w:isLgl w:val="false"/>
+      <w:lvlJc w:val="left"/>
+      <w:lvlText w:val="%1."/>
+      <w:numFmt w:val="decimal"/>
+      <w:pPr>
+        <w:pBdr/>
+        <w:spacing/>
+        <w:ind w:hanging="360" w:left="709"/>
+      </w:pPr>
+      <w:rPr/>
+      <w:start w:val="1"/>
+      <w:suff w:val="tab"/>
+    </w:lvl>
+    <w:lvl w:ilvl="1">
+      <w:isLgl w:val="false"/>
+      <w:lvlJc w:val="left"/>
+      <w:lvlText w:val="%2."/>
+      <w:numFmt w:val="lowerLetter"/>
+      <w:pPr>
+        <w:pBdr/>
+        <w:spacing/>
+        <w:ind w:hanging="360" w:left="1429"/>
+      </w:pPr>
+      <w:rPr/>
+      <w:start w:val="1"/>
+      <w:suff w:val="tab"/>
+    </w:lvl>
+    <w:lvl w:ilvl="2">
+      <w:isLgl w:val="false"/>
+      <w:lvlJc w:val="right"/>
+      <w:lvlText w:val="%3."/>
+      <w:numFmt w:val="lowerRoman"/>
+      <w:pPr>
+        <w:pBdr/>
+        <w:spacing/>
+        <w:ind w:hanging="180" w:left="2149"/>
+      </w:pPr>
+      <w:rPr/>
+      <w:start w:val="1"/>
+      <w:suff w:val="tab"/>
+    </w:lvl>
+    <w:lvl w:ilvl="3">
+      <w:isLgl w:val="false"/>
+      <w:lvlJc w:val="left"/>
+      <w:lvlText w:val="%4."/>
+      <w:numFmt w:val="decimal"/>
+      <w:pPr>
+        <w:pBdr/>
+        <w:spacing/>
+        <w:ind w:hanging="360" w:left="2869"/>
+      </w:pPr>
+      <w:rPr/>
+      <w:start w:val="1"/>
+      <w:suff w:val="tab"/>
+    </w:lvl>
+    <w:lvl w:ilvl="4">
+      <w:isLgl w:val="false"/>
+      <w:lvlJc w:val="left"/>
+      <w:lvlText w:val="%5."/>
+      <w:numFmt w:val="lowerLetter"/>
+      <w:pPr>
+        <w:pBdr/>
+        <w:spacing/>
+        <w:ind w:hanging="360" w:left="3589"/>
+      </w:pPr>
+      <w:rPr/>
+      <w:start w:val="1"/>
+      <w:suff w:val="tab"/>
+    </w:lvl>
+    <w:lvl w:ilvl="5">
+      <w:isLgl w:val="false"/>
+      <w:lvlJc w:val="right"/>
+      <w:lvlText w:val="%6."/>
+      <w:numFmt w:val="lowerRoman"/>
+      <w:pPr>
+        <w:pBdr/>
+        <w:spacing/>
+        <w:ind w:hanging="180" w:left="4309"/>
+      </w:pPr>
+      <w:rPr/>
+      <w:start w:val="1"/>
+      <w:suff w:val="tab"/>
+    </w:lvl>
+    <w:lvl w:ilvl="6">
+      <w:isLgl w:val="false"/>
+      <w:lvlJc w:val="left"/>
+      <w:lvlText w:val="%7."/>
+      <w:numFmt w:val="decimal"/>
+      <w:pPr>
+        <w:pBdr/>
+        <w:spacing/>
+        <w:ind w:hanging="360" w:left="5029"/>
+      </w:pPr>
+      <w:rPr/>
+      <w:start w:val="1"/>
+      <w:suff w:val="tab"/>
+    </w:lvl>
+    <w:lvl w:ilvl="7">
+      <w:isLgl w:val="false"/>
+      <w:lvlJc w:val="left"/>
+      <w:lvlText w:val="%8."/>
+      <w:numFmt w:val="lowerLetter"/>
+      <w:pPr>
+        <w:pBdr/>
+        <w:spacing/>
+        <w:ind w:hanging="360" w:left="5749"/>
+      </w:pPr>
+      <w:rPr/>
+      <w:start w:val="1"/>
+      <w:suff w:val="tab"/>
+    </w:lvl>
+    <w:lvl w:ilvl="8">
+      <w:isLgl w:val="false"/>
+      <w:lvlJc w:val="right"/>
+      <w:lvlText w:val="%9."/>
+      <w:numFmt w:val="lowerRoman"/>
+      <w:pPr>
+        <w:pBdr/>
+        <w:spacing/>
+        <w:ind w:hanging="180" w:left="6469"/>
+      </w:pPr>
+      <w:rPr/>
+      <w:start w:val="1"/>
+      <w:suff w:val="tab"/>
+    </w:lvl>
+  </w:abstractNum>
+  <w:abstractNum w:abstractNumId="41">
     <w:lvl w:ilvl="0">
       <w:isLgl w:val="false"/>
       <w:lvlJc w:val="left"/>
@@ -32467,6 +33544,9 @@
   </w:num>
   <w:num w:numId="41">
     <w:abstractNumId w:val="40"/>
+  </w:num>
+  <w:num w:numId="42">
+    <w:abstractNumId w:val="41"/>
   </w:num>
 </w:numbering>
 </file>

</xml_diff>

<commit_message>
docs: Adicionado teste unitário TU001.16
</commit_message>
<xml_diff>
--- a/documentation/Especificacao_de_Requisitos_de_Software.docx
+++ b/documentation/Especificacao_de_Requisitos_de_Software.docx
@@ -25751,7 +25751,7 @@
         <w:rPr>
           <w:color w:val="000000" w:themeColor="text1"/>
         </w:rPr>
-        <w:t xml:space="preserve">123456789012345678901234567890123</w:t>
+        <w:t xml:space="preserve">    </w:t>
       </w:r>
       <w:r>
         <w:rPr>
@@ -26135,6 +26135,972 @@
       </w:r>
       <w:r/>
       <w:r/>
+    </w:p>
+    <w:p>
+      <w:pPr>
+        <w:pBdr/>
+        <w:tabs>
+          <w:tab w:val="left" w:leader="none" w:pos="2703"/>
+        </w:tabs>
+        <w:spacing/>
+        <w:ind/>
+        <w:rPr>
+          <w:color w:val="000000" w:themeColor="text1"/>
+          <w:highlight w:val="none"/>
+        </w:rPr>
+      </w:pPr>
+      <w:r>
+        <w:rPr>
+          <w:color w:val="000000" w:themeColor="text1"/>
+          <w:highlight w:val="none"/>
+        </w:rPr>
+      </w:r>
+      <w:r>
+        <w:rPr>
+          <w:color w:val="000000" w:themeColor="text1"/>
+          <w:highlight w:val="none"/>
+        </w:rPr>
+      </w:r>
+    </w:p>
+    <w:p>
+      <w:pPr>
+        <w:pStyle w:val="793"/>
+        <w:pBdr/>
+        <w:spacing/>
+        <w:ind/>
+        <w:rPr>
+          <w:color w:val="ff0000"/>
+        </w:rPr>
+      </w:pPr>
+      <w:r>
+        <w:t xml:space="preserve">6.1.1.1</w:t>
+      </w:r>
+      <w:r>
+        <w:t xml:space="preserve">6 [TU001.1</w:t>
+      </w:r>
+      <w:r>
+        <w:t xml:space="preserve">6] </w:t>
+      </w:r>
+      <w:r>
+        <w:rPr>
+          <w:color w:val="000000" w:themeColor="text1"/>
+        </w:rPr>
+        <w:t xml:space="preserve">O sistema não deve </w:t>
+      </w:r>
+      <w:r>
+        <w:rPr>
+          <w:color w:val="000000" w:themeColor="text1"/>
+        </w:rPr>
+        <w:t xml:space="preserve">cadastrar usuário quando o telefone é inválido</w:t>
+      </w:r>
+      <w:r>
+        <w:rPr>
+          <w:color w:val="ff0000"/>
+        </w:rPr>
+      </w:r>
+    </w:p>
+    <w:p>
+      <w:pPr>
+        <w:pBdr/>
+        <w:spacing/>
+        <w:ind/>
+        <w:rPr/>
+      </w:pPr>
+      <w:r/>
+      <w:r/>
+      <w:r/>
+    </w:p>
+    <w:p>
+      <w:pPr>
+        <w:pBdr/>
+        <w:spacing/>
+        <w:ind/>
+        <w:rPr>
+          <w:color w:val="000000" w:themeColor="text1"/>
+        </w:rPr>
+      </w:pPr>
+      <w:r>
+        <w:rPr>
+          <w:b/>
+          <w:bCs/>
+          <w:color w:val="000000" w:themeColor="text1"/>
+        </w:rPr>
+        <w:t xml:space="preserve">Camada:</w:t>
+      </w:r>
+      <w:r>
+        <w:rPr>
+          <w:color w:val="000000" w:themeColor="text1"/>
+        </w:rPr>
+        <w:t xml:space="preserve"> Serviço.</w:t>
+      </w:r>
+      <w:r>
+        <w:rPr>
+          <w:color w:val="000000" w:themeColor="text1"/>
+        </w:rPr>
+      </w:r>
+      <w:r>
+        <w:rPr>
+          <w:color w:val="000000" w:themeColor="text1"/>
+        </w:rPr>
+      </w:r>
+    </w:p>
+    <w:p>
+      <w:pPr>
+        <w:pBdr/>
+        <w:spacing/>
+        <w:ind/>
+        <w:rPr>
+          <w:color w:val="000000" w:themeColor="text1"/>
+        </w:rPr>
+      </w:pPr>
+      <w:r>
+        <w:rPr>
+          <w:b/>
+          <w:color w:val="000000" w:themeColor="text1"/>
+        </w:rPr>
+        <w:t xml:space="preserve">Requisitos associados:</w:t>
+      </w:r>
+      <w:r>
+        <w:rPr>
+          <w:color w:val="000000" w:themeColor="text1"/>
+        </w:rPr>
+        <w:t xml:space="preserve"> RF001.01, RN001.11</w:t>
+      </w:r>
+      <w:r>
+        <w:rPr>
+          <w:color w:val="000000" w:themeColor="text1"/>
+        </w:rPr>
+        <w:t xml:space="preserve">.</w:t>
+      </w:r>
+      <w:r>
+        <w:rPr>
+          <w:color w:val="000000" w:themeColor="text1"/>
+        </w:rPr>
+      </w:r>
+      <w:r>
+        <w:rPr>
+          <w:color w:val="000000" w:themeColor="text1"/>
+        </w:rPr>
+      </w:r>
+    </w:p>
+    <w:p>
+      <w:pPr>
+        <w:pBdr/>
+        <w:spacing/>
+        <w:ind/>
+        <w:rPr>
+          <w:color w:val="000000" w:themeColor="text1"/>
+        </w:rPr>
+      </w:pPr>
+      <w:r>
+        <w:rPr>
+          <w:b/>
+          <w:color w:val="000000" w:themeColor="text1"/>
+        </w:rPr>
+        <w:t xml:space="preserve">Descrição: </w:t>
+      </w:r>
+      <w:r>
+        <w:rPr>
+          <w:color w:val="000000" w:themeColor="text1"/>
+        </w:rPr>
+        <w:t xml:space="preserve">O sistema não deve </w:t>
+      </w:r>
+      <w:r>
+        <w:rPr>
+          <w:color w:val="000000" w:themeColor="text1"/>
+        </w:rPr>
+        <w:t xml:space="preserve">cadastrar</w:t>
+      </w:r>
+      <w:r>
+        <w:rPr>
+          <w:color w:val="000000" w:themeColor="text1"/>
+        </w:rPr>
+        <w:t xml:space="preserve"> usuário.</w:t>
+      </w:r>
+      <w:r>
+        <w:rPr>
+          <w:color w:val="000000" w:themeColor="text1"/>
+        </w:rPr>
+      </w:r>
+      <w:r>
+        <w:rPr>
+          <w:color w:val="000000" w:themeColor="text1"/>
+        </w:rPr>
+      </w:r>
+    </w:p>
+    <w:p>
+      <w:pPr>
+        <w:pBdr/>
+        <w:spacing/>
+        <w:ind/>
+        <w:rPr>
+          <w:color w:val="000000" w:themeColor="text1"/>
+        </w:rPr>
+      </w:pPr>
+      <w:r>
+        <w:rPr>
+          <w:b/>
+          <w:color w:val="000000" w:themeColor="text1"/>
+        </w:rPr>
+        <w:t xml:space="preserve">Condições</w:t>
+      </w:r>
+      <w:r>
+        <w:rPr>
+          <w:color w:val="000000" w:themeColor="text1"/>
+        </w:rPr>
+        <w:t xml:space="preserve">: Telefone</w:t>
+      </w:r>
+      <w:r>
+        <w:rPr>
+          <w:color w:val="000000" w:themeColor="text1"/>
+        </w:rPr>
+        <w:t xml:space="preserve"> do usuário com 4 dígitos</w:t>
+      </w:r>
+      <w:r>
+        <w:rPr>
+          <w:color w:val="000000" w:themeColor="text1"/>
+        </w:rPr>
+        <w:t xml:space="preserve">.</w:t>
+      </w:r>
+      <w:r>
+        <w:rPr>
+          <w:color w:val="000000" w:themeColor="text1"/>
+        </w:rPr>
+      </w:r>
+      <w:r>
+        <w:rPr>
+          <w:color w:val="000000" w:themeColor="text1"/>
+        </w:rPr>
+      </w:r>
+    </w:p>
+    <w:p>
+      <w:pPr>
+        <w:pBdr/>
+        <w:spacing/>
+        <w:ind/>
+        <w:rPr>
+          <w:color w:val="000000" w:themeColor="text1"/>
+        </w:rPr>
+      </w:pPr>
+      <w:r>
+        <w:rPr>
+          <w:b/>
+          <w:color w:val="000000" w:themeColor="text1"/>
+        </w:rPr>
+        <w:t xml:space="preserve">Passos:</w:t>
+      </w:r>
+      <w:r>
+        <w:rPr>
+          <w:color w:val="000000" w:themeColor="text1"/>
+        </w:rPr>
+        <w:t xml:space="preserve"> </w:t>
+      </w:r>
+      <w:r>
+        <w:rPr>
+          <w:color w:val="000000" w:themeColor="text1"/>
+        </w:rPr>
+      </w:r>
+      <w:r>
+        <w:rPr>
+          <w:color w:val="000000" w:themeColor="text1"/>
+        </w:rPr>
+      </w:r>
+    </w:p>
+    <w:p>
+      <w:pPr>
+        <w:pStyle w:val="951"/>
+        <w:numPr>
+          <w:ilvl w:val="0"/>
+          <w:numId w:val="43"/>
+        </w:numPr>
+        <w:pBdr/>
+        <w:spacing/>
+        <w:ind/>
+        <w:rPr>
+          <w:color w:val="000000" w:themeColor="text1"/>
+        </w:rPr>
+      </w:pPr>
+      <w:r>
+        <w:rPr>
+          <w:color w:val="000000" w:themeColor="text1"/>
+        </w:rPr>
+        <w:t xml:space="preserve">Informar os dados do usuário com </w:t>
+      </w:r>
+      <w:r>
+        <w:rPr>
+          <w:color w:val="000000" w:themeColor="text1"/>
+        </w:rPr>
+        <w:t xml:space="preserve">o telefone com 4 dígitos</w:t>
+      </w:r>
+      <w:r>
+        <w:rPr>
+          <w:color w:val="000000" w:themeColor="text1"/>
+        </w:rPr>
+        <w:t xml:space="preserve">.</w:t>
+      </w:r>
+      <w:r>
+        <w:rPr>
+          <w:color w:val="000000" w:themeColor="text1"/>
+        </w:rPr>
+      </w:r>
+      <w:r>
+        <w:rPr>
+          <w:color w:val="000000" w:themeColor="text1"/>
+        </w:rPr>
+      </w:r>
+    </w:p>
+    <w:p>
+      <w:pPr>
+        <w:pStyle w:val="951"/>
+        <w:numPr>
+          <w:ilvl w:val="0"/>
+          <w:numId w:val="43"/>
+        </w:numPr>
+        <w:pBdr/>
+        <w:spacing/>
+        <w:ind/>
+        <w:rPr>
+          <w:color w:val="000000" w:themeColor="text1"/>
+        </w:rPr>
+      </w:pPr>
+      <w:r>
+        <w:rPr>
+          <w:color w:val="000000" w:themeColor="text1"/>
+        </w:rPr>
+        <w:t xml:space="preserve">Validar </w:t>
+      </w:r>
+      <w:r>
+        <w:rPr>
+          <w:color w:val="000000" w:themeColor="text1"/>
+        </w:rPr>
+        <w:t xml:space="preserve">o telefone</w:t>
+      </w:r>
+      <w:r>
+        <w:rPr>
+          <w:color w:val="000000" w:themeColor="text1"/>
+        </w:rPr>
+        <w:t xml:space="preserve">.</w:t>
+      </w:r>
+      <w:r>
+        <w:rPr>
+          <w:color w:val="000000" w:themeColor="text1"/>
+        </w:rPr>
+      </w:r>
+      <w:r>
+        <w:rPr>
+          <w:color w:val="000000" w:themeColor="text1"/>
+        </w:rPr>
+      </w:r>
+    </w:p>
+    <w:p>
+      <w:pPr>
+        <w:pStyle w:val="951"/>
+        <w:numPr>
+          <w:ilvl w:val="0"/>
+          <w:numId w:val="43"/>
+        </w:numPr>
+        <w:pBdr/>
+        <w:spacing/>
+        <w:ind/>
+        <w:rPr>
+          <w:color w:val="000000" w:themeColor="text1"/>
+        </w:rPr>
+      </w:pPr>
+      <w:r>
+        <w:rPr>
+          <w:color w:val="000000" w:themeColor="text1"/>
+        </w:rPr>
+        <w:t xml:space="preserve">Receber mensagem de erro ao </w:t>
+      </w:r>
+      <w:r>
+        <w:rPr>
+          <w:color w:val="000000" w:themeColor="text1"/>
+        </w:rPr>
+        <w:t xml:space="preserve">cadastrar telefone inválido</w:t>
+      </w:r>
+      <w:r>
+        <w:rPr>
+          <w:color w:val="000000" w:themeColor="text1"/>
+        </w:rPr>
+        <w:t xml:space="preserve">.</w:t>
+      </w:r>
+      <w:r>
+        <w:rPr>
+          <w:color w:val="000000" w:themeColor="text1"/>
+        </w:rPr>
+      </w:r>
+      <w:r>
+        <w:rPr>
+          <w:color w:val="000000" w:themeColor="text1"/>
+        </w:rPr>
+      </w:r>
+    </w:p>
+    <w:p>
+      <w:pPr>
+        <w:pBdr/>
+        <w:spacing/>
+        <w:ind/>
+        <w:rPr>
+          <w:color w:val="000000" w:themeColor="text1"/>
+        </w:rPr>
+      </w:pPr>
+      <w:r>
+        <w:rPr>
+          <w:b/>
+          <w:color w:val="000000" w:themeColor="text1"/>
+        </w:rPr>
+        <w:t xml:space="preserve">Dados do teste:</w:t>
+      </w:r>
+      <w:r>
+        <w:rPr>
+          <w:color w:val="000000" w:themeColor="text1"/>
+        </w:rPr>
+        <w:t xml:space="preserve"> </w:t>
+      </w:r>
+      <w:r>
+        <w:rPr>
+          <w:color w:val="000000" w:themeColor="text1"/>
+        </w:rPr>
+      </w:r>
+      <w:r>
+        <w:rPr>
+          <w:color w:val="000000" w:themeColor="text1"/>
+        </w:rPr>
+      </w:r>
+    </w:p>
+    <w:p>
+      <w:pPr>
+        <w:pBdr/>
+        <w:spacing/>
+        <w:ind w:firstLine="720"/>
+        <w:rPr>
+          <w:color w:val="000000" w:themeColor="text1"/>
+        </w:rPr>
+      </w:pPr>
+      <w:r>
+        <w:rPr>
+          <w:color w:val="000000" w:themeColor="text1"/>
+        </w:rPr>
+        <w:t xml:space="preserve">{</w:t>
+      </w:r>
+      <w:r>
+        <w:rPr>
+          <w:color w:val="000000" w:themeColor="text1"/>
+        </w:rPr>
+      </w:r>
+      <w:r>
+        <w:rPr>
+          <w:color w:val="000000" w:themeColor="text1"/>
+        </w:rPr>
+      </w:r>
+    </w:p>
+    <w:p>
+      <w:pPr>
+        <w:pBdr/>
+        <w:spacing/>
+        <w:ind/>
+        <w:rPr>
+          <w:color w:val="000000" w:themeColor="text1"/>
+        </w:rPr>
+      </w:pPr>
+      <w:r>
+        <w:rPr>
+          <w:color w:val="000000" w:themeColor="text1"/>
+        </w:rPr>
+        <w:tab/>
+      </w:r>
+      <w:r>
+        <w:rPr>
+          <w:color w:val="000000" w:themeColor="text1"/>
+        </w:rPr>
+        <w:tab/>
+      </w:r>
+      <w:r>
+        <w:rPr>
+          <w:color w:val="000000" w:themeColor="text1"/>
+        </w:rPr>
+        <w:t xml:space="preserve">nome: “teste”</w:t>
+      </w:r>
+      <w:r>
+        <w:rPr>
+          <w:color w:val="000000" w:themeColor="text1"/>
+        </w:rPr>
+      </w:r>
+      <w:r>
+        <w:rPr>
+          <w:color w:val="000000" w:themeColor="text1"/>
+        </w:rPr>
+      </w:r>
+    </w:p>
+    <w:p>
+      <w:pPr>
+        <w:pBdr/>
+        <w:spacing/>
+        <w:ind/>
+        <w:rPr>
+          <w:color w:val="000000" w:themeColor="text1"/>
+        </w:rPr>
+      </w:pPr>
+      <w:r>
+        <w:rPr>
+          <w:color w:val="000000" w:themeColor="text1"/>
+        </w:rPr>
+        <w:tab/>
+      </w:r>
+      <w:r>
+        <w:rPr>
+          <w:color w:val="000000" w:themeColor="text1"/>
+        </w:rPr>
+        <w:tab/>
+      </w:r>
+      <w:r>
+        <w:rPr>
+          <w:color w:val="000000" w:themeColor="text1"/>
+        </w:rPr>
+        <w:t xml:space="preserve">login: “login”</w:t>
+      </w:r>
+      <w:r>
+        <w:rPr>
+          <w:color w:val="000000" w:themeColor="text1"/>
+        </w:rPr>
+      </w:r>
+      <w:r>
+        <w:rPr>
+          <w:color w:val="000000" w:themeColor="text1"/>
+        </w:rPr>
+      </w:r>
+    </w:p>
+    <w:p>
+      <w:pPr>
+        <w:pBdr/>
+        <w:spacing/>
+        <w:ind/>
+        <w:rPr>
+          <w:color w:val="000000" w:themeColor="text1"/>
+        </w:rPr>
+      </w:pPr>
+      <w:r>
+        <w:rPr>
+          <w:color w:val="000000" w:themeColor="text1"/>
+        </w:rPr>
+        <w:tab/>
+      </w:r>
+      <w:r>
+        <w:rPr>
+          <w:color w:val="000000" w:themeColor="text1"/>
+        </w:rPr>
+        <w:tab/>
+      </w:r>
+      <w:r>
+        <w:rPr>
+          <w:color w:val="000000" w:themeColor="text1"/>
+        </w:rPr>
+        <w:t xml:space="preserve">password</w:t>
+      </w:r>
+      <w:r>
+        <w:rPr>
+          <w:color w:val="000000" w:themeColor="text1"/>
+        </w:rPr>
+        <w:t xml:space="preserve">: “</w:t>
+      </w:r>
+      <w:r>
+        <w:rPr>
+          <w:color w:val="000000" w:themeColor="text1"/>
+        </w:rPr>
+        <w:t xml:space="preserve">teste</w:t>
+      </w:r>
+      <w:r>
+        <w:rPr>
+          <w:color w:val="000000" w:themeColor="text1"/>
+        </w:rPr>
+        <w:t xml:space="preserve">”</w:t>
+      </w:r>
+      <w:r>
+        <w:rPr>
+          <w:color w:val="000000" w:themeColor="text1"/>
+        </w:rPr>
+      </w:r>
+      <w:r>
+        <w:rPr>
+          <w:color w:val="000000" w:themeColor="text1"/>
+        </w:rPr>
+      </w:r>
+    </w:p>
+    <w:p>
+      <w:pPr>
+        <w:pBdr/>
+        <w:spacing/>
+        <w:ind/>
+        <w:rPr>
+          <w:color w:val="000000" w:themeColor="text1"/>
+        </w:rPr>
+      </w:pPr>
+      <w:r>
+        <w:rPr>
+          <w:color w:val="000000" w:themeColor="text1"/>
+        </w:rPr>
+        <w:tab/>
+      </w:r>
+      <w:r>
+        <w:rPr>
+          <w:color w:val="000000" w:themeColor="text1"/>
+        </w:rPr>
+        <w:tab/>
+        <w:t xml:space="preserve">telefone: “1234”</w:t>
+      </w:r>
+      <w:r>
+        <w:rPr>
+          <w:color w:val="000000" w:themeColor="text1"/>
+        </w:rPr>
+      </w:r>
+      <w:r>
+        <w:rPr>
+          <w:color w:val="000000" w:themeColor="text1"/>
+        </w:rPr>
+      </w:r>
+    </w:p>
+    <w:p>
+      <w:pPr>
+        <w:pBdr/>
+        <w:spacing/>
+        <w:ind/>
+        <w:rPr>
+          <w:color w:val="000000" w:themeColor="text1"/>
+        </w:rPr>
+      </w:pPr>
+      <w:r>
+        <w:rPr>
+          <w:color w:val="000000" w:themeColor="text1"/>
+        </w:rPr>
+        <w:tab/>
+      </w:r>
+      <w:r>
+        <w:rPr>
+          <w:color w:val="000000" w:themeColor="text1"/>
+        </w:rPr>
+        <w:tab/>
+      </w:r>
+      <w:r>
+        <w:rPr>
+          <w:color w:val="000000" w:themeColor="text1"/>
+        </w:rPr>
+        <w:t xml:space="preserve">email</w:t>
+      </w:r>
+      <w:r>
+        <w:rPr>
+          <w:color w:val="000000" w:themeColor="text1"/>
+        </w:rPr>
+        <w:t xml:space="preserve">: “teste@email.com”</w:t>
+      </w:r>
+      <w:r>
+        <w:rPr>
+          <w:color w:val="000000" w:themeColor="text1"/>
+        </w:rPr>
+      </w:r>
+      <w:r>
+        <w:rPr>
+          <w:color w:val="000000" w:themeColor="text1"/>
+        </w:rPr>
+      </w:r>
+    </w:p>
+    <w:p>
+      <w:pPr>
+        <w:pBdr/>
+        <w:spacing/>
+        <w:ind/>
+        <w:rPr>
+          <w:color w:val="000000" w:themeColor="text1"/>
+        </w:rPr>
+      </w:pPr>
+      <w:r>
+        <w:rPr>
+          <w:color w:val="000000" w:themeColor="text1"/>
+        </w:rPr>
+        <w:tab/>
+      </w:r>
+      <w:r>
+        <w:rPr>
+          <w:color w:val="000000" w:themeColor="text1"/>
+        </w:rPr>
+        <w:tab/>
+      </w:r>
+      <w:r>
+        <w:rPr>
+          <w:color w:val="000000" w:themeColor="text1"/>
+        </w:rPr>
+        <w:t xml:space="preserve">status: ATIVO</w:t>
+      </w:r>
+      <w:r>
+        <w:rPr>
+          <w:color w:val="000000" w:themeColor="text1"/>
+        </w:rPr>
+      </w:r>
+      <w:r>
+        <w:rPr>
+          <w:color w:val="000000" w:themeColor="text1"/>
+        </w:rPr>
+      </w:r>
+    </w:p>
+    <w:p>
+      <w:pPr>
+        <w:pBdr/>
+        <w:spacing/>
+        <w:ind/>
+        <w:rPr>
+          <w:color w:val="000000" w:themeColor="text1"/>
+        </w:rPr>
+      </w:pPr>
+      <w:r>
+        <w:rPr>
+          <w:color w:val="000000" w:themeColor="text1"/>
+        </w:rPr>
+        <w:tab/>
+      </w:r>
+      <w:r>
+        <w:rPr>
+          <w:color w:val="000000" w:themeColor="text1"/>
+        </w:rPr>
+        <w:tab/>
+        <w:t xml:space="preserve">perfil: ADMIN</w:t>
+      </w:r>
+      <w:r>
+        <w:rPr>
+          <w:color w:val="000000" w:themeColor="text1"/>
+        </w:rPr>
+      </w:r>
+      <w:r>
+        <w:rPr>
+          <w:color w:val="000000" w:themeColor="text1"/>
+        </w:rPr>
+      </w:r>
+    </w:p>
+    <w:p>
+      <w:pPr>
+        <w:pBdr/>
+        <w:spacing/>
+        <w:ind/>
+        <w:rPr>
+          <w:color w:val="000000" w:themeColor="text1"/>
+        </w:rPr>
+      </w:pPr>
+      <w:r>
+        <w:rPr>
+          <w:color w:val="000000" w:themeColor="text1"/>
+        </w:rPr>
+        <w:tab/>
+        <w:t xml:space="preserve">}</w:t>
+      </w:r>
+      <w:r>
+        <w:rPr>
+          <w:color w:val="000000" w:themeColor="text1"/>
+        </w:rPr>
+      </w:r>
+      <w:r>
+        <w:rPr>
+          <w:color w:val="000000" w:themeColor="text1"/>
+        </w:rPr>
+      </w:r>
+    </w:p>
+    <w:p>
+      <w:pPr>
+        <w:pBdr/>
+        <w:spacing/>
+        <w:ind/>
+        <w:rPr>
+          <w:color w:val="000000" w:themeColor="text1"/>
+        </w:rPr>
+      </w:pPr>
+      <w:r>
+        <w:rPr>
+          <w:b/>
+          <w:color w:val="000000" w:themeColor="text1"/>
+        </w:rPr>
+        <w:t xml:space="preserve">Resultado esperado: </w:t>
+      </w:r>
+      <w:r>
+        <w:rPr>
+          <w:color w:val="000000" w:themeColor="text1"/>
+        </w:rPr>
+        <w:t xml:space="preserve">Lançar exceção </w:t>
+      </w:r>
+      <w:r>
+        <w:rPr>
+          <w:color w:val="000000" w:themeColor="text1"/>
+        </w:rPr>
+        <w:t xml:space="preserve">Invalid</w:t>
+      </w:r>
+      <w:r>
+        <w:rPr>
+          <w:color w:val="000000" w:themeColor="text1"/>
+        </w:rPr>
+        <w:t xml:space="preserve">Phone</w:t>
+      </w:r>
+      <w:r>
+        <w:rPr>
+          <w:color w:val="000000" w:themeColor="text1"/>
+        </w:rPr>
+        <w:t xml:space="preserve">Exception</w:t>
+      </w:r>
+      <w:r>
+        <w:rPr>
+          <w:color w:val="000000" w:themeColor="text1"/>
+        </w:rPr>
+        <w:t xml:space="preserve"> com a mensagem “Telefone inválido</w:t>
+      </w:r>
+      <w:r>
+        <w:rPr>
+          <w:color w:val="000000" w:themeColor="text1"/>
+        </w:rPr>
+        <w:t xml:space="preserve">”.</w:t>
+      </w:r>
+      <w:r>
+        <w:rPr>
+          <w:color w:val="000000" w:themeColor="text1"/>
+        </w:rPr>
+      </w:r>
+      <w:r>
+        <w:rPr>
+          <w:color w:val="000000" w:themeColor="text1"/>
+        </w:rPr>
+      </w:r>
+    </w:p>
+    <w:p>
+      <w:pPr>
+        <w:pBdr/>
+        <w:tabs>
+          <w:tab w:val="left" w:leader="none" w:pos="2703"/>
+        </w:tabs>
+        <w:spacing/>
+        <w:ind/>
+        <w:rPr>
+          <w:color w:val="000000" w:themeColor="text1"/>
+        </w:rPr>
+      </w:pPr>
+      <w:r>
+        <w:rPr>
+          <w:b/>
+          <w:color w:val="000000" w:themeColor="text1"/>
+        </w:rPr>
+        <w:t xml:space="preserve">Status:</w:t>
+      </w:r>
+      <w:r>
+        <w:rPr>
+          <w:color w:val="000000" w:themeColor="text1"/>
+        </w:rPr>
+        <w:t xml:space="preserve"> Não realizado.</w:t>
+      </w:r>
+      <w:r>
+        <w:rPr>
+          <w:color w:val="000000" w:themeColor="text1"/>
+        </w:rPr>
+        <w:tab/>
+      </w:r>
+      <w:r>
+        <w:rPr>
+          <w:color w:val="000000" w:themeColor="text1"/>
+        </w:rPr>
+      </w:r>
+      <w:r>
+        <w:rPr>
+          <w:color w:val="000000" w:themeColor="text1"/>
+        </w:rPr>
+      </w:r>
+    </w:p>
+    <w:p>
+      <w:pPr>
+        <w:pBdr/>
+        <w:spacing/>
+        <w:ind/>
+        <w:rPr>
+          <w:color w:val="000000" w:themeColor="text1"/>
+        </w:rPr>
+      </w:pPr>
+      <w:r>
+        <w:rPr>
+          <w:b/>
+          <w:color w:val="000000" w:themeColor="text1"/>
+        </w:rPr>
+        <w:t xml:space="preserve">Realização do teste:</w:t>
+      </w:r>
+      <w:r>
+        <w:rPr>
+          <w:color w:val="000000" w:themeColor="text1"/>
+        </w:rPr>
+        <w:t xml:space="preserve"> 00/00/0000.</w:t>
+      </w:r>
+      <w:r>
+        <w:rPr>
+          <w:color w:val="000000" w:themeColor="text1"/>
+        </w:rPr>
+      </w:r>
+      <w:r>
+        <w:rPr>
+          <w:color w:val="000000" w:themeColor="text1"/>
+        </w:rPr>
+      </w:r>
+    </w:p>
+    <w:p>
+      <w:pPr>
+        <w:pBdr/>
+        <w:tabs>
+          <w:tab w:val="left" w:leader="none" w:pos="2703"/>
+        </w:tabs>
+        <w:spacing/>
+        <w:ind/>
+        <w:rPr>
+          <w:color w:val="000000" w:themeColor="text1"/>
+          <w:highlight w:val="none"/>
+        </w:rPr>
+      </w:pPr>
+      <w:r>
+        <w:rPr>
+          <w:b/>
+          <w:color w:val="000000" w:themeColor="text1"/>
+        </w:rPr>
+        <w:t xml:space="preserve">Responsável: </w:t>
+      </w:r>
+      <w:r>
+        <w:rPr>
+          <w:color w:val="000000" w:themeColor="text1"/>
+        </w:rPr>
+        <w:t xml:space="preserve">A definir.</w:t>
+      </w:r>
+      <w:r>
+        <w:rPr>
+          <w:color w:val="000000" w:themeColor="text1"/>
+        </w:rPr>
+        <w:tab/>
+      </w:r>
+      <w:r>
+        <w:rPr>
+          <w:color w:val="000000" w:themeColor="text1"/>
+          <w:highlight w:val="none"/>
+        </w:rPr>
+      </w:r>
+      <w:r>
+        <w:rPr>
+          <w:color w:val="000000" w:themeColor="text1"/>
+          <w:highlight w:val="none"/>
+        </w:rPr>
+      </w:r>
+      <w:r>
+        <w:rPr>
+          <w:color w:val="000000" w:themeColor="text1"/>
+          <w:highlight w:val="none"/>
+        </w:rPr>
+      </w:r>
+      <w:r>
+        <w:rPr>
+          <w:color w:val="000000" w:themeColor="text1"/>
+          <w:highlight w:val="none"/>
+        </w:rPr>
+      </w:r>
+      <w:r>
+        <w:rPr>
+          <w:color w:val="000000" w:themeColor="text1"/>
+          <w:highlight w:val="none"/>
+        </w:rPr>
+      </w:r>
     </w:p>
     <w:p>
       <w:pPr>
@@ -33295,6 +34261,134 @@
     </w:lvl>
   </w:abstractNum>
   <w:abstractNum w:abstractNumId="41">
+    <w:lvl w:ilvl="0">
+      <w:isLgl w:val="false"/>
+      <w:lvlJc w:val="left"/>
+      <w:lvlText w:val="%1."/>
+      <w:numFmt w:val="decimal"/>
+      <w:pPr>
+        <w:pBdr/>
+        <w:spacing/>
+        <w:ind w:hanging="360" w:left="709"/>
+      </w:pPr>
+      <w:rPr/>
+      <w:start w:val="1"/>
+      <w:suff w:val="tab"/>
+    </w:lvl>
+    <w:lvl w:ilvl="1">
+      <w:isLgl w:val="false"/>
+      <w:lvlJc w:val="left"/>
+      <w:lvlText w:val="%2."/>
+      <w:numFmt w:val="lowerLetter"/>
+      <w:pPr>
+        <w:pBdr/>
+        <w:spacing/>
+        <w:ind w:hanging="360" w:left="1429"/>
+      </w:pPr>
+      <w:rPr/>
+      <w:start w:val="1"/>
+      <w:suff w:val="tab"/>
+    </w:lvl>
+    <w:lvl w:ilvl="2">
+      <w:isLgl w:val="false"/>
+      <w:lvlJc w:val="right"/>
+      <w:lvlText w:val="%3."/>
+      <w:numFmt w:val="lowerRoman"/>
+      <w:pPr>
+        <w:pBdr/>
+        <w:spacing/>
+        <w:ind w:hanging="180" w:left="2149"/>
+      </w:pPr>
+      <w:rPr/>
+      <w:start w:val="1"/>
+      <w:suff w:val="tab"/>
+    </w:lvl>
+    <w:lvl w:ilvl="3">
+      <w:isLgl w:val="false"/>
+      <w:lvlJc w:val="left"/>
+      <w:lvlText w:val="%4."/>
+      <w:numFmt w:val="decimal"/>
+      <w:pPr>
+        <w:pBdr/>
+        <w:spacing/>
+        <w:ind w:hanging="360" w:left="2869"/>
+      </w:pPr>
+      <w:rPr/>
+      <w:start w:val="1"/>
+      <w:suff w:val="tab"/>
+    </w:lvl>
+    <w:lvl w:ilvl="4">
+      <w:isLgl w:val="false"/>
+      <w:lvlJc w:val="left"/>
+      <w:lvlText w:val="%5."/>
+      <w:numFmt w:val="lowerLetter"/>
+      <w:pPr>
+        <w:pBdr/>
+        <w:spacing/>
+        <w:ind w:hanging="360" w:left="3589"/>
+      </w:pPr>
+      <w:rPr/>
+      <w:start w:val="1"/>
+      <w:suff w:val="tab"/>
+    </w:lvl>
+    <w:lvl w:ilvl="5">
+      <w:isLgl w:val="false"/>
+      <w:lvlJc w:val="right"/>
+      <w:lvlText w:val="%6."/>
+      <w:numFmt w:val="lowerRoman"/>
+      <w:pPr>
+        <w:pBdr/>
+        <w:spacing/>
+        <w:ind w:hanging="180" w:left="4309"/>
+      </w:pPr>
+      <w:rPr/>
+      <w:start w:val="1"/>
+      <w:suff w:val="tab"/>
+    </w:lvl>
+    <w:lvl w:ilvl="6">
+      <w:isLgl w:val="false"/>
+      <w:lvlJc w:val="left"/>
+      <w:lvlText w:val="%7."/>
+      <w:numFmt w:val="decimal"/>
+      <w:pPr>
+        <w:pBdr/>
+        <w:spacing/>
+        <w:ind w:hanging="360" w:left="5029"/>
+      </w:pPr>
+      <w:rPr/>
+      <w:start w:val="1"/>
+      <w:suff w:val="tab"/>
+    </w:lvl>
+    <w:lvl w:ilvl="7">
+      <w:isLgl w:val="false"/>
+      <w:lvlJc w:val="left"/>
+      <w:lvlText w:val="%8."/>
+      <w:numFmt w:val="lowerLetter"/>
+      <w:pPr>
+        <w:pBdr/>
+        <w:spacing/>
+        <w:ind w:hanging="360" w:left="5749"/>
+      </w:pPr>
+      <w:rPr/>
+      <w:start w:val="1"/>
+      <w:suff w:val="tab"/>
+    </w:lvl>
+    <w:lvl w:ilvl="8">
+      <w:isLgl w:val="false"/>
+      <w:lvlJc w:val="right"/>
+      <w:lvlText w:val="%9."/>
+      <w:numFmt w:val="lowerRoman"/>
+      <w:pPr>
+        <w:pBdr/>
+        <w:spacing/>
+        <w:ind w:hanging="180" w:left="6469"/>
+      </w:pPr>
+      <w:rPr/>
+      <w:start w:val="1"/>
+      <w:suff w:val="tab"/>
+    </w:lvl>
+  </w:abstractNum>
+  <w:abstractNum w:abstractNumId="42">
     <w:lvl w:ilvl="0">
       <w:isLgl w:val="false"/>
       <w:lvlJc w:val="left"/>
@@ -33547,6 +34641,9 @@
   </w:num>
   <w:num w:numId="42">
     <w:abstractNumId w:val="41"/>
+  </w:num>
+  <w:num w:numId="43">
+    <w:abstractNumId w:val="42"/>
   </w:num>
 </w:numbering>
 </file>

</xml_diff>

<commit_message>
docs: Adicionado teste unitário TU001.17
</commit_message>
<xml_diff>
--- a/documentation/Especificacao_de_Requisitos_de_Software.docx
+++ b/documentation/Especificacao_de_Requisitos_de_Software.docx
@@ -27143,10 +27143,7 @@
         </w:rPr>
       </w:pPr>
       <w:r>
-        <w:t xml:space="preserve">6.1.1.</w:t>
-      </w:r>
-      <w:r>
-        <w:t xml:space="preserve">X</w:t>
+        <w:t xml:space="preserve">6.1.1.17</w:t>
       </w:r>
       <w:r>
         <w:t xml:space="preserve"> [</w:t>
@@ -27155,10 +27152,7 @@
         <w:t xml:space="preserve">TU</w:t>
       </w:r>
       <w:r>
-        <w:t xml:space="preserve">001.0</w:t>
-      </w:r>
-      <w:r>
-        <w:t xml:space="preserve">X</w:t>
+        <w:t xml:space="preserve">001.17</w:t>
       </w:r>
       <w:r>
         <w:t xml:space="preserve">] </w:t>
@@ -27167,7 +27161,7 @@
         <w:rPr>
           <w:color w:val="000000" w:themeColor="text1"/>
         </w:rPr>
-        <w:t xml:space="preserve">O sistema não deve cadastrar usuário quando o login já existe</w:t>
+        <w:t xml:space="preserve">O sistema não deve cadastrar usuário quando o e-mail é inválido</w:t>
       </w:r>
       <w:r>
         <w:rPr>
@@ -27240,7 +27234,7 @@
         <w:rPr>
           <w:color w:val="000000" w:themeColor="text1"/>
         </w:rPr>
-        <w:t xml:space="preserve">, RN</w:t>
+        <w:t xml:space="preserve">, RN001.12</w:t>
       </w:r>
       <w:r>
         <w:rPr>
@@ -27302,7 +27296,7 @@
         <w:rPr>
           <w:color w:val="000000" w:themeColor="text1"/>
         </w:rPr>
-        <w:t xml:space="preserve">: Login existente.</w:t>
+        <w:t xml:space="preserve">: E-mail do usuário inválido.</w:t>
       </w:r>
       <w:r>
         <w:rPr>
@@ -27356,7 +27350,7 @@
         <w:rPr>
           <w:color w:val="000000" w:themeColor="text1"/>
         </w:rPr>
-        <w:t xml:space="preserve">Informar os dados do usuário com login existente.</w:t>
+        <w:t xml:space="preserve">Informar os dados do usuário com e-mail inválido.</w:t>
       </w:r>
       <w:r>
         <w:rPr>
@@ -27382,7 +27376,7 @@
         <w:rPr>
           <w:color w:val="000000" w:themeColor="text1"/>
         </w:rPr>
-        <w:t xml:space="preserve">Consultar no Repository se o login existe.</w:t>
+        <w:t xml:space="preserve">Validar o e-mail.</w:t>
       </w:r>
       <w:r>
         <w:rPr>
@@ -27408,7 +27402,24 @@
         <w:rPr>
           <w:color w:val="000000" w:themeColor="text1"/>
         </w:rPr>
-        <w:t xml:space="preserve">Caso login exista lançar exceção.</w:t>
+      </w:r>
+      <w:r>
+        <w:rPr>
+          <w:color w:val="000000" w:themeColor="text1"/>
+        </w:rPr>
+        <w:t xml:space="preserve">Receber mensagem de erro ao </w:t>
+      </w:r>
+      <w:r>
+        <w:rPr>
+          <w:color w:val="000000" w:themeColor="text1"/>
+        </w:rPr>
+        <w:t xml:space="preserve">cadastrar e-mail inválido</w:t>
+      </w:r>
+      <w:r>
+        <w:rPr>
+          <w:color w:val="000000" w:themeColor="text1"/>
+        </w:rPr>
+        <w:t xml:space="preserve">.</w:t>
       </w:r>
       <w:r>
         <w:rPr>
@@ -27646,7 +27657,7 @@
         <w:rPr>
           <w:color w:val="000000" w:themeColor="text1"/>
         </w:rPr>
-        <w:t xml:space="preserve">: “teste@email.com”</w:t>
+        <w:t xml:space="preserve">: “@email.com”</w:t>
       </w:r>
       <w:r>
         <w:rPr>
@@ -27752,19 +27763,19 @@
         <w:rPr>
           <w:color w:val="000000" w:themeColor="text1"/>
         </w:rPr>
-        <w:t xml:space="preserve">Lançar exceção </w:t>
-      </w:r>
-      <w:r>
-        <w:rPr>
-          <w:color w:val="000000" w:themeColor="text1"/>
-        </w:rPr>
-        <w:t xml:space="preserve">EntityAlreadyExisting</w:t>
-      </w:r>
-      <w:r>
-        <w:rPr>
-          <w:color w:val="000000" w:themeColor="text1"/>
-        </w:rPr>
-        <w:t xml:space="preserve"> com a mensagem “Login já cadastrado!”.</w:t>
+        <w:t xml:space="preserve">Lançar exceção InvalidMailException</w:t>
+      </w:r>
+      <w:r>
+        <w:rPr>
+          <w:color w:val="000000" w:themeColor="text1"/>
+        </w:rPr>
+        <w:t xml:space="preserve"> </w:t>
+      </w:r>
+      <w:r>
+        <w:rPr>
+          <w:color w:val="000000" w:themeColor="text1"/>
+        </w:rPr>
+        <w:t xml:space="preserve">com a mensagem “E-mail inválido”.</w:t>
       </w:r>
       <w:r>
         <w:rPr>
@@ -34389,6 +34400,134 @@
     </w:lvl>
   </w:abstractNum>
   <w:abstractNum w:abstractNumId="42">
+    <w:lvl w:ilvl="0">
+      <w:isLgl w:val="false"/>
+      <w:lvlJc w:val="left"/>
+      <w:lvlText w:val="%1."/>
+      <w:numFmt w:val="decimal"/>
+      <w:pPr>
+        <w:pBdr/>
+        <w:spacing/>
+        <w:ind w:hanging="360" w:left="709"/>
+      </w:pPr>
+      <w:rPr/>
+      <w:start w:val="1"/>
+      <w:suff w:val="tab"/>
+    </w:lvl>
+    <w:lvl w:ilvl="1">
+      <w:isLgl w:val="false"/>
+      <w:lvlJc w:val="left"/>
+      <w:lvlText w:val="%2."/>
+      <w:numFmt w:val="lowerLetter"/>
+      <w:pPr>
+        <w:pBdr/>
+        <w:spacing/>
+        <w:ind w:hanging="360" w:left="1429"/>
+      </w:pPr>
+      <w:rPr/>
+      <w:start w:val="1"/>
+      <w:suff w:val="tab"/>
+    </w:lvl>
+    <w:lvl w:ilvl="2">
+      <w:isLgl w:val="false"/>
+      <w:lvlJc w:val="right"/>
+      <w:lvlText w:val="%3."/>
+      <w:numFmt w:val="lowerRoman"/>
+      <w:pPr>
+        <w:pBdr/>
+        <w:spacing/>
+        <w:ind w:hanging="180" w:left="2149"/>
+      </w:pPr>
+      <w:rPr/>
+      <w:start w:val="1"/>
+      <w:suff w:val="tab"/>
+    </w:lvl>
+    <w:lvl w:ilvl="3">
+      <w:isLgl w:val="false"/>
+      <w:lvlJc w:val="left"/>
+      <w:lvlText w:val="%4."/>
+      <w:numFmt w:val="decimal"/>
+      <w:pPr>
+        <w:pBdr/>
+        <w:spacing/>
+        <w:ind w:hanging="360" w:left="2869"/>
+      </w:pPr>
+      <w:rPr/>
+      <w:start w:val="1"/>
+      <w:suff w:val="tab"/>
+    </w:lvl>
+    <w:lvl w:ilvl="4">
+      <w:isLgl w:val="false"/>
+      <w:lvlJc w:val="left"/>
+      <w:lvlText w:val="%5."/>
+      <w:numFmt w:val="lowerLetter"/>
+      <w:pPr>
+        <w:pBdr/>
+        <w:spacing/>
+        <w:ind w:hanging="360" w:left="3589"/>
+      </w:pPr>
+      <w:rPr/>
+      <w:start w:val="1"/>
+      <w:suff w:val="tab"/>
+    </w:lvl>
+    <w:lvl w:ilvl="5">
+      <w:isLgl w:val="false"/>
+      <w:lvlJc w:val="right"/>
+      <w:lvlText w:val="%6."/>
+      <w:numFmt w:val="lowerRoman"/>
+      <w:pPr>
+        <w:pBdr/>
+        <w:spacing/>
+        <w:ind w:hanging="180" w:left="4309"/>
+      </w:pPr>
+      <w:rPr/>
+      <w:start w:val="1"/>
+      <w:suff w:val="tab"/>
+    </w:lvl>
+    <w:lvl w:ilvl="6">
+      <w:isLgl w:val="false"/>
+      <w:lvlJc w:val="left"/>
+      <w:lvlText w:val="%7."/>
+      <w:numFmt w:val="decimal"/>
+      <w:pPr>
+        <w:pBdr/>
+        <w:spacing/>
+        <w:ind w:hanging="360" w:left="5029"/>
+      </w:pPr>
+      <w:rPr/>
+      <w:start w:val="1"/>
+      <w:suff w:val="tab"/>
+    </w:lvl>
+    <w:lvl w:ilvl="7">
+      <w:isLgl w:val="false"/>
+      <w:lvlJc w:val="left"/>
+      <w:lvlText w:val="%8."/>
+      <w:numFmt w:val="lowerLetter"/>
+      <w:pPr>
+        <w:pBdr/>
+        <w:spacing/>
+        <w:ind w:hanging="360" w:left="5749"/>
+      </w:pPr>
+      <w:rPr/>
+      <w:start w:val="1"/>
+      <w:suff w:val="tab"/>
+    </w:lvl>
+    <w:lvl w:ilvl="8">
+      <w:isLgl w:val="false"/>
+      <w:lvlJc w:val="right"/>
+      <w:lvlText w:val="%9."/>
+      <w:numFmt w:val="lowerRoman"/>
+      <w:pPr>
+        <w:pBdr/>
+        <w:spacing/>
+        <w:ind w:hanging="180" w:left="6469"/>
+      </w:pPr>
+      <w:rPr/>
+      <w:start w:val="1"/>
+      <w:suff w:val="tab"/>
+    </w:lvl>
+  </w:abstractNum>
+  <w:abstractNum w:abstractNumId="43">
     <w:lvl w:ilvl="0">
       <w:isLgl w:val="false"/>
       <w:lvlJc w:val="left"/>
@@ -34644,6 +34783,9 @@
   </w:num>
   <w:num w:numId="43">
     <w:abstractNumId w:val="42"/>
+  </w:num>
+  <w:num w:numId="44">
+    <w:abstractNumId w:val="43"/>
   </w:num>
 </w:numbering>
 </file>

</xml_diff>